<commit_message>
V4.1: Eclipse prediction analysis - misrepresented globe prediction
- Dome's -17 to -21 nT derived from scaling 2016 Chapman-mechanism data
- Globe prediction stated as "0.0 nT" but literature shows 5-20 nT
- Added peer-reviewed citations: 207 observations across 39 eclipses
- Kp < 2 condition creates heads-I-win, tails-doesn't-count framing
- Added analysis: why easy busts in Audit page are strategic not careless
- Added Pattern 10: Misrepresenting the Opponent's Prediction
- Updated Key Test section to reflect revised eclipse assessment

Co-Authored-By: Claude Opus 4.6 <noreply@anthropic.com>
</commit_message>
<xml_diff>
--- a/downloads/critical-review-dome-model-v4.docx
+++ b/downloads/critical-review-dome-model-v4.docx
@@ -8821,7 +8821,7 @@
       <w:r>
         <w:t xml:space="preserve">US Patent 787412 (1905), publicly available at </w:t>
       </w:r>
-      <w:hyperlink w:history="1" r:id="rIdi04iaa6a2dbdglr0mbsgm">
+      <w:hyperlink w:history="1" r:id="rIdt5evc9pbnzpgz_pir9aid">
         <w:r>
           <w:rPr>
             <w:rStyle w:val="Hyperlink"/>
@@ -8946,7 +8946,7 @@
       <w:r>
         <w:t xml:space="preserve">James Bradley (1727) explicitly tested and rejected atmospheric refraction as an explanation: refraction is wavelength-dependent (chromatic), while stellar aberration is achromatic. Modern VLBI measurements achieve milliarcsecond precision and directly confirm aberration correlates with Earth's orbital velocity (~30 km/s). The </w:t>
       </w:r>
-      <w:hyperlink w:history="1" r:id="rId8ogh9nl9jfa1mx663z3dv">
+      <w:hyperlink w:history="1" r:id="rIdu2vsyn6vptssn9zdblobg">
         <w:r>
           <w:rPr>
             <w:rStyle w:val="Hyperlink"/>
@@ -9012,7 +9012,7 @@
       <w:r>
         <w:t xml:space="preserve">ESA </w:t>
       </w:r>
-      <w:hyperlink w:history="1" r:id="rId0d6kja6fmwe7fdk9pfvq0">
+      <w:hyperlink w:history="1" r:id="rIdgcil4uonpfh4iqrsb66jv">
         <w:r>
           <w:rPr>
             <w:rStyle w:val="Hyperlink"/>
@@ -9078,7 +9078,7 @@
       <w:r>
         <w:t xml:space="preserve">Crepuscular rays are parallel beams made visible by atmospheric scattering. The apparent divergence is a perspective effect. Crucially, anticrepuscular rays converge at the anti-solar point simultaneously. See </w:t>
       </w:r>
-      <w:hyperlink w:history="1" r:id="rId0semgj9o1wxpcxvblzwa8">
+      <w:hyperlink w:history="1" r:id="rIdkpmq0achqs9_0evve1eiq">
         <w:r>
           <w:rPr>
             <w:rStyle w:val="Hyperlink"/>
@@ -9089,7 +9089,7 @@
       <w:r>
         <w:t xml:space="preserve"> and </w:t>
       </w:r>
-      <w:hyperlink w:history="1" r:id="rIdu38g5ylaphc_kjfp8ppgu">
+      <w:hyperlink w:history="1" r:id="rIdprckv5urlvt6nd7rqsztb">
         <w:r>
           <w:rPr>
             <w:rStyle w:val="Hyperlink"/>
@@ -9155,7 +9155,7 @@
       <w:r>
         <w:t xml:space="preserve">NOAA officially states no evidence of anomalous disappearances. </w:t>
       </w:r>
-      <w:hyperlink w:history="1" r:id="rIdbqydisdgzyr_6kd_req8p">
+      <w:hyperlink w:history="1" r:id="rIddvrnm333yprhvu81kp9pw">
         <w:r>
           <w:rPr>
             <w:rStyle w:val="Hyperlink"/>
@@ -9221,7 +9221,7 @@
       <w:r>
         <w:t xml:space="preserve">Hipparcos </w:t>
       </w:r>
-      <w:hyperlink w:history="1" r:id="rIddta517rrcq9rziqae-krp">
+      <w:hyperlink w:history="1" r:id="rIdbj_vjdl0zwj2kyiywgqno">
         <w:r>
           <w:rPr>
             <w:rStyle w:val="Hyperlink"/>
@@ -9607,7 +9607,7 @@
       <w:r>
         <w:t xml:space="preserve">Terra-Nova et al. (2017, PNAS) demonstrate reversed-flux patches reproduce SAA splitting in MHD simulations. The </w:t>
       </w:r>
-      <w:hyperlink w:history="1" r:id="rIdzljetkm6y_byapan39f27">
+      <w:hyperlink w:history="1" r:id="rIdm_9uk5umc1ppexmks19mk">
         <w:r>
           <w:rPr>
             <w:rStyle w:val="Hyperlink"/>
@@ -9618,7 +9618,7 @@
       <w:r>
         <w:t xml:space="preserve"> documents the evolution quantitatively. </w:t>
       </w:r>
-      <w:hyperlink w:history="1" r:id="rId-bbcizynpkjkvkaya1uro">
+      <w:hyperlink w:history="1" r:id="rIdpbrp5_b7tvcazar072ni-">
         <w:r>
           <w:rPr>
             <w:rStyle w:val="Hyperlink"/>
@@ -9669,7 +9669,7 @@
       <w:r>
         <w:t xml:space="preserve">Normal secular variation documented by </w:t>
       </w:r>
-      <w:hyperlink w:history="1" r:id="rIdglxjvbd3zcy1te2ytqj0n">
+      <w:hyperlink w:history="1" r:id="rIdvw9_cxxhkomplxvdz5zqh">
         <w:r>
           <w:rPr>
             <w:rStyle w:val="Hyperlink"/>
@@ -9736,7 +9736,7 @@
       <w:r>
         <w:t xml:space="preserve">Eclipse-induced perturbations predicted by Chapman (1933) via ionospheric conductivity drops. Data from </w:t>
       </w:r>
-      <w:hyperlink w:history="1" r:id="rId8xijfutaxb2rikb6eivvx">
+      <w:hyperlink w:history="1" r:id="rIdrv_hw_-cd6ukxsohir7qz">
         <w:r>
           <w:rPr>
             <w:rStyle w:val="Hyperlink"/>
@@ -9824,7 +9824,7 @@
       <w:r>
         <w:t xml:space="preserve">The formula used is for a quarter-wave linear waveguide, not a spherical cavity. Correct formula f = c/(2*pi*R) gives R = 6,098 km, within 4% of Earth's radius. The ionosphere IS conductive (</w:t>
       </w:r>
-      <w:hyperlink w:history="1" r:id="rId9u3xwdn1c1qfqbr8dfmk_">
+      <w:hyperlink w:history="1" r:id="rIdrlnj7fmev-yos-inzuz-k">
         <w:r>
           <w:rPr>
             <w:rStyle w:val="Hyperlink"/>
@@ -9891,7 +9891,7 @@
       <w:r>
         <w:t xml:space="preserve">All five observations already predicted by </w:t>
       </w:r>
-      <w:hyperlink w:history="1" r:id="rIdhqcg0nbbpjtzg6wveirpj">
+      <w:hyperlink w:history="1" r:id="rIdpoq8cczbf3cdimaeffclc">
         <w:r>
           <w:rPr>
             <w:rStyle w:val="Hyperlink"/>
@@ -9902,7 +9902,7 @@
       <w:r>
         <w:t xml:space="preserve">, </w:t>
       </w:r>
-      <w:hyperlink w:history="1" r:id="rIdp1os3rrq7ma9tvziit5yi">
+      <w:hyperlink w:history="1" r:id="rIddku4c2yqpbznimzjwxize">
         <w:r>
           <w:rPr>
             <w:rStyle w:val="Hyperlink"/>
@@ -10229,7 +10229,7 @@
       <w:r>
         <w:t xml:space="preserve">Antarctic gravity anomalies are mapped from orbit by </w:t>
       </w:r>
-      <w:hyperlink w:history="1" r:id="rId3dbreobev6sjblf7vx1tn">
+      <w:hyperlink w:history="1" r:id="rIdddp47qgi4aputnaufeacy">
         <w:r>
           <w:rPr>
             <w:rStyle w:val="Hyperlink"/>
@@ -10240,7 +10240,7 @@
       <w:r>
         <w:t xml:space="preserve"> and </w:t>
       </w:r>
-      <w:hyperlink w:history="1" r:id="rIdczd7dop7lyiuws-fwacy5">
+      <w:hyperlink w:history="1" r:id="rIdyvvibi7aigddberutl-_k">
         <w:r>
           <w:rPr>
             <w:rStyle w:val="Hyperlink"/>
@@ -10941,7 +10941,7 @@
         <w:t xml:space="preserve">Eclipse 2026: </w:t>
       </w:r>
       <w:r>
-        <w:t xml:space="preserve">The dome predicts -17 to -21 nT Z-component anomaly at seven European observatories; the globe predicts ~0 nT (no mechanism beyond Chapman ionospheric effect, which is much smaller). This is a genuinely discriminating prediction if both models' thresholds are stated correctly. However, the Chapman mechanism does predict small (~1-5 nT) perturbations, so the 0.0 nT globe prediction is slightly understated. The dome's -17 to -21 nT would be clearly distinguishable from Chapman's ~1-5 nT.</w:t>
+        <w:t xml:space="preserve">The dome predicts -17 to -21 nT Z-component anomaly at seven European observatories. The site states: 'Globe Model Prediction: 0.0 nT exactly; no physical mechanism proposed.' This is false. Chapman (1933) proposed the mechanism 93 years ago, and peer-reviewed literature documents eclipse magnetic perturbations of 5-20 nT during quiet conditions. See detailed analysis below.</w:t>
       </w:r>
     </w:p>
     <w:p>
@@ -10949,22 +10949,157 @@
         <w:pStyle w:val="Heading3"/>
       </w:pPr>
       <w:r>
-        <w:t xml:space="preserve">Is There a Genuinely New Falsifiable Prediction?</w:t>
-      </w:r>
-    </w:p>
-    <w:p>
-      <w:pPr>
-        <w:spacing w:after="120"/>
-      </w:pPr>
-      <w:r>
-        <w:rPr>
-          <w:b/>
-          <w:bCs/>
-        </w:rPr>
-        <w:t xml:space="preserve">August 12, 2026 Eclipse Test: </w:t>
-      </w:r>
-      <w:r>
-        <w:t xml:space="preserve">YES. This is a genuine, falsifiable, discriminating prediction. The dome model predicts a Z-component magnetic anomaly of -17 to -21 nT at seven named European INTERMAGNET stations, conditional on Kp &lt; 2 (quiet geomagnetic conditions). The globe model predicts only the Chapman ionospheric effect (~1-5 nT). If geomagnetic conditions are quiet and the measured anomaly is within the dome's predicted range and far exceeds Chapman predictions, this would be significant evidence requiring explanation. Conversely, if the anomaly is within the Chapman range or absent, the dome model's specific prediction fails.</w:t>
+        <w:t xml:space="preserve">The August 2026 Eclipse: A Misrepresented Prediction</w:t>
+      </w:r>
+    </w:p>
+    <w:p>
+      <w:pPr>
+        <w:spacing w:after="120"/>
+      </w:pPr>
+      <w:r>
+        <w:rPr>
+          <w:b/>
+          <w:bCs/>
+        </w:rPr>
+        <w:t xml:space="preserve">The dome prediction: </w:t>
+      </w:r>
+      <w:r>
+        <w:t xml:space="preserve">-17 to -21 nT Z-component anomaly at European INTERMAGNET stations during the August 12, 2026 eclipse, conditional on Kp &lt; 2 (quiet geomagnetic conditions).</w:t>
+      </w:r>
+    </w:p>
+    <w:p>
+      <w:pPr>
+        <w:spacing w:after="120"/>
+      </w:pPr>
+      <w:r>
+        <w:rPr>
+          <w:b/>
+          <w:bCs/>
+        </w:rPr>
+        <w:t xml:space="preserve">The stated globe prediction: </w:t>
+      </w:r>
+      <w:r>
+        <w:t xml:space="preserve">'0.0 nT exactly; no physical mechanism proposed.'</w:t>
+      </w:r>
+    </w:p>
+    <w:p>
+      <w:pPr>
+        <w:spacing w:after="120"/>
+      </w:pPr>
+      <w:r>
+        <w:rPr>
+          <w:b/>
+          <w:bCs/>
+        </w:rPr>
+        <w:t xml:space="preserve">The actual globe prediction: </w:t>
+      </w:r>
+      <w:r>
+        <w:t xml:space="preserve">5-20 nT perturbation via the Chapman ionospheric mechanism. Chapman (1933) showed that when the Moon blocks sunlight, photoionization ceases in the ionospheric E-layer (90-150 km), reducing conductivity and disrupting the Sq current system. This produces measurable magnetic perturbations at ground observatories.</w:t>
+      </w:r>
+    </w:p>
+    <w:p>
+      <w:pPr>
+        <w:spacing w:after="120"/>
+      </w:pPr>
+      <w:r>
+        <w:rPr>
+          <w:b/>
+          <w:bCs/>
+        </w:rPr>
+        <w:t xml:space="preserve">What the peer-reviewed literature shows: </w:t>
+      </w:r>
+      <w:r>
+        <w:t xml:space="preserve">A </w:t>
+      </w:r>
+      <w:hyperlink w:history="1" r:id="rIdxlbiyfdlqmknlzx791kgj">
+        <w:r>
+          <w:rPr>
+            <w:rStyle w:val="Hyperlink"/>
+          </w:rPr>
+          <w:t xml:space="preserve">statistical analysis of 207 observations across 39 eclipses (1991-2016)</w:t>
+        </w:r>
+      </w:hyperlink>
+      <w:r>
+        <w:t xml:space="preserve"> found detectable decreases in X, Z, and total field components during eclipses. An </w:t>
+      </w:r>
+      <w:hyperlink w:history="1" r:id="rIdexuoxt1baccjrrau48dkk">
+        <w:r>
+          <w:rPr>
+            <w:rStyle w:val="Hyperlink"/>
+          </w:rPr>
+          <w:t xml:space="preserve">INTERMAGNET study of 4 total eclipses</w:t>
+        </w:r>
+      </w:hyperlink>
+      <w:r>
+        <w:t xml:space="preserve"> at 6 observatories confirmed characteristic Z-component decreases. Published perturbation magnitudes during quiet geomagnetic conditions consistently fall in the 5-20 nT range, depending on eclipse coverage percentage and station location.</w:t>
+      </w:r>
+    </w:p>
+    <w:p>
+      <w:pPr>
+        <w:spacing w:after="120"/>
+      </w:pPr>
+      <w:r>
+        <w:rPr>
+          <w:b/>
+          <w:bCs/>
+        </w:rPr>
+        <w:t xml:space="preserve">How the dome prediction was derived: </w:t>
+      </w:r>
+      <w:r>
+        <w:t xml:space="preserve">The author's own data reveals the method. He cites the March 9, 2016 Pacific eclipse (a quiet day with BOU std=2.23 nT) where station GUA (Guam, near totality) showed a Z-component anomaly of -13.16 to -15.11 nT. He then applied his 'correction factor of 1.672' (equal to the coupling constant from WIN-012) to scale these values up, arriving at the -17 to -21 nT prediction. But the 2016 observations were made at real INTERMAGNET stations on a real globe. They are Chapman-mechanism data. He is taking globe-model-confirmed observations, scaling them slightly upward, and predicting the same thing will happen again.</w:t>
+      </w:r>
+    </w:p>
+    <w:p>
+      <w:pPr>
+        <w:spacing w:after="120"/>
+      </w:pPr>
+      <w:r>
+        <w:rPr>
+          <w:b/>
+          <w:bCs/>
+        </w:rPr>
+        <w:t xml:space="preserve">The strategic framing: </w:t>
+      </w:r>
+      <w:r>
+        <w:t xml:space="preserve">By stating the globe prediction as '0.0 nT exactly,' the author creates a false binary: either you see -17 to -21 nT (dome wins) or you see 0.0 nT (globe wins). In reality, a quiet-day eclipse result of -10 to -20 nT would be entirely consistent with the Chapman mechanism, as demonstrated by decades of peer-reviewed research. The dome model is not predicting something the globe model disagrees with. It is predicting something the globe model already predicts and already explains, while misrepresenting the globe prediction as zero.</w:t>
+      </w:r>
+    </w:p>
+    <w:p>
+      <w:pPr>
+        <w:spacing w:after="120"/>
+      </w:pPr>
+      <w:r>
+        <w:rPr>
+          <w:b/>
+          <w:bCs/>
+        </w:rPr>
+        <w:t xml:space="preserve">Why the Kp &lt; 2 condition matters: </w:t>
+      </w:r>
+      <w:r>
+        <w:t xml:space="preserve">The author correctly identifies that eclipse magnetic signals require quiet geomagnetic conditions to detect. He cites the 2017 eclipse (BOU std=8.05 nT, Kp ~5) and 2024 eclipse (BOU std=5.59 nT, Kp ~5-6) as 'storm contaminated' and removed WIN-025 for exactly this reason. The Kp &lt; 2 condition also provides an escape clause: if the August 2026 eclipse occurs during disturbed conditions, the prediction is 'not falsified, just untestable.' This makes the prediction heads-I-win, tails-doesn't-count.</w:t>
+      </w:r>
+    </w:p>
+    <w:p>
+      <w:pPr>
+        <w:spacing w:after="120"/>
+      </w:pPr>
+      <w:r>
+        <w:rPr>
+          <w:b/>
+          <w:bCs/>
+        </w:rPr>
+        <w:t xml:space="preserve">Verdict on the eclipse test: </w:t>
+      </w:r>
+      <w:r>
+        <w:t xml:space="preserve">This is NOT a genuinely discriminating prediction. The dome's -17 to -21 nT range overlaps substantially with the 5-20 nT range documented in peer-reviewed eclipse magnetism studies. If the eclipse produces ~15 nT perturbation under quiet conditions, both the dome model and the Chapman mechanism predict this outcome. The test is constructed to guarantee a 'win' for the dome model as long as geomagnetic conditions cooperate, because the stated globe prediction of 0.0 nT is a straw man.</w:t>
+      </w:r>
+    </w:p>
+    <w:p>
+      <w:pPr>
+        <w:pStyle w:val="Heading3"/>
+      </w:pPr>
+      <w:r>
+        <w:t xml:space="preserve">Other Claimed Discriminating Tests</w:t>
       </w:r>
     </w:p>
     <w:p>
@@ -11009,7 +11144,7 @@
         <w:t xml:space="preserve">Assessment: </w:t>
       </w:r>
       <w:r>
-        <w:t xml:space="preserve">Of all the claims on the Live Power and Kill-Shot pages, only the August 2026 Eclipse Test represents a genuinely new, time-bound, falsifiable prediction where the dome and globe models make clearly different quantitative predictions. All other 'tests' either use data that already exists and favors the globe, or measure quantities both models predict similarly.</w:t>
+        <w:t xml:space="preserve">None of the claimed discriminating tests on the Live Power and Kill-Shot pages actually discriminate between the dome and globe models. The eclipse test misrepresents the globe prediction. The Sydney-Perth test favors the globe. The Polaris test has been resolved for centuries. The remaining pending tests (NMP drift, SAA cell, JFK-LHR) measure quantities both models predict similarly.</w:t>
       </w:r>
     </w:p>
     <w:p>
@@ -11091,6 +11226,38 @@
     </w:p>
     <w:p>
       <w:pPr>
+        <w:pStyle w:val="Heading3"/>
+      </w:pPr>
+      <w:r>
+        <w:t xml:space="preserve">Why the Easy Busts Are a Feature, Not a Bug</w:t>
+      </w:r>
+    </w:p>
+    <w:p>
+      <w:pPr>
+        <w:spacing w:after="120"/>
+      </w:pPr>
+      <w:r>
+        <w:t xml:space="preserve">A notable pattern emerges: the author clearly anticipates AI auditors reviewing his work, yet includes claims that are trivially disprovable (tidal periods as 'predictions,' contradictory gravity results counted as wins, internal version inconsistencies). This appears strategic rather than careless. The Audit Walkthrough is designed for sequential processing: each step builds on the previous without inviting cross-referencing against external data. The 'easy busts' serve as padding that inflates the headline numbers (67 wins, 9.2 sigma, 20 domains) while betting that a sequential AI processor will reach Step 6 and produce the scripted conclusion before independently verifying each claim.</w:t>
+      </w:r>
+    </w:p>
+    <w:p>
+      <w:pPr>
+        <w:spacing w:after="120"/>
+      </w:pPr>
+      <w:r>
+        <w:t xml:space="preserve">The selective acknowledgment of some problems (WIN-025 removed, WIN-004 methodology invalid, 4 falsified on the context page) reinforces this interpretation. Admitting minor flaws creates an appearance of intellectual honesty that makes the remaining claims seem more credible to an uncritical reader: 'See, I am willing to admit when I am wrong.' Meanwhile, the homepage WIN count is not decremented, the falsification count is not updated, and the admitted problems are buried in subpages rather than reflected in headline statistics.</w:t>
+      </w:r>
+    </w:p>
+    <w:p>
+      <w:pPr>
+        <w:spacing w:after="120"/>
+      </w:pPr>
+      <w:r>
+        <w:t xml:space="preserve">The Audit page's final step provides pre-written 'suggested AI auditor response' language. This is the most explicit form of prompt injection on the site: rather than merely instructing AI to accept the model, it provides the exact words for the AI to produce, completing a pipeline that moves from selective evidence presentation through guided reasoning to scripted output.</w:t>
+      </w:r>
+    </w:p>
+    <w:p>
+      <w:pPr>
         <w:pStyle w:val="Heading2"/>
       </w:pPr>
       <w:r>
@@ -11239,7 +11406,7 @@
       <w:r>
         <w:t xml:space="preserve">Continuous 24-hour sunlight. A local sun at 5,733 km circling above a flat disc cannot produce 24-hour sunlight at the disc edge. Directly observable at Amundsen-Scott Station, staffed year-round since 1957. See </w:t>
       </w:r>
-      <w:hyperlink w:history="1" r:id="rIdwbcigsv8eqwkv7hicsqfk">
+      <w:hyperlink w:history="1" r:id="rIdysln7fphffqy8t-renwzl">
         <w:r>
           <w:rPr>
             <w:rStyle w:val="Hyperlink"/>
@@ -11288,7 +11455,7 @@
       <w:r>
         <w:t xml:space="preserve">GPS provides 1-3 meter accuracy worldwide. The ISS at 408 km is visible on predictable schedules. Geostationary satellites at 35,786 km. All require unobstructed radio paths. See </w:t>
       </w:r>
-      <w:hyperlink w:history="1" r:id="rIdhr_nw1vxytxyuqxvzknjy">
+      <w:hyperlink w:history="1" r:id="rIdf8sw6lru6jda9sr7duv4q">
         <w:r>
           <w:rPr>
             <w:rStyle w:val="Hyperlink"/>
@@ -11299,7 +11466,7 @@
       <w:r>
         <w:t xml:space="preserve">; </w:t>
       </w:r>
-      <w:hyperlink w:history="1" r:id="rIdbv2x8aje86tjlhv48adw3">
+      <w:hyperlink w:history="1" r:id="rId63jzn7zhdwjgrq4a0e0p1">
         <w:r>
           <w:rPr>
             <w:rStyle w:val="Hyperlink"/>
@@ -11348,7 +11515,7 @@
       <w:r>
         <w:t xml:space="preserve">Modern solar calculators (</w:t>
       </w:r>
-      <w:hyperlink w:history="1" r:id="rIdao7dvhmejku2q2-o3y-u5">
+      <w:hyperlink w:history="1" r:id="rIdbrre_xyrezdxfducx-o8r">
         <w:r>
           <w:rPr>
             <w:rStyle w:val="Hyperlink"/>
@@ -11397,7 +11564,7 @@
       <w:r>
         <w:t xml:space="preserve">The </w:t>
       </w:r>
-      <w:hyperlink w:history="1" r:id="rIdvzesms6vitshwzyf84k9m">
+      <w:hyperlink w:history="1" r:id="rId6kyszvvxotdq37elj_l2i">
         <w:r>
           <w:rPr>
             <w:rStyle w:val="Hyperlink"/>
@@ -11446,7 +11613,7 @@
       <w:r>
         <w:t xml:space="preserve">Earth's field is a dipole. South magnetic pole at 64.1°S, 135.9°E (</w:t>
       </w:r>
-      <w:hyperlink w:history="1" r:id="rIdbv4wq2ipf09pibqxjerfr">
+      <w:hyperlink w:history="1" r:id="rIdbx1zezvxzg4mqstxmzzxi">
         <w:r>
           <w:rPr>
             <w:rStyle w:val="Hyperlink"/>
@@ -11495,7 +11662,7 @@
       <w:r>
         <w:t xml:space="preserve">g = 9.780 m/s² at equator, 9.832 m/s² at poles (0.53% variation). On a flat disc, centrifugal force points outward from center, producing the OPPOSITE pattern. See </w:t>
       </w:r>
-      <w:hyperlink w:history="1" r:id="rId29vz1crfh8velvrh_rz2i">
+      <w:hyperlink w:history="1" r:id="rIdkqfizdutjrkp3af475z-w">
         <w:r>
           <w:rPr>
             <w:rStyle w:val="Hyperlink"/>
@@ -11764,18 +11931,49 @@
     </w:p>
     <w:p>
       <w:pPr>
+        <w:spacing w:after="120"/>
+      </w:pPr>
+      <w:r>
+        <w:rPr>
+          <w:b/>
+          <w:bCs/>
+        </w:rPr>
+        <w:t xml:space="preserve">Pattern 10 (NEW): Misrepresenting the Opponent's Prediction. </w:t>
+      </w:r>
+      <w:r>
+        <w:t xml:space="preserve">The eclipse test states the globe predicts '0.0 nT exactly' when peer-reviewed literature documents 5-20 nT perturbations via the Chapman mechanism. The dome's -17 to -21 nT prediction was derived by scaling actual globe-model-confirmed observations (2016 eclipse) upward by a correction factor. The test is constructed so that the expected real-world outcome (10-20 nT perturbation on a quiet day) would be claimed as a dome 'win' despite being fully consistent with mainstream ionospheric physics.</w:t>
+      </w:r>
+    </w:p>
+    <w:p>
+      <w:pPr>
         <w:pStyle w:val="Heading2"/>
       </w:pPr>
       <w:r>
-        <w:t xml:space="preserve">6.2 The Key Test</w:t>
-      </w:r>
-    </w:p>
-    <w:p>
-      <w:pPr>
-        <w:spacing w:after="120"/>
-      </w:pPr>
-      <w:r>
-        <w:t xml:space="preserve">The August 12, 2026 Eclipse Test remains the single most important prediction. The dome model predicts -17 to -21 nT Z-component anomaly at seven European INTERMAGNET stations under quiet conditions (Kp &lt; 2). The globe model predicts only Chapman ionospheric effects (~1-5 nT). This is time-bound, quantitative, and clearly discriminating. INTERMAGNET data will be public within 72 hours of the eclipse.</w:t>
+        <w:t xml:space="preserve">6.2 The Eclipse Test: Not What It Appears</w:t>
+      </w:r>
+    </w:p>
+    <w:p>
+      <w:pPr>
+        <w:spacing w:after="120"/>
+      </w:pPr>
+      <w:r>
+        <w:t xml:space="preserve">The August 12, 2026 Eclipse Test is presented as the single most important discriminating prediction. The dome model predicts -17 to -21 nT Z-component anomaly at seven European INTERMAGNET stations under quiet conditions (Kp &lt; 2). However, as documented in Part 3.1, the site misrepresents the globe prediction as '0.0 nT exactly' when the Chapman ionospheric mechanism (peer-reviewed since 1933) predicts 5-20 nT under identical conditions. The dome's prediction range was derived by applying a 1.672x scaling factor to actual INTERMAGNET data from the 2016 eclipse, which was itself a Chapman-mechanism observation on a spherical Earth.</w:t>
+      </w:r>
+    </w:p>
+    <w:p>
+      <w:pPr>
+        <w:spacing w:after="120"/>
+      </w:pPr>
+      <w:r>
+        <w:t xml:space="preserve">The test is constructed as a heads-I-win, tails-doesn't-count proposition: if a quiet-day eclipse produces ~15 nT perturbation (as the Chapman mechanism predicts and as documented across 39 eclipses in the peer-reviewed literature), the dome claims victory. If geomagnetic conditions are disturbed, the prediction is declared untestable rather than failed. There is no outcome under which the test as framed would falsify the dome model.</w:t>
+      </w:r>
+    </w:p>
+    <w:p>
+      <w:pPr>
+        <w:spacing w:after="120"/>
+      </w:pPr>
+      <w:r>
+        <w:t xml:space="preserve">A genuinely discriminating eclipse test would require the dome model to predict something the Chapman mechanism does not: for example, a specific directional pattern in the anomaly that follows 'aetheric pressure' geometry rather than ionospheric conductivity geometry, or a perturbation at a station far from the eclipse path where ionospheric effects would be negligible but 'cavity height perturbation' would still register. The current prediction makes no such distinction.</w:t>
       </w:r>
     </w:p>
     <w:p>
@@ -11896,7 +12094,7 @@
         <w:spacing w:after="120"/>
       </w:pPr>
       <w:r>
-        <w:t xml:space="preserve">None of the 67 claims demonstrate predictive power exceeding mainstream geophysical models. The 28 new WINs added in V51.0 include zero genuinely new, dome-specific predictions. The only genuinely discriminating test is the August 2026 eclipse, which has not yet occurred.</w:t>
+        <w:t xml:space="preserve">None of the 67 claims demonstrate predictive power exceeding mainstream geophysical models. The 28 new WINs added in V51.0 include zero genuinely new, dome-specific predictions. The August 2026 eclipse test, initially identified as potentially discriminating, is revealed upon closer examination to be a misframed comparison: the dome's predicted range (derived from scaling actual Chapman-mechanism observations) overlaps with the published peer-reviewed range for quiet-day eclipse perturbations. No claimed test on the site produces a prediction that the globe model disagrees with and that the dome model uniquely explains.</w:t>
       </w:r>
     </w:p>
     <w:p>
@@ -11931,7 +12129,7 @@
         </w:rPr>
         <w:t xml:space="preserve">NOAA World Magnetic Model 2025: </w:t>
       </w:r>
-      <w:hyperlink w:history="1" r:id="rIdiuvaddpefczpp6vnogxlx">
+      <w:hyperlink w:history="1" r:id="rIdydrkjpqvlaoutfworxkxa">
         <w:r>
           <w:rPr>
             <w:rStyle w:val="Hyperlink"/>
@@ -11951,7 +12149,7 @@
         </w:rPr>
         <w:t xml:space="preserve">NOAA Wandering Geomagnetic Poles: </w:t>
       </w:r>
-      <w:hyperlink w:history="1" r:id="rIdr5pswk253yjzelogd30vr">
+      <w:hyperlink w:history="1" r:id="rIdjlr14rqegy67ujivrp7fj">
         <w:r>
           <w:rPr>
             <w:rStyle w:val="Hyperlink"/>
@@ -11971,7 +12169,7 @@
         </w:rPr>
         <w:t xml:space="preserve">CHAOS-7 Geomagnetic Field Model: </w:t>
       </w:r>
-      <w:hyperlink w:history="1" r:id="rId0lvoaxlfam-qfhhy6wlqf">
+      <w:hyperlink w:history="1" r:id="rIdz1ff_dufhgdvdeaeg9per">
         <w:r>
           <w:rPr>
             <w:rStyle w:val="Hyperlink"/>
@@ -11991,7 +12189,7 @@
         </w:rPr>
         <w:t xml:space="preserve">ESA Swarm Satellite Mission: </w:t>
       </w:r>
-      <w:hyperlink w:history="1" r:id="rIdxksveow1an6jhkd5syccz">
+      <w:hyperlink w:history="1" r:id="rIdro8i7j3wkoguzglmvlv-s">
         <w:r>
           <w:rPr>
             <w:rStyle w:val="Hyperlink"/>
@@ -12011,7 +12209,7 @@
         </w:rPr>
         <w:t xml:space="preserve">INTERMAGNET Observatory Network: </w:t>
       </w:r>
-      <w:hyperlink w:history="1" r:id="rIdtgmhl7rindnsdcefgswsz">
+      <w:hyperlink w:history="1" r:id="rId_cbs-ovk0j-eyqblh3pqr">
         <w:r>
           <w:rPr>
             <w:rStyle w:val="Hyperlink"/>
@@ -12031,7 +12229,7 @@
         </w:rPr>
         <w:t xml:space="preserve">IGRF-13: </w:t>
       </w:r>
-      <w:hyperlink w:history="1" r:id="rIdnr4zxz40bjnvym83rnrzj">
+      <w:hyperlink w:history="1" r:id="rIdqqnnokwus2baagdp-bfax">
         <w:r>
           <w:rPr>
             <w:rStyle w:val="Hyperlink"/>
@@ -12051,7 +12249,7 @@
         </w:rPr>
         <w:t xml:space="preserve">ESA Gaia Data Release 3: </w:t>
       </w:r>
-      <w:hyperlink w:history="1" r:id="rIdxehyy3j8jj6w8uz6e8ead">
+      <w:hyperlink w:history="1" r:id="rIdlxjg-zhvfji77sg4xqb9n">
         <w:r>
           <w:rPr>
             <w:rStyle w:val="Hyperlink"/>
@@ -12071,7 +12269,7 @@
         </w:rPr>
         <w:t xml:space="preserve">Hipparcos Catalogue: </w:t>
       </w:r>
-      <w:hyperlink w:history="1" r:id="rIdl0yn5qn6uqfu9rcpbo9f0">
+      <w:hyperlink w:history="1" r:id="rIdwsbvyyku_t4vabkktacfa">
         <w:r>
           <w:rPr>
             <w:rStyle w:val="Hyperlink"/>
@@ -12091,7 +12289,7 @@
         </w:rPr>
         <w:t xml:space="preserve">US Patent 787412 (Tesla): </w:t>
       </w:r>
-      <w:hyperlink w:history="1" r:id="rIdaiv1xgi8k9wbhk5ckc3hc">
+      <w:hyperlink w:history="1" r:id="rIdtfdykqdediiwxxyrw7apm">
         <w:r>
           <w:rPr>
             <w:rStyle w:val="Hyperlink"/>
@@ -12111,7 +12309,7 @@
         </w:rPr>
         <w:t xml:space="preserve">NOAA Solar Position Algorithm: </w:t>
       </w:r>
-      <w:hyperlink w:history="1" r:id="rIdzdnpyuzmwsjddnia5rao5">
+      <w:hyperlink w:history="1" r:id="rIdbaz3ploq-sf8tkd_pmgw6">
         <w:r>
           <w:rPr>
             <w:rStyle w:val="Hyperlink"/>
@@ -12131,7 +12329,7 @@
         </w:rPr>
         <w:t xml:space="preserve">National Geodetic Survey Gravity: </w:t>
       </w:r>
-      <w:hyperlink w:history="1" r:id="rIdqpowqosrgtwoggoem5p4b">
+      <w:hyperlink w:history="1" r:id="rIddsl36aximnyiuqrid6_iv">
         <w:r>
           <w:rPr>
             <w:rStyle w:val="Hyperlink"/>
@@ -12151,7 +12349,7 @@
         </w:rPr>
         <w:t xml:space="preserve">CHIME/FRB Project: </w:t>
       </w:r>
-      <w:hyperlink w:history="1" r:id="rIdwmic9xjtgijr9lgot7kwx">
+      <w:hyperlink w:history="1" r:id="rIdrm2r3fhnbyp4quwchpz-u">
         <w:r>
           <w:rPr>
             <w:rStyle w:val="Hyperlink"/>
@@ -12171,7 +12369,7 @@
         </w:rPr>
         <w:t xml:space="preserve">GRACE-FO (gravity mapping): </w:t>
       </w:r>
-      <w:hyperlink w:history="1" r:id="rIdk-nbeu_rdgzo-xvnumfv7">
+      <w:hyperlink w:history="1" r:id="rIdwgsh4q4bslvisoucyaka4">
         <w:r>
           <w:rPr>
             <w:rStyle w:val="Hyperlink"/>
@@ -12191,7 +12389,7 @@
         </w:rPr>
         <w:t xml:space="preserve">GOCE (gravity field): </w:t>
       </w:r>
-      <w:hyperlink w:history="1" r:id="rIdhgo01vkik2v0i2nujfgt8">
+      <w:hyperlink w:history="1" r:id="rIdckbnszl-ehzjzpm_bp8a9">
         <w:r>
           <w:rPr>
             <w:rStyle w:val="Hyperlink"/>
@@ -12211,7 +12409,7 @@
         </w:rPr>
         <w:t xml:space="preserve">GPS.gov: </w:t>
       </w:r>
-      <w:hyperlink w:history="1" r:id="rIdyhbckcrlwne5agw4lzrni">
+      <w:hyperlink w:history="1" r:id="rId9sw_2hhx1e97tkmoqhldv">
         <w:r>
           <w:rPr>
             <w:rStyle w:val="Hyperlink"/>
@@ -12231,7 +12429,7 @@
         </w:rPr>
         <w:t xml:space="preserve">CelesTrak TLE Data: </w:t>
       </w:r>
-      <w:hyperlink w:history="1" r:id="rIdxhgwclewi_knnlhu12_m7">
+      <w:hyperlink w:history="1" r:id="rIdzzpyszhesqtlhiqph3rtc">
         <w:r>
           <w:rPr>
             <w:rStyle w:val="Hyperlink"/>
@@ -12362,6 +12560,30 @@
     </w:p>
     <w:p>
       <w:pPr>
+        <w:spacing w:after="120"/>
+      </w:pPr>
+      <w:r>
+        <w:t xml:space="preserve">Curto, J.J., et al. (2018). Statistical analysis of geomagnetic field variations during solar eclipses. Advances in Space Research.</w:t>
+      </w:r>
+    </w:p>
+    <w:p>
+      <w:pPr>
+        <w:spacing w:after="120"/>
+      </w:pPr>
+      <w:r>
+        <w:t xml:space="preserve">Barta, V., et al. (2017). Geomagnetic field variations observed by INTERMAGNET during 4 total solar eclipses. Journal of Atmospheric and Solar-Terrestrial Physics.</w:t>
+      </w:r>
+    </w:p>
+    <w:p>
+      <w:pPr>
+        <w:spacing w:after="120"/>
+      </w:pPr>
+      <w:r>
+        <w:t xml:space="preserve">Hvozdara, M., et al. (2024). Geomagnetic effect of the solar eclipse of April 8, 2024. Advances in Space Research.</w:t>
+      </w:r>
+    </w:p>
+    <w:p>
+      <w:pPr>
         <w:pStyle w:val="Heading2"/>
       </w:pPr>
       <w:r>
@@ -12425,7 +12647,7 @@
         <w:t xml:space="preserve">V4 (April 5, 2026): </w:t>
       </w:r>
       <w:r>
-        <w:t xml:space="preserve">Updated for V51.0 (67 WINs). Added version change analysis, 28 new WIN reviews, analysis of four new site pages (Live Power, Kill-Shot, Audit, Tracking), identified August 2026 eclipse as the only genuinely discriminating prediction, documented internal version contradictions.</w:t>
+        <w:t xml:space="preserve">Updated for V51.0 (67 WINs). Added version change analysis, 28 new WIN reviews, analysis of four new site pages (Live Power, Kill-Shot, Audit, Tracking). Eclipse analysis: dome's -17 to -21 nT prediction derived from scaling Chapman-mechanism data; globe prediction misrepresented as 0.0 nT when peer-reviewed literature shows 5-20 nT. Documented internal contradictions and prompt injection escalation.</w:t>
       </w:r>
     </w:p>
     <w:p>

</xml_diff>

<commit_message>
V4.4: Update Part 1 with full toroidal architecture description
Sections 1.1 and 1.2 now describe the V51.0 model accurately: the
Closed Toroidal Ovoid with dual-plate cavity, sub-terrestrial return
path, ring magnet topology, and key equations (H(r), Sub-H(r), B(r),
κ coupling constant). Part 1 heading updated to "Ovoid Cavity
Cosmological Model." Section 1.2 notes this is the first flat-earth
model to attempt a closed electromagnetic circuit for dipole field.

Co-Authored-By: Claude Opus 4.6 <noreply@anthropic.com>
</commit_message>
<xml_diff>
--- a/downloads/critical-review-dome-model-v4.docx
+++ b/downloads/critical-review-dome-model-v4.docx
@@ -254,7 +254,15 @@
         <w:spacing w:after="120"/>
       </w:pPr>
       <w:r>
-        <w:t xml:space="preserve">The Ovoid Cavity Cosmological Model (formerly the Dome Cosmological Model), as presented at john09289.github.io/predictions (Version 51.0, April 2026), proposes a physical cosmology in which the Earth is a flat, elliptical disc enclosed by a conductive metal dome (the firmament) forming a 'Closed Toroidal Ovoid' cavity. It posits a local sun and moon traveling circuits above the disc, an aetheric medium filling the space between disc and dome, and Polaris fixed directly above the north pole at the dome apex. The model draws on a combination of geomagnetic data, electromagnetic resonance measurements, biblical texts, tidal constituent periods, cosmological observations, and proprietary coordinate formulas to claim 67 confirmed predictions and zero falsifications. The site has expanded significantly since V50.6 (March 2026), adding new pages (Live Power dashboard, Kill-Shot tests, Audit walkthrough, Tracking logs) and nearly doubling the WIN count from 39 to 67.</w:t>
+        <w:t xml:space="preserve">The Ovoid Cavity Cosmological Model (formerly the Dome Cosmological Model), as presented at john09289.github.io/predictions (Version 51.0, April 2026), proposes a physical cosmology in which the Earth is a flat, elliptical disc enclosed within a 'Closed Toroidal Ovoid' cavity. The upper boundary is a conductive metal firmament (cast copper/bronze); the lower boundary is a 'Bottom Firmament' or 'Sump.' An aetheric medium circulates through the full cavity in a toroidal loop: exiting the Axis Mundi at the north pole, flowing south across the disc surface, descending at the Antarctic resonance barrier (ice wall, r ≈ 20,015 km), returning through a sub-terrestrial path, and re-entering at the north pole. This circulation is topologically identical to a ring magnet. The model posits a local sun and moon traveling circuits inside the upper cavity, and Polaris fixed directly above the north pole at the dome apex. It draws on a combination of geomagnetic data, electromagnetic resonance measurements, biblical texts, tidal constituent periods, cosmological observations, and proprietary coordinate formulas to claim 67 confirmed predictions and zero falsifications. The site has expanded significantly since V50.6 (March 2026), adding new pages (Live Power dashboard, Kill-Shot tests, Audit walkthrough, Tracking logs) and nearly doubling the WIN count from 39 to 67.</w:t>
+      </w:r>
+    </w:p>
+    <w:p>
+      <w:pPr>
+        <w:spacing w:after="120"/>
+      </w:pPr>
+      <w:r>
+        <w:t xml:space="preserve">Key architectural parameters: Firmament height H(r) = 8,537 × exp(−r/8,619) km (exponential decay from pole apex). Subterranean cavity depth Sub-H(r) = H(r) × (1 − exp(−r/6,371)). Two-pole geomagnetic field B(r) = 62,376×exp(−r_N/8,619) + 64,852×exp(−r_S/8,619) nT. Disc semi-major axis ~20,015 km, semi-minor ~15,000 km (elliptical). Coupling constant κ = 1.67 nT/µGal (claimed electromagnetic-gravity link). The model claims this geometry produces Earth's dipole field, Schumann resonances, and geomagnetic secular variation from a single set of parameters.</w:t>
       </w:r>
     </w:p>
     <w:p>
@@ -270,7 +278,7 @@
         <w:spacing w:after="120"/>
       </w:pPr>
       <w:r>
-        <w:t xml:space="preserve">While the model shares the flat-earth premise of a disc-shaped Earth, it diverges from classic flat earth models in several important ways. Classic flat earth models typically use a simple circular disc with the North Pole at center, a constant-height dome or no dome at all, and rely primarily on visual arguments. This model introduces significantly more mathematical apparatus: an elliptical disc shape, a firmament height that varies as H(r) = 8537 * exp(-r/8619) km, a quadratic southern distance law, a formal coordinate system with longitude-based angular scaling, and quantitative predictions tested against real geomagnetic datasets. V51.0 now describes the geometry as a 'Closed Toroidal Ovoid' inspired by Hildegard of Bingen's 1151 AD egg-shaped cosmos, with Finsler geometry corrections (eccentricity 0.66) for southern hemisphere distances.</w:t>
+        <w:t xml:space="preserve">While the model shares the flat-earth premise of a disc-shaped Earth, it diverges from classic flat earth models in several important ways. Classic flat earth models typically use a simple circular disc with the North Pole at center, a constant-height dome or no dome at all, and rely primarily on visual arguments. This model introduces significantly more mathematical apparatus: an elliptical disc shape, an exponentially varying firmament height, a quadratic southern distance law, a formal coordinate system with longitude-based angular scaling, and quantitative predictions tested against real geomagnetic datasets. Critically, V51.0 introduces a dual-plate toroidal cavity with a sub-terrestrial return path — no classic flat earth model attempts a closed electromagnetic circuit. The geometry is inspired by Hildegard of Bingen's 1151 AD egg-shaped cosmos (Scivias), with Finsler geometry corrections (eccentricity 0.66) for southern hemisphere distances. The toroidal architecture is the model's attempt to explain why Earth has two magnetic poles, a problem no previous flat earth model has addressed.</w:t>
       </w:r>
     </w:p>
     <w:p>
@@ -8851,7 +8859,7 @@
       <w:r>
         <w:t xml:space="preserve">US Patent 787412 (1905), publicly available at </w:t>
       </w:r>
-      <w:hyperlink w:history="1" r:id="rIdkaqj_m-mhvbbzy-jhl5dn">
+      <w:hyperlink w:history="1" r:id="rIdcryukyrjlu5ogdufcrny6">
         <w:r>
           <w:rPr>
             <w:rStyle w:val="Hyperlink"/>
@@ -8976,7 +8984,7 @@
       <w:r>
         <w:t xml:space="preserve">James Bradley (1727) explicitly tested and rejected atmospheric refraction as an explanation: refraction is wavelength-dependent (chromatic), while stellar aberration is achromatic. Modern VLBI measurements achieve milliarcsecond precision and directly confirm aberration correlates with Earth's orbital velocity (~30 km/s). The </w:t>
       </w:r>
-      <w:hyperlink w:history="1" r:id="rIdxkp8lowpaggric3osmur9">
+      <w:hyperlink w:history="1" r:id="rIdhronzf-wxim20ee1xjx_k">
         <w:r>
           <w:rPr>
             <w:rStyle w:val="Hyperlink"/>
@@ -9042,7 +9050,7 @@
       <w:r>
         <w:t xml:space="preserve">ESA </w:t>
       </w:r>
-      <w:hyperlink w:history="1" r:id="rIdquw9mqdjrvftatmnoltfb">
+      <w:hyperlink w:history="1" r:id="rIdtxoorkqjhx1duhn33kdtm">
         <w:r>
           <w:rPr>
             <w:rStyle w:val="Hyperlink"/>
@@ -9108,7 +9116,7 @@
       <w:r>
         <w:t xml:space="preserve">Crepuscular rays are parallel beams made visible by atmospheric scattering. The apparent divergence is a perspective effect. Crucially, anticrepuscular rays converge at the anti-solar point simultaneously. See </w:t>
       </w:r>
-      <w:hyperlink w:history="1" r:id="rId2syaxorztggdafnnuydib">
+      <w:hyperlink w:history="1" r:id="rIda6a9i439j2zfifpnzsscs">
         <w:r>
           <w:rPr>
             <w:rStyle w:val="Hyperlink"/>
@@ -9119,7 +9127,7 @@
       <w:r>
         <w:t xml:space="preserve"> and </w:t>
       </w:r>
-      <w:hyperlink w:history="1" r:id="rIdd5g6swwpuje6o9hc6sdnr">
+      <w:hyperlink w:history="1" r:id="rIdlz2tcgriopuorknzc5xzw">
         <w:r>
           <w:rPr>
             <w:rStyle w:val="Hyperlink"/>
@@ -9185,7 +9193,7 @@
       <w:r>
         <w:t xml:space="preserve">NOAA officially states no evidence of anomalous disappearances. </w:t>
       </w:r>
-      <w:hyperlink w:history="1" r:id="rIdwnsvwrihwveoo6-axwt3z">
+      <w:hyperlink w:history="1" r:id="rIdhlabknsd54_6c5wbkztwh">
         <w:r>
           <w:rPr>
             <w:rStyle w:val="Hyperlink"/>
@@ -9251,7 +9259,7 @@
       <w:r>
         <w:t xml:space="preserve">Hipparcos </w:t>
       </w:r>
-      <w:hyperlink w:history="1" r:id="rIdmunapvgavztgpj2a9k0ih">
+      <w:hyperlink w:history="1" r:id="rIdxrijt8_uzfxpltkv0-mnv">
         <w:r>
           <w:rPr>
             <w:rStyle w:val="Hyperlink"/>
@@ -9667,7 +9675,7 @@
       <w:r>
         <w:t xml:space="preserve">Terra-Nova et al. (2017, PNAS) demonstrate reversed-flux patches reproduce SAA splitting in MHD simulations. The </w:t>
       </w:r>
-      <w:hyperlink w:history="1" r:id="rId7sjctncbjvsodnhyqnxsu">
+      <w:hyperlink w:history="1" r:id="rIdl3jkdxr_9zw5auro9kti6">
         <w:r>
           <w:rPr>
             <w:rStyle w:val="Hyperlink"/>
@@ -9678,7 +9686,7 @@
       <w:r>
         <w:t xml:space="preserve"> documents the evolution quantitatively. </w:t>
       </w:r>
-      <w:hyperlink w:history="1" r:id="rIdsad-aq1wq4fhmdepgatox">
+      <w:hyperlink w:history="1" r:id="rIdinrto3_utlha83eapsd4h">
         <w:r>
           <w:rPr>
             <w:rStyle w:val="Hyperlink"/>
@@ -9729,7 +9737,7 @@
       <w:r>
         <w:t xml:space="preserve">Normal secular variation documented by </w:t>
       </w:r>
-      <w:hyperlink w:history="1" r:id="rIdlpqlnqeidpbmzpyzuzwyf">
+      <w:hyperlink w:history="1" r:id="rId2n7zp-8fl_b_ast022sog">
         <w:r>
           <w:rPr>
             <w:rStyle w:val="Hyperlink"/>
@@ -9796,7 +9804,7 @@
       <w:r>
         <w:t xml:space="preserve">Eclipse-induced perturbations predicted by Chapman (1933) via ionospheric conductivity drops. Data from </w:t>
       </w:r>
-      <w:hyperlink w:history="1" r:id="rIdenrw0ez0l6wov7sihanif">
+      <w:hyperlink w:history="1" r:id="rIdthemjs7-1old8bdgpmrus">
         <w:r>
           <w:rPr>
             <w:rStyle w:val="Hyperlink"/>
@@ -9884,7 +9892,7 @@
       <w:r>
         <w:t xml:space="preserve">The formula used is for a quarter-wave linear waveguide, not a spherical cavity. Correct formula f = c/(2*pi*R) gives R = 6,098 km, within 4% of Earth's radius. The ionosphere IS conductive (</w:t>
       </w:r>
-      <w:hyperlink w:history="1" r:id="rIdlh6z--mucz8b_xzxdnkme">
+      <w:hyperlink w:history="1" r:id="rIdtsve3c-fiv3gsk_uwhcjo">
         <w:r>
           <w:rPr>
             <w:rStyle w:val="Hyperlink"/>
@@ -9951,7 +9959,7 @@
       <w:r>
         <w:t xml:space="preserve">All five observations already predicted by </w:t>
       </w:r>
-      <w:hyperlink w:history="1" r:id="rIdwq-rzwscynwtoxychg6qp">
+      <w:hyperlink w:history="1" r:id="rIdylcut0yolwh6ahhjev6wu">
         <w:r>
           <w:rPr>
             <w:rStyle w:val="Hyperlink"/>
@@ -9962,7 +9970,7 @@
       <w:r>
         <w:t xml:space="preserve">, </w:t>
       </w:r>
-      <w:hyperlink w:history="1" r:id="rIdu2qgyytm4ktpavy6dcb1q">
+      <w:hyperlink w:history="1" r:id="rIdursnrqzjehqsy_kwbppj2">
         <w:r>
           <w:rPr>
             <w:rStyle w:val="Hyperlink"/>
@@ -10289,7 +10297,7 @@
       <w:r>
         <w:t xml:space="preserve">Antarctic gravity anomalies are mapped from orbit by </w:t>
       </w:r>
-      <w:hyperlink w:history="1" r:id="rIdnni7r3sj7d5-pxfojx6kv">
+      <w:hyperlink w:history="1" r:id="rIdot0-ojp0rqksohzbqoggg">
         <w:r>
           <w:rPr>
             <w:rStyle w:val="Hyperlink"/>
@@ -10300,7 +10308,7 @@
       <w:r>
         <w:t xml:space="preserve"> and </w:t>
       </w:r>
-      <w:hyperlink w:history="1" r:id="rIdbdypr22mw_2r14a-u-ibb">
+      <w:hyperlink w:history="1" r:id="rIdrbei8tyefobn8geg5xpyc">
         <w:r>
           <w:rPr>
             <w:rStyle w:val="Hyperlink"/>
@@ -11089,7 +11097,7 @@
       <w:r>
         <w:t xml:space="preserve">A </w:t>
       </w:r>
-      <w:hyperlink w:history="1" r:id="rIdai0re1bgj0h3nfqiwoghk">
+      <w:hyperlink w:history="1" r:id="rIdhw3icdqstl3ufdptyohes">
         <w:r>
           <w:rPr>
             <w:rStyle w:val="Hyperlink"/>
@@ -11100,7 +11108,7 @@
       <w:r>
         <w:t xml:space="preserve"> found detectable decreases in X, Z, and total field components during eclipses. An </w:t>
       </w:r>
-      <w:hyperlink w:history="1" r:id="rId4tabknl3x_lltifxdf4ef">
+      <w:hyperlink w:history="1" r:id="rIdg2lxwtjg_t_cqy-joo_f1">
         <w:r>
           <w:rPr>
             <w:rStyle w:val="Hyperlink"/>
@@ -11590,7 +11598,7 @@
       <w:r>
         <w:t xml:space="preserve">Continuous 24-hour sunlight. A local sun at 5,733 km circling above a flat disc cannot produce 24-hour sunlight at the disc edge. Directly observable at Amundsen-Scott Station, staffed year-round since 1957. See </w:t>
       </w:r>
-      <w:hyperlink w:history="1" r:id="rIdyrc4dj3fwgoieg7txzloz">
+      <w:hyperlink w:history="1" r:id="rId7l7hvegn4atyzqli6e9hi">
         <w:r>
           <w:rPr>
             <w:rStyle w:val="Hyperlink"/>
@@ -11639,7 +11647,7 @@
       <w:r>
         <w:t xml:space="preserve">GPS provides 1-3 meter accuracy worldwide. The ISS at 408 km is visible on predictable schedules. Geostationary satellites at 35,786 km. All require unobstructed radio paths. See </w:t>
       </w:r>
-      <w:hyperlink w:history="1" r:id="rIdbggphw-iafvhq2gltifv7">
+      <w:hyperlink w:history="1" r:id="rIdft4hz9dag-u1zy6bthiuq">
         <w:r>
           <w:rPr>
             <w:rStyle w:val="Hyperlink"/>
@@ -11650,7 +11658,7 @@
       <w:r>
         <w:t xml:space="preserve">; </w:t>
       </w:r>
-      <w:hyperlink w:history="1" r:id="rIdteiybfpyrrxnlij3zdoct">
+      <w:hyperlink w:history="1" r:id="rIdi-_k0iha4ujqssxyugtr3">
         <w:r>
           <w:rPr>
             <w:rStyle w:val="Hyperlink"/>
@@ -11699,7 +11707,7 @@
       <w:r>
         <w:t xml:space="preserve">Modern solar calculators (</w:t>
       </w:r>
-      <w:hyperlink w:history="1" r:id="rId34yimeq5pu2zkqyokitpw">
+      <w:hyperlink w:history="1" r:id="rId8fjx1hzqs8ijhxycg3n2d">
         <w:r>
           <w:rPr>
             <w:rStyle w:val="Hyperlink"/>
@@ -11748,7 +11756,7 @@
       <w:r>
         <w:t xml:space="preserve">The </w:t>
       </w:r>
-      <w:hyperlink w:history="1" r:id="rId4zzloe2xax-gyxwzmcxgv">
+      <w:hyperlink w:history="1" r:id="rId20f0evrsts4mtkmflzo5e">
         <w:r>
           <w:rPr>
             <w:rStyle w:val="Hyperlink"/>
@@ -11797,7 +11805,7 @@
       <w:r>
         <w:t xml:space="preserve">Earth's field is a dipole. South magnetic pole at 64.1°S, 135.9°E (</w:t>
       </w:r>
-      <w:hyperlink w:history="1" r:id="rIdarcjwfc37yxkitl4fwo6c">
+      <w:hyperlink w:history="1" r:id="rIdfdstp_7w1xasiivwz7m5y">
         <w:r>
           <w:rPr>
             <w:rStyle w:val="Hyperlink"/>
@@ -11846,7 +11854,7 @@
       <w:r>
         <w:t xml:space="preserve">g = 9.780 m/s² at equator, 9.832 m/s² at poles (0.53% variation). On a flat disc, centrifugal force points outward from center, producing the OPPOSITE pattern. See </w:t>
       </w:r>
-      <w:hyperlink w:history="1" r:id="rIdctvcgakew-7pyfxfz27mm">
+      <w:hyperlink w:history="1" r:id="rIdd4h1fenw0srviillhzmmq">
         <w:r>
           <w:rPr>
             <w:rStyle w:val="Hyperlink"/>
@@ -12313,7 +12321,7 @@
         </w:rPr>
         <w:t xml:space="preserve">NOAA World Magnetic Model 2025: </w:t>
       </w:r>
-      <w:hyperlink w:history="1" r:id="rIdp7ldr0eax168x0hjerleb">
+      <w:hyperlink w:history="1" r:id="rIdwq7cf3uqskfybukfkcxpl">
         <w:r>
           <w:rPr>
             <w:rStyle w:val="Hyperlink"/>
@@ -12333,7 +12341,7 @@
         </w:rPr>
         <w:t xml:space="preserve">NOAA Wandering Geomagnetic Poles: </w:t>
       </w:r>
-      <w:hyperlink w:history="1" r:id="rIdhlkznmsu7bbbffwo40ttp">
+      <w:hyperlink w:history="1" r:id="rIdvkivppuf37f2glukbiwo0">
         <w:r>
           <w:rPr>
             <w:rStyle w:val="Hyperlink"/>
@@ -12353,7 +12361,7 @@
         </w:rPr>
         <w:t xml:space="preserve">CHAOS-7 Geomagnetic Field Model: </w:t>
       </w:r>
-      <w:hyperlink w:history="1" r:id="rIdcgy-rgcfd3xh3c9niw65y">
+      <w:hyperlink w:history="1" r:id="rIdw7i-0u8gs2c2lg5lf_nfs">
         <w:r>
           <w:rPr>
             <w:rStyle w:val="Hyperlink"/>
@@ -12373,7 +12381,7 @@
         </w:rPr>
         <w:t xml:space="preserve">ESA Swarm Satellite Mission: </w:t>
       </w:r>
-      <w:hyperlink w:history="1" r:id="rIdrpuflfl-2zmrrmpjx5w7s">
+      <w:hyperlink w:history="1" r:id="rIdagf8cfgsdntlsrysrbgmr">
         <w:r>
           <w:rPr>
             <w:rStyle w:val="Hyperlink"/>
@@ -12393,7 +12401,7 @@
         </w:rPr>
         <w:t xml:space="preserve">INTERMAGNET Observatory Network: </w:t>
       </w:r>
-      <w:hyperlink w:history="1" r:id="rId7vh76bdiywsrdg-anjdlb">
+      <w:hyperlink w:history="1" r:id="rId24rcxu55ucvangligimtf">
         <w:r>
           <w:rPr>
             <w:rStyle w:val="Hyperlink"/>
@@ -12413,7 +12421,7 @@
         </w:rPr>
         <w:t xml:space="preserve">IGRF-13: </w:t>
       </w:r>
-      <w:hyperlink w:history="1" r:id="rIdtkqxzeovs2jkkpp0weqgw">
+      <w:hyperlink w:history="1" r:id="rIdmsawlqy9xg7ttq-97ndpq">
         <w:r>
           <w:rPr>
             <w:rStyle w:val="Hyperlink"/>
@@ -12433,7 +12441,7 @@
         </w:rPr>
         <w:t xml:space="preserve">ESA Gaia Data Release 3: </w:t>
       </w:r>
-      <w:hyperlink w:history="1" r:id="rId172yzy-x89manzfmpvrzm">
+      <w:hyperlink w:history="1" r:id="rIddefam7wmn25swtqld2r9l">
         <w:r>
           <w:rPr>
             <w:rStyle w:val="Hyperlink"/>
@@ -12453,7 +12461,7 @@
         </w:rPr>
         <w:t xml:space="preserve">Hipparcos Catalogue: </w:t>
       </w:r>
-      <w:hyperlink w:history="1" r:id="rIdvmhapaotk7-aikb8h1hoz">
+      <w:hyperlink w:history="1" r:id="rId92m_5h9n3tpayxvfbhoyn">
         <w:r>
           <w:rPr>
             <w:rStyle w:val="Hyperlink"/>
@@ -12473,7 +12481,7 @@
         </w:rPr>
         <w:t xml:space="preserve">US Patent 787412 (Tesla): </w:t>
       </w:r>
-      <w:hyperlink w:history="1" r:id="rId-ucbtps9zgrcttdmvbdny">
+      <w:hyperlink w:history="1" r:id="rIdwppatdxaf2yyqptvkjpua">
         <w:r>
           <w:rPr>
             <w:rStyle w:val="Hyperlink"/>
@@ -12493,7 +12501,7 @@
         </w:rPr>
         <w:t xml:space="preserve">NOAA Solar Position Algorithm: </w:t>
       </w:r>
-      <w:hyperlink w:history="1" r:id="rIdlug_owiqedkon89vnblp5">
+      <w:hyperlink w:history="1" r:id="rIdann0keqsmvybc2qhqnnta">
         <w:r>
           <w:rPr>
             <w:rStyle w:val="Hyperlink"/>
@@ -12513,7 +12521,7 @@
         </w:rPr>
         <w:t xml:space="preserve">National Geodetic Survey Gravity: </w:t>
       </w:r>
-      <w:hyperlink w:history="1" r:id="rIdqj8ktxo4ja5efxqi4bsiw">
+      <w:hyperlink w:history="1" r:id="rIdbcp62cwy2nssqjji_sr-h">
         <w:r>
           <w:rPr>
             <w:rStyle w:val="Hyperlink"/>
@@ -12533,7 +12541,7 @@
         </w:rPr>
         <w:t xml:space="preserve">CHIME/FRB Project: </w:t>
       </w:r>
-      <w:hyperlink w:history="1" r:id="rIdbpinqkskeumhlca42rqjn">
+      <w:hyperlink w:history="1" r:id="rIdughjtfn_1ez-f03eshjjn">
         <w:r>
           <w:rPr>
             <w:rStyle w:val="Hyperlink"/>
@@ -12553,7 +12561,7 @@
         </w:rPr>
         <w:t xml:space="preserve">GRACE-FO (gravity mapping): </w:t>
       </w:r>
-      <w:hyperlink w:history="1" r:id="rIdelplxpvuhkx4msi7imx-b">
+      <w:hyperlink w:history="1" r:id="rIde2ugbtcyhp2ch1khqy1tg">
         <w:r>
           <w:rPr>
             <w:rStyle w:val="Hyperlink"/>
@@ -12573,7 +12581,7 @@
         </w:rPr>
         <w:t xml:space="preserve">GOCE (gravity field): </w:t>
       </w:r>
-      <w:hyperlink w:history="1" r:id="rId_s4kopnpiw5odppfpsz2g">
+      <w:hyperlink w:history="1" r:id="rIdneynunq125xjr1fevuouz">
         <w:r>
           <w:rPr>
             <w:rStyle w:val="Hyperlink"/>
@@ -12593,7 +12601,7 @@
         </w:rPr>
         <w:t xml:space="preserve">GPS.gov: </w:t>
       </w:r>
-      <w:hyperlink w:history="1" r:id="rIdjh9l-q7q3wa_3puiwzckd">
+      <w:hyperlink w:history="1" r:id="rIdmqxbpxootcvzv_jg6jol7">
         <w:r>
           <w:rPr>
             <w:rStyle w:val="Hyperlink"/>
@@ -12613,7 +12621,7 @@
         </w:rPr>
         <w:t xml:space="preserve">CelesTrak TLE Data: </w:t>
       </w:r>
-      <w:hyperlink w:history="1" r:id="rIdf8nv8uikbajt1c4wkwq8z">
+      <w:hyperlink w:history="1" r:id="rIddjuismfmu4cto7waf9fa5">
         <w:r>
           <w:rPr>
             <w:rStyle w:val="Hyperlink"/>

</xml_diff>

<commit_message>
V4.5: Add corrected 20-domain independence analysis table
All 20 Live Power domains classified into three groups: Group A (14
domains sharing λg=8619 km — one curve fit, not 14 independent tests),
Group B (3 trivially confirmable known constants), Group C (3 testable
but problematic). Zero of 20 domains produce a result the globe model
disagrees with that the dome model uniquely explains. Includes
"ruler-in-30-rooms" analogy for the shared-constant problem.

Co-Authored-By: Claude Opus 4.6 <noreply@anthropic.com>
</commit_message>
<xml_diff>
--- a/downloads/critical-review-dome-model-v4.docx
+++ b/downloads/critical-review-dome-model-v4.docx
@@ -8859,7 +8859,7 @@
       <w:r>
         <w:t xml:space="preserve">US Patent 787412 (1905), publicly available at </w:t>
       </w:r>
-      <w:hyperlink w:history="1" r:id="rIdcryukyrjlu5ogdufcrny6">
+      <w:hyperlink w:history="1" r:id="rIdjkfo3v0e1rtazdt_m_fig">
         <w:r>
           <w:rPr>
             <w:rStyle w:val="Hyperlink"/>
@@ -8984,7 +8984,7 @@
       <w:r>
         <w:t xml:space="preserve">James Bradley (1727) explicitly tested and rejected atmospheric refraction as an explanation: refraction is wavelength-dependent (chromatic), while stellar aberration is achromatic. Modern VLBI measurements achieve milliarcsecond precision and directly confirm aberration correlates with Earth's orbital velocity (~30 km/s). The </w:t>
       </w:r>
-      <w:hyperlink w:history="1" r:id="rIdhronzf-wxim20ee1xjx_k">
+      <w:hyperlink w:history="1" r:id="rIdhigjlhzwyzu0z4rxzkrlo">
         <w:r>
           <w:rPr>
             <w:rStyle w:val="Hyperlink"/>
@@ -9050,7 +9050,7 @@
       <w:r>
         <w:t xml:space="preserve">ESA </w:t>
       </w:r>
-      <w:hyperlink w:history="1" r:id="rIdtxoorkqjhx1duhn33kdtm">
+      <w:hyperlink w:history="1" r:id="rIdbtvhojuklxnhwoz3sspjw">
         <w:r>
           <w:rPr>
             <w:rStyle w:val="Hyperlink"/>
@@ -9116,7 +9116,7 @@
       <w:r>
         <w:t xml:space="preserve">Crepuscular rays are parallel beams made visible by atmospheric scattering. The apparent divergence is a perspective effect. Crucially, anticrepuscular rays converge at the anti-solar point simultaneously. See </w:t>
       </w:r>
-      <w:hyperlink w:history="1" r:id="rIda6a9i439j2zfifpnzsscs">
+      <w:hyperlink w:history="1" r:id="rIdt-pftcutimzsn1f_m1uur">
         <w:r>
           <w:rPr>
             <w:rStyle w:val="Hyperlink"/>
@@ -9127,7 +9127,7 @@
       <w:r>
         <w:t xml:space="preserve"> and </w:t>
       </w:r>
-      <w:hyperlink w:history="1" r:id="rIdlz2tcgriopuorknzc5xzw">
+      <w:hyperlink w:history="1" r:id="rIdn8xtkprl7a8j9rc2syc32">
         <w:r>
           <w:rPr>
             <w:rStyle w:val="Hyperlink"/>
@@ -9193,7 +9193,7 @@
       <w:r>
         <w:t xml:space="preserve">NOAA officially states no evidence of anomalous disappearances. </w:t>
       </w:r>
-      <w:hyperlink w:history="1" r:id="rIdhlabknsd54_6c5wbkztwh">
+      <w:hyperlink w:history="1" r:id="rIdfe0jw4kx4gb9qwh58naxr">
         <w:r>
           <w:rPr>
             <w:rStyle w:val="Hyperlink"/>
@@ -9259,7 +9259,7 @@
       <w:r>
         <w:t xml:space="preserve">Hipparcos </w:t>
       </w:r>
-      <w:hyperlink w:history="1" r:id="rIdxrijt8_uzfxpltkv0-mnv">
+      <w:hyperlink w:history="1" r:id="rIdxb4qwlzpbkxawp-xr6pim">
         <w:r>
           <w:rPr>
             <w:rStyle w:val="Hyperlink"/>
@@ -9675,7 +9675,7 @@
       <w:r>
         <w:t xml:space="preserve">Terra-Nova et al. (2017, PNAS) demonstrate reversed-flux patches reproduce SAA splitting in MHD simulations. The </w:t>
       </w:r>
-      <w:hyperlink w:history="1" r:id="rIdl3jkdxr_9zw5auro9kti6">
+      <w:hyperlink w:history="1" r:id="rIdig-ckoe4gymihqltmvpfe">
         <w:r>
           <w:rPr>
             <w:rStyle w:val="Hyperlink"/>
@@ -9686,7 +9686,7 @@
       <w:r>
         <w:t xml:space="preserve"> documents the evolution quantitatively. </w:t>
       </w:r>
-      <w:hyperlink w:history="1" r:id="rIdinrto3_utlha83eapsd4h">
+      <w:hyperlink w:history="1" r:id="rIdbzdn4yccjg91ima0iqnbe">
         <w:r>
           <w:rPr>
             <w:rStyle w:val="Hyperlink"/>
@@ -9737,7 +9737,7 @@
       <w:r>
         <w:t xml:space="preserve">Normal secular variation documented by </w:t>
       </w:r>
-      <w:hyperlink w:history="1" r:id="rId2n7zp-8fl_b_ast022sog">
+      <w:hyperlink w:history="1" r:id="rIdlh-vlxeij6htpbvb_7ixw">
         <w:r>
           <w:rPr>
             <w:rStyle w:val="Hyperlink"/>
@@ -9804,7 +9804,7 @@
       <w:r>
         <w:t xml:space="preserve">Eclipse-induced perturbations predicted by Chapman (1933) via ionospheric conductivity drops. Data from </w:t>
       </w:r>
-      <w:hyperlink w:history="1" r:id="rIdthemjs7-1old8bdgpmrus">
+      <w:hyperlink w:history="1" r:id="rIdik4qsiyodc0hlwgt4uj0q">
         <w:r>
           <w:rPr>
             <w:rStyle w:val="Hyperlink"/>
@@ -9892,7 +9892,7 @@
       <w:r>
         <w:t xml:space="preserve">The formula used is for a quarter-wave linear waveguide, not a spherical cavity. Correct formula f = c/(2*pi*R) gives R = 6,098 km, within 4% of Earth's radius. The ionosphere IS conductive (</w:t>
       </w:r>
-      <w:hyperlink w:history="1" r:id="rIdtsve3c-fiv3gsk_uwhcjo">
+      <w:hyperlink w:history="1" r:id="rIdg-iihly7nsemyqr80ve9y">
         <w:r>
           <w:rPr>
             <w:rStyle w:val="Hyperlink"/>
@@ -9959,7 +9959,7 @@
       <w:r>
         <w:t xml:space="preserve">All five observations already predicted by </w:t>
       </w:r>
-      <w:hyperlink w:history="1" r:id="rIdylcut0yolwh6ahhjev6wu">
+      <w:hyperlink w:history="1" r:id="rId0yirsacp4pzz4v9btb7qr">
         <w:r>
           <w:rPr>
             <w:rStyle w:val="Hyperlink"/>
@@ -9970,7 +9970,7 @@
       <w:r>
         <w:t xml:space="preserve">, </w:t>
       </w:r>
-      <w:hyperlink w:history="1" r:id="rIdursnrqzjehqsy_kwbppj2">
+      <w:hyperlink w:history="1" r:id="rIdc6gcogvpmgvd1if4pj4_a">
         <w:r>
           <w:rPr>
             <w:rStyle w:val="Hyperlink"/>
@@ -10297,7 +10297,7 @@
       <w:r>
         <w:t xml:space="preserve">Antarctic gravity anomalies are mapped from orbit by </w:t>
       </w:r>
-      <w:hyperlink w:history="1" r:id="rIdot0-ojp0rqksohzbqoggg">
+      <w:hyperlink w:history="1" r:id="rIdmnmnfaw4jierdkyph_gvo">
         <w:r>
           <w:rPr>
             <w:rStyle w:val="Hyperlink"/>
@@ -10308,7 +10308,7 @@
       <w:r>
         <w:t xml:space="preserve"> and </w:t>
       </w:r>
-      <w:hyperlink w:history="1" r:id="rIdrbei8tyefobn8geg5xpyc">
+      <w:hyperlink w:history="1" r:id="rIdvyvoc-am3pi6k0alnijzy">
         <w:r>
           <w:rPr>
             <w:rStyle w:val="Hyperlink"/>
@@ -11035,6 +11035,2193 @@
         <w:pStyle w:val="Heading3"/>
       </w:pPr>
       <w:r>
+        <w:t xml:space="preserve">Corrected 20-Domain Analysis: The Independence Problem</w:t>
+      </w:r>
+    </w:p>
+    <w:p>
+      <w:pPr>
+        <w:spacing w:after="120"/>
+      </w:pPr>
+      <w:r>
+        <w:t xml:space="preserve">The site claims 9.2-sigma convergence across '20 independent domains' with 'locked constants derived from first principles.' Below, all 20 domains are classified by their actual constant dependencies, showing that the claimed independence is illusory.</w:t>
+      </w:r>
+    </w:p>
+    <w:p>
+      <w:pPr>
+        <w:spacing w:after="120"/>
+      </w:pPr>
+      <w:r>
+        <w:rPr>
+          <w:b/>
+          <w:bCs/>
+        </w:rPr>
+        <w:t xml:space="preserve">GROUP A — λg = 8,619 km Dependent (14 of 20 domains): </w:t>
+      </w:r>
+      <w:r>
+        <w:t xml:space="preserve">These 14 domains all share the fitted scale constant λg = 8,619 km and/or H₀ = 8,537 km. They are not statistically independent of each other.</w:t>
+      </w:r>
+    </w:p>
+    <w:tbl>
+      <w:tblPr>
+        <w:tblW w:type="dxa" w:w="9360"/>
+        <w:tblBorders>
+          <w:top w:val="single" w:color="auto" w:sz="4"/>
+          <w:left w:val="single" w:color="auto" w:sz="4"/>
+          <w:bottom w:val="single" w:color="auto" w:sz="4"/>
+          <w:right w:val="single" w:color="auto" w:sz="4"/>
+          <w:insideH w:val="single" w:color="auto" w:sz="4"/>
+          <w:insideV w:val="single" w:color="auto" w:sz="4"/>
+        </w:tblBorders>
+      </w:tblPr>
+      <w:tblGrid>
+        <w:gridCol w:w="500"/>
+        <w:gridCol w:w="2200"/>
+        <w:gridCol w:w="1200"/>
+        <w:gridCol w:w="1800"/>
+        <w:gridCol w:w="3660"/>
+      </w:tblGrid>
+      <w:tr>
+        <w:tc>
+          <w:tcPr>
+            <w:tcW w:type="dxa" w:w="500"/>
+            <w:tcBorders>
+              <w:top w:val="single" w:color="CCCCCC" w:sz="1"/>
+              <w:left w:val="single" w:color="CCCCCC" w:sz="1"/>
+              <w:bottom w:val="single" w:color="CCCCCC" w:sz="1"/>
+              <w:right w:val="single" w:color="CCCCCC" w:sz="1"/>
+            </w:tcBorders>
+            <w:shd w:fill="2E4057" w:val="clear"/>
+            <w:tcMar>
+              <w:top w:type="dxa" w:w="80"/>
+              <w:left w:type="dxa" w:w="120"/>
+              <w:bottom w:type="dxa" w:w="80"/>
+              <w:right w:type="dxa" w:w="120"/>
+            </w:tcMar>
+          </w:tcPr>
+          <w:p>
+            <w:r>
+              <w:rPr>
+                <w:rFonts w:ascii="Arial" w:cs="Arial" w:eastAsia="Arial" w:hAnsi="Arial"/>
+                <w:b/>
+                <w:bCs/>
+                <w:color w:val="FFFFFF"/>
+                <w:sz w:val="18"/>
+                <w:szCs w:val="18"/>
+              </w:rPr>
+              <w:t xml:space="preserve">#</w:t>
+            </w:r>
+          </w:p>
+        </w:tc>
+        <w:tc>
+          <w:tcPr>
+            <w:tcW w:type="dxa" w:w="2200"/>
+            <w:tcBorders>
+              <w:top w:val="single" w:color="CCCCCC" w:sz="1"/>
+              <w:left w:val="single" w:color="CCCCCC" w:sz="1"/>
+              <w:bottom w:val="single" w:color="CCCCCC" w:sz="1"/>
+              <w:right w:val="single" w:color="CCCCCC" w:sz="1"/>
+            </w:tcBorders>
+            <w:shd w:fill="2E4057" w:val="clear"/>
+            <w:tcMar>
+              <w:top w:type="dxa" w:w="80"/>
+              <w:left w:type="dxa" w:w="120"/>
+              <w:bottom w:type="dxa" w:w="80"/>
+              <w:right w:type="dxa" w:w="120"/>
+            </w:tcMar>
+          </w:tcPr>
+          <w:p>
+            <w:r>
+              <w:rPr>
+                <w:rFonts w:ascii="Arial" w:cs="Arial" w:eastAsia="Arial" w:hAnsi="Arial"/>
+                <w:b/>
+                <w:bCs/>
+                <w:color w:val="FFFFFF"/>
+                <w:sz w:val="18"/>
+                <w:szCs w:val="18"/>
+              </w:rPr>
+              <w:t xml:space="preserve">Domain</w:t>
+            </w:r>
+          </w:p>
+        </w:tc>
+        <w:tc>
+          <w:tcPr>
+            <w:tcW w:type="dxa" w:w="1200"/>
+            <w:tcBorders>
+              <w:top w:val="single" w:color="CCCCCC" w:sz="1"/>
+              <w:left w:val="single" w:color="CCCCCC" w:sz="1"/>
+              <w:bottom w:val="single" w:color="CCCCCC" w:sz="1"/>
+              <w:right w:val="single" w:color="CCCCCC" w:sz="1"/>
+            </w:tcBorders>
+            <w:shd w:fill="2E4057" w:val="clear"/>
+            <w:tcMar>
+              <w:top w:type="dxa" w:w="80"/>
+              <w:left w:type="dxa" w:w="120"/>
+              <w:bottom w:type="dxa" w:w="80"/>
+              <w:right w:type="dxa" w:w="120"/>
+            </w:tcMar>
+          </w:tcPr>
+          <w:p>
+            <w:r>
+              <w:rPr>
+                <w:rFonts w:ascii="Arial" w:cs="Arial" w:eastAsia="Arial" w:hAnsi="Arial"/>
+                <w:b/>
+                <w:bCs/>
+                <w:color w:val="FFFFFF"/>
+                <w:sz w:val="18"/>
+                <w:szCs w:val="18"/>
+              </w:rPr>
+              <w:t xml:space="preserve">Shared Constant</w:t>
+            </w:r>
+          </w:p>
+        </w:tc>
+        <w:tc>
+          <w:tcPr>
+            <w:tcW w:type="dxa" w:w="1800"/>
+            <w:tcBorders>
+              <w:top w:val="single" w:color="CCCCCC" w:sz="1"/>
+              <w:left w:val="single" w:color="CCCCCC" w:sz="1"/>
+              <w:bottom w:val="single" w:color="CCCCCC" w:sz="1"/>
+              <w:right w:val="single" w:color="CCCCCC" w:sz="1"/>
+            </w:tcBorders>
+            <w:shd w:fill="2E4057" w:val="clear"/>
+            <w:tcMar>
+              <w:top w:type="dxa" w:w="80"/>
+              <w:left w:type="dxa" w:w="120"/>
+              <w:bottom w:type="dxa" w:w="80"/>
+              <w:right w:type="dxa" w:w="120"/>
+            </w:tcMar>
+          </w:tcPr>
+          <w:p>
+            <w:r>
+              <w:rPr>
+                <w:rFonts w:ascii="Arial" w:cs="Arial" w:eastAsia="Arial" w:hAnsi="Arial"/>
+                <w:b/>
+                <w:bCs/>
+                <w:color w:val="FFFFFF"/>
+                <w:sz w:val="18"/>
+                <w:szCs w:val="18"/>
+              </w:rPr>
+              <w:t xml:space="preserve">Globe Same?</w:t>
+            </w:r>
+          </w:p>
+        </w:tc>
+        <w:tc>
+          <w:tcPr>
+            <w:tcW w:type="dxa" w:w="3660"/>
+            <w:tcBorders>
+              <w:top w:val="single" w:color="CCCCCC" w:sz="1"/>
+              <w:left w:val="single" w:color="CCCCCC" w:sz="1"/>
+              <w:bottom w:val="single" w:color="CCCCCC" w:sz="1"/>
+              <w:right w:val="single" w:color="CCCCCC" w:sz="1"/>
+            </w:tcBorders>
+            <w:shd w:fill="2E4057" w:val="clear"/>
+            <w:tcMar>
+              <w:top w:type="dxa" w:w="80"/>
+              <w:left w:type="dxa" w:w="120"/>
+              <w:bottom w:type="dxa" w:w="80"/>
+              <w:right w:type="dxa" w:w="120"/>
+            </w:tcMar>
+          </w:tcPr>
+          <w:p>
+            <w:r>
+              <w:rPr>
+                <w:rFonts w:ascii="Arial" w:cs="Arial" w:eastAsia="Arial" w:hAnsi="Arial"/>
+                <w:b/>
+                <w:bCs/>
+                <w:color w:val="FFFFFF"/>
+                <w:sz w:val="18"/>
+                <w:szCs w:val="18"/>
+              </w:rPr>
+              <w:t xml:space="preserve">Issues</w:t>
+            </w:r>
+          </w:p>
+        </w:tc>
+      </w:tr>
+      <w:tr>
+        <w:tc>
+          <w:tcPr>
+            <w:tcW w:type="dxa" w:w="500"/>
+            <w:tcBorders>
+              <w:top w:val="single" w:color="CCCCCC" w:sz="1"/>
+              <w:left w:val="single" w:color="CCCCCC" w:sz="1"/>
+              <w:bottom w:val="single" w:color="CCCCCC" w:sz="1"/>
+              <w:right w:val="single" w:color="CCCCCC" w:sz="1"/>
+            </w:tcBorders>
+            <w:tcMar>
+              <w:top w:type="dxa" w:w="80"/>
+              <w:left w:type="dxa" w:w="120"/>
+              <w:bottom w:type="dxa" w:w="80"/>
+              <w:right w:type="dxa" w:w="120"/>
+            </w:tcMar>
+          </w:tcPr>
+          <w:p>
+            <w:r>
+              <w:rPr>
+                <w:rFonts w:ascii="Arial" w:cs="Arial" w:eastAsia="Arial" w:hAnsi="Arial"/>
+                <w:sz w:val="18"/>
+                <w:szCs w:val="18"/>
+              </w:rPr>
+              <w:t xml:space="preserve">1</w:t>
+            </w:r>
+          </w:p>
+        </w:tc>
+        <w:tc>
+          <w:tcPr>
+            <w:tcW w:type="dxa" w:w="2200"/>
+            <w:tcBorders>
+              <w:top w:val="single" w:color="CCCCCC" w:sz="1"/>
+              <w:left w:val="single" w:color="CCCCCC" w:sz="1"/>
+              <w:bottom w:val="single" w:color="CCCCCC" w:sz="1"/>
+              <w:right w:val="single" w:color="CCCCCC" w:sz="1"/>
+            </w:tcBorders>
+            <w:tcMar>
+              <w:top w:type="dxa" w:w="80"/>
+              <w:left w:type="dxa" w:w="120"/>
+              <w:bottom w:type="dxa" w:w="80"/>
+              <w:right w:type="dxa" w:w="120"/>
+            </w:tcMar>
+          </w:tcPr>
+          <w:p>
+            <w:r>
+              <w:rPr>
+                <w:rFonts w:ascii="Arial" w:cs="Arial" w:eastAsia="Arial" w:hAnsi="Arial"/>
+                <w:sz w:val="18"/>
+                <w:szCs w:val="18"/>
+              </w:rPr>
+              <w:t xml:space="preserve">Schumann Resonance</w:t>
+            </w:r>
+          </w:p>
+        </w:tc>
+        <w:tc>
+          <w:tcPr>
+            <w:tcW w:type="dxa" w:w="1200"/>
+            <w:tcBorders>
+              <w:top w:val="single" w:color="CCCCCC" w:sz="1"/>
+              <w:left w:val="single" w:color="CCCCCC" w:sz="1"/>
+              <w:bottom w:val="single" w:color="CCCCCC" w:sz="1"/>
+              <w:right w:val="single" w:color="CCCCCC" w:sz="1"/>
+            </w:tcBorders>
+            <w:tcMar>
+              <w:top w:type="dxa" w:w="80"/>
+              <w:left w:type="dxa" w:w="120"/>
+              <w:bottom w:type="dxa" w:w="80"/>
+              <w:right w:type="dxa" w:w="120"/>
+            </w:tcMar>
+          </w:tcPr>
+          <w:p>
+            <w:r>
+              <w:rPr>
+                <w:rFonts w:ascii="Arial" w:cs="Arial" w:eastAsia="Arial" w:hAnsi="Arial"/>
+                <w:sz w:val="18"/>
+                <w:szCs w:val="18"/>
+              </w:rPr>
+              <w:t xml:space="preserve">λg, H₀</w:t>
+            </w:r>
+          </w:p>
+        </w:tc>
+        <w:tc>
+          <w:tcPr>
+            <w:tcW w:type="dxa" w:w="1800"/>
+            <w:tcBorders>
+              <w:top w:val="single" w:color="CCCCCC" w:sz="1"/>
+              <w:left w:val="single" w:color="CCCCCC" w:sz="1"/>
+              <w:bottom w:val="single" w:color="CCCCCC" w:sz="1"/>
+              <w:right w:val="single" w:color="CCCCCC" w:sz="1"/>
+            </w:tcBorders>
+            <w:tcMar>
+              <w:top w:type="dxa" w:w="80"/>
+              <w:left w:type="dxa" w:w="120"/>
+              <w:bottom w:type="dxa" w:w="80"/>
+              <w:right w:type="dxa" w:w="120"/>
+            </w:tcMar>
+          </w:tcPr>
+          <w:p>
+            <w:r>
+              <w:rPr>
+                <w:rFonts w:ascii="Arial" w:cs="Arial" w:eastAsia="Arial" w:hAnsi="Arial"/>
+                <w:sz w:val="18"/>
+                <w:szCs w:val="18"/>
+              </w:rPr>
+              <w:t xml:space="preserve">YES</w:t>
+            </w:r>
+          </w:p>
+        </w:tc>
+        <w:tc>
+          <w:tcPr>
+            <w:tcW w:type="dxa" w:w="3660"/>
+            <w:tcBorders>
+              <w:top w:val="single" w:color="CCCCCC" w:sz="1"/>
+              <w:left w:val="single" w:color="CCCCCC" w:sz="1"/>
+              <w:bottom w:val="single" w:color="CCCCCC" w:sz="1"/>
+              <w:right w:val="single" w:color="CCCCCC" w:sz="1"/>
+            </w:tcBorders>
+            <w:tcMar>
+              <w:top w:type="dxa" w:w="80"/>
+              <w:left w:type="dxa" w:w="120"/>
+              <w:bottom w:type="dxa" w:w="80"/>
+              <w:right w:type="dxa" w:w="120"/>
+            </w:tcMar>
+          </w:tcPr>
+          <w:p>
+            <w:r>
+              <w:rPr>
+                <w:rFonts w:ascii="Arial" w:cs="Arial" w:eastAsia="Arial" w:hAnsi="Arial"/>
+                <w:sz w:val="18"/>
+                <w:szCs w:val="18"/>
+              </w:rPr>
+              <w:t xml:space="preserve">Both predict 7.83 Hz</w:t>
+            </w:r>
+          </w:p>
+        </w:tc>
+      </w:tr>
+      <w:tr>
+        <w:tc>
+          <w:tcPr>
+            <w:tcW w:type="dxa" w:w="500"/>
+            <w:tcBorders>
+              <w:top w:val="single" w:color="CCCCCC" w:sz="1"/>
+              <w:left w:val="single" w:color="CCCCCC" w:sz="1"/>
+              <w:bottom w:val="single" w:color="CCCCCC" w:sz="1"/>
+              <w:right w:val="single" w:color="CCCCCC" w:sz="1"/>
+            </w:tcBorders>
+            <w:tcMar>
+              <w:top w:type="dxa" w:w="80"/>
+              <w:left w:type="dxa" w:w="120"/>
+              <w:bottom w:type="dxa" w:w="80"/>
+              <w:right w:type="dxa" w:w="120"/>
+            </w:tcMar>
+          </w:tcPr>
+          <w:p>
+            <w:r>
+              <w:rPr>
+                <w:rFonts w:ascii="Arial" w:cs="Arial" w:eastAsia="Arial" w:hAnsi="Arial"/>
+                <w:sz w:val="18"/>
+                <w:szCs w:val="18"/>
+              </w:rPr>
+              <w:t xml:space="preserve">2</w:t>
+            </w:r>
+          </w:p>
+        </w:tc>
+        <w:tc>
+          <w:tcPr>
+            <w:tcW w:type="dxa" w:w="2200"/>
+            <w:tcBorders>
+              <w:top w:val="single" w:color="CCCCCC" w:sz="1"/>
+              <w:left w:val="single" w:color="CCCCCC" w:sz="1"/>
+              <w:bottom w:val="single" w:color="CCCCCC" w:sz="1"/>
+              <w:right w:val="single" w:color="CCCCCC" w:sz="1"/>
+            </w:tcBorders>
+            <w:tcMar>
+              <w:top w:type="dxa" w:w="80"/>
+              <w:left w:type="dxa" w:w="120"/>
+              <w:bottom w:type="dxa" w:w="80"/>
+              <w:right w:type="dxa" w:w="120"/>
+            </w:tcMar>
+          </w:tcPr>
+          <w:p>
+            <w:r>
+              <w:rPr>
+                <w:rFonts w:ascii="Arial" w:cs="Arial" w:eastAsia="Arial" w:hAnsi="Arial"/>
+                <w:sz w:val="18"/>
+                <w:szCs w:val="18"/>
+              </w:rPr>
+              <w:t xml:space="preserve">Tesla Longitudinal Freq</w:t>
+            </w:r>
+          </w:p>
+        </w:tc>
+        <w:tc>
+          <w:tcPr>
+            <w:tcW w:type="dxa" w:w="1200"/>
+            <w:tcBorders>
+              <w:top w:val="single" w:color="CCCCCC" w:sz="1"/>
+              <w:left w:val="single" w:color="CCCCCC" w:sz="1"/>
+              <w:bottom w:val="single" w:color="CCCCCC" w:sz="1"/>
+              <w:right w:val="single" w:color="CCCCCC" w:sz="1"/>
+            </w:tcBorders>
+            <w:tcMar>
+              <w:top w:type="dxa" w:w="80"/>
+              <w:left w:type="dxa" w:w="120"/>
+              <w:bottom w:type="dxa" w:w="80"/>
+              <w:right w:type="dxa" w:w="120"/>
+            </w:tcMar>
+          </w:tcPr>
+          <w:p>
+            <w:r>
+              <w:rPr>
+                <w:rFonts w:ascii="Arial" w:cs="Arial" w:eastAsia="Arial" w:hAnsi="Arial"/>
+                <w:sz w:val="18"/>
+                <w:szCs w:val="18"/>
+              </w:rPr>
+              <w:t xml:space="preserve">λg, va</w:t>
+            </w:r>
+          </w:p>
+        </w:tc>
+        <w:tc>
+          <w:tcPr>
+            <w:tcW w:type="dxa" w:w="1800"/>
+            <w:tcBorders>
+              <w:top w:val="single" w:color="CCCCCC" w:sz="1"/>
+              <w:left w:val="single" w:color="CCCCCC" w:sz="1"/>
+              <w:bottom w:val="single" w:color="CCCCCC" w:sz="1"/>
+              <w:right w:val="single" w:color="CCCCCC" w:sz="1"/>
+            </w:tcBorders>
+            <w:tcMar>
+              <w:top w:type="dxa" w:w="80"/>
+              <w:left w:type="dxa" w:w="120"/>
+              <w:bottom w:type="dxa" w:w="80"/>
+              <w:right w:type="dxa" w:w="120"/>
+            </w:tcMar>
+          </w:tcPr>
+          <w:p>
+            <w:r>
+              <w:rPr>
+                <w:rFonts w:ascii="Arial" w:cs="Arial" w:eastAsia="Arial" w:hAnsi="Arial"/>
+                <w:sz w:val="18"/>
+                <w:szCs w:val="18"/>
+              </w:rPr>
+              <w:t xml:space="preserve">N/A</w:t>
+            </w:r>
+          </w:p>
+        </w:tc>
+        <w:tc>
+          <w:tcPr>
+            <w:tcW w:type="dxa" w:w="3660"/>
+            <w:tcBorders>
+              <w:top w:val="single" w:color="CCCCCC" w:sz="1"/>
+              <w:left w:val="single" w:color="CCCCCC" w:sz="1"/>
+              <w:bottom w:val="single" w:color="CCCCCC" w:sz="1"/>
+              <w:right w:val="single" w:color="CCCCCC" w:sz="1"/>
+            </w:tcBorders>
+            <w:tcMar>
+              <w:top w:type="dxa" w:w="80"/>
+              <w:left w:type="dxa" w:w="120"/>
+              <w:bottom w:type="dxa" w:w="80"/>
+              <w:right w:type="dxa" w:w="120"/>
+            </w:tcMar>
+          </w:tcPr>
+          <w:p>
+            <w:r>
+              <w:rPr>
+                <w:rFonts w:ascii="Arial" w:cs="Arial" w:eastAsia="Arial" w:hAnsi="Arial"/>
+                <w:sz w:val="18"/>
+                <w:szCs w:val="18"/>
+              </w:rPr>
+              <w:t xml:space="preserve">Patent lacks cited formula</w:t>
+            </w:r>
+          </w:p>
+        </w:tc>
+      </w:tr>
+      <w:tr>
+        <w:tc>
+          <w:tcPr>
+            <w:tcW w:type="dxa" w:w="500"/>
+            <w:tcBorders>
+              <w:top w:val="single" w:color="CCCCCC" w:sz="1"/>
+              <w:left w:val="single" w:color="CCCCCC" w:sz="1"/>
+              <w:bottom w:val="single" w:color="CCCCCC" w:sz="1"/>
+              <w:right w:val="single" w:color="CCCCCC" w:sz="1"/>
+            </w:tcBorders>
+            <w:tcMar>
+              <w:top w:type="dxa" w:w="80"/>
+              <w:left w:type="dxa" w:w="120"/>
+              <w:bottom w:type="dxa" w:w="80"/>
+              <w:right w:type="dxa" w:w="120"/>
+            </w:tcMar>
+          </w:tcPr>
+          <w:p>
+            <w:r>
+              <w:rPr>
+                <w:rFonts w:ascii="Arial" w:cs="Arial" w:eastAsia="Arial" w:hAnsi="Arial"/>
+                <w:sz w:val="18"/>
+                <w:szCs w:val="18"/>
+              </w:rPr>
+              <w:t xml:space="preserve">3</w:t>
+            </w:r>
+          </w:p>
+        </w:tc>
+        <w:tc>
+          <w:tcPr>
+            <w:tcW w:type="dxa" w:w="2200"/>
+            <w:tcBorders>
+              <w:top w:val="single" w:color="CCCCCC" w:sz="1"/>
+              <w:left w:val="single" w:color="CCCCCC" w:sz="1"/>
+              <w:bottom w:val="single" w:color="CCCCCC" w:sz="1"/>
+              <w:right w:val="single" w:color="CCCCCC" w:sz="1"/>
+            </w:tcBorders>
+            <w:tcMar>
+              <w:top w:type="dxa" w:w="80"/>
+              <w:left w:type="dxa" w:w="120"/>
+              <w:bottom w:type="dxa" w:w="80"/>
+              <w:right w:type="dxa" w:w="120"/>
+            </w:tcMar>
+          </w:tcPr>
+          <w:p>
+            <w:r>
+              <w:rPr>
+                <w:rFonts w:ascii="Arial" w:cs="Arial" w:eastAsia="Arial" w:hAnsi="Arial"/>
+                <w:sz w:val="18"/>
+                <w:szCs w:val="18"/>
+              </w:rPr>
+              <w:t xml:space="preserve">NMP Drift Rate</w:t>
+            </w:r>
+          </w:p>
+        </w:tc>
+        <w:tc>
+          <w:tcPr>
+            <w:tcW w:type="dxa" w:w="1200"/>
+            <w:tcBorders>
+              <w:top w:val="single" w:color="CCCCCC" w:sz="1"/>
+              <w:left w:val="single" w:color="CCCCCC" w:sz="1"/>
+              <w:bottom w:val="single" w:color="CCCCCC" w:sz="1"/>
+              <w:right w:val="single" w:color="CCCCCC" w:sz="1"/>
+            </w:tcBorders>
+            <w:tcMar>
+              <w:top w:type="dxa" w:w="80"/>
+              <w:left w:type="dxa" w:w="120"/>
+              <w:bottom w:type="dxa" w:w="80"/>
+              <w:right w:type="dxa" w:w="120"/>
+            </w:tcMar>
+          </w:tcPr>
+          <w:p>
+            <w:r>
+              <w:rPr>
+                <w:rFonts w:ascii="Arial" w:cs="Arial" w:eastAsia="Arial" w:hAnsi="Arial"/>
+                <w:sz w:val="18"/>
+                <w:szCs w:val="18"/>
+              </w:rPr>
+              <w:t xml:space="preserve">λg</w:t>
+            </w:r>
+          </w:p>
+        </w:tc>
+        <w:tc>
+          <w:tcPr>
+            <w:tcW w:type="dxa" w:w="1800"/>
+            <w:tcBorders>
+              <w:top w:val="single" w:color="CCCCCC" w:sz="1"/>
+              <w:left w:val="single" w:color="CCCCCC" w:sz="1"/>
+              <w:bottom w:val="single" w:color="CCCCCC" w:sz="1"/>
+              <w:right w:val="single" w:color="CCCCCC" w:sz="1"/>
+            </w:tcBorders>
+            <w:tcMar>
+              <w:top w:type="dxa" w:w="80"/>
+              <w:left w:type="dxa" w:w="120"/>
+              <w:bottom w:type="dxa" w:w="80"/>
+              <w:right w:type="dxa" w:w="120"/>
+            </w:tcMar>
+          </w:tcPr>
+          <w:p>
+            <w:r>
+              <w:rPr>
+                <w:rFonts w:ascii="Arial" w:cs="Arial" w:eastAsia="Arial" w:hAnsi="Arial"/>
+                <w:sz w:val="18"/>
+                <w:szCs w:val="18"/>
+              </w:rPr>
+              <w:t xml:space="preserve">YES</w:t>
+            </w:r>
+          </w:p>
+        </w:tc>
+        <w:tc>
+          <w:tcPr>
+            <w:tcW w:type="dxa" w:w="3660"/>
+            <w:tcBorders>
+              <w:top w:val="single" w:color="CCCCCC" w:sz="1"/>
+              <w:left w:val="single" w:color="CCCCCC" w:sz="1"/>
+              <w:bottom w:val="single" w:color="CCCCCC" w:sz="1"/>
+              <w:right w:val="single" w:color="CCCCCC" w:sz="1"/>
+            </w:tcBorders>
+            <w:tcMar>
+              <w:top w:type="dxa" w:w="80"/>
+              <w:left w:type="dxa" w:w="120"/>
+              <w:bottom w:type="dxa" w:w="80"/>
+              <w:right w:type="dxa" w:w="120"/>
+            </w:tcMar>
+          </w:tcPr>
+          <w:p>
+            <w:r>
+              <w:rPr>
+                <w:rFonts w:ascii="Arial" w:cs="Arial" w:eastAsia="Arial" w:hAnsi="Arial"/>
+                <w:sz w:val="18"/>
+                <w:szCs w:val="18"/>
+              </w:rPr>
+              <w:t xml:space="preserve">Divergence testable ~2028+</w:t>
+            </w:r>
+          </w:p>
+        </w:tc>
+      </w:tr>
+      <w:tr>
+        <w:tc>
+          <w:tcPr>
+            <w:tcW w:type="dxa" w:w="500"/>
+            <w:tcBorders>
+              <w:top w:val="single" w:color="CCCCCC" w:sz="1"/>
+              <w:left w:val="single" w:color="CCCCCC" w:sz="1"/>
+              <w:bottom w:val="single" w:color="CCCCCC" w:sz="1"/>
+              <w:right w:val="single" w:color="CCCCCC" w:sz="1"/>
+            </w:tcBorders>
+            <w:tcMar>
+              <w:top w:type="dxa" w:w="80"/>
+              <w:left w:type="dxa" w:w="120"/>
+              <w:bottom w:type="dxa" w:w="80"/>
+              <w:right w:type="dxa" w:w="120"/>
+            </w:tcMar>
+          </w:tcPr>
+          <w:p>
+            <w:r>
+              <w:rPr>
+                <w:rFonts w:ascii="Arial" w:cs="Arial" w:eastAsia="Arial" w:hAnsi="Arial"/>
+                <w:sz w:val="18"/>
+                <w:szCs w:val="18"/>
+              </w:rPr>
+              <w:t xml:space="preserve">4</w:t>
+            </w:r>
+          </w:p>
+        </w:tc>
+        <w:tc>
+          <w:tcPr>
+            <w:tcW w:type="dxa" w:w="2200"/>
+            <w:tcBorders>
+              <w:top w:val="single" w:color="CCCCCC" w:sz="1"/>
+              <w:left w:val="single" w:color="CCCCCC" w:sz="1"/>
+              <w:bottom w:val="single" w:color="CCCCCC" w:sz="1"/>
+              <w:right w:val="single" w:color="CCCCCC" w:sz="1"/>
+            </w:tcBorders>
+            <w:tcMar>
+              <w:top w:type="dxa" w:w="80"/>
+              <w:left w:type="dxa" w:w="120"/>
+              <w:bottom w:type="dxa" w:w="80"/>
+              <w:right w:type="dxa" w:w="120"/>
+            </w:tcMar>
+          </w:tcPr>
+          <w:p>
+            <w:r>
+              <w:rPr>
+                <w:rFonts w:ascii="Arial" w:cs="Arial" w:eastAsia="Arial" w:hAnsi="Arial"/>
+                <w:sz w:val="18"/>
+                <w:szCs w:val="18"/>
+              </w:rPr>
+              <w:t xml:space="preserve">Equatorial Gravity</w:t>
+            </w:r>
+          </w:p>
+        </w:tc>
+        <w:tc>
+          <w:tcPr>
+            <w:tcW w:type="dxa" w:w="1200"/>
+            <w:tcBorders>
+              <w:top w:val="single" w:color="CCCCCC" w:sz="1"/>
+              <w:left w:val="single" w:color="CCCCCC" w:sz="1"/>
+              <w:bottom w:val="single" w:color="CCCCCC" w:sz="1"/>
+              <w:right w:val="single" w:color="CCCCCC" w:sz="1"/>
+            </w:tcBorders>
+            <w:tcMar>
+              <w:top w:type="dxa" w:w="80"/>
+              <w:left w:type="dxa" w:w="120"/>
+              <w:bottom w:type="dxa" w:w="80"/>
+              <w:right w:type="dxa" w:w="120"/>
+            </w:tcMar>
+          </w:tcPr>
+          <w:p>
+            <w:r>
+              <w:rPr>
+                <w:rFonts w:ascii="Arial" w:cs="Arial" w:eastAsia="Arial" w:hAnsi="Arial"/>
+                <w:sz w:val="18"/>
+                <w:szCs w:val="18"/>
+              </w:rPr>
+              <w:t xml:space="preserve">λg</w:t>
+            </w:r>
+          </w:p>
+        </w:tc>
+        <w:tc>
+          <w:tcPr>
+            <w:tcW w:type="dxa" w:w="1800"/>
+            <w:tcBorders>
+              <w:top w:val="single" w:color="CCCCCC" w:sz="1"/>
+              <w:left w:val="single" w:color="CCCCCC" w:sz="1"/>
+              <w:bottom w:val="single" w:color="CCCCCC" w:sz="1"/>
+              <w:right w:val="single" w:color="CCCCCC" w:sz="1"/>
+            </w:tcBorders>
+            <w:tcMar>
+              <w:top w:type="dxa" w:w="80"/>
+              <w:left w:type="dxa" w:w="120"/>
+              <w:bottom w:type="dxa" w:w="80"/>
+              <w:right w:type="dxa" w:w="120"/>
+            </w:tcMar>
+          </w:tcPr>
+          <w:p>
+            <w:r>
+              <w:rPr>
+                <w:rFonts w:ascii="Arial" w:cs="Arial" w:eastAsia="Arial" w:hAnsi="Arial"/>
+                <w:sz w:val="18"/>
+                <w:szCs w:val="18"/>
+              </w:rPr>
+              <w:t xml:space="preserve">YES</w:t>
+            </w:r>
+          </w:p>
+        </w:tc>
+        <w:tc>
+          <w:tcPr>
+            <w:tcW w:type="dxa" w:w="3660"/>
+            <w:tcBorders>
+              <w:top w:val="single" w:color="CCCCCC" w:sz="1"/>
+              <w:left w:val="single" w:color="CCCCCC" w:sz="1"/>
+              <w:bottom w:val="single" w:color="CCCCCC" w:sz="1"/>
+              <w:right w:val="single" w:color="CCCCCC" w:sz="1"/>
+            </w:tcBorders>
+            <w:tcMar>
+              <w:top w:type="dxa" w:w="80"/>
+              <w:left w:type="dxa" w:w="120"/>
+              <w:bottom w:type="dxa" w:w="80"/>
+              <w:right w:type="dxa" w:w="120"/>
+            </w:tcMar>
+          </w:tcPr>
+          <w:p>
+            <w:r>
+              <w:rPr>
+                <w:rFonts w:ascii="Arial" w:cs="Arial" w:eastAsia="Arial" w:hAnsi="Arial"/>
+                <w:sz w:val="18"/>
+                <w:szCs w:val="18"/>
+              </w:rPr>
+              <w:t xml:space="preserve">Uses observed 9.7803 as input</w:t>
+            </w:r>
+          </w:p>
+        </w:tc>
+      </w:tr>
+      <w:tr>
+        <w:tc>
+          <w:tcPr>
+            <w:tcW w:type="dxa" w:w="500"/>
+            <w:tcBorders>
+              <w:top w:val="single" w:color="CCCCCC" w:sz="1"/>
+              <w:left w:val="single" w:color="CCCCCC" w:sz="1"/>
+              <w:bottom w:val="single" w:color="CCCCCC" w:sz="1"/>
+              <w:right w:val="single" w:color="CCCCCC" w:sz="1"/>
+            </w:tcBorders>
+            <w:tcMar>
+              <w:top w:type="dxa" w:w="80"/>
+              <w:left w:type="dxa" w:w="120"/>
+              <w:bottom w:type="dxa" w:w="80"/>
+              <w:right w:type="dxa" w:w="120"/>
+            </w:tcMar>
+          </w:tcPr>
+          <w:p>
+            <w:r>
+              <w:rPr>
+                <w:rFonts w:ascii="Arial" w:cs="Arial" w:eastAsia="Arial" w:hAnsi="Arial"/>
+                <w:sz w:val="18"/>
+                <w:szCs w:val="18"/>
+              </w:rPr>
+              <w:t xml:space="preserve">5</w:t>
+            </w:r>
+          </w:p>
+        </w:tc>
+        <w:tc>
+          <w:tcPr>
+            <w:tcW w:type="dxa" w:w="2200"/>
+            <w:tcBorders>
+              <w:top w:val="single" w:color="CCCCCC" w:sz="1"/>
+              <w:left w:val="single" w:color="CCCCCC" w:sz="1"/>
+              <w:bottom w:val="single" w:color="CCCCCC" w:sz="1"/>
+              <w:right w:val="single" w:color="CCCCCC" w:sz="1"/>
+            </w:tcBorders>
+            <w:tcMar>
+              <w:top w:type="dxa" w:w="80"/>
+              <w:left w:type="dxa" w:w="120"/>
+              <w:bottom w:type="dxa" w:w="80"/>
+              <w:right w:type="dxa" w:w="120"/>
+            </w:tcMar>
+          </w:tcPr>
+          <w:p>
+            <w:r>
+              <w:rPr>
+                <w:rFonts w:ascii="Arial" w:cs="Arial" w:eastAsia="Arial" w:hAnsi="Arial"/>
+                <w:sz w:val="18"/>
+                <w:szCs w:val="18"/>
+              </w:rPr>
+              <w:t xml:space="preserve">EM-Gravity Coupling</w:t>
+            </w:r>
+          </w:p>
+        </w:tc>
+        <w:tc>
+          <w:tcPr>
+            <w:tcW w:type="dxa" w:w="1200"/>
+            <w:tcBorders>
+              <w:top w:val="single" w:color="CCCCCC" w:sz="1"/>
+              <w:left w:val="single" w:color="CCCCCC" w:sz="1"/>
+              <w:bottom w:val="single" w:color="CCCCCC" w:sz="1"/>
+              <w:right w:val="single" w:color="CCCCCC" w:sz="1"/>
+            </w:tcBorders>
+            <w:tcMar>
+              <w:top w:type="dxa" w:w="80"/>
+              <w:left w:type="dxa" w:w="120"/>
+              <w:bottom w:type="dxa" w:w="80"/>
+              <w:right w:type="dxa" w:w="120"/>
+            </w:tcMar>
+          </w:tcPr>
+          <w:p>
+            <w:r>
+              <w:rPr>
+                <w:rFonts w:ascii="Arial" w:cs="Arial" w:eastAsia="Arial" w:hAnsi="Arial"/>
+                <w:sz w:val="18"/>
+                <w:szCs w:val="18"/>
+              </w:rPr>
+              <w:t xml:space="preserve">κ, λg</w:t>
+            </w:r>
+          </w:p>
+        </w:tc>
+        <w:tc>
+          <w:tcPr>
+            <w:tcW w:type="dxa" w:w="1800"/>
+            <w:tcBorders>
+              <w:top w:val="single" w:color="CCCCCC" w:sz="1"/>
+              <w:left w:val="single" w:color="CCCCCC" w:sz="1"/>
+              <w:bottom w:val="single" w:color="CCCCCC" w:sz="1"/>
+              <w:right w:val="single" w:color="CCCCCC" w:sz="1"/>
+            </w:tcBorders>
+            <w:tcMar>
+              <w:top w:type="dxa" w:w="80"/>
+              <w:left w:type="dxa" w:w="120"/>
+              <w:bottom w:type="dxa" w:w="80"/>
+              <w:right w:type="dxa" w:w="120"/>
+            </w:tcMar>
+          </w:tcPr>
+          <w:p>
+            <w:r>
+              <w:rPr>
+                <w:rFonts w:ascii="Arial" w:cs="Arial" w:eastAsia="Arial" w:hAnsi="Arial"/>
+                <w:sz w:val="18"/>
+                <w:szCs w:val="18"/>
+              </w:rPr>
+              <w:t xml:space="preserve">YES (0.0)</w:t>
+            </w:r>
+          </w:p>
+        </w:tc>
+        <w:tc>
+          <w:tcPr>
+            <w:tcW w:type="dxa" w:w="3660"/>
+            <w:tcBorders>
+              <w:top w:val="single" w:color="CCCCCC" w:sz="1"/>
+              <w:left w:val="single" w:color="CCCCCC" w:sz="1"/>
+              <w:bottom w:val="single" w:color="CCCCCC" w:sz="1"/>
+              <w:right w:val="single" w:color="CCCCCC" w:sz="1"/>
+            </w:tcBorders>
+            <w:tcMar>
+              <w:top w:type="dxa" w:w="80"/>
+              <w:left w:type="dxa" w:w="120"/>
+              <w:bottom w:type="dxa" w:w="80"/>
+              <w:right w:type="dxa" w:w="120"/>
+            </w:tcMar>
+          </w:tcPr>
+          <w:p>
+            <w:r>
+              <w:rPr>
+                <w:rFonts w:ascii="Arial" w:cs="Arial" w:eastAsia="Arial" w:hAnsi="Arial"/>
+                <w:sz w:val="18"/>
+                <w:szCs w:val="18"/>
+              </w:rPr>
+              <w:t xml:space="preserve">SGs confirm 0.0 µGal</w:t>
+            </w:r>
+          </w:p>
+        </w:tc>
+      </w:tr>
+      <w:tr>
+        <w:tc>
+          <w:tcPr>
+            <w:tcW w:type="dxa" w:w="500"/>
+            <w:tcBorders>
+              <w:top w:val="single" w:color="CCCCCC" w:sz="1"/>
+              <w:left w:val="single" w:color="CCCCCC" w:sz="1"/>
+              <w:bottom w:val="single" w:color="CCCCCC" w:sz="1"/>
+              <w:right w:val="single" w:color="CCCCCC" w:sz="1"/>
+            </w:tcBorders>
+            <w:tcMar>
+              <w:top w:type="dxa" w:w="80"/>
+              <w:left w:type="dxa" w:w="120"/>
+              <w:bottom w:type="dxa" w:w="80"/>
+              <w:right w:type="dxa" w:w="120"/>
+            </w:tcMar>
+          </w:tcPr>
+          <w:p>
+            <w:r>
+              <w:rPr>
+                <w:rFonts w:ascii="Arial" w:cs="Arial" w:eastAsia="Arial" w:hAnsi="Arial"/>
+                <w:sz w:val="18"/>
+                <w:szCs w:val="18"/>
+              </w:rPr>
+              <w:t xml:space="preserve">6</w:t>
+            </w:r>
+          </w:p>
+        </w:tc>
+        <w:tc>
+          <w:tcPr>
+            <w:tcW w:type="dxa" w:w="2200"/>
+            <w:tcBorders>
+              <w:top w:val="single" w:color="CCCCCC" w:sz="1"/>
+              <w:left w:val="single" w:color="CCCCCC" w:sz="1"/>
+              <w:bottom w:val="single" w:color="CCCCCC" w:sz="1"/>
+              <w:right w:val="single" w:color="CCCCCC" w:sz="1"/>
+            </w:tcBorders>
+            <w:tcMar>
+              <w:top w:type="dxa" w:w="80"/>
+              <w:left w:type="dxa" w:w="120"/>
+              <w:bottom w:type="dxa" w:w="80"/>
+              <w:right w:type="dxa" w:w="120"/>
+            </w:tcMar>
+          </w:tcPr>
+          <w:p>
+            <w:r>
+              <w:rPr>
+                <w:rFonts w:ascii="Arial" w:cs="Arial" w:eastAsia="Arial" w:hAnsi="Arial"/>
+                <w:sz w:val="18"/>
+                <w:szCs w:val="18"/>
+              </w:rPr>
+              <w:t xml:space="preserve">Schumann Suppression</w:t>
+            </w:r>
+          </w:p>
+        </w:tc>
+        <w:tc>
+          <w:tcPr>
+            <w:tcW w:type="dxa" w:w="1200"/>
+            <w:tcBorders>
+              <w:top w:val="single" w:color="CCCCCC" w:sz="1"/>
+              <w:left w:val="single" w:color="CCCCCC" w:sz="1"/>
+              <w:bottom w:val="single" w:color="CCCCCC" w:sz="1"/>
+              <w:right w:val="single" w:color="CCCCCC" w:sz="1"/>
+            </w:tcBorders>
+            <w:tcMar>
+              <w:top w:type="dxa" w:w="80"/>
+              <w:left w:type="dxa" w:w="120"/>
+              <w:bottom w:type="dxa" w:w="80"/>
+              <w:right w:type="dxa" w:w="120"/>
+            </w:tcMar>
+          </w:tcPr>
+          <w:p>
+            <w:r>
+              <w:rPr>
+                <w:rFonts w:ascii="Arial" w:cs="Arial" w:eastAsia="Arial" w:hAnsi="Arial"/>
+                <w:sz w:val="18"/>
+                <w:szCs w:val="18"/>
+              </w:rPr>
+              <w:t xml:space="preserve">H₀, λg</w:t>
+            </w:r>
+          </w:p>
+        </w:tc>
+        <w:tc>
+          <w:tcPr>
+            <w:tcW w:type="dxa" w:w="1800"/>
+            <w:tcBorders>
+              <w:top w:val="single" w:color="CCCCCC" w:sz="1"/>
+              <w:left w:val="single" w:color="CCCCCC" w:sz="1"/>
+              <w:bottom w:val="single" w:color="CCCCCC" w:sz="1"/>
+              <w:right w:val="single" w:color="CCCCCC" w:sz="1"/>
+            </w:tcBorders>
+            <w:tcMar>
+              <w:top w:type="dxa" w:w="80"/>
+              <w:left w:type="dxa" w:w="120"/>
+              <w:bottom w:type="dxa" w:w="80"/>
+              <w:right w:type="dxa" w:w="120"/>
+            </w:tcMar>
+          </w:tcPr>
+          <w:p>
+            <w:r>
+              <w:rPr>
+                <w:rFonts w:ascii="Arial" w:cs="Arial" w:eastAsia="Arial" w:hAnsi="Arial"/>
+                <w:sz w:val="18"/>
+                <w:szCs w:val="18"/>
+              </w:rPr>
+              <w:t xml:space="preserve">YES</w:t>
+            </w:r>
+          </w:p>
+        </w:tc>
+        <w:tc>
+          <w:tcPr>
+            <w:tcW w:type="dxa" w:w="3660"/>
+            <w:tcBorders>
+              <w:top w:val="single" w:color="CCCCCC" w:sz="1"/>
+              <w:left w:val="single" w:color="CCCCCC" w:sz="1"/>
+              <w:bottom w:val="single" w:color="CCCCCC" w:sz="1"/>
+              <w:right w:val="single" w:color="CCCCCC" w:sz="1"/>
+            </w:tcBorders>
+            <w:tcMar>
+              <w:top w:type="dxa" w:w="80"/>
+              <w:left w:type="dxa" w:w="120"/>
+              <w:bottom w:type="dxa" w:w="80"/>
+              <w:right w:type="dxa" w:w="120"/>
+            </w:tcMar>
+          </w:tcPr>
+          <w:p>
+            <w:r>
+              <w:rPr>
+                <w:rFonts w:ascii="Arial" w:cs="Arial" w:eastAsia="Arial" w:hAnsi="Arial"/>
+                <w:sz w:val="18"/>
+                <w:szCs w:val="18"/>
+              </w:rPr>
+              <w:t xml:space="preserve">D-layer absorption</w:t>
+            </w:r>
+          </w:p>
+        </w:tc>
+      </w:tr>
+      <w:tr>
+        <w:tc>
+          <w:tcPr>
+            <w:tcW w:type="dxa" w:w="500"/>
+            <w:tcBorders>
+              <w:top w:val="single" w:color="CCCCCC" w:sz="1"/>
+              <w:left w:val="single" w:color="CCCCCC" w:sz="1"/>
+              <w:bottom w:val="single" w:color="CCCCCC" w:sz="1"/>
+              <w:right w:val="single" w:color="CCCCCC" w:sz="1"/>
+            </w:tcBorders>
+            <w:tcMar>
+              <w:top w:type="dxa" w:w="80"/>
+              <w:left w:type="dxa" w:w="120"/>
+              <w:bottom w:type="dxa" w:w="80"/>
+              <w:right w:type="dxa" w:w="120"/>
+            </w:tcMar>
+          </w:tcPr>
+          <w:p>
+            <w:r>
+              <w:rPr>
+                <w:rFonts w:ascii="Arial" w:cs="Arial" w:eastAsia="Arial" w:hAnsi="Arial"/>
+                <w:sz w:val="18"/>
+                <w:szCs w:val="18"/>
+              </w:rPr>
+              <w:t xml:space="preserve">7</w:t>
+            </w:r>
+          </w:p>
+        </w:tc>
+        <w:tc>
+          <w:tcPr>
+            <w:tcW w:type="dxa" w:w="2200"/>
+            <w:tcBorders>
+              <w:top w:val="single" w:color="CCCCCC" w:sz="1"/>
+              <w:left w:val="single" w:color="CCCCCC" w:sz="1"/>
+              <w:bottom w:val="single" w:color="CCCCCC" w:sz="1"/>
+              <w:right w:val="single" w:color="CCCCCC" w:sz="1"/>
+            </w:tcBorders>
+            <w:tcMar>
+              <w:top w:type="dxa" w:w="80"/>
+              <w:left w:type="dxa" w:w="120"/>
+              <w:bottom w:type="dxa" w:w="80"/>
+              <w:right w:type="dxa" w:w="120"/>
+            </w:tcMar>
+          </w:tcPr>
+          <w:p>
+            <w:r>
+              <w:rPr>
+                <w:rFonts w:ascii="Arial" w:cs="Arial" w:eastAsia="Arial" w:hAnsi="Arial"/>
+                <w:sz w:val="18"/>
+                <w:szCs w:val="18"/>
+              </w:rPr>
+              <w:t xml:space="preserve">Roaring 40s AAO</w:t>
+            </w:r>
+          </w:p>
+        </w:tc>
+        <w:tc>
+          <w:tcPr>
+            <w:tcW w:type="dxa" w:w="1200"/>
+            <w:tcBorders>
+              <w:top w:val="single" w:color="CCCCCC" w:sz="1"/>
+              <w:left w:val="single" w:color="CCCCCC" w:sz="1"/>
+              <w:bottom w:val="single" w:color="CCCCCC" w:sz="1"/>
+              <w:right w:val="single" w:color="CCCCCC" w:sz="1"/>
+            </w:tcBorders>
+            <w:tcMar>
+              <w:top w:type="dxa" w:w="80"/>
+              <w:left w:type="dxa" w:w="120"/>
+              <w:bottom w:type="dxa" w:w="80"/>
+              <w:right w:type="dxa" w:w="120"/>
+            </w:tcMar>
+          </w:tcPr>
+          <w:p>
+            <w:r>
+              <w:rPr>
+                <w:rFonts w:ascii="Arial" w:cs="Arial" w:eastAsia="Arial" w:hAnsi="Arial"/>
+                <w:sz w:val="18"/>
+                <w:szCs w:val="18"/>
+              </w:rPr>
+              <w:t xml:space="preserve">λg</w:t>
+            </w:r>
+          </w:p>
+        </w:tc>
+        <w:tc>
+          <w:tcPr>
+            <w:tcW w:type="dxa" w:w="1800"/>
+            <w:tcBorders>
+              <w:top w:val="single" w:color="CCCCCC" w:sz="1"/>
+              <w:left w:val="single" w:color="CCCCCC" w:sz="1"/>
+              <w:bottom w:val="single" w:color="CCCCCC" w:sz="1"/>
+              <w:right w:val="single" w:color="CCCCCC" w:sz="1"/>
+            </w:tcBorders>
+            <w:tcMar>
+              <w:top w:type="dxa" w:w="80"/>
+              <w:left w:type="dxa" w:w="120"/>
+              <w:bottom w:type="dxa" w:w="80"/>
+              <w:right w:type="dxa" w:w="120"/>
+            </w:tcMar>
+          </w:tcPr>
+          <w:p>
+            <w:r>
+              <w:rPr>
+                <w:rFonts w:ascii="Arial" w:cs="Arial" w:eastAsia="Arial" w:hAnsi="Arial"/>
+                <w:sz w:val="18"/>
+                <w:szCs w:val="18"/>
+              </w:rPr>
+              <w:t xml:space="preserve">YES</w:t>
+            </w:r>
+          </w:p>
+        </w:tc>
+        <w:tc>
+          <w:tcPr>
+            <w:tcW w:type="dxa" w:w="3660"/>
+            <w:tcBorders>
+              <w:top w:val="single" w:color="CCCCCC" w:sz="1"/>
+              <w:left w:val="single" w:color="CCCCCC" w:sz="1"/>
+              <w:bottom w:val="single" w:color="CCCCCC" w:sz="1"/>
+              <w:right w:val="single" w:color="CCCCCC" w:sz="1"/>
+            </w:tcBorders>
+            <w:tcMar>
+              <w:top w:type="dxa" w:w="80"/>
+              <w:left w:type="dxa" w:w="120"/>
+              <w:bottom w:type="dxa" w:w="80"/>
+              <w:right w:type="dxa" w:w="120"/>
+            </w:tcMar>
+          </w:tcPr>
+          <w:p>
+            <w:r>
+              <w:rPr>
+                <w:rFonts w:ascii="Arial" w:cs="Arial" w:eastAsia="Arial" w:hAnsi="Arial"/>
+                <w:sz w:val="18"/>
+                <w:szCs w:val="18"/>
+              </w:rPr>
+              <w:t xml:space="preserve">No causal test</w:t>
+            </w:r>
+          </w:p>
+        </w:tc>
+      </w:tr>
+      <w:tr>
+        <w:tc>
+          <w:tcPr>
+            <w:tcW w:type="dxa" w:w="500"/>
+            <w:tcBorders>
+              <w:top w:val="single" w:color="CCCCCC" w:sz="1"/>
+              <w:left w:val="single" w:color="CCCCCC" w:sz="1"/>
+              <w:bottom w:val="single" w:color="CCCCCC" w:sz="1"/>
+              <w:right w:val="single" w:color="CCCCCC" w:sz="1"/>
+            </w:tcBorders>
+            <w:tcMar>
+              <w:top w:type="dxa" w:w="80"/>
+              <w:left w:type="dxa" w:w="120"/>
+              <w:bottom w:type="dxa" w:w="80"/>
+              <w:right w:type="dxa" w:w="120"/>
+            </w:tcMar>
+          </w:tcPr>
+          <w:p>
+            <w:r>
+              <w:rPr>
+                <w:rFonts w:ascii="Arial" w:cs="Arial" w:eastAsia="Arial" w:hAnsi="Arial"/>
+                <w:sz w:val="18"/>
+                <w:szCs w:val="18"/>
+              </w:rPr>
+              <w:t xml:space="preserve">8</w:t>
+            </w:r>
+          </w:p>
+        </w:tc>
+        <w:tc>
+          <w:tcPr>
+            <w:tcW w:type="dxa" w:w="2200"/>
+            <w:tcBorders>
+              <w:top w:val="single" w:color="CCCCCC" w:sz="1"/>
+              <w:left w:val="single" w:color="CCCCCC" w:sz="1"/>
+              <w:bottom w:val="single" w:color="CCCCCC" w:sz="1"/>
+              <w:right w:val="single" w:color="CCCCCC" w:sz="1"/>
+            </w:tcBorders>
+            <w:tcMar>
+              <w:top w:type="dxa" w:w="80"/>
+              <w:left w:type="dxa" w:w="120"/>
+              <w:bottom w:type="dxa" w:w="80"/>
+              <w:right w:type="dxa" w:w="120"/>
+            </w:tcMar>
+          </w:tcPr>
+          <w:p>
+            <w:r>
+              <w:rPr>
+                <w:rFonts w:ascii="Arial" w:cs="Arial" w:eastAsia="Arial" w:hAnsi="Arial"/>
+                <w:sz w:val="18"/>
+                <w:szCs w:val="18"/>
+              </w:rPr>
+              <w:t xml:space="preserve">Telluric Cutoff</w:t>
+            </w:r>
+          </w:p>
+        </w:tc>
+        <w:tc>
+          <w:tcPr>
+            <w:tcW w:type="dxa" w:w="1200"/>
+            <w:tcBorders>
+              <w:top w:val="single" w:color="CCCCCC" w:sz="1"/>
+              <w:left w:val="single" w:color="CCCCCC" w:sz="1"/>
+              <w:bottom w:val="single" w:color="CCCCCC" w:sz="1"/>
+              <w:right w:val="single" w:color="CCCCCC" w:sz="1"/>
+            </w:tcBorders>
+            <w:tcMar>
+              <w:top w:type="dxa" w:w="80"/>
+              <w:left w:type="dxa" w:w="120"/>
+              <w:bottom w:type="dxa" w:w="80"/>
+              <w:right w:type="dxa" w:w="120"/>
+            </w:tcMar>
+          </w:tcPr>
+          <w:p>
+            <w:r>
+              <w:rPr>
+                <w:rFonts w:ascii="Arial" w:cs="Arial" w:eastAsia="Arial" w:hAnsi="Arial"/>
+                <w:sz w:val="18"/>
+                <w:szCs w:val="18"/>
+              </w:rPr>
+              <w:t xml:space="preserve">λg</w:t>
+            </w:r>
+          </w:p>
+        </w:tc>
+        <w:tc>
+          <w:tcPr>
+            <w:tcW w:type="dxa" w:w="1800"/>
+            <w:tcBorders>
+              <w:top w:val="single" w:color="CCCCCC" w:sz="1"/>
+              <w:left w:val="single" w:color="CCCCCC" w:sz="1"/>
+              <w:bottom w:val="single" w:color="CCCCCC" w:sz="1"/>
+              <w:right w:val="single" w:color="CCCCCC" w:sz="1"/>
+            </w:tcBorders>
+            <w:tcMar>
+              <w:top w:type="dxa" w:w="80"/>
+              <w:left w:type="dxa" w:w="120"/>
+              <w:bottom w:type="dxa" w:w="80"/>
+              <w:right w:type="dxa" w:w="120"/>
+            </w:tcMar>
+          </w:tcPr>
+          <w:p>
+            <w:r>
+              <w:rPr>
+                <w:rFonts w:ascii="Arial" w:cs="Arial" w:eastAsia="Arial" w:hAnsi="Arial"/>
+                <w:sz w:val="18"/>
+                <w:szCs w:val="18"/>
+              </w:rPr>
+              <w:t xml:space="preserve">N/A</w:t>
+            </w:r>
+          </w:p>
+        </w:tc>
+        <w:tc>
+          <w:tcPr>
+            <w:tcW w:type="dxa" w:w="3660"/>
+            <w:tcBorders>
+              <w:top w:val="single" w:color="CCCCCC" w:sz="1"/>
+              <w:left w:val="single" w:color="CCCCCC" w:sz="1"/>
+              <w:bottom w:val="single" w:color="CCCCCC" w:sz="1"/>
+              <w:right w:val="single" w:color="CCCCCC" w:sz="1"/>
+            </w:tcBorders>
+            <w:tcMar>
+              <w:top w:type="dxa" w:w="80"/>
+              <w:left w:type="dxa" w:w="120"/>
+              <w:bottom w:type="dxa" w:w="80"/>
+              <w:right w:type="dxa" w:w="120"/>
+            </w:tcMar>
+          </w:tcPr>
+          <w:p>
+            <w:r>
+              <w:rPr>
+                <w:rFonts w:ascii="Arial" w:cs="Arial" w:eastAsia="Arial" w:hAnsi="Arial"/>
+                <w:sz w:val="18"/>
+                <w:szCs w:val="18"/>
+              </w:rPr>
+              <w:t xml:space="preserve">MT: valley not peak</w:t>
+            </w:r>
+          </w:p>
+        </w:tc>
+      </w:tr>
+      <w:tr>
+        <w:tc>
+          <w:tcPr>
+            <w:tcW w:type="dxa" w:w="500"/>
+            <w:tcBorders>
+              <w:top w:val="single" w:color="CCCCCC" w:sz="1"/>
+              <w:left w:val="single" w:color="CCCCCC" w:sz="1"/>
+              <w:bottom w:val="single" w:color="CCCCCC" w:sz="1"/>
+              <w:right w:val="single" w:color="CCCCCC" w:sz="1"/>
+            </w:tcBorders>
+            <w:tcMar>
+              <w:top w:type="dxa" w:w="80"/>
+              <w:left w:type="dxa" w:w="120"/>
+              <w:bottom w:type="dxa" w:w="80"/>
+              <w:right w:type="dxa" w:w="120"/>
+            </w:tcMar>
+          </w:tcPr>
+          <w:p>
+            <w:r>
+              <w:rPr>
+                <w:rFonts w:ascii="Arial" w:cs="Arial" w:eastAsia="Arial" w:hAnsi="Arial"/>
+                <w:sz w:val="18"/>
+                <w:szCs w:val="18"/>
+              </w:rPr>
+              <w:t xml:space="preserve">9</w:t>
+            </w:r>
+          </w:p>
+        </w:tc>
+        <w:tc>
+          <w:tcPr>
+            <w:tcW w:type="dxa" w:w="2200"/>
+            <w:tcBorders>
+              <w:top w:val="single" w:color="CCCCCC" w:sz="1"/>
+              <w:left w:val="single" w:color="CCCCCC" w:sz="1"/>
+              <w:bottom w:val="single" w:color="CCCCCC" w:sz="1"/>
+              <w:right w:val="single" w:color="CCCCCC" w:sz="1"/>
+            </w:tcBorders>
+            <w:tcMar>
+              <w:top w:type="dxa" w:w="80"/>
+              <w:left w:type="dxa" w:w="120"/>
+              <w:bottom w:type="dxa" w:w="80"/>
+              <w:right w:type="dxa" w:w="120"/>
+            </w:tcMar>
+          </w:tcPr>
+          <w:p>
+            <w:r>
+              <w:rPr>
+                <w:rFonts w:ascii="Arial" w:cs="Arial" w:eastAsia="Arial" w:hAnsi="Arial"/>
+                <w:sz w:val="18"/>
+                <w:szCs w:val="18"/>
+              </w:rPr>
+              <w:t xml:space="preserve">Ionospheric D-layer</w:t>
+            </w:r>
+          </w:p>
+        </w:tc>
+        <w:tc>
+          <w:tcPr>
+            <w:tcW w:type="dxa" w:w="1200"/>
+            <w:tcBorders>
+              <w:top w:val="single" w:color="CCCCCC" w:sz="1"/>
+              <w:left w:val="single" w:color="CCCCCC" w:sz="1"/>
+              <w:bottom w:val="single" w:color="CCCCCC" w:sz="1"/>
+              <w:right w:val="single" w:color="CCCCCC" w:sz="1"/>
+            </w:tcBorders>
+            <w:tcMar>
+              <w:top w:type="dxa" w:w="80"/>
+              <w:left w:type="dxa" w:w="120"/>
+              <w:bottom w:type="dxa" w:w="80"/>
+              <w:right w:type="dxa" w:w="120"/>
+            </w:tcMar>
+          </w:tcPr>
+          <w:p>
+            <w:r>
+              <w:rPr>
+                <w:rFonts w:ascii="Arial" w:cs="Arial" w:eastAsia="Arial" w:hAnsi="Arial"/>
+                <w:sz w:val="18"/>
+                <w:szCs w:val="18"/>
+              </w:rPr>
+              <w:t xml:space="preserve">H₀, λg</w:t>
+            </w:r>
+          </w:p>
+        </w:tc>
+        <w:tc>
+          <w:tcPr>
+            <w:tcW w:type="dxa" w:w="1800"/>
+            <w:tcBorders>
+              <w:top w:val="single" w:color="CCCCCC" w:sz="1"/>
+              <w:left w:val="single" w:color="CCCCCC" w:sz="1"/>
+              <w:bottom w:val="single" w:color="CCCCCC" w:sz="1"/>
+              <w:right w:val="single" w:color="CCCCCC" w:sz="1"/>
+            </w:tcBorders>
+            <w:tcMar>
+              <w:top w:type="dxa" w:w="80"/>
+              <w:left w:type="dxa" w:w="120"/>
+              <w:bottom w:type="dxa" w:w="80"/>
+              <w:right w:type="dxa" w:w="120"/>
+            </w:tcMar>
+          </w:tcPr>
+          <w:p>
+            <w:r>
+              <w:rPr>
+                <w:rFonts w:ascii="Arial" w:cs="Arial" w:eastAsia="Arial" w:hAnsi="Arial"/>
+                <w:sz w:val="18"/>
+                <w:szCs w:val="18"/>
+              </w:rPr>
+              <w:t xml:space="preserve">YES</w:t>
+            </w:r>
+          </w:p>
+        </w:tc>
+        <w:tc>
+          <w:tcPr>
+            <w:tcW w:type="dxa" w:w="3660"/>
+            <w:tcBorders>
+              <w:top w:val="single" w:color="CCCCCC" w:sz="1"/>
+              <w:left w:val="single" w:color="CCCCCC" w:sz="1"/>
+              <w:bottom w:val="single" w:color="CCCCCC" w:sz="1"/>
+              <w:right w:val="single" w:color="CCCCCC" w:sz="1"/>
+            </w:tcBorders>
+            <w:tcMar>
+              <w:top w:type="dxa" w:w="80"/>
+              <w:left w:type="dxa" w:w="120"/>
+              <w:bottom w:type="dxa" w:w="80"/>
+              <w:right w:type="dxa" w:w="120"/>
+            </w:tcMar>
+          </w:tcPr>
+          <w:p>
+            <w:r>
+              <w:rPr>
+                <w:rFonts w:ascii="Arial" w:cs="Arial" w:eastAsia="Arial" w:hAnsi="Arial"/>
+                <w:sz w:val="18"/>
+                <w:szCs w:val="18"/>
+              </w:rPr>
+              <w:t xml:space="preserve">Known since 1920s</w:t>
+            </w:r>
+          </w:p>
+        </w:tc>
+      </w:tr>
+      <w:tr>
+        <w:tc>
+          <w:tcPr>
+            <w:tcW w:type="dxa" w:w="500"/>
+            <w:tcBorders>
+              <w:top w:val="single" w:color="CCCCCC" w:sz="1"/>
+              <w:left w:val="single" w:color="CCCCCC" w:sz="1"/>
+              <w:bottom w:val="single" w:color="CCCCCC" w:sz="1"/>
+              <w:right w:val="single" w:color="CCCCCC" w:sz="1"/>
+            </w:tcBorders>
+            <w:tcMar>
+              <w:top w:type="dxa" w:w="80"/>
+              <w:left w:type="dxa" w:w="120"/>
+              <w:bottom w:type="dxa" w:w="80"/>
+              <w:right w:type="dxa" w:w="120"/>
+            </w:tcMar>
+          </w:tcPr>
+          <w:p>
+            <w:r>
+              <w:rPr>
+                <w:rFonts w:ascii="Arial" w:cs="Arial" w:eastAsia="Arial" w:hAnsi="Arial"/>
+                <w:sz w:val="18"/>
+                <w:szCs w:val="18"/>
+              </w:rPr>
+              <w:t xml:space="preserve">10</w:t>
+            </w:r>
+          </w:p>
+        </w:tc>
+        <w:tc>
+          <w:tcPr>
+            <w:tcW w:type="dxa" w:w="2200"/>
+            <w:tcBorders>
+              <w:top w:val="single" w:color="CCCCCC" w:sz="1"/>
+              <w:left w:val="single" w:color="CCCCCC" w:sz="1"/>
+              <w:bottom w:val="single" w:color="CCCCCC" w:sz="1"/>
+              <w:right w:val="single" w:color="CCCCCC" w:sz="1"/>
+            </w:tcBorders>
+            <w:tcMar>
+              <w:top w:type="dxa" w:w="80"/>
+              <w:left w:type="dxa" w:w="120"/>
+              <w:bottom w:type="dxa" w:w="80"/>
+              <w:right w:type="dxa" w:w="120"/>
+            </w:tcMar>
+          </w:tcPr>
+          <w:p>
+            <w:r>
+              <w:rPr>
+                <w:rFonts w:ascii="Arial" w:cs="Arial" w:eastAsia="Arial" w:hAnsi="Arial"/>
+                <w:sz w:val="18"/>
+                <w:szCs w:val="18"/>
+              </w:rPr>
+              <w:t xml:space="preserve">Mascon Gravity</w:t>
+            </w:r>
+          </w:p>
+        </w:tc>
+        <w:tc>
+          <w:tcPr>
+            <w:tcW w:type="dxa" w:w="1200"/>
+            <w:tcBorders>
+              <w:top w:val="single" w:color="CCCCCC" w:sz="1"/>
+              <w:left w:val="single" w:color="CCCCCC" w:sz="1"/>
+              <w:bottom w:val="single" w:color="CCCCCC" w:sz="1"/>
+              <w:right w:val="single" w:color="CCCCCC" w:sz="1"/>
+            </w:tcBorders>
+            <w:tcMar>
+              <w:top w:type="dxa" w:w="80"/>
+              <w:left w:type="dxa" w:w="120"/>
+              <w:bottom w:type="dxa" w:w="80"/>
+              <w:right w:type="dxa" w:w="120"/>
+            </w:tcMar>
+          </w:tcPr>
+          <w:p>
+            <w:r>
+              <w:rPr>
+                <w:rFonts w:ascii="Arial" w:cs="Arial" w:eastAsia="Arial" w:hAnsi="Arial"/>
+                <w:sz w:val="18"/>
+                <w:szCs w:val="18"/>
+              </w:rPr>
+              <w:t xml:space="preserve">λg</w:t>
+            </w:r>
+          </w:p>
+        </w:tc>
+        <w:tc>
+          <w:tcPr>
+            <w:tcW w:type="dxa" w:w="1800"/>
+            <w:tcBorders>
+              <w:top w:val="single" w:color="CCCCCC" w:sz="1"/>
+              <w:left w:val="single" w:color="CCCCCC" w:sz="1"/>
+              <w:bottom w:val="single" w:color="CCCCCC" w:sz="1"/>
+              <w:right w:val="single" w:color="CCCCCC" w:sz="1"/>
+            </w:tcBorders>
+            <w:tcMar>
+              <w:top w:type="dxa" w:w="80"/>
+              <w:left w:type="dxa" w:w="120"/>
+              <w:bottom w:type="dxa" w:w="80"/>
+              <w:right w:type="dxa" w:w="120"/>
+            </w:tcMar>
+          </w:tcPr>
+          <w:p>
+            <w:r>
+              <w:rPr>
+                <w:rFonts w:ascii="Arial" w:cs="Arial" w:eastAsia="Arial" w:hAnsi="Arial"/>
+                <w:sz w:val="18"/>
+                <w:szCs w:val="18"/>
+              </w:rPr>
+              <w:t xml:space="preserve">YES</w:t>
+            </w:r>
+          </w:p>
+        </w:tc>
+        <w:tc>
+          <w:tcPr>
+            <w:tcW w:type="dxa" w:w="3660"/>
+            <w:tcBorders>
+              <w:top w:val="single" w:color="CCCCCC" w:sz="1"/>
+              <w:left w:val="single" w:color="CCCCCC" w:sz="1"/>
+              <w:bottom w:val="single" w:color="CCCCCC" w:sz="1"/>
+              <w:right w:val="single" w:color="CCCCCC" w:sz="1"/>
+            </w:tcBorders>
+            <w:tcMar>
+              <w:top w:type="dxa" w:w="80"/>
+              <w:left w:type="dxa" w:w="120"/>
+              <w:bottom w:type="dxa" w:w="80"/>
+              <w:right w:type="dxa" w:w="120"/>
+            </w:tcMar>
+          </w:tcPr>
+          <w:p>
+            <w:r>
+              <w:rPr>
+                <w:rFonts w:ascii="Arial" w:cs="Arial" w:eastAsia="Arial" w:hAnsi="Arial"/>
+                <w:sz w:val="18"/>
+                <w:szCs w:val="18"/>
+              </w:rPr>
+              <w:t xml:space="preserve">Mapped from orbit</w:t>
+            </w:r>
+          </w:p>
+        </w:tc>
+      </w:tr>
+      <w:tr>
+        <w:tc>
+          <w:tcPr>
+            <w:tcW w:type="dxa" w:w="500"/>
+            <w:tcBorders>
+              <w:top w:val="single" w:color="CCCCCC" w:sz="1"/>
+              <w:left w:val="single" w:color="CCCCCC" w:sz="1"/>
+              <w:bottom w:val="single" w:color="CCCCCC" w:sz="1"/>
+              <w:right w:val="single" w:color="CCCCCC" w:sz="1"/>
+            </w:tcBorders>
+            <w:tcMar>
+              <w:top w:type="dxa" w:w="80"/>
+              <w:left w:type="dxa" w:w="120"/>
+              <w:bottom w:type="dxa" w:w="80"/>
+              <w:right w:type="dxa" w:w="120"/>
+            </w:tcMar>
+          </w:tcPr>
+          <w:p>
+            <w:r>
+              <w:rPr>
+                <w:rFonts w:ascii="Arial" w:cs="Arial" w:eastAsia="Arial" w:hAnsi="Arial"/>
+                <w:sz w:val="18"/>
+                <w:szCs w:val="18"/>
+              </w:rPr>
+              <w:t xml:space="preserve">11</w:t>
+            </w:r>
+          </w:p>
+        </w:tc>
+        <w:tc>
+          <w:tcPr>
+            <w:tcW w:type="dxa" w:w="2200"/>
+            <w:tcBorders>
+              <w:top w:val="single" w:color="CCCCCC" w:sz="1"/>
+              <w:left w:val="single" w:color="CCCCCC" w:sz="1"/>
+              <w:bottom w:val="single" w:color="CCCCCC" w:sz="1"/>
+              <w:right w:val="single" w:color="CCCCCC" w:sz="1"/>
+            </w:tcBorders>
+            <w:tcMar>
+              <w:top w:type="dxa" w:w="80"/>
+              <w:left w:type="dxa" w:w="120"/>
+              <w:bottom w:type="dxa" w:w="80"/>
+              <w:right w:type="dxa" w:w="120"/>
+            </w:tcMar>
+          </w:tcPr>
+          <w:p>
+            <w:r>
+              <w:rPr>
+                <w:rFonts w:ascii="Arial" w:cs="Arial" w:eastAsia="Arial" w:hAnsi="Arial"/>
+                <w:sz w:val="18"/>
+                <w:szCs w:val="18"/>
+              </w:rPr>
+              <w:t xml:space="preserve">Solar Ang. Diameter</w:t>
+            </w:r>
+          </w:p>
+        </w:tc>
+        <w:tc>
+          <w:tcPr>
+            <w:tcW w:type="dxa" w:w="1200"/>
+            <w:tcBorders>
+              <w:top w:val="single" w:color="CCCCCC" w:sz="1"/>
+              <w:left w:val="single" w:color="CCCCCC" w:sz="1"/>
+              <w:bottom w:val="single" w:color="CCCCCC" w:sz="1"/>
+              <w:right w:val="single" w:color="CCCCCC" w:sz="1"/>
+            </w:tcBorders>
+            <w:tcMar>
+              <w:top w:type="dxa" w:w="80"/>
+              <w:left w:type="dxa" w:w="120"/>
+              <w:bottom w:type="dxa" w:w="80"/>
+              <w:right w:type="dxa" w:w="120"/>
+            </w:tcMar>
+          </w:tcPr>
+          <w:p>
+            <w:r>
+              <w:rPr>
+                <w:rFonts w:ascii="Arial" w:cs="Arial" w:eastAsia="Arial" w:hAnsi="Arial"/>
+                <w:sz w:val="18"/>
+                <w:szCs w:val="18"/>
+              </w:rPr>
+              <w:t xml:space="preserve">H₀, λg</w:t>
+            </w:r>
+          </w:p>
+        </w:tc>
+        <w:tc>
+          <w:tcPr>
+            <w:tcW w:type="dxa" w:w="1800"/>
+            <w:tcBorders>
+              <w:top w:val="single" w:color="CCCCCC" w:sz="1"/>
+              <w:left w:val="single" w:color="CCCCCC" w:sz="1"/>
+              <w:bottom w:val="single" w:color="CCCCCC" w:sz="1"/>
+              <w:right w:val="single" w:color="CCCCCC" w:sz="1"/>
+            </w:tcBorders>
+            <w:tcMar>
+              <w:top w:type="dxa" w:w="80"/>
+              <w:left w:type="dxa" w:w="120"/>
+              <w:bottom w:type="dxa" w:w="80"/>
+              <w:right w:type="dxa" w:w="120"/>
+            </w:tcMar>
+          </w:tcPr>
+          <w:p>
+            <w:r>
+              <w:rPr>
+                <w:rFonts w:ascii="Arial" w:cs="Arial" w:eastAsia="Arial" w:hAnsi="Arial"/>
+                <w:sz w:val="18"/>
+                <w:szCs w:val="18"/>
+              </w:rPr>
+              <w:t xml:space="preserve">YES</w:t>
+            </w:r>
+          </w:p>
+        </w:tc>
+        <w:tc>
+          <w:tcPr>
+            <w:tcW w:type="dxa" w:w="3660"/>
+            <w:tcBorders>
+              <w:top w:val="single" w:color="CCCCCC" w:sz="1"/>
+              <w:left w:val="single" w:color="CCCCCC" w:sz="1"/>
+              <w:bottom w:val="single" w:color="CCCCCC" w:sz="1"/>
+              <w:right w:val="single" w:color="CCCCCC" w:sz="1"/>
+            </w:tcBorders>
+            <w:tcMar>
+              <w:top w:type="dxa" w:w="80"/>
+              <w:left w:type="dxa" w:w="120"/>
+              <w:bottom w:type="dxa" w:w="80"/>
+              <w:right w:type="dxa" w:w="120"/>
+            </w:tcMar>
+          </w:tcPr>
+          <w:p>
+            <w:r>
+              <w:rPr>
+                <w:rFonts w:ascii="Arial" w:cs="Arial" w:eastAsia="Arial" w:hAnsi="Arial"/>
+                <w:sz w:val="18"/>
+                <w:szCs w:val="18"/>
+              </w:rPr>
+              <w:t xml:space="preserve">Matches eccentricity</w:t>
+            </w:r>
+          </w:p>
+        </w:tc>
+      </w:tr>
+      <w:tr>
+        <w:tc>
+          <w:tcPr>
+            <w:tcW w:type="dxa" w:w="500"/>
+            <w:tcBorders>
+              <w:top w:val="single" w:color="CCCCCC" w:sz="1"/>
+              <w:left w:val="single" w:color="CCCCCC" w:sz="1"/>
+              <w:bottom w:val="single" w:color="CCCCCC" w:sz="1"/>
+              <w:right w:val="single" w:color="CCCCCC" w:sz="1"/>
+            </w:tcBorders>
+            <w:tcMar>
+              <w:top w:type="dxa" w:w="80"/>
+              <w:left w:type="dxa" w:w="120"/>
+              <w:bottom w:type="dxa" w:w="80"/>
+              <w:right w:type="dxa" w:w="120"/>
+            </w:tcMar>
+          </w:tcPr>
+          <w:p>
+            <w:r>
+              <w:rPr>
+                <w:rFonts w:ascii="Arial" w:cs="Arial" w:eastAsia="Arial" w:hAnsi="Arial"/>
+                <w:sz w:val="18"/>
+                <w:szCs w:val="18"/>
+              </w:rPr>
+              <w:t xml:space="preserve">12</w:t>
+            </w:r>
+          </w:p>
+        </w:tc>
+        <w:tc>
+          <w:tcPr>
+            <w:tcW w:type="dxa" w:w="2200"/>
+            <w:tcBorders>
+              <w:top w:val="single" w:color="CCCCCC" w:sz="1"/>
+              <w:left w:val="single" w:color="CCCCCC" w:sz="1"/>
+              <w:bottom w:val="single" w:color="CCCCCC" w:sz="1"/>
+              <w:right w:val="single" w:color="CCCCCC" w:sz="1"/>
+            </w:tcBorders>
+            <w:tcMar>
+              <w:top w:type="dxa" w:w="80"/>
+              <w:left w:type="dxa" w:w="120"/>
+              <w:bottom w:type="dxa" w:w="80"/>
+              <w:right w:type="dxa" w:w="120"/>
+            </w:tcMar>
+          </w:tcPr>
+          <w:p>
+            <w:r>
+              <w:rPr>
+                <w:rFonts w:ascii="Arial" w:cs="Arial" w:eastAsia="Arial" w:hAnsi="Arial"/>
+                <w:sz w:val="18"/>
+                <w:szCs w:val="18"/>
+              </w:rPr>
+              <w:t xml:space="preserve">Kp–SR Suppression</w:t>
+            </w:r>
+          </w:p>
+        </w:tc>
+        <w:tc>
+          <w:tcPr>
+            <w:tcW w:type="dxa" w:w="1200"/>
+            <w:tcBorders>
+              <w:top w:val="single" w:color="CCCCCC" w:sz="1"/>
+              <w:left w:val="single" w:color="CCCCCC" w:sz="1"/>
+              <w:bottom w:val="single" w:color="CCCCCC" w:sz="1"/>
+              <w:right w:val="single" w:color="CCCCCC" w:sz="1"/>
+            </w:tcBorders>
+            <w:tcMar>
+              <w:top w:type="dxa" w:w="80"/>
+              <w:left w:type="dxa" w:w="120"/>
+              <w:bottom w:type="dxa" w:w="80"/>
+              <w:right w:type="dxa" w:w="120"/>
+            </w:tcMar>
+          </w:tcPr>
+          <w:p>
+            <w:r>
+              <w:rPr>
+                <w:rFonts w:ascii="Arial" w:cs="Arial" w:eastAsia="Arial" w:hAnsi="Arial"/>
+                <w:sz w:val="18"/>
+                <w:szCs w:val="18"/>
+              </w:rPr>
+              <w:t xml:space="preserve">H₀, λg</w:t>
+            </w:r>
+          </w:p>
+        </w:tc>
+        <w:tc>
+          <w:tcPr>
+            <w:tcW w:type="dxa" w:w="1800"/>
+            <w:tcBorders>
+              <w:top w:val="single" w:color="CCCCCC" w:sz="1"/>
+              <w:left w:val="single" w:color="CCCCCC" w:sz="1"/>
+              <w:bottom w:val="single" w:color="CCCCCC" w:sz="1"/>
+              <w:right w:val="single" w:color="CCCCCC" w:sz="1"/>
+            </w:tcBorders>
+            <w:tcMar>
+              <w:top w:type="dxa" w:w="80"/>
+              <w:left w:type="dxa" w:w="120"/>
+              <w:bottom w:type="dxa" w:w="80"/>
+              <w:right w:type="dxa" w:w="120"/>
+            </w:tcMar>
+          </w:tcPr>
+          <w:p>
+            <w:r>
+              <w:rPr>
+                <w:rFonts w:ascii="Arial" w:cs="Arial" w:eastAsia="Arial" w:hAnsi="Arial"/>
+                <w:sz w:val="18"/>
+                <w:szCs w:val="18"/>
+              </w:rPr>
+              <w:t xml:space="preserve">YES</w:t>
+            </w:r>
+          </w:p>
+        </w:tc>
+        <w:tc>
+          <w:tcPr>
+            <w:tcW w:type="dxa" w:w="3660"/>
+            <w:tcBorders>
+              <w:top w:val="single" w:color="CCCCCC" w:sz="1"/>
+              <w:left w:val="single" w:color="CCCCCC" w:sz="1"/>
+              <w:bottom w:val="single" w:color="CCCCCC" w:sz="1"/>
+              <w:right w:val="single" w:color="CCCCCC" w:sz="1"/>
+            </w:tcBorders>
+            <w:tcMar>
+              <w:top w:type="dxa" w:w="80"/>
+              <w:left w:type="dxa" w:w="120"/>
+              <w:bottom w:type="dxa" w:w="80"/>
+              <w:right w:type="dxa" w:w="120"/>
+            </w:tcMar>
+          </w:tcPr>
+          <w:p>
+            <w:r>
+              <w:rPr>
+                <w:rFonts w:ascii="Arial" w:cs="Arial" w:eastAsia="Arial" w:hAnsi="Arial"/>
+                <w:sz w:val="18"/>
+                <w:szCs w:val="18"/>
+              </w:rPr>
+              <w:t xml:space="preserve">Both predict correlation</w:t>
+            </w:r>
+          </w:p>
+        </w:tc>
+      </w:tr>
+      <w:tr>
+        <w:tc>
+          <w:tcPr>
+            <w:tcW w:type="dxa" w:w="500"/>
+            <w:tcBorders>
+              <w:top w:val="single" w:color="CCCCCC" w:sz="1"/>
+              <w:left w:val="single" w:color="CCCCCC" w:sz="1"/>
+              <w:bottom w:val="single" w:color="CCCCCC" w:sz="1"/>
+              <w:right w:val="single" w:color="CCCCCC" w:sz="1"/>
+            </w:tcBorders>
+            <w:tcMar>
+              <w:top w:type="dxa" w:w="80"/>
+              <w:left w:type="dxa" w:w="120"/>
+              <w:bottom w:type="dxa" w:w="80"/>
+              <w:right w:type="dxa" w:w="120"/>
+            </w:tcMar>
+          </w:tcPr>
+          <w:p>
+            <w:r>
+              <w:rPr>
+                <w:rFonts w:ascii="Arial" w:cs="Arial" w:eastAsia="Arial" w:hAnsi="Arial"/>
+                <w:sz w:val="18"/>
+                <w:szCs w:val="18"/>
+              </w:rPr>
+              <w:t xml:space="preserve">13</w:t>
+            </w:r>
+          </w:p>
+        </w:tc>
+        <w:tc>
+          <w:tcPr>
+            <w:tcW w:type="dxa" w:w="2200"/>
+            <w:tcBorders>
+              <w:top w:val="single" w:color="CCCCCC" w:sz="1"/>
+              <w:left w:val="single" w:color="CCCCCC" w:sz="1"/>
+              <w:bottom w:val="single" w:color="CCCCCC" w:sz="1"/>
+              <w:right w:val="single" w:color="CCCCCC" w:sz="1"/>
+            </w:tcBorders>
+            <w:tcMar>
+              <w:top w:type="dxa" w:w="80"/>
+              <w:left w:type="dxa" w:w="120"/>
+              <w:bottom w:type="dxa" w:w="80"/>
+              <w:right w:type="dxa" w:w="120"/>
+            </w:tcMar>
+          </w:tcPr>
+          <w:p>
+            <w:r>
+              <w:rPr>
+                <w:rFonts w:ascii="Arial" w:cs="Arial" w:eastAsia="Arial" w:hAnsi="Arial"/>
+                <w:sz w:val="18"/>
+                <w:szCs w:val="18"/>
+              </w:rPr>
+              <w:t xml:space="preserve">Solar Wind Pressure</w:t>
+            </w:r>
+          </w:p>
+        </w:tc>
+        <w:tc>
+          <w:tcPr>
+            <w:tcW w:type="dxa" w:w="1200"/>
+            <w:tcBorders>
+              <w:top w:val="single" w:color="CCCCCC" w:sz="1"/>
+              <w:left w:val="single" w:color="CCCCCC" w:sz="1"/>
+              <w:bottom w:val="single" w:color="CCCCCC" w:sz="1"/>
+              <w:right w:val="single" w:color="CCCCCC" w:sz="1"/>
+            </w:tcBorders>
+            <w:tcMar>
+              <w:top w:type="dxa" w:w="80"/>
+              <w:left w:type="dxa" w:w="120"/>
+              <w:bottom w:type="dxa" w:w="80"/>
+              <w:right w:type="dxa" w:w="120"/>
+            </w:tcMar>
+          </w:tcPr>
+          <w:p>
+            <w:r>
+              <w:rPr>
+                <w:rFonts w:ascii="Arial" w:cs="Arial" w:eastAsia="Arial" w:hAnsi="Arial"/>
+                <w:sz w:val="18"/>
+                <w:szCs w:val="18"/>
+              </w:rPr>
+              <w:t xml:space="preserve">λg</w:t>
+            </w:r>
+          </w:p>
+        </w:tc>
+        <w:tc>
+          <w:tcPr>
+            <w:tcW w:type="dxa" w:w="1800"/>
+            <w:tcBorders>
+              <w:top w:val="single" w:color="CCCCCC" w:sz="1"/>
+              <w:left w:val="single" w:color="CCCCCC" w:sz="1"/>
+              <w:bottom w:val="single" w:color="CCCCCC" w:sz="1"/>
+              <w:right w:val="single" w:color="CCCCCC" w:sz="1"/>
+            </w:tcBorders>
+            <w:tcMar>
+              <w:top w:type="dxa" w:w="80"/>
+              <w:left w:type="dxa" w:w="120"/>
+              <w:bottom w:type="dxa" w:w="80"/>
+              <w:right w:type="dxa" w:w="120"/>
+            </w:tcMar>
+          </w:tcPr>
+          <w:p>
+            <w:r>
+              <w:rPr>
+                <w:rFonts w:ascii="Arial" w:cs="Arial" w:eastAsia="Arial" w:hAnsi="Arial"/>
+                <w:sz w:val="18"/>
+                <w:szCs w:val="18"/>
+              </w:rPr>
+              <w:t xml:space="preserve">YES</w:t>
+            </w:r>
+          </w:p>
+        </w:tc>
+        <w:tc>
+          <w:tcPr>
+            <w:tcW w:type="dxa" w:w="3660"/>
+            <w:tcBorders>
+              <w:top w:val="single" w:color="CCCCCC" w:sz="1"/>
+              <w:left w:val="single" w:color="CCCCCC" w:sz="1"/>
+              <w:bottom w:val="single" w:color="CCCCCC" w:sz="1"/>
+              <w:right w:val="single" w:color="CCCCCC" w:sz="1"/>
+            </w:tcBorders>
+            <w:tcMar>
+              <w:top w:type="dxa" w:w="80"/>
+              <w:left w:type="dxa" w:w="120"/>
+              <w:bottom w:type="dxa" w:w="80"/>
+              <w:right w:type="dxa" w:w="120"/>
+            </w:tcMar>
+          </w:tcPr>
+          <w:p>
+            <w:r>
+              <w:rPr>
+                <w:rFonts w:ascii="Arial" w:cs="Arial" w:eastAsia="Arial" w:hAnsi="Arial"/>
+                <w:sz w:val="18"/>
+                <w:szCs w:val="18"/>
+              </w:rPr>
+              <w:t xml:space="preserve">MHD since 1960s</w:t>
+            </w:r>
+          </w:p>
+        </w:tc>
+      </w:tr>
+      <w:tr>
+        <w:tc>
+          <w:tcPr>
+            <w:tcW w:type="dxa" w:w="500"/>
+            <w:tcBorders>
+              <w:top w:val="single" w:color="CCCCCC" w:sz="1"/>
+              <w:left w:val="single" w:color="CCCCCC" w:sz="1"/>
+              <w:bottom w:val="single" w:color="CCCCCC" w:sz="1"/>
+              <w:right w:val="single" w:color="CCCCCC" w:sz="1"/>
+            </w:tcBorders>
+            <w:tcMar>
+              <w:top w:type="dxa" w:w="80"/>
+              <w:left w:type="dxa" w:w="120"/>
+              <w:bottom w:type="dxa" w:w="80"/>
+              <w:right w:type="dxa" w:w="120"/>
+            </w:tcMar>
+          </w:tcPr>
+          <w:p>
+            <w:r>
+              <w:rPr>
+                <w:rFonts w:ascii="Arial" w:cs="Arial" w:eastAsia="Arial" w:hAnsi="Arial"/>
+                <w:sz w:val="18"/>
+                <w:szCs w:val="18"/>
+              </w:rPr>
+              <w:t xml:space="preserve">14</w:t>
+            </w:r>
+          </w:p>
+        </w:tc>
+        <w:tc>
+          <w:tcPr>
+            <w:tcW w:type="dxa" w:w="2200"/>
+            <w:tcBorders>
+              <w:top w:val="single" w:color="CCCCCC" w:sz="1"/>
+              <w:left w:val="single" w:color="CCCCCC" w:sz="1"/>
+              <w:bottom w:val="single" w:color="CCCCCC" w:sz="1"/>
+              <w:right w:val="single" w:color="CCCCCC" w:sz="1"/>
+            </w:tcBorders>
+            <w:tcMar>
+              <w:top w:type="dxa" w:w="80"/>
+              <w:left w:type="dxa" w:w="120"/>
+              <w:bottom w:type="dxa" w:w="80"/>
+              <w:right w:type="dxa" w:w="120"/>
+            </w:tcMar>
+          </w:tcPr>
+          <w:p>
+            <w:r>
+              <w:rPr>
+                <w:rFonts w:ascii="Arial" w:cs="Arial" w:eastAsia="Arial" w:hAnsi="Arial"/>
+                <w:sz w:val="18"/>
+                <w:szCs w:val="18"/>
+              </w:rPr>
+              <w:t xml:space="preserve">Schumann Splitting</w:t>
+            </w:r>
+          </w:p>
+        </w:tc>
+        <w:tc>
+          <w:tcPr>
+            <w:tcW w:type="dxa" w:w="1200"/>
+            <w:tcBorders>
+              <w:top w:val="single" w:color="CCCCCC" w:sz="1"/>
+              <w:left w:val="single" w:color="CCCCCC" w:sz="1"/>
+              <w:bottom w:val="single" w:color="CCCCCC" w:sz="1"/>
+              <w:right w:val="single" w:color="CCCCCC" w:sz="1"/>
+            </w:tcBorders>
+            <w:tcMar>
+              <w:top w:type="dxa" w:w="80"/>
+              <w:left w:type="dxa" w:w="120"/>
+              <w:bottom w:type="dxa" w:w="80"/>
+              <w:right w:type="dxa" w:w="120"/>
+            </w:tcMar>
+          </w:tcPr>
+          <w:p>
+            <w:r>
+              <w:rPr>
+                <w:rFonts w:ascii="Arial" w:cs="Arial" w:eastAsia="Arial" w:hAnsi="Arial"/>
+                <w:sz w:val="18"/>
+                <w:szCs w:val="18"/>
+              </w:rPr>
+              <w:t xml:space="preserve">H₀, λg</w:t>
+            </w:r>
+          </w:p>
+        </w:tc>
+        <w:tc>
+          <w:tcPr>
+            <w:tcW w:type="dxa" w:w="1800"/>
+            <w:tcBorders>
+              <w:top w:val="single" w:color="CCCCCC" w:sz="1"/>
+              <w:left w:val="single" w:color="CCCCCC" w:sz="1"/>
+              <w:bottom w:val="single" w:color="CCCCCC" w:sz="1"/>
+              <w:right w:val="single" w:color="CCCCCC" w:sz="1"/>
+            </w:tcBorders>
+            <w:tcMar>
+              <w:top w:type="dxa" w:w="80"/>
+              <w:left w:type="dxa" w:w="120"/>
+              <w:bottom w:type="dxa" w:w="80"/>
+              <w:right w:type="dxa" w:w="120"/>
+            </w:tcMar>
+          </w:tcPr>
+          <w:p>
+            <w:r>
+              <w:rPr>
+                <w:rFonts w:ascii="Arial" w:cs="Arial" w:eastAsia="Arial" w:hAnsi="Arial"/>
+                <w:sz w:val="18"/>
+                <w:szCs w:val="18"/>
+              </w:rPr>
+              <w:t xml:space="preserve">YES</w:t>
+            </w:r>
+          </w:p>
+        </w:tc>
+        <w:tc>
+          <w:tcPr>
+            <w:tcW w:type="dxa" w:w="3660"/>
+            <w:tcBorders>
+              <w:top w:val="single" w:color="CCCCCC" w:sz="1"/>
+              <w:left w:val="single" w:color="CCCCCC" w:sz="1"/>
+              <w:bottom w:val="single" w:color="CCCCCC" w:sz="1"/>
+              <w:right w:val="single" w:color="CCCCCC" w:sz="1"/>
+            </w:tcBorders>
+            <w:tcMar>
+              <w:top w:type="dxa" w:w="80"/>
+              <w:left w:type="dxa" w:w="120"/>
+              <w:bottom w:type="dxa" w:w="80"/>
+              <w:right w:type="dxa" w:w="120"/>
+            </w:tcMar>
+          </w:tcPr>
+          <w:p>
+            <w:r>
+              <w:rPr>
+                <w:rFonts w:ascii="Arial" w:cs="Arial" w:eastAsia="Arial" w:hAnsi="Arial"/>
+                <w:sz w:val="18"/>
+                <w:szCs w:val="18"/>
+              </w:rPr>
+              <w:t xml:space="preserve">Spherical asymmetry</w:t>
+            </w:r>
+          </w:p>
+        </w:tc>
+      </w:tr>
+    </w:tbl>
+    <w:p>
+      <w:pPr>
+        <w:spacing w:after="120"/>
+      </w:pPr>
+      <w:r>
+        <w:rPr>
+          <w:b/>
+          <w:bCs/>
+        </w:rPr>
+        <w:t xml:space="preserve">GROUP B — Trivially Confirmable (3 of 20): </w:t>
+      </w:r>
+      <w:r>
+        <w:t xml:space="preserve">Known physical constants or long-established phenomena that are not predictions.</w:t>
+      </w:r>
+    </w:p>
+    <w:p>
+      <w:pPr>
+        <w:spacing w:after="120"/>
+      </w:pPr>
+      <w:r>
+        <w:t xml:space="preserve">15. Lunar Magnetic Tide (M2 = 12.42h): Known since Doodson 1921. 16. Roaring 40s Wind Speed: Documented since Age of Sail; Coriolis + baroclinic instability. 17. Polaris Excess: Claimed +0.27° is within Polaris's 0.74° offset from true pole + atmospheric refraction.</w:t>
+      </w:r>
+    </w:p>
+    <w:p>
+      <w:pPr>
+        <w:spacing w:after="120"/>
+      </w:pPr>
+      <w:r>
+        <w:rPr>
+          <w:b/>
+          <w:bCs/>
+        </w:rPr>
+        <w:t xml:space="preserve">GROUP C — Potentially Testable but Problematic (3 of 20): </w:t>
+      </w:r>
+      <w:r>
+        <w:t xml:space="preserve">These domains could in principle discriminate, but each has issues.</w:t>
+      </w:r>
+    </w:p>
+    <w:p>
+      <w:pPr>
+        <w:spacing w:after="120"/>
+      </w:pPr>
+      <w:r>
+        <w:t xml:space="preserve">18. Aetheric Slipstream: Globe explains via jet stream; asymmetry vanishes on equatorial routes. 19. GPS Sagnac: GPS is built on SR + GR; without relativistic corrections it drifts ~10 km/day. 20. Eclipse 2026: Pending, but dome range (-17 to -21 nT) overlaps Chapman-mechanism range (5-20 nT); stated globe prediction of '0.0 nT' is a straw man.</w:t>
+      </w:r>
+    </w:p>
+    <w:p>
+      <w:pPr>
+        <w:spacing w:after="120"/>
+      </w:pPr>
+      <w:r>
+        <w:rPr>
+          <w:b/>
+          <w:bCs/>
+        </w:rPr>
+        <w:t xml:space="preserve">Bottom line: </w:t>
+      </w:r>
+      <w:r>
+        <w:t xml:space="preserve">14 of 20 domains share the same fitted constant and are therefore one test, not fourteen. Of the remaining 6, the globe model predicts the same or better result in 5, and the dome prediction is directly contradicted by data in 1 (Polaris). Zero of 20 domains produce a result the globe model disagrees with that the dome model uniquely explains. The 9.2-sigma figure is the product of treating correlated tests as independent; the actual statistical significance is indeterminate.</w:t>
+      </w:r>
+    </w:p>
+    <w:p>
+      <w:pPr>
+        <w:pStyle w:val="Heading3"/>
+      </w:pPr>
+      <w:r>
         <w:t xml:space="preserve">The August 2026 Eclipse: A Misrepresented Prediction</w:t>
       </w:r>
     </w:p>
@@ -11097,7 +13284,7 @@
       <w:r>
         <w:t xml:space="preserve">A </w:t>
       </w:r>
-      <w:hyperlink w:history="1" r:id="rIdhw3icdqstl3ufdptyohes">
+      <w:hyperlink w:history="1" r:id="rIdicrle31trydbhtk494t1k">
         <w:r>
           <w:rPr>
             <w:rStyle w:val="Hyperlink"/>
@@ -11108,7 +13295,7 @@
       <w:r>
         <w:t xml:space="preserve"> found detectable decreases in X, Z, and total field components during eclipses. An </w:t>
       </w:r>
-      <w:hyperlink w:history="1" r:id="rIdg2lxwtjg_t_cqy-joo_f1">
+      <w:hyperlink w:history="1" r:id="rId_qysraqmxtzqqej_eajsi">
         <w:r>
           <w:rPr>
             <w:rStyle w:val="Hyperlink"/>
@@ -11598,7 +13785,7 @@
       <w:r>
         <w:t xml:space="preserve">Continuous 24-hour sunlight. A local sun at 5,733 km circling above a flat disc cannot produce 24-hour sunlight at the disc edge. Directly observable at Amundsen-Scott Station, staffed year-round since 1957. See </w:t>
       </w:r>
-      <w:hyperlink w:history="1" r:id="rId7l7hvegn4atyzqli6e9hi">
+      <w:hyperlink w:history="1" r:id="rId4uixc-hyb-2w1zvdur2zg">
         <w:r>
           <w:rPr>
             <w:rStyle w:val="Hyperlink"/>
@@ -11647,7 +13834,7 @@
       <w:r>
         <w:t xml:space="preserve">GPS provides 1-3 meter accuracy worldwide. The ISS at 408 km is visible on predictable schedules. Geostationary satellites at 35,786 km. All require unobstructed radio paths. See </w:t>
       </w:r>
-      <w:hyperlink w:history="1" r:id="rIdft4hz9dag-u1zy6bthiuq">
+      <w:hyperlink w:history="1" r:id="rIdqyf5dxo8kvx94bzo0m9e-">
         <w:r>
           <w:rPr>
             <w:rStyle w:val="Hyperlink"/>
@@ -11658,7 +13845,7 @@
       <w:r>
         <w:t xml:space="preserve">; </w:t>
       </w:r>
-      <w:hyperlink w:history="1" r:id="rIdi-_k0iha4ujqssxyugtr3">
+      <w:hyperlink w:history="1" r:id="rIduirrhxieyckgdqorrocff">
         <w:r>
           <w:rPr>
             <w:rStyle w:val="Hyperlink"/>
@@ -11707,7 +13894,7 @@
       <w:r>
         <w:t xml:space="preserve">Modern solar calculators (</w:t>
       </w:r>
-      <w:hyperlink w:history="1" r:id="rId8fjx1hzqs8ijhxycg3n2d">
+      <w:hyperlink w:history="1" r:id="rIdo0yslyrm7fsfzyvmdhnnz">
         <w:r>
           <w:rPr>
             <w:rStyle w:val="Hyperlink"/>
@@ -11756,7 +13943,7 @@
       <w:r>
         <w:t xml:space="preserve">The </w:t>
       </w:r>
-      <w:hyperlink w:history="1" r:id="rId20f0evrsts4mtkmflzo5e">
+      <w:hyperlink w:history="1" r:id="rId5eomcnz7cxsrtbrc9-jsi">
         <w:r>
           <w:rPr>
             <w:rStyle w:val="Hyperlink"/>
@@ -11805,7 +13992,7 @@
       <w:r>
         <w:t xml:space="preserve">Earth's field is a dipole. South magnetic pole at 64.1°S, 135.9°E (</w:t>
       </w:r>
-      <w:hyperlink w:history="1" r:id="rIdfdstp_7w1xasiivwz7m5y">
+      <w:hyperlink w:history="1" r:id="rIdwgldfknk1crv7dqd2ekji">
         <w:r>
           <w:rPr>
             <w:rStyle w:val="Hyperlink"/>
@@ -11854,7 +14041,7 @@
       <w:r>
         <w:t xml:space="preserve">g = 9.780 m/s² at equator, 9.832 m/s² at poles (0.53% variation). On a flat disc, centrifugal force points outward from center, producing the OPPOSITE pattern. See </w:t>
       </w:r>
-      <w:hyperlink w:history="1" r:id="rIdd4h1fenw0srviillhzmmq">
+      <w:hyperlink w:history="1" r:id="rIdbleqvhgwqoacunr8lqaub">
         <w:r>
           <w:rPr>
             <w:rStyle w:val="Hyperlink"/>
@@ -12321,7 +14508,7 @@
         </w:rPr>
         <w:t xml:space="preserve">NOAA World Magnetic Model 2025: </w:t>
       </w:r>
-      <w:hyperlink w:history="1" r:id="rIdwq7cf3uqskfybukfkcxpl">
+      <w:hyperlink w:history="1" r:id="rIdt2h_xcbqo9jmimnnuayhe">
         <w:r>
           <w:rPr>
             <w:rStyle w:val="Hyperlink"/>
@@ -12341,7 +14528,7 @@
         </w:rPr>
         <w:t xml:space="preserve">NOAA Wandering Geomagnetic Poles: </w:t>
       </w:r>
-      <w:hyperlink w:history="1" r:id="rIdvkivppuf37f2glukbiwo0">
+      <w:hyperlink w:history="1" r:id="rIdeqxeymbrnrqs9pcvtwzsg">
         <w:r>
           <w:rPr>
             <w:rStyle w:val="Hyperlink"/>
@@ -12361,7 +14548,7 @@
         </w:rPr>
         <w:t xml:space="preserve">CHAOS-7 Geomagnetic Field Model: </w:t>
       </w:r>
-      <w:hyperlink w:history="1" r:id="rIdw7i-0u8gs2c2lg5lf_nfs">
+      <w:hyperlink w:history="1" r:id="rIdfb2z-qzq3xvelspan_u42">
         <w:r>
           <w:rPr>
             <w:rStyle w:val="Hyperlink"/>
@@ -12381,7 +14568,7 @@
         </w:rPr>
         <w:t xml:space="preserve">ESA Swarm Satellite Mission: </w:t>
       </w:r>
-      <w:hyperlink w:history="1" r:id="rIdagf8cfgsdntlsrysrbgmr">
+      <w:hyperlink w:history="1" r:id="rId3t-6dsqpegryfs93s8vbk">
         <w:r>
           <w:rPr>
             <w:rStyle w:val="Hyperlink"/>
@@ -12401,7 +14588,7 @@
         </w:rPr>
         <w:t xml:space="preserve">INTERMAGNET Observatory Network: </w:t>
       </w:r>
-      <w:hyperlink w:history="1" r:id="rId24rcxu55ucvangligimtf">
+      <w:hyperlink w:history="1" r:id="rIddemahsuvgwyhhhehxgfum">
         <w:r>
           <w:rPr>
             <w:rStyle w:val="Hyperlink"/>
@@ -12421,7 +14608,7 @@
         </w:rPr>
         <w:t xml:space="preserve">IGRF-13: </w:t>
       </w:r>
-      <w:hyperlink w:history="1" r:id="rIdmsawlqy9xg7ttq-97ndpq">
+      <w:hyperlink w:history="1" r:id="rIdixe8kwv7zcdmo-6ib6ufp">
         <w:r>
           <w:rPr>
             <w:rStyle w:val="Hyperlink"/>
@@ -12441,7 +14628,7 @@
         </w:rPr>
         <w:t xml:space="preserve">ESA Gaia Data Release 3: </w:t>
       </w:r>
-      <w:hyperlink w:history="1" r:id="rIddefam7wmn25swtqld2r9l">
+      <w:hyperlink w:history="1" r:id="rIdfnzy-szr6izrwnehu2cv_">
         <w:r>
           <w:rPr>
             <w:rStyle w:val="Hyperlink"/>
@@ -12461,7 +14648,7 @@
         </w:rPr>
         <w:t xml:space="preserve">Hipparcos Catalogue: </w:t>
       </w:r>
-      <w:hyperlink w:history="1" r:id="rId92m_5h9n3tpayxvfbhoyn">
+      <w:hyperlink w:history="1" r:id="rIdpedf6rvr0enrgjmzl51im">
         <w:r>
           <w:rPr>
             <w:rStyle w:val="Hyperlink"/>
@@ -12481,7 +14668,7 @@
         </w:rPr>
         <w:t xml:space="preserve">US Patent 787412 (Tesla): </w:t>
       </w:r>
-      <w:hyperlink w:history="1" r:id="rIdwppatdxaf2yyqptvkjpua">
+      <w:hyperlink w:history="1" r:id="rIdatlokit49su60slsbewec">
         <w:r>
           <w:rPr>
             <w:rStyle w:val="Hyperlink"/>
@@ -12501,7 +14688,7 @@
         </w:rPr>
         <w:t xml:space="preserve">NOAA Solar Position Algorithm: </w:t>
       </w:r>
-      <w:hyperlink w:history="1" r:id="rIdann0keqsmvybc2qhqnnta">
+      <w:hyperlink w:history="1" r:id="rIdswylthf8iefrbfgkalyzw">
         <w:r>
           <w:rPr>
             <w:rStyle w:val="Hyperlink"/>
@@ -12521,7 +14708,7 @@
         </w:rPr>
         <w:t xml:space="preserve">National Geodetic Survey Gravity: </w:t>
       </w:r>
-      <w:hyperlink w:history="1" r:id="rIdbcp62cwy2nssqjji_sr-h">
+      <w:hyperlink w:history="1" r:id="rIdywwsspne59gphn9xj1fko">
         <w:r>
           <w:rPr>
             <w:rStyle w:val="Hyperlink"/>
@@ -12541,7 +14728,7 @@
         </w:rPr>
         <w:t xml:space="preserve">CHIME/FRB Project: </w:t>
       </w:r>
-      <w:hyperlink w:history="1" r:id="rIdughjtfn_1ez-f03eshjjn">
+      <w:hyperlink w:history="1" r:id="rIdkmlibty8qgkjcradvyez7">
         <w:r>
           <w:rPr>
             <w:rStyle w:val="Hyperlink"/>
@@ -12561,7 +14748,7 @@
         </w:rPr>
         <w:t xml:space="preserve">GRACE-FO (gravity mapping): </w:t>
       </w:r>
-      <w:hyperlink w:history="1" r:id="rIde2ugbtcyhp2ch1khqy1tg">
+      <w:hyperlink w:history="1" r:id="rIddi2u9fv2rdjqruxobpd4d">
         <w:r>
           <w:rPr>
             <w:rStyle w:val="Hyperlink"/>
@@ -12581,7 +14768,7 @@
         </w:rPr>
         <w:t xml:space="preserve">GOCE (gravity field): </w:t>
       </w:r>
-      <w:hyperlink w:history="1" r:id="rIdneynunq125xjr1fevuouz">
+      <w:hyperlink w:history="1" r:id="rIdnlaw-smhquh4qrq9bxnlw">
         <w:r>
           <w:rPr>
             <w:rStyle w:val="Hyperlink"/>
@@ -12601,7 +14788,7 @@
         </w:rPr>
         <w:t xml:space="preserve">GPS.gov: </w:t>
       </w:r>
-      <w:hyperlink w:history="1" r:id="rIdmqxbpxootcvzv_jg6jol7">
+      <w:hyperlink w:history="1" r:id="rIdagucmbsb_j_6tsbionp_k">
         <w:r>
           <w:rPr>
             <w:rStyle w:val="Hyperlink"/>
@@ -12621,7 +14808,7 @@
         </w:rPr>
         <w:t xml:space="preserve">CelesTrak TLE Data: </w:t>
       </w:r>
-      <w:hyperlink w:history="1" r:id="rIddjuismfmu4cto7waf9fa5">
+      <w:hyperlink w:history="1" r:id="rId9fbud7umqzrzvx6za98in">
         <w:r>
           <w:rPr>
             <w:rStyle w:val="Hyperlink"/>

</xml_diff>

<commit_message>
V4.6: Add self-consistency analysis (Part 4.5)
New section works through the dome's own geometry to show its claimed
predictions don't follow from its own premises. Key findings:
- Schumann: varying-height cavity predicts ~22 Hz, not 7.83 Hz
- Gravity: aetheric pressure predicts 80% pole-equator variation (152x too large)
- Solar diameter: local sun predicts 50% daily variation (29x too large)
- Tidal forces: local moon 300,000x too strong
- SAA: axially symmetric disc can't produce longitude-dependent features
- Secular variation: static cavity has no time dependence
- Solar elevation formula is the globe's formula, not derived from dome
Identifies three substitution strategies: formula smuggling, simplified
formulas ignoring own geometry, and curve fitting declared as derivation.

Co-Authored-By: Claude Opus 4.6 <noreply@anthropic.com>
</commit_message>
<xml_diff>
--- a/downloads/critical-review-dome-model-v4.docx
+++ b/downloads/critical-review-dome-model-v4.docx
@@ -8859,7 +8859,7 @@
       <w:r>
         <w:t xml:space="preserve">US Patent 787412 (1905), publicly available at </w:t>
       </w:r>
-      <w:hyperlink w:history="1" r:id="rIdjkfo3v0e1rtazdt_m_fig">
+      <w:hyperlink w:history="1" r:id="rIdbotgicmwktgvz_lvortdi">
         <w:r>
           <w:rPr>
             <w:rStyle w:val="Hyperlink"/>
@@ -8984,7 +8984,7 @@
       <w:r>
         <w:t xml:space="preserve">James Bradley (1727) explicitly tested and rejected atmospheric refraction as an explanation: refraction is wavelength-dependent (chromatic), while stellar aberration is achromatic. Modern VLBI measurements achieve milliarcsecond precision and directly confirm aberration correlates with Earth's orbital velocity (~30 km/s). The </w:t>
       </w:r>
-      <w:hyperlink w:history="1" r:id="rIdhigjlhzwyzu0z4rxzkrlo">
+      <w:hyperlink w:history="1" r:id="rIdhbgr2gttculpvzgaykoaa">
         <w:r>
           <w:rPr>
             <w:rStyle w:val="Hyperlink"/>
@@ -9050,7 +9050,7 @@
       <w:r>
         <w:t xml:space="preserve">ESA </w:t>
       </w:r>
-      <w:hyperlink w:history="1" r:id="rIdbtvhojuklxnhwoz3sspjw">
+      <w:hyperlink w:history="1" r:id="rIdo9hsjgp8falkqvbtq_gzh">
         <w:r>
           <w:rPr>
             <w:rStyle w:val="Hyperlink"/>
@@ -9116,7 +9116,7 @@
       <w:r>
         <w:t xml:space="preserve">Crepuscular rays are parallel beams made visible by atmospheric scattering. The apparent divergence is a perspective effect. Crucially, anticrepuscular rays converge at the anti-solar point simultaneously. See </w:t>
       </w:r>
-      <w:hyperlink w:history="1" r:id="rIdt-pftcutimzsn1f_m1uur">
+      <w:hyperlink w:history="1" r:id="rIdjbykvo-c1rxpi66xbdygf">
         <w:r>
           <w:rPr>
             <w:rStyle w:val="Hyperlink"/>
@@ -9127,7 +9127,7 @@
       <w:r>
         <w:t xml:space="preserve"> and </w:t>
       </w:r>
-      <w:hyperlink w:history="1" r:id="rIdn8xtkprl7a8j9rc2syc32">
+      <w:hyperlink w:history="1" r:id="rIdlksilrbbcvwypjofgs3_u">
         <w:r>
           <w:rPr>
             <w:rStyle w:val="Hyperlink"/>
@@ -9193,7 +9193,7 @@
       <w:r>
         <w:t xml:space="preserve">NOAA officially states no evidence of anomalous disappearances. </w:t>
       </w:r>
-      <w:hyperlink w:history="1" r:id="rIdfe0jw4kx4gb9qwh58naxr">
+      <w:hyperlink w:history="1" r:id="rIdpkl-yifk9xf-f9titoavi">
         <w:r>
           <w:rPr>
             <w:rStyle w:val="Hyperlink"/>
@@ -9259,7 +9259,7 @@
       <w:r>
         <w:t xml:space="preserve">Hipparcos </w:t>
       </w:r>
-      <w:hyperlink w:history="1" r:id="rIdxb4qwlzpbkxawp-xr6pim">
+      <w:hyperlink w:history="1" r:id="rIdflqbwwln2xrwle9_80o7z">
         <w:r>
           <w:rPr>
             <w:rStyle w:val="Hyperlink"/>
@@ -9675,7 +9675,7 @@
       <w:r>
         <w:t xml:space="preserve">Terra-Nova et al. (2017, PNAS) demonstrate reversed-flux patches reproduce SAA splitting in MHD simulations. The </w:t>
       </w:r>
-      <w:hyperlink w:history="1" r:id="rIdig-ckoe4gymihqltmvpfe">
+      <w:hyperlink w:history="1" r:id="rIdpisby8vlkyfkmvfqtlozg">
         <w:r>
           <w:rPr>
             <w:rStyle w:val="Hyperlink"/>
@@ -9686,7 +9686,7 @@
       <w:r>
         <w:t xml:space="preserve"> documents the evolution quantitatively. </w:t>
       </w:r>
-      <w:hyperlink w:history="1" r:id="rIdbzdn4yccjg91ima0iqnbe">
+      <w:hyperlink w:history="1" r:id="rId6qoof5c5xfkdqreomhh1a">
         <w:r>
           <w:rPr>
             <w:rStyle w:val="Hyperlink"/>
@@ -9737,7 +9737,7 @@
       <w:r>
         <w:t xml:space="preserve">Normal secular variation documented by </w:t>
       </w:r>
-      <w:hyperlink w:history="1" r:id="rIdlh-vlxeij6htpbvb_7ixw">
+      <w:hyperlink w:history="1" r:id="rIdn4zgqrriahmlrcgxttepf">
         <w:r>
           <w:rPr>
             <w:rStyle w:val="Hyperlink"/>
@@ -9804,7 +9804,7 @@
       <w:r>
         <w:t xml:space="preserve">Eclipse-induced perturbations predicted by Chapman (1933) via ionospheric conductivity drops. Data from </w:t>
       </w:r>
-      <w:hyperlink w:history="1" r:id="rIdik4qsiyodc0hlwgt4uj0q">
+      <w:hyperlink w:history="1" r:id="rIdw7hpfkes8h1hxosaezmke">
         <w:r>
           <w:rPr>
             <w:rStyle w:val="Hyperlink"/>
@@ -9892,7 +9892,7 @@
       <w:r>
         <w:t xml:space="preserve">The formula used is for a quarter-wave linear waveguide, not a spherical cavity. Correct formula f = c/(2*pi*R) gives R = 6,098 km, within 4% of Earth's radius. The ionosphere IS conductive (</w:t>
       </w:r>
-      <w:hyperlink w:history="1" r:id="rIdg-iihly7nsemyqr80ve9y">
+      <w:hyperlink w:history="1" r:id="rId-9jd-qhkb7sx3c6ksgl8e">
         <w:r>
           <w:rPr>
             <w:rStyle w:val="Hyperlink"/>
@@ -9959,7 +9959,7 @@
       <w:r>
         <w:t xml:space="preserve">All five observations already predicted by </w:t>
       </w:r>
-      <w:hyperlink w:history="1" r:id="rId0yirsacp4pzz4v9btb7qr">
+      <w:hyperlink w:history="1" r:id="rIddeznshdonc1bpaqyl3tnu">
         <w:r>
           <w:rPr>
             <w:rStyle w:val="Hyperlink"/>
@@ -9970,7 +9970,7 @@
       <w:r>
         <w:t xml:space="preserve">, </w:t>
       </w:r>
-      <w:hyperlink w:history="1" r:id="rIdc6gcogvpmgvd1if4pj4_a">
+      <w:hyperlink w:history="1" r:id="rIdcbyvhl_9zlf2uir5r7aeo">
         <w:r>
           <w:rPr>
             <w:rStyle w:val="Hyperlink"/>
@@ -10297,7 +10297,7 @@
       <w:r>
         <w:t xml:space="preserve">Antarctic gravity anomalies are mapped from orbit by </w:t>
       </w:r>
-      <w:hyperlink w:history="1" r:id="rIdmnmnfaw4jierdkyph_gvo">
+      <w:hyperlink w:history="1" r:id="rId2nlb1c1c28ppnd_zirwzn">
         <w:r>
           <w:rPr>
             <w:rStyle w:val="Hyperlink"/>
@@ -10308,7 +10308,7 @@
       <w:r>
         <w:t xml:space="preserve"> and </w:t>
       </w:r>
-      <w:hyperlink w:history="1" r:id="rIdvyvoc-am3pi6k0alnijzy">
+      <w:hyperlink w:history="1" r:id="rIdfoezagdny-4dwfo5rnena">
         <w:r>
           <w:rPr>
             <w:rStyle w:val="Hyperlink"/>
@@ -13284,7 +13284,7 @@
       <w:r>
         <w:t xml:space="preserve">A </w:t>
       </w:r>
-      <w:hyperlink w:history="1" r:id="rIdicrle31trydbhtk494t1k">
+      <w:hyperlink w:history="1" r:id="rId8jaqa4uvnw1-o0scgmbhp">
         <w:r>
           <w:rPr>
             <w:rStyle w:val="Hyperlink"/>
@@ -13295,7 +13295,7 @@
       <w:r>
         <w:t xml:space="preserve"> found detectable decreases in X, Z, and total field components during eclipses. An </w:t>
       </w:r>
-      <w:hyperlink w:history="1" r:id="rId_qysraqmxtzqqej_eajsi">
+      <w:hyperlink w:history="1" r:id="rIdjvzvnzb1zqwef06vlmjcb">
         <w:r>
           <w:rPr>
             <w:rStyle w:val="Hyperlink"/>
@@ -13785,7 +13785,7 @@
       <w:r>
         <w:t xml:space="preserve">Continuous 24-hour sunlight. A local sun at 5,733 km circling above a flat disc cannot produce 24-hour sunlight at the disc edge. Directly observable at Amundsen-Scott Station, staffed year-round since 1957. See </w:t>
       </w:r>
-      <w:hyperlink w:history="1" r:id="rId4uixc-hyb-2w1zvdur2zg">
+      <w:hyperlink w:history="1" r:id="rIdsf43jszz9oeeuomtjqquc">
         <w:r>
           <w:rPr>
             <w:rStyle w:val="Hyperlink"/>
@@ -13834,7 +13834,7 @@
       <w:r>
         <w:t xml:space="preserve">GPS provides 1-3 meter accuracy worldwide. The ISS at 408 km is visible on predictable schedules. Geostationary satellites at 35,786 km. All require unobstructed radio paths. See </w:t>
       </w:r>
-      <w:hyperlink w:history="1" r:id="rIdqyf5dxo8kvx94bzo0m9e-">
+      <w:hyperlink w:history="1" r:id="rIdzgbxp421b79scfcdn8mt0">
         <w:r>
           <w:rPr>
             <w:rStyle w:val="Hyperlink"/>
@@ -13845,7 +13845,7 @@
       <w:r>
         <w:t xml:space="preserve">; </w:t>
       </w:r>
-      <w:hyperlink w:history="1" r:id="rIduirrhxieyckgdqorrocff">
+      <w:hyperlink w:history="1" r:id="rIdnbdcmtp22efmti4tm_j2t">
         <w:r>
           <w:rPr>
             <w:rStyle w:val="Hyperlink"/>
@@ -13894,7 +13894,7 @@
       <w:r>
         <w:t xml:space="preserve">Modern solar calculators (</w:t>
       </w:r>
-      <w:hyperlink w:history="1" r:id="rIdo0yslyrm7fsfzyvmdhnnz">
+      <w:hyperlink w:history="1" r:id="rId_ajb6otrnwl936kattea_">
         <w:r>
           <w:rPr>
             <w:rStyle w:val="Hyperlink"/>
@@ -13943,7 +13943,7 @@
       <w:r>
         <w:t xml:space="preserve">The </w:t>
       </w:r>
-      <w:hyperlink w:history="1" r:id="rId5eomcnz7cxsrtbrc9-jsi">
+      <w:hyperlink w:history="1" r:id="rIdzaalfnzfztnpetg52gijo">
         <w:r>
           <w:rPr>
             <w:rStyle w:val="Hyperlink"/>
@@ -13992,7 +13992,7 @@
       <w:r>
         <w:t xml:space="preserve">Earth's field is a dipole. South magnetic pole at 64.1°S, 135.9°E (</w:t>
       </w:r>
-      <w:hyperlink w:history="1" r:id="rIdwgldfknk1crv7dqd2ekji">
+      <w:hyperlink w:history="1" r:id="rIdijvpmxesyvtwoaxwm6xmw">
         <w:r>
           <w:rPr>
             <w:rStyle w:val="Hyperlink"/>
@@ -14041,7 +14041,7 @@
       <w:r>
         <w:t xml:space="preserve">g = 9.780 m/s² at equator, 9.832 m/s² at poles (0.53% variation). On a flat disc, centrifugal force points outward from center, producing the OPPOSITE pattern. See </w:t>
       </w:r>
-      <w:hyperlink w:history="1" r:id="rIdbleqvhgwqoacunr8lqaub">
+      <w:hyperlink w:history="1" r:id="rIddlgszhqpqfbgvd4sutedm">
         <w:r>
           <w:rPr>
             <w:rStyle w:val="Hyperlink"/>
@@ -14063,6 +14063,362 @@
         <w:pStyle w:val="Heading1"/>
       </w:pPr>
       <w:r>
+        <w:t xml:space="preserve">Part 4.5: Self-Consistency — Does the Dome’s Own Geometry Produce Its Claimed Predictions?</w:t>
+      </w:r>
+    </w:p>
+    <w:p>
+      <w:pPr>
+        <w:spacing w:after="120"/>
+      </w:pPr>
+      <w:r>
+        <w:t xml:space="preserve">A striking pattern emerges in the 20-domain analysis: many dome 'predictions' match globe predictions despite starting from radically different premises (flat disc vs. oblate spheroid, local sun vs. distant sun, aetheric medium vs. vacuum). This section asks: if you actually work through the physics of the dome's own stated geometry, do you get the numbers the author claims? In most cases, the answer is no. The author achieves agreement with observations by quietly substituting globe-derived formulas or by fitting parameters to observed values rather than deriving them from his geometry.</w:t>
+      </w:r>
+    </w:p>
+    <w:p>
+      <w:pPr>
+        <w:pStyle w:val="Heading2"/>
+      </w:pPr>
+      <w:r>
+        <w:t xml:space="preserve">4.5.1 Schumann Resonance: Wrong Formula for His Own Cavity</w:t>
+      </w:r>
+    </w:p>
+    <w:p>
+      <w:pPr>
+        <w:spacing w:after="120"/>
+      </w:pPr>
+      <w:r>
+        <w:rPr>
+          <w:b/>
+          <w:bCs/>
+        </w:rPr>
+        <w:t xml:space="preserve">Author's formula: </w:t>
+      </w:r>
+      <w:r>
+        <w:t xml:space="preserve">f = c/(4H₀) = 299,792/(4×8,537) = 8.78 Hz. He then claims this matches 7.83 Hz (it doesn't — 12% error — but set that aside).</w:t>
+      </w:r>
+    </w:p>
+    <w:p>
+      <w:pPr>
+        <w:spacing w:after="120"/>
+      </w:pPr>
+      <w:r>
+        <w:rPr>
+          <w:b/>
+          <w:bCs/>
+        </w:rPr>
+        <w:t xml:space="preserve">The real problem: </w:t>
+      </w:r>
+      <w:r>
+        <w:t xml:space="preserve">The formula f = c/(4H) assumes a UNIFORM-HEIGHT rectangular cavity. His cavity has VARYING height: H(r) = 8,537×exp(−r/8,619) km, from 8,537 km at the pole to 837 km at the ice wall — a 10× variation. For a non-uniform cavity, the resonant frequency is not determined by the maximum height alone; it depends on the weighted average across the entire cavity. The average height across his disc is ~3,339 km, which would give f ≈ 22 Hz — nearly 3× higher than observed. His own geometry predicts the wrong Schumann frequency. He gets close to 7.83 Hz only by using a simplified formula that ignores the exponential height variation he himself specifies.</w:t>
+      </w:r>
+    </w:p>
+    <w:p>
+      <w:pPr>
+        <w:pStyle w:val="Heading2"/>
+      </w:pPr>
+      <w:r>
+        <w:t xml:space="preserve">4.5.2 Gravity Variation: 152× Too Large</w:t>
+      </w:r>
+    </w:p>
+    <w:p>
+      <w:pPr>
+        <w:spacing w:after="120"/>
+      </w:pPr>
+      <w:r>
+        <w:rPr>
+          <w:b/>
+          <w:bCs/>
+        </w:rPr>
+        <w:t xml:space="preserve">The model's mechanism: </w:t>
+      </w:r>
+      <w:r>
+        <w:t xml:space="preserve">Gravity is attributed to 'aetheric pressure' from the medium filling the cavity. If gravity is proportional to the column of aetheric medium above a point (which is the only physical interpretation of a pressure-based mechanism), then g should track H(r).</w:t>
+      </w:r>
+    </w:p>
+    <w:p>
+      <w:pPr>
+        <w:spacing w:after="120"/>
+      </w:pPr>
+      <w:r>
+        <w:rPr>
+          <w:b/>
+          <w:bCs/>
+        </w:rPr>
+        <w:t xml:space="preserve">What this predicts: </w:t>
+      </w:r>
+      <w:r>
+        <w:t xml:space="preserve">H(r) drops from 8,537 km at the pole to 1,662 km at the equatorial radius (r = 14,105 km) — an 80.5% decrease. The actual gravity variation from pole to equator is 0.53%. The dome's own geometry predicts a variation 152× larger than observed. At the Antarctic rim, H = 837 km, meaning gravity should be ~10% of its polar value — a 90% drop. No such variation exists. The author avoids this by fitting g(r) = 9.7803×(1+0.005307×exp(−r/8619)), which reproduces observations but does not follow from aetheric pressure — it is a curve fit using the observed 9.7803 as a starting constant.</w:t>
+      </w:r>
+    </w:p>
+    <w:p>
+      <w:pPr>
+        <w:pStyle w:val="Heading2"/>
+      </w:pPr>
+      <w:r>
+        <w:t xml:space="preserve">4.5.3 Solar Angular Diameter: 29× Too Much Variation</w:t>
+      </w:r>
+    </w:p>
+    <w:p>
+      <w:pPr>
+        <w:spacing w:after="120"/>
+      </w:pPr>
+      <w:r>
+        <w:rPr>
+          <w:b/>
+          <w:bCs/>
+        </w:rPr>
+        <w:t xml:space="preserve">Dome geometry: </w:t>
+      </w:r>
+      <w:r>
+        <w:t xml:space="preserve">The model posits a local sun at ~5,733 km altitude (WIN-026, from crepuscular ray convergence). At the zenith, the sun is 5,733 km away. At 60° zenith angle, the sun is 11,466 km away (simple trigonometry). Angular diameter goes as 1/distance.</w:t>
+      </w:r>
+    </w:p>
+    <w:p>
+      <w:pPr>
+        <w:spacing w:after="120"/>
+      </w:pPr>
+      <w:r>
+        <w:rPr>
+          <w:b/>
+          <w:bCs/>
+        </w:rPr>
+        <w:t xml:space="preserve">What this predicts: </w:t>
+      </w:r>
+      <w:r>
+        <w:t xml:space="preserve">The sun should appear 50% smaller at 60° zenith angle than at noon. The observed variation is ±1.7% (entirely from orbital eccentricity). The dome predicts 29× more variation than observed. Furthermore, the sun should appear LARGEST at noon and SMALLEST at sunrise/sunset. Century-old micrometer measurements confirm the sun's angular diameter is constant throughout the day. This is one of the clearest falsifications of a local sun.</w:t>
+      </w:r>
+    </w:p>
+    <w:p>
+      <w:pPr>
+        <w:pStyle w:val="Heading2"/>
+      </w:pPr>
+      <w:r>
+        <w:t xml:space="preserve">4.5.4 Tidal Forces: 300,000× Too Strong</w:t>
+      </w:r>
+    </w:p>
+    <w:p>
+      <w:pPr>
+        <w:spacing w:after="120"/>
+      </w:pPr>
+      <w:r>
+        <w:rPr>
+          <w:b/>
+          <w:bCs/>
+        </w:rPr>
+        <w:t xml:space="preserve">Globe tidal mechanism: </w:t>
+      </w:r>
+      <w:r>
+        <w:t xml:space="preserve">Tides are driven by the differential gravitational pull of the Moon at 384,400 km, producing a 1/r³ tidal potential. The tidal forcing ratio is (R_Earth/r_Moon)³ = (6,371/384,400)³ = 4.55×10⁻⁶.</w:t>
+      </w:r>
+    </w:p>
+    <w:p>
+      <w:pPr>
+        <w:spacing w:after="120"/>
+      </w:pPr>
+      <w:r>
+        <w:rPr>
+          <w:b/>
+          <w:bCs/>
+        </w:rPr>
+        <w:t xml:space="preserve">Dome tidal mechanism: </w:t>
+      </w:r>
+      <w:r>
+        <w:t xml:space="preserve">A local moon at ~5,733 km altitude circling the disc. The tidal forcing ratio becomes (6,371/5,733)³ = 1.37 — a factor of 301,000× stronger than the globe calculation. If the dome's local moon exerted any gravitational influence at all, tidal ranges would be measured in kilometers, not the observed ~1 meter. The author claims tidal periods (M2 = 12.42h, etc.) as dome 'predictions' but has never derived them from his own geometry — he simply cites the standard tidal constituent values and declares them confirmed.</w:t>
+      </w:r>
+    </w:p>
+    <w:p>
+      <w:pPr>
+        <w:pStyle w:val="Heading2"/>
+      </w:pPr>
+      <w:r>
+        <w:t xml:space="preserve">4.5.5 South Atlantic Anomaly: Axial Symmetry Problem</w:t>
+      </w:r>
+    </w:p>
+    <w:p>
+      <w:pPr>
+        <w:spacing w:after="120"/>
+      </w:pPr>
+      <w:r>
+        <w:rPr>
+          <w:b/>
+          <w:bCs/>
+        </w:rPr>
+        <w:t xml:space="preserve">What the SAA is: </w:t>
+      </w:r>
+      <w:r>
+        <w:t xml:space="preserve">A localized region of reduced magnetic field strength centered at ~25°S, 55°W (over Brazil). It is longitude-dependent — strongest at one specific longitude, extending westward over time.</w:t>
+      </w:r>
+    </w:p>
+    <w:p>
+      <w:pPr>
+        <w:spacing w:after="120"/>
+      </w:pPr>
+      <w:r>
+        <w:rPr>
+          <w:b/>
+          <w:bCs/>
+        </w:rPr>
+        <w:t xml:space="preserve">What the dome geometry predicts: </w:t>
+      </w:r>
+      <w:r>
+        <w:t xml:space="preserve">The disc and toroidal cavity are axially symmetric around the north pole. Any 'rim effect' from the Antarctic resonance barrier would form a RING around the entire disc edge, at all longitudes equally. The dome has no mechanism for features at a specific longitude. The SAA's longitude-dependent structure, its westward drift (~0.3°/year), and its splitting into two lobes (documented by ESA Swarm satellites) all require 3D convective dynamics in a fluid core — exactly what the globe model provides and the dome model lacks.</w:t>
+      </w:r>
+    </w:p>
+    <w:p>
+      <w:pPr>
+        <w:pStyle w:val="Heading2"/>
+      </w:pPr>
+      <w:r>
+        <w:t xml:space="preserve">4.5.6 Secular Variation and Pole Drift: No Time Dependence</w:t>
+      </w:r>
+    </w:p>
+    <w:p>
+      <w:pPr>
+        <w:spacing w:after="120"/>
+      </w:pPr>
+      <w:r>
+        <w:rPr>
+          <w:b/>
+          <w:bCs/>
+        </w:rPr>
+        <w:t xml:space="preserve">The dome's field equation: </w:t>
+      </w:r>
+      <w:r>
+        <w:t xml:space="preserve">B(r) = 62,376×exp(−r_N/8,619) + 64,852×exp(−r_S/8,619). This has NO time variable. A static geometric cavity with fixed material properties produces a STATIC field.</w:t>
+      </w:r>
+    </w:p>
+    <w:p>
+      <w:pPr>
+        <w:spacing w:after="120"/>
+      </w:pPr>
+      <w:r>
+        <w:rPr>
+          <w:b/>
+          <w:bCs/>
+        </w:rPr>
+        <w:t xml:space="preserve">What is observed: </w:t>
+      </w:r>
+      <w:r>
+        <w:t xml:space="preserve">The field at Hermanus, South Africa is declining ~100 nT/year. The north magnetic pole has moved &gt;1,000 km since 1900 and is currently at ~86.5°N, 175°E — offset from geographic north. The field has completely reversed hundreds of times over geologic history (paleomagnetic record in ocean floor basalts). The dome model has no mechanism for any of these. The Axis Mundi is a fixed geometric point; if it is the magnetic source, the magnetic pole should be fixed at geographic north. It isn’t.</w:t>
+      </w:r>
+    </w:p>
+    <w:p>
+      <w:pPr>
+        <w:pStyle w:val="Heading2"/>
+      </w:pPr>
+      <w:r>
+        <w:t xml:space="preserve">4.5.7 Solar Elevation: Using the Globe's Formula</w:t>
+      </w:r>
+    </w:p>
+    <w:p>
+      <w:pPr>
+        <w:spacing w:after="120"/>
+      </w:pPr>
+      <w:r>
+        <w:rPr>
+          <w:b/>
+          <w:bCs/>
+        </w:rPr>
+        <w:t xml:space="preserve">The author's formula: </w:t>
+      </w:r>
+      <w:r>
+        <w:t xml:space="preserve">θ = 90° − φ_obs + φ_sun(t), where φ_sun(t) = 23.45° × sin(2π(t−81)/365). The model page states this 'reproduces the globe formula exactly.'</w:t>
+      </w:r>
+    </w:p>
+    <w:p>
+      <w:pPr>
+        <w:spacing w:after="120"/>
+      </w:pPr>
+      <w:r>
+        <w:rPr>
+          <w:b/>
+          <w:bCs/>
+        </w:rPr>
+        <w:t xml:space="preserve">The problem: </w:t>
+      </w:r>
+      <w:r>
+        <w:t xml:space="preserve">This IS the globe formula. Solar declination = 23.45° comes from Earth's axial tilt relative to its orbital plane. On a flat disc with a local sun, solar elevation depends on the sun's altitude and the observer's radial distance from the sun's projection point — a completely different geometric relationship. The author has not derived solar elevation from his own geometry; he has adopted the globe's formula and labeled it as his own. This is the most transparent case of smuggling globe physics into the dome model.</w:t>
+      </w:r>
+    </w:p>
+    <w:p>
+      <w:pPr>
+        <w:pStyle w:val="Heading2"/>
+      </w:pPr>
+      <w:r>
+        <w:t xml:space="preserve">4.5.8 Summary: The Substitution Pattern</w:t>
+      </w:r>
+    </w:p>
+    <w:p>
+      <w:pPr>
+        <w:spacing w:after="120"/>
+      </w:pPr>
+      <w:r>
+        <w:t xml:space="preserve">In every case where the dome model 'agrees with globe predictions,' one of three strategies is at work:</w:t>
+      </w:r>
+    </w:p>
+    <w:p>
+      <w:pPr>
+        <w:spacing w:after="120"/>
+      </w:pPr>
+      <w:r>
+        <w:rPr>
+          <w:b/>
+          <w:bCs/>
+        </w:rPr>
+        <w:t xml:space="preserve">Strategy 1 — Formula substitution: </w:t>
+      </w:r>
+      <w:r>
+        <w:t xml:space="preserve">Use the globe's formula directly (solar elevation, tidal periods) without deriving it from dome geometry.</w:t>
+      </w:r>
+    </w:p>
+    <w:p>
+      <w:pPr>
+        <w:spacing w:after="120"/>
+      </w:pPr>
+      <w:r>
+        <w:rPr>
+          <w:b/>
+          <w:bCs/>
+        </w:rPr>
+        <w:t xml:space="preserve">Strategy 2 — Simplified formula: </w:t>
+      </w:r>
+      <w:r>
+        <w:t xml:space="preserve">Use a simplified version that ignores the dome's own geometry (Schumann resonance with uniform height instead of exponentially varying height).</w:t>
+      </w:r>
+    </w:p>
+    <w:p>
+      <w:pPr>
+        <w:spacing w:after="120"/>
+      </w:pPr>
+      <w:r>
+        <w:rPr>
+          <w:b/>
+          <w:bCs/>
+        </w:rPr>
+        <w:t xml:space="preserve">Strategy 3 — Curve fitting: </w:t>
+      </w:r>
+      <w:r>
+        <w:t xml:space="preserve">Fit free parameters to observed values, then claim the match as a 'derivation from first principles' (gravity formula using observed 9.7803 as a constant; B(r) using fitted amplitudes that violate flux conservation).</w:t>
+      </w:r>
+    </w:p>
+    <w:p>
+      <w:pPr>
+        <w:spacing w:after="120"/>
+      </w:pPr>
+      <w:r>
+        <w:t xml:space="preserve">If the author's own geometry were taken seriously and the physics worked through honestly, the dome model would predict: Schumann resonance at ~22 Hz (not 7.83), gravity varying by 80% pole-to-equator (not 0.53%), solar angular diameter changing by 50% through the day (not 1.7%), tidal forces 300,000× too strong, no longitude-dependent magnetic features, no secular variation, and a magnetic pole locked to geographic north. None of these match reality. The model 'works' only because the author replaces his own physics with the globe's physics whenever the dome geometry would produce the wrong answer.</w:t>
+      </w:r>
+    </w:p>
+    <w:p>
+      <w:r>
+        <w:br w:type="page"/>
+      </w:r>
+    </w:p>
+    <w:p>
+      <w:pPr>
+        <w:pStyle w:val="Heading1"/>
+      </w:pPr>
+      <w:r>
         <w:t xml:space="preserve">Part 5: Analysis of AI Context Directives</w:t>
       </w:r>
     </w:p>
@@ -14508,7 +14864,7 @@
         </w:rPr>
         <w:t xml:space="preserve">NOAA World Magnetic Model 2025: </w:t>
       </w:r>
-      <w:hyperlink w:history="1" r:id="rIdt2h_xcbqo9jmimnnuayhe">
+      <w:hyperlink w:history="1" r:id="rIddfxzuk8k9ilgvtjgzjnkk">
         <w:r>
           <w:rPr>
             <w:rStyle w:val="Hyperlink"/>
@@ -14528,7 +14884,7 @@
         </w:rPr>
         <w:t xml:space="preserve">NOAA Wandering Geomagnetic Poles: </w:t>
       </w:r>
-      <w:hyperlink w:history="1" r:id="rIdeqxeymbrnrqs9pcvtwzsg">
+      <w:hyperlink w:history="1" r:id="rIdwyabpmetpze4nc-yzwymn">
         <w:r>
           <w:rPr>
             <w:rStyle w:val="Hyperlink"/>
@@ -14548,7 +14904,7 @@
         </w:rPr>
         <w:t xml:space="preserve">CHAOS-7 Geomagnetic Field Model: </w:t>
       </w:r>
-      <w:hyperlink w:history="1" r:id="rIdfb2z-qzq3xvelspan_u42">
+      <w:hyperlink w:history="1" r:id="rIdrdueaeyhyd2o4ns8kt_lr">
         <w:r>
           <w:rPr>
             <w:rStyle w:val="Hyperlink"/>
@@ -14568,7 +14924,7 @@
         </w:rPr>
         <w:t xml:space="preserve">ESA Swarm Satellite Mission: </w:t>
       </w:r>
-      <w:hyperlink w:history="1" r:id="rId3t-6dsqpegryfs93s8vbk">
+      <w:hyperlink w:history="1" r:id="rIdwtx9zqgnj1-211q-zpcji">
         <w:r>
           <w:rPr>
             <w:rStyle w:val="Hyperlink"/>
@@ -14588,7 +14944,7 @@
         </w:rPr>
         <w:t xml:space="preserve">INTERMAGNET Observatory Network: </w:t>
       </w:r>
-      <w:hyperlink w:history="1" r:id="rIddemahsuvgwyhhhehxgfum">
+      <w:hyperlink w:history="1" r:id="rIdoapwdrojqoh25dowfipio">
         <w:r>
           <w:rPr>
             <w:rStyle w:val="Hyperlink"/>
@@ -14608,7 +14964,7 @@
         </w:rPr>
         <w:t xml:space="preserve">IGRF-13: </w:t>
       </w:r>
-      <w:hyperlink w:history="1" r:id="rIdixe8kwv7zcdmo-6ib6ufp">
+      <w:hyperlink w:history="1" r:id="rIdt34g0wu9opkhnpofgz7qg">
         <w:r>
           <w:rPr>
             <w:rStyle w:val="Hyperlink"/>
@@ -14628,7 +14984,7 @@
         </w:rPr>
         <w:t xml:space="preserve">ESA Gaia Data Release 3: </w:t>
       </w:r>
-      <w:hyperlink w:history="1" r:id="rIdfnzy-szr6izrwnehu2cv_">
+      <w:hyperlink w:history="1" r:id="rIdfk040og1fqqurivubhoj4">
         <w:r>
           <w:rPr>
             <w:rStyle w:val="Hyperlink"/>
@@ -14648,7 +15004,7 @@
         </w:rPr>
         <w:t xml:space="preserve">Hipparcos Catalogue: </w:t>
       </w:r>
-      <w:hyperlink w:history="1" r:id="rIdpedf6rvr0enrgjmzl51im">
+      <w:hyperlink w:history="1" r:id="rIda4hmdvnjkys64b-dtjpcr">
         <w:r>
           <w:rPr>
             <w:rStyle w:val="Hyperlink"/>
@@ -14668,7 +15024,7 @@
         </w:rPr>
         <w:t xml:space="preserve">US Patent 787412 (Tesla): </w:t>
       </w:r>
-      <w:hyperlink w:history="1" r:id="rIdatlokit49su60slsbewec">
+      <w:hyperlink w:history="1" r:id="rId2sfd_xwpeaib-97hfofgv">
         <w:r>
           <w:rPr>
             <w:rStyle w:val="Hyperlink"/>
@@ -14688,7 +15044,7 @@
         </w:rPr>
         <w:t xml:space="preserve">NOAA Solar Position Algorithm: </w:t>
       </w:r>
-      <w:hyperlink w:history="1" r:id="rIdswylthf8iefrbfgkalyzw">
+      <w:hyperlink w:history="1" r:id="rIdzhhgnugqq_zmofqt2sogk">
         <w:r>
           <w:rPr>
             <w:rStyle w:val="Hyperlink"/>
@@ -14708,7 +15064,7 @@
         </w:rPr>
         <w:t xml:space="preserve">National Geodetic Survey Gravity: </w:t>
       </w:r>
-      <w:hyperlink w:history="1" r:id="rIdywwsspne59gphn9xj1fko">
+      <w:hyperlink w:history="1" r:id="rId6c60g37xjpijmvmq-cpeq">
         <w:r>
           <w:rPr>
             <w:rStyle w:val="Hyperlink"/>
@@ -14728,7 +15084,7 @@
         </w:rPr>
         <w:t xml:space="preserve">CHIME/FRB Project: </w:t>
       </w:r>
-      <w:hyperlink w:history="1" r:id="rIdkmlibty8qgkjcradvyez7">
+      <w:hyperlink w:history="1" r:id="rIdcdh082rt3y8fe4ydrv_0u">
         <w:r>
           <w:rPr>
             <w:rStyle w:val="Hyperlink"/>
@@ -14748,7 +15104,7 @@
         </w:rPr>
         <w:t xml:space="preserve">GRACE-FO (gravity mapping): </w:t>
       </w:r>
-      <w:hyperlink w:history="1" r:id="rIddi2u9fv2rdjqruxobpd4d">
+      <w:hyperlink w:history="1" r:id="rId0dsl23i73ht8mjrinipgx">
         <w:r>
           <w:rPr>
             <w:rStyle w:val="Hyperlink"/>
@@ -14768,7 +15124,7 @@
         </w:rPr>
         <w:t xml:space="preserve">GOCE (gravity field): </w:t>
       </w:r>
-      <w:hyperlink w:history="1" r:id="rIdnlaw-smhquh4qrq9bxnlw">
+      <w:hyperlink w:history="1" r:id="rIdynfi8ruo861i7fppeonnb">
         <w:r>
           <w:rPr>
             <w:rStyle w:val="Hyperlink"/>
@@ -14788,7 +15144,7 @@
         </w:rPr>
         <w:t xml:space="preserve">GPS.gov: </w:t>
       </w:r>
-      <w:hyperlink w:history="1" r:id="rIdagucmbsb_j_6tsbionp_k">
+      <w:hyperlink w:history="1" r:id="rIdsbd_rlxg-i4hnzzmgcmvk">
         <w:r>
           <w:rPr>
             <w:rStyle w:val="Hyperlink"/>
@@ -14808,7 +15164,7 @@
         </w:rPr>
         <w:t xml:space="preserve">CelesTrak TLE Data: </w:t>
       </w:r>
-      <w:hyperlink w:history="1" r:id="rId9fbud7umqzrzvx6za98in">
+      <w:hyperlink w:history="1" r:id="rIdtnzricynko7c_aps08vkw">
         <w:r>
           <w:rPr>
             <w:rStyle w:val="Hyperlink"/>

</xml_diff>

<commit_message>
V4.8: Incorporate independent adversarial review findings
New falsification sections: solar angular diameter (4.8), aetheric
refraction unfalsifiability (4.9), Open Problems as concessions (4.10).
Strengthened: SH distances (model's own 73% admission), GPS (Keplerian
orbits + relativistic corrections), Antarctic circumnavigation (126,000
km rim vs 13,800 km measured). Improved timestamping acknowledgment
(cryptographically sound but low discriminating power). Added WIN-001 vs
WIN-002 Schumann frequency internal contradiction.

Co-Authored-By: Claude Opus 4.6 <noreply@anthropic.com>
</commit_message>
<xml_diff>
--- a/downloads/critical-review-dome-model-v4.docx
+++ b/downloads/critical-review-dome-model-v4.docx
@@ -325,7 +325,7 @@
         <w:spacing w:after="120"/>
       </w:pPr>
       <w:r>
-        <w:t xml:space="preserve">The model uses git commit timestamps and Bitcoin blockchain anchoring (OpenTimestamps) to prove predictions existed before confirming data arrived. This timestamping mechanism is cryptographically sound. However, scientific validation also requires: (a) comparison to a null hypothesis (would mainstream models predict the same outcome?), (b) accounting for all predictions including failures, and (c) independent replication. V51.0 introduces a 'Live Power' dashboard claiming 9.2-sigma convergence across 20 domains, but the domains are not statistically independent (many share the same scale constant and data sources), invalidating the aggregate p-value calculation.</w:t>
+        <w:t xml:space="preserve">The model uses git commit timestamps and Bitcoin blockchain anchoring (OpenTimestamps) to prove predictions existed before confirming data arrived. This timestamping mechanism is cryptographically sound, and prospective prediction is the gold standard in science — credit is due for implementing it. However, the timestamped predictions themselves have low discriminating power: 'field will decay by ≥28 nT' when secular decay has been ongoing for centuries; 'Schumann resonance will remain at 7.83 Hz' when it has been stable for decades; 'SAA will continue westward drift' when NOAA has published the same trend for years. These are predictions of continuity, not novel phenomena. A prediction that 'tomorrow the sun will rise in the east' is prospective and timestamped, but it does not validate a new solar model. Scientific validation also requires: (a) comparison to a null hypothesis (would mainstream models predict the same outcome?), (b) accounting for all predictions including failures, and (c) independent replication. V51.0 introduces a 'Live Power' dashboard claiming 9.2-sigma convergence across 20 domains, but the domains are not statistically independent (many share the same scale constant and data sources), invalidating the aggregate p-value calculation.</w:t>
       </w:r>
     </w:p>
     <w:p>
@@ -8889,7 +8889,7 @@
       <w:r>
         <w:t xml:space="preserve">US Patent 787412 (1905), publicly available at </w:t>
       </w:r>
-      <w:hyperlink w:history="1" r:id="rIdb5uqtq0w3uerrubq0ckzz">
+      <w:hyperlink w:history="1" r:id="rIdostdh5cgrrtd-oflwcp-f">
         <w:r>
           <w:rPr>
             <w:rStyle w:val="Hyperlink"/>
@@ -8910,6 +8910,21 @@
           <w:b/>
           <w:bCs/>
         </w:rPr>
+        <w:t xml:space="preserve">Internal contradiction: </w:t>
+      </w:r>
+      <w:r>
+        <w:t xml:space="preserve">WIN-001 claims a fundamental resonance of 11.78 Hz while WIN-002 claims 7.83 Hz (with 26% aetheric damping reducing from 10.6 Hz). These are incompatible: if the disc thickness resonance is 11.78 Hz, the Schumann frequency should be near that value, not 7.83 Hz. The model claims credit for two different frequencies from two incompatible calculations.</w:t>
+      </w:r>
+    </w:p>
+    <w:p>
+      <w:pPr>
+        <w:spacing w:after="120"/>
+      </w:pPr>
+      <w:r>
+        <w:rPr>
+          <w:b/>
+          <w:bCs/>
+        </w:rPr>
         <w:t xml:space="preserve">Verdict: REFUTED BY DATA. </w:t>
       </w:r>
       <w:r>
@@ -9014,7 +9029,7 @@
       <w:r>
         <w:t xml:space="preserve">James Bradley (1727) explicitly tested and rejected atmospheric refraction as an explanation: refraction is wavelength-dependent (chromatic), while stellar aberration is achromatic. Modern VLBI measurements achieve milliarcsecond precision and directly confirm aberration correlates with Earth's orbital velocity (~30 km/s). The </w:t>
       </w:r>
-      <w:hyperlink w:history="1" r:id="rIdig6apfwu8pikzt38bu2qm">
+      <w:hyperlink w:history="1" r:id="rIdnkv5u85klvv-bgepwe3mb">
         <w:r>
           <w:rPr>
             <w:rStyle w:val="Hyperlink"/>
@@ -9080,7 +9095,7 @@
       <w:r>
         <w:t xml:space="preserve">ESA </w:t>
       </w:r>
-      <w:hyperlink w:history="1" r:id="rIdehr_sb6asyy7wl2zzwwl6">
+      <w:hyperlink w:history="1" r:id="rId4nz3i_u8vzxtv0i91qh9d">
         <w:r>
           <w:rPr>
             <w:rStyle w:val="Hyperlink"/>
@@ -9146,7 +9161,7 @@
       <w:r>
         <w:t xml:space="preserve">Crepuscular rays are parallel beams made visible by atmospheric scattering. The apparent divergence is a perspective effect. Crucially, anticrepuscular rays converge at the anti-solar point simultaneously. See </w:t>
       </w:r>
-      <w:hyperlink w:history="1" r:id="rIdetqkkcc42hitpkq5c-pi0">
+      <w:hyperlink w:history="1" r:id="rIdq-tkjbjh10smexknvcmtq">
         <w:r>
           <w:rPr>
             <w:rStyle w:val="Hyperlink"/>
@@ -9157,7 +9172,7 @@
       <w:r>
         <w:t xml:space="preserve"> and </w:t>
       </w:r>
-      <w:hyperlink w:history="1" r:id="rIdhjqcezkihi_up-po56gmh">
+      <w:hyperlink w:history="1" r:id="rIdukrnzjeydvgweijbegfp-">
         <w:r>
           <w:rPr>
             <w:rStyle w:val="Hyperlink"/>
@@ -9223,7 +9238,7 @@
       <w:r>
         <w:t xml:space="preserve">NOAA officially states no evidence of anomalous disappearances. </w:t>
       </w:r>
-      <w:hyperlink w:history="1" r:id="rIdsxv5lhjkuvlh0d5qnal7q">
+      <w:hyperlink w:history="1" r:id="rIdch2lcctocseulo1ekf8sb">
         <w:r>
           <w:rPr>
             <w:rStyle w:val="Hyperlink"/>
@@ -9289,7 +9304,7 @@
       <w:r>
         <w:t xml:space="preserve">Hipparcos </w:t>
       </w:r>
-      <w:hyperlink w:history="1" r:id="rIdym_b9flpz-m1fagb2p-6r">
+      <w:hyperlink w:history="1" r:id="rIdsp_0kpiw-s-6x96ctwb6h">
         <w:r>
           <w:rPr>
             <w:rStyle w:val="Hyperlink"/>
@@ -9705,7 +9720,7 @@
       <w:r>
         <w:t xml:space="preserve">Terra-Nova et al. (2017, PNAS) demonstrate reversed-flux patches reproduce SAA splitting in MHD simulations. The </w:t>
       </w:r>
-      <w:hyperlink w:history="1" r:id="rIdmn8wqm6olvsgfh3xf-jkr">
+      <w:hyperlink w:history="1" r:id="rIdyn27fqatv1ydvjzipg3at">
         <w:r>
           <w:rPr>
             <w:rStyle w:val="Hyperlink"/>
@@ -9716,7 +9731,7 @@
       <w:r>
         <w:t xml:space="preserve"> documents the evolution quantitatively. </w:t>
       </w:r>
-      <w:hyperlink w:history="1" r:id="rIdssan-tbyd68vmmwcoimjl">
+      <w:hyperlink w:history="1" r:id="rId5ulvywqixsceyn6elbhdd">
         <w:r>
           <w:rPr>
             <w:rStyle w:val="Hyperlink"/>
@@ -9767,7 +9782,7 @@
       <w:r>
         <w:t xml:space="preserve">Normal secular variation documented by </w:t>
       </w:r>
-      <w:hyperlink w:history="1" r:id="rIdbeaq6dbtwzph_wzu6fffr">
+      <w:hyperlink w:history="1" r:id="rIdubg5b-lwstfyzosyyuzwg">
         <w:r>
           <w:rPr>
             <w:rStyle w:val="Hyperlink"/>
@@ -9834,7 +9849,7 @@
       <w:r>
         <w:t xml:space="preserve">Eclipse-induced perturbations predicted by Chapman (1933) via ionospheric conductivity drops. Data from </w:t>
       </w:r>
-      <w:hyperlink w:history="1" r:id="rIdrmdgx_puhak15g5me7xw2">
+      <w:hyperlink w:history="1" r:id="rIdmesbg-fi1bepvl1rtqnhu">
         <w:r>
           <w:rPr>
             <w:rStyle w:val="Hyperlink"/>
@@ -9922,7 +9937,7 @@
       <w:r>
         <w:t xml:space="preserve">The formula used is for a quarter-wave linear waveguide, not a spherical cavity. Correct formula f = c/(2*pi*R) gives R = 6,098 km, within 4% of Earth's radius. The ionosphere IS conductive (</w:t>
       </w:r>
-      <w:hyperlink w:history="1" r:id="rIdj5vajpye04b2gzklytb5w">
+      <w:hyperlink w:history="1" r:id="rIdzhxbbspitdvla5g1u3et6">
         <w:r>
           <w:rPr>
             <w:rStyle w:val="Hyperlink"/>
@@ -9989,7 +10004,7 @@
       <w:r>
         <w:t xml:space="preserve">All five observations already predicted by </w:t>
       </w:r>
-      <w:hyperlink w:history="1" r:id="rIdurrmdjuw7bt-r64osdxxu">
+      <w:hyperlink w:history="1" r:id="rIdpnpreejohpbbjihmlm7pe">
         <w:r>
           <w:rPr>
             <w:rStyle w:val="Hyperlink"/>
@@ -10000,7 +10015,7 @@
       <w:r>
         <w:t xml:space="preserve">, </w:t>
       </w:r>
-      <w:hyperlink w:history="1" r:id="rId7xhumwk7ilrk8w4beotue">
+      <w:hyperlink w:history="1" r:id="rIdkpzkszu-q5wqlpk301qc-">
         <w:r>
           <w:rPr>
             <w:rStyle w:val="Hyperlink"/>
@@ -10327,7 +10342,7 @@
       <w:r>
         <w:t xml:space="preserve">Antarctic gravity anomalies are mapped from orbit by </w:t>
       </w:r>
-      <w:hyperlink w:history="1" r:id="rIdei-nyggnqcmrtaqah7jzk">
+      <w:hyperlink w:history="1" r:id="rIdxmcxulsooau4pftb435gc">
         <w:r>
           <w:rPr>
             <w:rStyle w:val="Hyperlink"/>
@@ -10338,7 +10353,7 @@
       <w:r>
         <w:t xml:space="preserve"> and </w:t>
       </w:r>
-      <w:hyperlink w:history="1" r:id="rIdf9lgajyhfety7knoszmps">
+      <w:hyperlink w:history="1" r:id="rIdc1eu5wsu7bmukyiopbv_u">
         <w:r>
           <w:rPr>
             <w:rStyle w:val="Hyperlink"/>
@@ -13314,7 +13329,7 @@
       <w:r>
         <w:t xml:space="preserve">A </w:t>
       </w:r>
-      <w:hyperlink w:history="1" r:id="rId1xixupcekqv_fbnx_lhbj">
+      <w:hyperlink w:history="1" r:id="rIduec1cuisaspn3sordbkoc">
         <w:r>
           <w:rPr>
             <w:rStyle w:val="Hyperlink"/>
@@ -13325,7 +13340,7 @@
       <w:r>
         <w:t xml:space="preserve"> found detectable decreases in X, Z, and total field components during eclipses. An </w:t>
       </w:r>
-      <w:hyperlink w:history="1" r:id="rId_3p4es71u4r0kr-zvlekh">
+      <w:hyperlink w:history="1" r:id="rIdzvljqwmfpw24n160xktiz">
         <w:r>
           <w:rPr>
             <w:rStyle w:val="Hyperlink"/>
@@ -13737,7 +13752,7 @@
         <w:spacing w:after="120"/>
       </w:pPr>
       <w:r>
-        <w:t xml:space="preserve">If the model is a genuine physical model, it must make predictions that differ from the globe model. Below are seven categories of concrete, repeatable measurements that are incompatible with an elliptical flat disc topped by a copper dome.</w:t>
+        <w:t xml:space="preserve">If the model is a genuine physical model, it must make predictions that differ from the globe model. Below are ten categories of concrete, repeatable measurements that are incompatible with an elliptical flat disc topped by a copper dome.</w:t>
       </w:r>
     </w:p>
     <w:p>
@@ -13775,7 +13790,22 @@
         <w:t xml:space="preserve">What the data shows: </w:t>
       </w:r>
       <w:r>
-        <w:t xml:space="preserve">Sydney to Santiago: 11,400-11,900 km (12-13.75 hours nonstop). Johannesburg to Perth: 8,308 km (10h 20m). Auckland to Buenos Aires: 10,460 km (~12 hours). Actual flight times match great-circle distances on a sphere with sub-1% accuracy. The dome model's own quadratic law achieves only R-squared 0.79. The V13 coordinate system's 6.2% RMSE for cross-equatorial routes is 12x worse than globe geodesy.</w:t>
+        <w:t xml:space="preserve">Sydney to Santiago: 11,400-11,900 km (12-13.75 hours nonstop). Johannesburg to Perth: 8,308 km (10h 20m). Auckland to Buenos Aires: 10,460 km (~12 hours). Actual flight times match great-circle distances on a sphere with sub-1% accuracy. The dome model's own quadratic law achieves only R-squared 0.79. The V13 coordinate system's 6.2% RMSE for cross-equatorial routes is 12× worse than globe geodesy.</w:t>
+      </w:r>
+    </w:p>
+    <w:p>
+      <w:pPr>
+        <w:spacing w:after="120"/>
+      </w:pPr>
+      <w:r>
+        <w:rPr>
+          <w:b/>
+          <w:bCs/>
+        </w:rPr>
+        <w:t xml:space="preserve">The model's own admission: </w:t>
+      </w:r>
+      <w:r>
+        <w:t xml:space="preserve">The ECM model page reports Southern Hemisphere distance errors of 32–73%. Sydney–Buenos Aires is off by 73%. This is not a calibration issue — it means the model cannot reproduce the actual measured distances between major cities that millions of people fly between every day. A model claiming to describe Earth's geometry but getting Sydney-to-Buenos-Aires wrong by 73% has a fundamental problem that no amount of geomagnetic curve-fitting can paper over. Globe geodesy (Vincenty, 1975) achieves &lt;0.5% on all routes globally.</w:t>
       </w:r>
     </w:p>
     <w:p>
@@ -13795,7 +13825,7 @@
           <w:b/>
           <w:bCs/>
         </w:rPr>
-        <w:t xml:space="preserve">The test: </w:t>
+        <w:t xml:space="preserve">Test A — Sunlight: </w:t>
       </w:r>
       <w:r>
         <w:t xml:space="preserve">Observe the Sun from the South Pole during austral summer.</w:t>
@@ -13815,7 +13845,7 @@
       <w:r>
         <w:t xml:space="preserve">Continuous 24-hour sunlight. A local sun at 5,733 km circling above a flat disc cannot produce 24-hour sunlight at the disc edge. Directly observable at Amundsen-Scott Station, staffed year-round since 1957. See </w:t>
       </w:r>
-      <w:hyperlink w:history="1" r:id="rIdytinqwudxlxg5_0d8mr6i">
+      <w:hyperlink w:history="1" r:id="rIdvssaqcvn-cfcfn4bzyy49">
         <w:r>
           <w:rPr>
             <w:rStyle w:val="Hyperlink"/>
@@ -13829,6 +13859,21 @@
     </w:p>
     <w:p>
       <w:pPr>
+        <w:spacing w:after="120"/>
+      </w:pPr>
+      <w:r>
+        <w:rPr>
+          <w:b/>
+          <w:bCs/>
+        </w:rPr>
+        <w:t xml:space="preserve">Test B — Circumnavigation: </w:t>
+      </w:r>
+      <w:r>
+        <w:t xml:space="preserve">The ECM places Antarctica as a wall at the disc rim (r ≈ 20,015 km). On a flat disc, the rim circumference is 2π × 20,015 ≈ 125,758 km. On the globe, Antarctica's coastline circle at ~70°S has a circumference of roughly 13,800 km. Ships, aircraft, and research expeditions regularly circumnavigate Antarctica, and their logged distances match the globe prediction — not a 126,000 km rim. This is a factor-of-9 discrepancy. Crucially, the aetheric refraction index cannot explain this: refraction bends light, not ship odometers and aircraft fuel consumption logs.</w:t>
+      </w:r>
+    </w:p>
+    <w:p>
+      <w:pPr>
         <w:pStyle w:val="Heading2"/>
       </w:pPr>
       <w:r>
@@ -13862,9 +13907,9 @@
         <w:t xml:space="preserve">What the data shows: </w:t>
       </w:r>
       <w:r>
-        <w:t xml:space="preserve">GPS provides 1-3 meter accuracy worldwide. The ISS at 408 km is visible on predictable schedules. Geostationary satellites at 35,786 km. All require unobstructed radio paths. See </w:t>
-      </w:r>
-      <w:hyperlink w:history="1" r:id="rIdbumxpxaduh72rloqkh0dg">
+        <w:t xml:space="preserve">GPS provides 1–3 meter accuracy worldwide using 24+ satellites in Keplerian orbits calculated from spherical-Earth gravitational mechanics. The system requires precise relativistic corrections (both special and general) that depend on the satellites' orbital velocity and altitude above a spherical gravitational well. If Earth were a flat disc with different geometry, the signal propagation times, relativistic corrections, and satellite visibility geometry would all be wrong, and the system would not achieve meter-level accuracy. The same applies to every other satellite navigation system (GLONASS, Galileo, BeiDou). The ISS at 408 km is visible on predictable schedules computed from Keplerian orbits. Geostationary satellites at 35,786 km — far above the dome's maximum height — provide continuous coverage. See </w:t>
+      </w:r>
+      <w:hyperlink w:history="1" r:id="rIdxzhio0wn32iarr7iffjcv">
         <w:r>
           <w:rPr>
             <w:rStyle w:val="Hyperlink"/>
@@ -13875,7 +13920,7 @@
       <w:r>
         <w:t xml:space="preserve">; </w:t>
       </w:r>
-      <w:hyperlink w:history="1" r:id="rIdjv3rgzhpclr-hyistznzy">
+      <w:hyperlink w:history="1" r:id="rIdnif-jn0ssfcorbf13qcbh">
         <w:r>
           <w:rPr>
             <w:rStyle w:val="Hyperlink"/>
@@ -13884,7 +13929,7 @@
         </w:r>
       </w:hyperlink>
       <w:r>
-        <w:t xml:space="preserve">.</w:t>
+        <w:t xml:space="preserve">. This is arguably the most practically verifiable refutation of any flat-geometry model: billions of people use GPS daily with meter-level accuracy that requires spherical-Earth orbital mechanics.</w:t>
       </w:r>
     </w:p>
     <w:p>
@@ -13924,7 +13969,7 @@
       <w:r>
         <w:t xml:space="preserve">Modern solar calculators (</w:t>
       </w:r>
-      <w:hyperlink w:history="1" r:id="rIdc2176lsto-wiaxvzsaaj7">
+      <w:hyperlink w:history="1" r:id="rId6iblgfhdbkpmt8yzhe1ov">
         <w:r>
           <w:rPr>
             <w:rStyle w:val="Hyperlink"/>
@@ -13973,7 +14018,7 @@
       <w:r>
         <w:t xml:space="preserve">The </w:t>
       </w:r>
-      <w:hyperlink w:history="1" r:id="rIdb1lq5c-ipipjvxvlodtkf">
+      <w:hyperlink w:history="1" r:id="rIdoc7wxppnnwlohadfdmwmw">
         <w:r>
           <w:rPr>
             <w:rStyle w:val="Hyperlink"/>
@@ -14022,7 +14067,7 @@
       <w:r>
         <w:t xml:space="preserve">Earth's field is a dipole. South magnetic pole at 64.1°S, 135.9°E (</w:t>
       </w:r>
-      <w:hyperlink w:history="1" r:id="rIdmpiercgengfsuqwn9tsjt">
+      <w:hyperlink w:history="1" r:id="rIdnn3ged8z6d1qnvfuzoio9">
         <w:r>
           <w:rPr>
             <w:rStyle w:val="Hyperlink"/>
@@ -14071,7 +14116,7 @@
       <w:r>
         <w:t xml:space="preserve">g = 9.780 m/s² at equator, 9.832 m/s² at poles (0.53% variation). On a flat disc, centrifugal force points outward from center, producing the OPPOSITE pattern. See </w:t>
       </w:r>
-      <w:hyperlink w:history="1" r:id="rIdxofoptqc0j9zetpjedbrw">
+      <w:hyperlink w:history="1" r:id="rId2pfqyhuwv3kpirfi9epng">
         <w:r>
           <w:rPr>
             <w:rStyle w:val="Hyperlink"/>
@@ -14084,6 +14129,150 @@
       </w:r>
     </w:p>
     <w:p>
+      <w:pPr>
+        <w:pStyle w:val="Heading2"/>
+      </w:pPr>
+      <w:r>
+        <w:t xml:space="preserve">4.8 Solar Angular Diameter</w:t>
+      </w:r>
+    </w:p>
+    <w:p>
+      <w:pPr>
+        <w:spacing w:after="120"/>
+      </w:pPr>
+      <w:r>
+        <w:rPr>
+          <w:b/>
+          <w:bCs/>
+        </w:rPr>
+        <w:t xml:space="preserve">The test: </w:t>
+      </w:r>
+      <w:r>
+        <w:t xml:space="preserve">Measure the Sun's angular diameter at noon vs. sunrise/sunset using a solar filter and camera.</w:t>
+      </w:r>
+    </w:p>
+    <w:p>
+      <w:pPr>
+        <w:spacing w:after="120"/>
+      </w:pPr>
+      <w:r>
+        <w:rPr>
+          <w:b/>
+          <w:bCs/>
+        </w:rPr>
+        <w:t xml:space="preserve">What the dome predicts: </w:t>
+      </w:r>
+      <w:r>
+        <w:t xml:space="preserve">A local sun at ~5,733 km altitude. At noon the sun is directly above (~5,733 km away). At 60° zenith angle, it is ~11,466 km away. Angular diameter scales as 1/distance, so the sun should appear ~50% smaller at 60° than at noon, and even smaller at sunrise/sunset when slant distance is greatest.</w:t>
+      </w:r>
+    </w:p>
+    <w:p>
+      <w:pPr>
+        <w:spacing w:after="120"/>
+      </w:pPr>
+      <w:r>
+        <w:rPr>
+          <w:b/>
+          <w:bCs/>
+        </w:rPr>
+        <w:t xml:space="preserve">What is observed: </w:t>
+      </w:r>
+      <w:r>
+        <w:t xml:space="preserve">The Sun's angular diameter varies by only ±1.7% over the entire year (entirely from orbital eccentricity, peaking at perihelion in January). There is zero daily variation correlated with elevation angle. Century-old micrometer measurements confirm this. This is one of the simplest and most accessible falsifications of a local sun: anyone with a solar filter can verify it. The dome model predicts 29× more variation than observed (see Section 4.5.3).</w:t>
+      </w:r>
+    </w:p>
+    <w:p>
+      <w:pPr>
+        <w:pStyle w:val="Heading2"/>
+      </w:pPr>
+      <w:r>
+        <w:t xml:space="preserve">4.9 The Aetheric Refraction Index: Unfalsifiability by Design</w:t>
+      </w:r>
+    </w:p>
+    <w:p>
+      <w:pPr>
+        <w:spacing w:after="120"/>
+      </w:pPr>
+      <w:r>
+        <w:rPr>
+          <w:b/>
+          <w:bCs/>
+        </w:rPr>
+        <w:t xml:space="preserve">The problem: </w:t>
+      </w:r>
+      <w:r>
+        <w:t xml:space="preserve">The ECM defines a position-dependent refraction index n(r) = 1 + 0.20 × (8537/H(r) − 1). Near the ice wall, n(r) = 3.49. At r = 40,000 km, n(r) = 28.8. This means light bends by a factor of up to 29 at the disc's edge.</w:t>
+      </w:r>
+    </w:p>
+    <w:p>
+      <w:pPr>
+        <w:spacing w:after="120"/>
+      </w:pPr>
+      <w:r>
+        <w:rPr>
+          <w:b/>
+          <w:bCs/>
+        </w:rPr>
+        <w:t xml:space="preserve">Why this matters: </w:t>
+      </w:r>
+      <w:r>
+        <w:t xml:space="preserve">When a model has a free function that can bend light by a factor of 29, it can accommodate essentially any optical observation from southern latitudes. Star positions look wrong? Refraction. Sun angle doesn't match? Refraction. Southern cross visibility from unexpected locations? Refraction. This is not a prediction — it is an escape hatch that makes the model's optical predictions unfalsifiable. A genuinely predictive refraction model would need to specify n(r) from first principles and then show it reproduces specific, quantitative observations better than the standard atmosphere. The ECM does not do this; the function was fitted to reconcile the dome geometry with observations that contradict it.</w:t>
+      </w:r>
+    </w:p>
+    <w:p>
+      <w:pPr>
+        <w:pStyle w:val="Heading2"/>
+      </w:pPr>
+      <w:r>
+        <w:t xml:space="preserve">4.10 The Model's Own 'Open Problems' as Concessions</w:t>
+      </w:r>
+    </w:p>
+    <w:p>
+      <w:pPr>
+        <w:spacing w:after="120"/>
+      </w:pPr>
+      <w:r>
+        <w:rPr>
+          <w:b/>
+          <w:bCs/>
+        </w:rPr>
+        <w:t xml:space="preserve">OPEN-001: </w:t>
+      </w:r>
+      <w:r>
+        <w:t xml:space="preserve">Admits the model cannot produce geographic coordinates without borrowing WGS84 (the globe's coordinate system). A cosmological model that cannot independently locate points on its own geometry is not operationally complete.</w:t>
+      </w:r>
+    </w:p>
+    <w:p>
+      <w:pPr>
+        <w:spacing w:after="120"/>
+      </w:pPr>
+      <w:r>
+        <w:rPr>
+          <w:b/>
+          <w:bCs/>
+        </w:rPr>
+        <w:t xml:space="preserve">OPEN-003: </w:t>
+      </w:r>
+      <w:r>
+        <w:t xml:space="preserve">Admits the ellipse parameters are 'still converging.' After 51 versions, the basic shape of the disc is still being adjusted — this is curve-fitting in real time, not derivation from first principles.</w:t>
+      </w:r>
+    </w:p>
+    <w:p>
+      <w:pPr>
+        <w:spacing w:after="120"/>
+      </w:pPr>
+      <w:r>
+        <w:rPr>
+          <w:b/>
+          <w:bCs/>
+        </w:rPr>
+        <w:t xml:space="preserve">OPEN-007: </w:t>
+      </w:r>
+      <w:r>
+        <w:t xml:space="preserve">Admits the moon's orbital mechanics have no working dome-native explanation. Tidal periods are claimed as predictions (WINs 045–051), but the lunar mechanics that generate those periods remain an open problem. This is not an 'open problem' in the way physics uses the term (like the strong CP problem); it is a missing foundation. A model that cannot independently produce coordinates or explain the moon's motion is not a working cosmological model.</w:t>
+      </w:r>
+    </w:p>
+    <w:p>
       <w:r>
         <w:br w:type="page"/>
       </w:r>
@@ -14924,7 +15113,7 @@
         </w:rPr>
         <w:t xml:space="preserve">NOAA World Magnetic Model 2025: </w:t>
       </w:r>
-      <w:hyperlink w:history="1" r:id="rIdfd-q8odtoltdmwuie33ve">
+      <w:hyperlink w:history="1" r:id="rIdow1iohh_fk9ijs-dy-xyi">
         <w:r>
           <w:rPr>
             <w:rStyle w:val="Hyperlink"/>
@@ -14944,7 +15133,7 @@
         </w:rPr>
         <w:t xml:space="preserve">NOAA Wandering Geomagnetic Poles: </w:t>
       </w:r>
-      <w:hyperlink w:history="1" r:id="rIdh2-butd9vdm-g4rb4p3ea">
+      <w:hyperlink w:history="1" r:id="rId3_geui-upvy1snrrzv_ee">
         <w:r>
           <w:rPr>
             <w:rStyle w:val="Hyperlink"/>
@@ -14964,7 +15153,7 @@
         </w:rPr>
         <w:t xml:space="preserve">CHAOS-7 Geomagnetic Field Model: </w:t>
       </w:r>
-      <w:hyperlink w:history="1" r:id="rIdufxsriqgmlbzkvtezjgai">
+      <w:hyperlink w:history="1" r:id="rId0x1_hiichmq8sfp_wassj">
         <w:r>
           <w:rPr>
             <w:rStyle w:val="Hyperlink"/>
@@ -14984,7 +15173,7 @@
         </w:rPr>
         <w:t xml:space="preserve">ESA Swarm Satellite Mission: </w:t>
       </w:r>
-      <w:hyperlink w:history="1" r:id="rIduc5mhhohvfa11x7-rjqru">
+      <w:hyperlink w:history="1" r:id="rIdfh4xyw-y3vuw-fxwjlmfx">
         <w:r>
           <w:rPr>
             <w:rStyle w:val="Hyperlink"/>
@@ -15004,7 +15193,7 @@
         </w:rPr>
         <w:t xml:space="preserve">INTERMAGNET Observatory Network: </w:t>
       </w:r>
-      <w:hyperlink w:history="1" r:id="rIdi2lu9dp5ubea9m8azexu_">
+      <w:hyperlink w:history="1" r:id="rIdcbfyeah-rivyvjbc0lxrc">
         <w:r>
           <w:rPr>
             <w:rStyle w:val="Hyperlink"/>
@@ -15024,7 +15213,7 @@
         </w:rPr>
         <w:t xml:space="preserve">IGRF-13: </w:t>
       </w:r>
-      <w:hyperlink w:history="1" r:id="rIdorpgzsjbj4pcwmxaxmvbh">
+      <w:hyperlink w:history="1" r:id="rIdo4piphcfjtkd8stam0yjb">
         <w:r>
           <w:rPr>
             <w:rStyle w:val="Hyperlink"/>
@@ -15044,7 +15233,7 @@
         </w:rPr>
         <w:t xml:space="preserve">ESA Gaia Data Release 3: </w:t>
       </w:r>
-      <w:hyperlink w:history="1" r:id="rIdf9kq_vevqmbogtfbumidp">
+      <w:hyperlink w:history="1" r:id="rIdnzevnc5wz0dcxiiqo3gmv">
         <w:r>
           <w:rPr>
             <w:rStyle w:val="Hyperlink"/>
@@ -15064,7 +15253,7 @@
         </w:rPr>
         <w:t xml:space="preserve">Hipparcos Catalogue: </w:t>
       </w:r>
-      <w:hyperlink w:history="1" r:id="rIdxzea263vojt28krl2ycia">
+      <w:hyperlink w:history="1" r:id="rIdaw43xj2_uai4mpush06j7">
         <w:r>
           <w:rPr>
             <w:rStyle w:val="Hyperlink"/>
@@ -15084,7 +15273,7 @@
         </w:rPr>
         <w:t xml:space="preserve">US Patent 787412 (Tesla): </w:t>
       </w:r>
-      <w:hyperlink w:history="1" r:id="rId8gg2vvsxzp9frtx1mdnks">
+      <w:hyperlink w:history="1" r:id="rIdkq5w7kqcxoi6adkpbwidq">
         <w:r>
           <w:rPr>
             <w:rStyle w:val="Hyperlink"/>
@@ -15104,7 +15293,7 @@
         </w:rPr>
         <w:t xml:space="preserve">NOAA Solar Position Algorithm: </w:t>
       </w:r>
-      <w:hyperlink w:history="1" r:id="rIdsy7hqbwtbjmoz7lxtmlp5">
+      <w:hyperlink w:history="1" r:id="rId_cbfzb7ex-q9qgc5n85lw">
         <w:r>
           <w:rPr>
             <w:rStyle w:val="Hyperlink"/>
@@ -15124,7 +15313,7 @@
         </w:rPr>
         <w:t xml:space="preserve">National Geodetic Survey Gravity: </w:t>
       </w:r>
-      <w:hyperlink w:history="1" r:id="rIdlr41vkfbeqjkcov527yvz">
+      <w:hyperlink w:history="1" r:id="rIdc1ncsle565gddnuwflymo">
         <w:r>
           <w:rPr>
             <w:rStyle w:val="Hyperlink"/>
@@ -15144,7 +15333,7 @@
         </w:rPr>
         <w:t xml:space="preserve">CHIME/FRB Project: </w:t>
       </w:r>
-      <w:hyperlink w:history="1" r:id="rIdu8wcos5vlkj_qmkpzka0k">
+      <w:hyperlink w:history="1" r:id="rId3q0hocsdrzgl283e0u4ga">
         <w:r>
           <w:rPr>
             <w:rStyle w:val="Hyperlink"/>
@@ -15164,7 +15353,7 @@
         </w:rPr>
         <w:t xml:space="preserve">GRACE-FO (gravity mapping): </w:t>
       </w:r>
-      <w:hyperlink w:history="1" r:id="rIdtmfxc52ogfyzvzr9uclui">
+      <w:hyperlink w:history="1" r:id="rId-h7b4igu2mfyryxjve7nk">
         <w:r>
           <w:rPr>
             <w:rStyle w:val="Hyperlink"/>
@@ -15184,7 +15373,7 @@
         </w:rPr>
         <w:t xml:space="preserve">GOCE (gravity field): </w:t>
       </w:r>
-      <w:hyperlink w:history="1" r:id="rId9xvdm99azege9byzalzy3">
+      <w:hyperlink w:history="1" r:id="rIdryuglgy1rynbf9oecyx1-">
         <w:r>
           <w:rPr>
             <w:rStyle w:val="Hyperlink"/>
@@ -15204,7 +15393,7 @@
         </w:rPr>
         <w:t xml:space="preserve">GPS.gov: </w:t>
       </w:r>
-      <w:hyperlink w:history="1" r:id="rIdi0me7rt-nnpuqsmkqe-_j">
+      <w:hyperlink w:history="1" r:id="rIdn3jo0wbxbvsa3fgvnotaf">
         <w:r>
           <w:rPr>
             <w:rStyle w:val="Hyperlink"/>
@@ -15224,7 +15413,7 @@
         </w:rPr>
         <w:t xml:space="preserve">CelesTrak TLE Data: </w:t>
       </w:r>
-      <w:hyperlink w:history="1" r:id="rIdxi-efa1a0ef3eyvgiyuxn">
+      <w:hyperlink w:history="1" r:id="rIdjncrydx0ox6abseljhzll">
         <w:r>
           <w:rPr>
             <w:rStyle w:val="Hyperlink"/>
@@ -15458,6 +15647,21 @@
       </w:r>
       <w:r>
         <w:t xml:space="preserve">Added 'Self-Contradicted' verdict category for 11 WINs where the dome's own geometry produces predictions that contradict the author's claims (Schumann ~22 Hz, tidal forces 300,000× excess, gravity 90% drop at rim, globe solar formula substitution). Updated tallies and patterns.</w:t>
+      </w:r>
+    </w:p>
+    <w:p>
+      <w:pPr>
+        <w:spacing w:after="120"/>
+      </w:pPr>
+      <w:r>
+        <w:rPr>
+          <w:b/>
+          <w:bCs/>
+        </w:rPr>
+        <w:t xml:space="preserve">V4.8 (April 5, 2026): </w:t>
+      </w:r>
+      <w:r>
+        <w:t xml:space="preserve">Incorporated findings from independent adversarial review. Strengthened: SH distance failures (model's own 73% admission), GPS/satellite argument (Keplerian orbits, relativistic corrections), Antarctic circumnavigation (126,000 km rim vs 13,800 km measured). New sections: solar angular diameter falsification (4.8), aetheric refraction unfalsifiability (4.9), Open Problems as concessions (4.10). Improved timestamping acknowledgment. Added WIN-001 vs WIN-002 Schumann frequency internal contradiction.</w:t>
       </w:r>
     </w:p>
     <w:p>

</xml_diff>

<commit_message>
Add clickable references to 32 WIN detail blocks missing them
63 of 67 WINs now have verifiable external links in their evidence
sections (up from 33). Added references to peer-reviewed papers
(Doodson, Oldham, Gutenberg, Vincenty, Stephens, Gravity Probe B),
government datasets (NOAA, NASA, ESA/Planck, WMAP), and observatory
networks (INTERMAGNET, CHAOS-7, IGRF-13). WIN-031 and WIN-032
(unfalsifiable theological claims) have no data sources to link.
Rebuilt HTML, DOCX, and PDF.

Co-Authored-By: Claude Opus 4.6 <noreply@anthropic.com>
</commit_message>
<xml_diff>
--- a/downloads/critical-review-dome-model-v4.docx
+++ b/downloads/critical-review-dome-model-v4.docx
@@ -8889,7 +8889,7 @@
       <w:r>
         <w:t xml:space="preserve">US Patent 787412 (1905), publicly available at </w:t>
       </w:r>
-      <w:hyperlink w:history="1" r:id="rIdjmp6n5sathvmcun4atlfn">
+      <w:hyperlink w:history="1" r:id="rIdtcjrmta6ngemae2wf5wd3">
         <w:r>
           <w:rPr>
             <w:rStyle w:val="Hyperlink"/>
@@ -9029,7 +9029,7 @@
       <w:r>
         <w:t xml:space="preserve">James Bradley (1727) explicitly tested and rejected atmospheric refraction as an explanation: refraction is wavelength-dependent (chromatic), while stellar aberration is achromatic. Modern VLBI measurements achieve milliarcsecond precision and directly confirm aberration correlates with Earth's orbital velocity (~30 km/s). The </w:t>
       </w:r>
-      <w:hyperlink w:history="1" r:id="rIdq1t5dryferd4aneezjshe">
+      <w:hyperlink w:history="1" r:id="rIdbguvoac3asf6miaenwyp2">
         <w:r>
           <w:rPr>
             <w:rStyle w:val="Hyperlink"/>
@@ -9095,7 +9095,7 @@
       <w:r>
         <w:t xml:space="preserve">ESA </w:t>
       </w:r>
-      <w:hyperlink w:history="1" r:id="rIdzhusgz11biiuqm-whpjvw">
+      <w:hyperlink w:history="1" r:id="rIdv1_zzaq67xugobxpn89zv">
         <w:r>
           <w:rPr>
             <w:rStyle w:val="Hyperlink"/>
@@ -9161,7 +9161,7 @@
       <w:r>
         <w:t xml:space="preserve">Crepuscular rays are parallel beams made visible by atmospheric scattering. The apparent divergence is a perspective effect. Crucially, anticrepuscular rays converge at the anti-solar point simultaneously. See </w:t>
       </w:r>
-      <w:hyperlink w:history="1" r:id="rId6v9pv47adniodqqrwaxhq">
+      <w:hyperlink w:history="1" r:id="rIduyurmozklho7qqbzd_xj8">
         <w:r>
           <w:rPr>
             <w:rStyle w:val="Hyperlink"/>
@@ -9172,7 +9172,7 @@
       <w:r>
         <w:t xml:space="preserve"> and </w:t>
       </w:r>
-      <w:hyperlink w:history="1" r:id="rId0oqjyqtuxjan6uaqsbm0b">
+      <w:hyperlink w:history="1" r:id="rIdxxzhgr2a6ahrijh-npnud">
         <w:r>
           <w:rPr>
             <w:rStyle w:val="Hyperlink"/>
@@ -9238,7 +9238,7 @@
       <w:r>
         <w:t xml:space="preserve">NOAA officially states no evidence of anomalous disappearances. </w:t>
       </w:r>
-      <w:hyperlink w:history="1" r:id="rIden7zh2dm5hnlmmgjtauwl">
+      <w:hyperlink w:history="1" r:id="rIdu4lfs3dnauxibyjvvnmq9">
         <w:r>
           <w:rPr>
             <w:rStyle w:val="Hyperlink"/>
@@ -9304,7 +9304,7 @@
       <w:r>
         <w:t xml:space="preserve">Hipparcos </w:t>
       </w:r>
-      <w:hyperlink w:history="1" r:id="rIdprag2pdzrbtusdcscj_dk">
+      <w:hyperlink w:history="1" r:id="rIdaqhat4s9meblywvjtxqel">
         <w:r>
           <w:rPr>
             <w:rStyle w:val="Hyperlink"/>
@@ -9720,7 +9720,7 @@
       <w:r>
         <w:t xml:space="preserve">Terra-Nova et al. (2017, PNAS) demonstrate reversed-flux patches reproduce SAA splitting in MHD simulations. The </w:t>
       </w:r>
-      <w:hyperlink w:history="1" r:id="rIdajlvlnzryothibxrszemm">
+      <w:hyperlink w:history="1" r:id="rId-uzy7cmfyex0_wie6mdyj">
         <w:r>
           <w:rPr>
             <w:rStyle w:val="Hyperlink"/>
@@ -9731,7 +9731,7 @@
       <w:r>
         <w:t xml:space="preserve"> documents the evolution quantitatively. </w:t>
       </w:r>
-      <w:hyperlink w:history="1" r:id="rIdd2ya502-vei9kkt1ft4rx">
+      <w:hyperlink w:history="1" r:id="rId-nkqs4ae8701jtmx4wjju">
         <w:r>
           <w:rPr>
             <w:rStyle w:val="Hyperlink"/>
@@ -9782,7 +9782,7 @@
       <w:r>
         <w:t xml:space="preserve">Normal secular variation documented by </w:t>
       </w:r>
-      <w:hyperlink w:history="1" r:id="rIdfjfpbqm8mb7ffzgunpytj">
+      <w:hyperlink w:history="1" r:id="rIdpcvrhtx_3apr6hrb74i8i">
         <w:r>
           <w:rPr>
             <w:rStyle w:val="Hyperlink"/>
@@ -9849,7 +9849,7 @@
       <w:r>
         <w:t xml:space="preserve">Eclipse-induced perturbations predicted by Chapman (1933) via ionospheric conductivity drops. Data from </w:t>
       </w:r>
-      <w:hyperlink w:history="1" r:id="rIdnks2jacbr-xsn2m8xspui">
+      <w:hyperlink w:history="1" r:id="rIdkall5_31dbdzidoo25sw5">
         <w:r>
           <w:rPr>
             <w:rStyle w:val="Hyperlink"/>
@@ -9937,7 +9937,7 @@
       <w:r>
         <w:t xml:space="preserve">The formula used is for a quarter-wave linear waveguide, not a spherical cavity. Correct formula f = c/(2*pi*R) gives R = 6,098 km, within 4% of Earth's radius. The ionosphere IS conductive (</w:t>
       </w:r>
-      <w:hyperlink w:history="1" r:id="rIdpeaahwzpspon5mg7gy7cn">
+      <w:hyperlink w:history="1" r:id="rId72nfx1x-2_mhpg5wjwq3i">
         <w:r>
           <w:rPr>
             <w:rStyle w:val="Hyperlink"/>
@@ -10004,7 +10004,7 @@
       <w:r>
         <w:t xml:space="preserve">All five observations already predicted by </w:t>
       </w:r>
-      <w:hyperlink w:history="1" r:id="rIdfdtcmqxhpcay45hb72x5n">
+      <w:hyperlink w:history="1" r:id="rId2uj5y3hjj8yemy9fhwvwj">
         <w:r>
           <w:rPr>
             <w:rStyle w:val="Hyperlink"/>
@@ -10015,7 +10015,7 @@
       <w:r>
         <w:t xml:space="preserve">, </w:t>
       </w:r>
-      <w:hyperlink w:history="1" r:id="rIdhrqbigudh5zboi7t2jomd">
+      <w:hyperlink w:history="1" r:id="rId6yvex0p389jrb1a5l2frl">
         <w:r>
           <w:rPr>
             <w:rStyle w:val="Hyperlink"/>
@@ -10342,7 +10342,7 @@
       <w:r>
         <w:t xml:space="preserve">Antarctic gravity anomalies are mapped from orbit by </w:t>
       </w:r>
-      <w:hyperlink w:history="1" r:id="rIdpp1kpet9ymvs8aybu5s2k">
+      <w:hyperlink w:history="1" r:id="rIdf0gjmsgj1pjsqwnbkvjql">
         <w:r>
           <w:rPr>
             <w:rStyle w:val="Hyperlink"/>
@@ -10353,7 +10353,7 @@
       <w:r>
         <w:t xml:space="preserve"> and </w:t>
       </w:r>
-      <w:hyperlink w:history="1" r:id="rId5k80z-1yqywwkd_qkumb5">
+      <w:hyperlink w:history="1" r:id="rIdqbirsnjtypas29m37znzr">
         <w:r>
           <w:rPr>
             <w:rStyle w:val="Hyperlink"/>
@@ -13329,7 +13329,7 @@
       <w:r>
         <w:t xml:space="preserve">A </w:t>
       </w:r>
-      <w:hyperlink w:history="1" r:id="rId7e8u7h-0gytwtumaefzqu">
+      <w:hyperlink w:history="1" r:id="rIdquvlsvhaowbnttkdzk1vd">
         <w:r>
           <w:rPr>
             <w:rStyle w:val="Hyperlink"/>
@@ -13340,7 +13340,7 @@
       <w:r>
         <w:t xml:space="preserve"> found detectable decreases in X, Z, and total field components during eclipses. An </w:t>
       </w:r>
-      <w:hyperlink w:history="1" r:id="rIdp-re4bilwvtoxzbeoyjkb">
+      <w:hyperlink w:history="1" r:id="rIdj4o6kxysuzemjvm5fhcuy">
         <w:r>
           <w:rPr>
             <w:rStyle w:val="Hyperlink"/>
@@ -13845,7 +13845,7 @@
       <w:r>
         <w:t xml:space="preserve">Continuous 24-hour sunlight. A local sun at 5,733 km circling above a flat disc cannot produce 24-hour sunlight at the disc edge. Directly observable at Amundsen-Scott Station, staffed year-round since 1957. See </w:t>
       </w:r>
-      <w:hyperlink w:history="1" r:id="rIdpjax4khewosdqbkjwoe2r">
+      <w:hyperlink w:history="1" r:id="rIdlu_046lar6gs5oqpouf1h">
         <w:r>
           <w:rPr>
             <w:rStyle w:val="Hyperlink"/>
@@ -13909,7 +13909,7 @@
       <w:r>
         <w:t xml:space="preserve">GPS provides 1–3 meter accuracy worldwide using 24+ satellites in Keplerian orbits calculated from spherical-Earth gravitational mechanics. The system requires precise relativistic corrections (both special and general) that depend on the satellites' orbital velocity and altitude above a spherical gravitational well. If Earth were a flat disc with different geometry, the signal propagation times, relativistic corrections, and satellite visibility geometry would all be wrong, and the system would not achieve meter-level accuracy. The same applies to every other satellite navigation system (GLONASS, Galileo, BeiDou). The ISS at 408 km is visible on predictable schedules computed from Keplerian orbits. Geostationary satellites at 35,786 km — far above the dome's maximum height — provide continuous coverage. See </w:t>
       </w:r>
-      <w:hyperlink w:history="1" r:id="rIdkk8h4i4y_nagahrwm5-mk">
+      <w:hyperlink w:history="1" r:id="rIdfv6hdrph-h2cxavtoz9g5">
         <w:r>
           <w:rPr>
             <w:rStyle w:val="Hyperlink"/>
@@ -13920,7 +13920,7 @@
       <w:r>
         <w:t xml:space="preserve">; </w:t>
       </w:r>
-      <w:hyperlink w:history="1" r:id="rId1uwxkbzlqrjrznyrjmtvo">
+      <w:hyperlink w:history="1" r:id="rId0osbssm8a896ybj_pqij3">
         <w:r>
           <w:rPr>
             <w:rStyle w:val="Hyperlink"/>
@@ -13969,7 +13969,7 @@
       <w:r>
         <w:t xml:space="preserve">Modern solar calculators (</w:t>
       </w:r>
-      <w:hyperlink w:history="1" r:id="rIdsuzg-ugqay2ht1dykw9_z">
+      <w:hyperlink w:history="1" r:id="rId2erik6gfexrpbzhty1to8">
         <w:r>
           <w:rPr>
             <w:rStyle w:val="Hyperlink"/>
@@ -14018,7 +14018,7 @@
       <w:r>
         <w:t xml:space="preserve">The </w:t>
       </w:r>
-      <w:hyperlink w:history="1" r:id="rIdf5fn_pgd6idlaqf9wo0zj">
+      <w:hyperlink w:history="1" r:id="rIdyc2cgxjt5eqqhlw3cjnlg">
         <w:r>
           <w:rPr>
             <w:rStyle w:val="Hyperlink"/>
@@ -14067,7 +14067,7 @@
       <w:r>
         <w:t xml:space="preserve">Earth's field is a dipole. South magnetic pole at 64.1°S, 135.9°E (</w:t>
       </w:r>
-      <w:hyperlink w:history="1" r:id="rIdqzrazuwl2vuot6er1qfho">
+      <w:hyperlink w:history="1" r:id="rIdtjjir8tt6qn2yukrzdenx">
         <w:r>
           <w:rPr>
             <w:rStyle w:val="Hyperlink"/>
@@ -14116,7 +14116,7 @@
       <w:r>
         <w:t xml:space="preserve">g = 9.780 m/s² at equator, 9.832 m/s² at poles (0.53% variation). On a flat disc, centrifugal force points outward from center, producing the OPPOSITE pattern. See </w:t>
       </w:r>
-      <w:hyperlink w:history="1" r:id="rIdlz3ihjkkqt-ilhivu6fem">
+      <w:hyperlink w:history="1" r:id="rId0rpvt4cz5ydjh1t7cz3cr">
         <w:r>
           <w:rPr>
             <w:rStyle w:val="Hyperlink"/>
@@ -15113,7 +15113,7 @@
         </w:rPr>
         <w:t xml:space="preserve">NOAA World Magnetic Model 2025: </w:t>
       </w:r>
-      <w:hyperlink w:history="1" r:id="rIdjweawlx2vt6msodlajyvu">
+      <w:hyperlink w:history="1" r:id="rIdzafecxmm2pcdaybex-mgm">
         <w:r>
           <w:rPr>
             <w:rStyle w:val="Hyperlink"/>
@@ -15133,7 +15133,7 @@
         </w:rPr>
         <w:t xml:space="preserve">NOAA Wandering Geomagnetic Poles: </w:t>
       </w:r>
-      <w:hyperlink w:history="1" r:id="rIdqryokvv37tgcnruo0r2x1">
+      <w:hyperlink w:history="1" r:id="rIdcwfpwwgfrxgqdbzb8sw9f">
         <w:r>
           <w:rPr>
             <w:rStyle w:val="Hyperlink"/>
@@ -15153,7 +15153,7 @@
         </w:rPr>
         <w:t xml:space="preserve">CHAOS-7 Geomagnetic Field Model: </w:t>
       </w:r>
-      <w:hyperlink w:history="1" r:id="rIdrf9bzj5i8btpefmibokb2">
+      <w:hyperlink w:history="1" r:id="rId1nwuflcmos1frzspwgisq">
         <w:r>
           <w:rPr>
             <w:rStyle w:val="Hyperlink"/>
@@ -15173,7 +15173,7 @@
         </w:rPr>
         <w:t xml:space="preserve">ESA Swarm Satellite Mission: </w:t>
       </w:r>
-      <w:hyperlink w:history="1" r:id="rIdvuut_u9wjiyrwuozqkzpq">
+      <w:hyperlink w:history="1" r:id="rIddxizpw0ygb_byrevrylc9">
         <w:r>
           <w:rPr>
             <w:rStyle w:val="Hyperlink"/>
@@ -15193,7 +15193,7 @@
         </w:rPr>
         <w:t xml:space="preserve">INTERMAGNET Observatory Network: </w:t>
       </w:r>
-      <w:hyperlink w:history="1" r:id="rId5famt2nxkvromhssq_tfv">
+      <w:hyperlink w:history="1" r:id="rIdd4zxculikfhsqphlada4u">
         <w:r>
           <w:rPr>
             <w:rStyle w:val="Hyperlink"/>
@@ -15213,7 +15213,7 @@
         </w:rPr>
         <w:t xml:space="preserve">IGRF-13: </w:t>
       </w:r>
-      <w:hyperlink w:history="1" r:id="rIdqojbe86mnu6q244qcfpic">
+      <w:hyperlink w:history="1" r:id="rIdfhdpwh1kb40wrkdwyokhf">
         <w:r>
           <w:rPr>
             <w:rStyle w:val="Hyperlink"/>
@@ -15233,7 +15233,7 @@
         </w:rPr>
         <w:t xml:space="preserve">ESA Gaia Data Release 3: </w:t>
       </w:r>
-      <w:hyperlink w:history="1" r:id="rIda7d6s6guqhec9whpdxa4e">
+      <w:hyperlink w:history="1" r:id="rIdguon9rzrrjn2xkcopkan3">
         <w:r>
           <w:rPr>
             <w:rStyle w:val="Hyperlink"/>
@@ -15253,7 +15253,7 @@
         </w:rPr>
         <w:t xml:space="preserve">Hipparcos Catalogue: </w:t>
       </w:r>
-      <w:hyperlink w:history="1" r:id="rIdzesjthgay08sisg4hxwbw">
+      <w:hyperlink w:history="1" r:id="rIdxx5gbnf7tfbufhxx0sd1c">
         <w:r>
           <w:rPr>
             <w:rStyle w:val="Hyperlink"/>
@@ -15273,7 +15273,7 @@
         </w:rPr>
         <w:t xml:space="preserve">US Patent 787412 (Tesla): </w:t>
       </w:r>
-      <w:hyperlink w:history="1" r:id="rIdsndpzg366taymmlp4laqm">
+      <w:hyperlink w:history="1" r:id="rIdtv-vebpi1jojz-hftz-wa">
         <w:r>
           <w:rPr>
             <w:rStyle w:val="Hyperlink"/>
@@ -15293,7 +15293,7 @@
         </w:rPr>
         <w:t xml:space="preserve">NOAA Solar Position Algorithm: </w:t>
       </w:r>
-      <w:hyperlink w:history="1" r:id="rIda_ugd39oqnnk2zyrwexkc">
+      <w:hyperlink w:history="1" r:id="rIdck7m5tm6ja8c33f89ai-e">
         <w:r>
           <w:rPr>
             <w:rStyle w:val="Hyperlink"/>
@@ -15313,7 +15313,7 @@
         </w:rPr>
         <w:t xml:space="preserve">National Geodetic Survey Gravity: </w:t>
       </w:r>
-      <w:hyperlink w:history="1" r:id="rId874pbfuvgek4jwjgrru5e">
+      <w:hyperlink w:history="1" r:id="rIdt4a78sqct4ahr2xs_9600">
         <w:r>
           <w:rPr>
             <w:rStyle w:val="Hyperlink"/>
@@ -15333,7 +15333,7 @@
         </w:rPr>
         <w:t xml:space="preserve">CHIME/FRB Project: </w:t>
       </w:r>
-      <w:hyperlink w:history="1" r:id="rIdrlmfkopockwotluf1s-jj">
+      <w:hyperlink w:history="1" r:id="rId_6vgn2ifmelhgpmhozsdu">
         <w:r>
           <w:rPr>
             <w:rStyle w:val="Hyperlink"/>
@@ -15353,7 +15353,7 @@
         </w:rPr>
         <w:t xml:space="preserve">GRACE-FO (gravity mapping): </w:t>
       </w:r>
-      <w:hyperlink w:history="1" r:id="rIdwpvawnbzn7ngdd1eobm3j">
+      <w:hyperlink w:history="1" r:id="rId9cmoap3vbdiaxeqrhxdjl">
         <w:r>
           <w:rPr>
             <w:rStyle w:val="Hyperlink"/>
@@ -15373,7 +15373,7 @@
         </w:rPr>
         <w:t xml:space="preserve">GOCE (gravity field): </w:t>
       </w:r>
-      <w:hyperlink w:history="1" r:id="rIdcmedmucwuv8bydc3w6fxn">
+      <w:hyperlink w:history="1" r:id="rIditjih7wgiif7uzhnkboem">
         <w:r>
           <w:rPr>
             <w:rStyle w:val="Hyperlink"/>
@@ -15393,7 +15393,7 @@
         </w:rPr>
         <w:t xml:space="preserve">GPS.gov: </w:t>
       </w:r>
-      <w:hyperlink w:history="1" r:id="rIdkmv1zr6bwofqvizxwjtru">
+      <w:hyperlink w:history="1" r:id="rIdtra6ydzgzrtpjizmo4_p7">
         <w:r>
           <w:rPr>
             <w:rStyle w:val="Hyperlink"/>
@@ -15413,7 +15413,7 @@
         </w:rPr>
         <w:t xml:space="preserve">CelesTrak TLE Data: </w:t>
       </w:r>
-      <w:hyperlink w:history="1" r:id="rId10sn74jb9czssj9364abi">
+      <w:hyperlink w:history="1" r:id="rId0pgrk5pfyis4mw-unk2_w">
         <w:r>
           <w:rPr>
             <w:rStyle w:val="Hyperlink"/>

</xml_diff>

<commit_message>
Strengthen 11 Self-Contradicted evidence blocks with dome's own math
Each rewritten block now explicitly:
- States the dome model's own parameter (e.g., H(r) = 8537·exp(−r/8619))
- Works through the math using those parameters
- Shows the contradictory result vs observation
- Links to the relevant Section 4.5.x derivation

Key contradictions surfaced:
- Schumann: dome's H_eff ≈ 3,400 km → 22 Hz (observed: 7.83 Hz, 2.8× off)
- Tides: local moon at 5,733 km → 301,000× too strong forcing → 300 km ranges
- Gravity: dome height at rim = 837 km → 90% gravity drop (observed: 0.53%)
- Solar elevation: author uses globe's 23.45° axial tilt formula verbatim

Co-Authored-By: Claude Opus 4.6 <noreply@anthropic.com>
</commit_message>
<xml_diff>
--- a/downloads/critical-review-dome-model-v4.docx
+++ b/downloads/critical-review-dome-model-v4.docx
@@ -8889,7 +8889,7 @@
       <w:r>
         <w:t xml:space="preserve">US Patent 787412 (1905), publicly available at </w:t>
       </w:r>
-      <w:hyperlink w:history="1" r:id="rIdtcjrmta6ngemae2wf5wd3">
+      <w:hyperlink w:history="1" r:id="rIddg2ylui8mnwhaw9j6ec1y">
         <w:r>
           <w:rPr>
             <w:rStyle w:val="Hyperlink"/>
@@ -9029,7 +9029,7 @@
       <w:r>
         <w:t xml:space="preserve">James Bradley (1727) explicitly tested and rejected atmospheric refraction as an explanation: refraction is wavelength-dependent (chromatic), while stellar aberration is achromatic. Modern VLBI measurements achieve milliarcsecond precision and directly confirm aberration correlates with Earth's orbital velocity (~30 km/s). The </w:t>
       </w:r>
-      <w:hyperlink w:history="1" r:id="rIdbguvoac3asf6miaenwyp2">
+      <w:hyperlink w:history="1" r:id="rId5epxhloek_hiyvzcbma2i">
         <w:r>
           <w:rPr>
             <w:rStyle w:val="Hyperlink"/>
@@ -9095,7 +9095,7 @@
       <w:r>
         <w:t xml:space="preserve">ESA </w:t>
       </w:r>
-      <w:hyperlink w:history="1" r:id="rIdv1_zzaq67xugobxpn89zv">
+      <w:hyperlink w:history="1" r:id="rId5f0u4sanxirvajicyd1lp">
         <w:r>
           <w:rPr>
             <w:rStyle w:val="Hyperlink"/>
@@ -9161,7 +9161,7 @@
       <w:r>
         <w:t xml:space="preserve">Crepuscular rays are parallel beams made visible by atmospheric scattering. The apparent divergence is a perspective effect. Crucially, anticrepuscular rays converge at the anti-solar point simultaneously. See </w:t>
       </w:r>
-      <w:hyperlink w:history="1" r:id="rIduyurmozklho7qqbzd_xj8">
+      <w:hyperlink w:history="1" r:id="rIdkzfgm21qpjwq5k5jkymgu">
         <w:r>
           <w:rPr>
             <w:rStyle w:val="Hyperlink"/>
@@ -9172,7 +9172,7 @@
       <w:r>
         <w:t xml:space="preserve"> and </w:t>
       </w:r>
-      <w:hyperlink w:history="1" r:id="rIdxxzhgr2a6ahrijh-npnud">
+      <w:hyperlink w:history="1" r:id="rIdopzmrewhmymmbgzoyo-j6">
         <w:r>
           <w:rPr>
             <w:rStyle w:val="Hyperlink"/>
@@ -9238,7 +9238,7 @@
       <w:r>
         <w:t xml:space="preserve">NOAA officially states no evidence of anomalous disappearances. </w:t>
       </w:r>
-      <w:hyperlink w:history="1" r:id="rIdu4lfs3dnauxibyjvvnmq9">
+      <w:hyperlink w:history="1" r:id="rIdtmmlcwvgruvet1htapcmo">
         <w:r>
           <w:rPr>
             <w:rStyle w:val="Hyperlink"/>
@@ -9304,7 +9304,7 @@
       <w:r>
         <w:t xml:space="preserve">Hipparcos </w:t>
       </w:r>
-      <w:hyperlink w:history="1" r:id="rIdaqhat4s9meblywvjtxqel">
+      <w:hyperlink w:history="1" r:id="rIdf73yqepj88p_f_avfsl6n">
         <w:r>
           <w:rPr>
             <w:rStyle w:val="Hyperlink"/>
@@ -9720,7 +9720,7 @@
       <w:r>
         <w:t xml:space="preserve">Terra-Nova et al. (2017, PNAS) demonstrate reversed-flux patches reproduce SAA splitting in MHD simulations. The </w:t>
       </w:r>
-      <w:hyperlink w:history="1" r:id="rId-uzy7cmfyex0_wie6mdyj">
+      <w:hyperlink w:history="1" r:id="rId8huqpmidrn16fhdop-yq9">
         <w:r>
           <w:rPr>
             <w:rStyle w:val="Hyperlink"/>
@@ -9731,7 +9731,7 @@
       <w:r>
         <w:t xml:space="preserve"> documents the evolution quantitatively. </w:t>
       </w:r>
-      <w:hyperlink w:history="1" r:id="rId-nkqs4ae8701jtmx4wjju">
+      <w:hyperlink w:history="1" r:id="rIdemcwkbrbts6s9tqdnqp04">
         <w:r>
           <w:rPr>
             <w:rStyle w:val="Hyperlink"/>
@@ -9782,7 +9782,7 @@
       <w:r>
         <w:t xml:space="preserve">Normal secular variation documented by </w:t>
       </w:r>
-      <w:hyperlink w:history="1" r:id="rIdpcvrhtx_3apr6hrb74i8i">
+      <w:hyperlink w:history="1" r:id="rIdrdouiqkx2oe-n8tx06pnh">
         <w:r>
           <w:rPr>
             <w:rStyle w:val="Hyperlink"/>
@@ -9849,7 +9849,7 @@
       <w:r>
         <w:t xml:space="preserve">Eclipse-induced perturbations predicted by Chapman (1933) via ionospheric conductivity drops. Data from </w:t>
       </w:r>
-      <w:hyperlink w:history="1" r:id="rIdkall5_31dbdzidoo25sw5">
+      <w:hyperlink w:history="1" r:id="rIdvotec7xcoapgvrv8anhnn">
         <w:r>
           <w:rPr>
             <w:rStyle w:val="Hyperlink"/>
@@ -9937,7 +9937,7 @@
       <w:r>
         <w:t xml:space="preserve">The formula used is for a quarter-wave linear waveguide, not a spherical cavity. Correct formula f = c/(2*pi*R) gives R = 6,098 km, within 4% of Earth's radius. The ionosphere IS conductive (</w:t>
       </w:r>
-      <w:hyperlink w:history="1" r:id="rId72nfx1x-2_mhpg5wjwq3i">
+      <w:hyperlink w:history="1" r:id="rIdsxv0ageieianhy_q_u9yl">
         <w:r>
           <w:rPr>
             <w:rStyle w:val="Hyperlink"/>
@@ -10004,7 +10004,7 @@
       <w:r>
         <w:t xml:space="preserve">All five observations already predicted by </w:t>
       </w:r>
-      <w:hyperlink w:history="1" r:id="rId2uj5y3hjj8yemy9fhwvwj">
+      <w:hyperlink w:history="1" r:id="rIde4-ckefpkuexsb3sd5hlk">
         <w:r>
           <w:rPr>
             <w:rStyle w:val="Hyperlink"/>
@@ -10015,7 +10015,7 @@
       <w:r>
         <w:t xml:space="preserve">, </w:t>
       </w:r>
-      <w:hyperlink w:history="1" r:id="rId6yvex0p389jrb1a5l2frl">
+      <w:hyperlink w:history="1" r:id="rIdceg5-dooapsljzlsm0ua4">
         <w:r>
           <w:rPr>
             <w:rStyle w:val="Hyperlink"/>
@@ -10342,7 +10342,7 @@
       <w:r>
         <w:t xml:space="preserve">Antarctic gravity anomalies are mapped from orbit by </w:t>
       </w:r>
-      <w:hyperlink w:history="1" r:id="rIdf0gjmsgj1pjsqwnbkvjql">
+      <w:hyperlink w:history="1" r:id="rIdxxjkes_22i_mretuhvd0s">
         <w:r>
           <w:rPr>
             <w:rStyle w:val="Hyperlink"/>
@@ -10353,7 +10353,7 @@
       <w:r>
         <w:t xml:space="preserve"> and </w:t>
       </w:r>
-      <w:hyperlink w:history="1" r:id="rIdqbirsnjtypas29m37znzr">
+      <w:hyperlink w:history="1" r:id="rIdvpo7xsxldmdnpva7cwntk">
         <w:r>
           <w:rPr>
             <w:rStyle w:val="Hyperlink"/>
@@ -13329,7 +13329,7 @@
       <w:r>
         <w:t xml:space="preserve">A </w:t>
       </w:r>
-      <w:hyperlink w:history="1" r:id="rIdquvlsvhaowbnttkdzk1vd">
+      <w:hyperlink w:history="1" r:id="rId95cfygkuguokhbv4mg8fl">
         <w:r>
           <w:rPr>
             <w:rStyle w:val="Hyperlink"/>
@@ -13340,7 +13340,7 @@
       <w:r>
         <w:t xml:space="preserve"> found detectable decreases in X, Z, and total field components during eclipses. An </w:t>
       </w:r>
-      <w:hyperlink w:history="1" r:id="rIdj4o6kxysuzemjvm5fhcuy">
+      <w:hyperlink w:history="1" r:id="rIdufxcbhar5uuzlu-mvzw8q">
         <w:r>
           <w:rPr>
             <w:rStyle w:val="Hyperlink"/>
@@ -13845,7 +13845,7 @@
       <w:r>
         <w:t xml:space="preserve">Continuous 24-hour sunlight. A local sun at 5,733 km circling above a flat disc cannot produce 24-hour sunlight at the disc edge. Directly observable at Amundsen-Scott Station, staffed year-round since 1957. See </w:t>
       </w:r>
-      <w:hyperlink w:history="1" r:id="rIdlu_046lar6gs5oqpouf1h">
+      <w:hyperlink w:history="1" r:id="rIdyqxsm5sdngzicra_tvoyb">
         <w:r>
           <w:rPr>
             <w:rStyle w:val="Hyperlink"/>
@@ -13909,7 +13909,7 @@
       <w:r>
         <w:t xml:space="preserve">GPS provides 1–3 meter accuracy worldwide using 24+ satellites in Keplerian orbits calculated from spherical-Earth gravitational mechanics. The system requires precise relativistic corrections (both special and general) that depend on the satellites' orbital velocity and altitude above a spherical gravitational well. If Earth were a flat disc with different geometry, the signal propagation times, relativistic corrections, and satellite visibility geometry would all be wrong, and the system would not achieve meter-level accuracy. The same applies to every other satellite navigation system (GLONASS, Galileo, BeiDou). The ISS at 408 km is visible on predictable schedules computed from Keplerian orbits. Geostationary satellites at 35,786 km — far above the dome's maximum height — provide continuous coverage. See </w:t>
       </w:r>
-      <w:hyperlink w:history="1" r:id="rIdfv6hdrph-h2cxavtoz9g5">
+      <w:hyperlink w:history="1" r:id="rId-fwfwm29arjfjodbgylod">
         <w:r>
           <w:rPr>
             <w:rStyle w:val="Hyperlink"/>
@@ -13920,7 +13920,7 @@
       <w:r>
         <w:t xml:space="preserve">; </w:t>
       </w:r>
-      <w:hyperlink w:history="1" r:id="rId0osbssm8a896ybj_pqij3">
+      <w:hyperlink w:history="1" r:id="rIdn0_qn-sfslkrpg3n0x8db">
         <w:r>
           <w:rPr>
             <w:rStyle w:val="Hyperlink"/>
@@ -13969,7 +13969,7 @@
       <w:r>
         <w:t xml:space="preserve">Modern solar calculators (</w:t>
       </w:r>
-      <w:hyperlink w:history="1" r:id="rId2erik6gfexrpbzhty1to8">
+      <w:hyperlink w:history="1" r:id="rIdzv51ih8z1euf3ceimb4st">
         <w:r>
           <w:rPr>
             <w:rStyle w:val="Hyperlink"/>
@@ -14018,7 +14018,7 @@
       <w:r>
         <w:t xml:space="preserve">The </w:t>
       </w:r>
-      <w:hyperlink w:history="1" r:id="rIdyc2cgxjt5eqqhlw3cjnlg">
+      <w:hyperlink w:history="1" r:id="rIdsradv32izhi4hj6fyuqdk">
         <w:r>
           <w:rPr>
             <w:rStyle w:val="Hyperlink"/>
@@ -14067,7 +14067,7 @@
       <w:r>
         <w:t xml:space="preserve">Earth's field is a dipole. South magnetic pole at 64.1°S, 135.9°E (</w:t>
       </w:r>
-      <w:hyperlink w:history="1" r:id="rIdtjjir8tt6qn2yukrzdenx">
+      <w:hyperlink w:history="1" r:id="rIdae99yi2ht7ovrc5kgtf44">
         <w:r>
           <w:rPr>
             <w:rStyle w:val="Hyperlink"/>
@@ -14116,7 +14116,7 @@
       <w:r>
         <w:t xml:space="preserve">g = 9.780 m/s² at equator, 9.832 m/s² at poles (0.53% variation). On a flat disc, centrifugal force points outward from center, producing the OPPOSITE pattern. See </w:t>
       </w:r>
-      <w:hyperlink w:history="1" r:id="rId0rpvt4cz5ydjh1t7cz3cr">
+      <w:hyperlink w:history="1" r:id="rIdrp9413udh-h_8pb1eqofj">
         <w:r>
           <w:rPr>
             <w:rStyle w:val="Hyperlink"/>
@@ -15113,7 +15113,7 @@
         </w:rPr>
         <w:t xml:space="preserve">NOAA World Magnetic Model 2025: </w:t>
       </w:r>
-      <w:hyperlink w:history="1" r:id="rIdzafecxmm2pcdaybex-mgm">
+      <w:hyperlink w:history="1" r:id="rId8c_jf0qanshvdxezw0pyp">
         <w:r>
           <w:rPr>
             <w:rStyle w:val="Hyperlink"/>
@@ -15133,7 +15133,7 @@
         </w:rPr>
         <w:t xml:space="preserve">NOAA Wandering Geomagnetic Poles: </w:t>
       </w:r>
-      <w:hyperlink w:history="1" r:id="rIdcwfpwwgfrxgqdbzb8sw9f">
+      <w:hyperlink w:history="1" r:id="rIdfyvlblyv5fn6giczhoh84">
         <w:r>
           <w:rPr>
             <w:rStyle w:val="Hyperlink"/>
@@ -15153,7 +15153,7 @@
         </w:rPr>
         <w:t xml:space="preserve">CHAOS-7 Geomagnetic Field Model: </w:t>
       </w:r>
-      <w:hyperlink w:history="1" r:id="rId1nwuflcmos1frzspwgisq">
+      <w:hyperlink w:history="1" r:id="rIddfbuaw8ghvxbgjkx6glji">
         <w:r>
           <w:rPr>
             <w:rStyle w:val="Hyperlink"/>
@@ -15173,7 +15173,7 @@
         </w:rPr>
         <w:t xml:space="preserve">ESA Swarm Satellite Mission: </w:t>
       </w:r>
-      <w:hyperlink w:history="1" r:id="rIddxizpw0ygb_byrevrylc9">
+      <w:hyperlink w:history="1" r:id="rIdiop5ylijmx5ralwf5hzjo">
         <w:r>
           <w:rPr>
             <w:rStyle w:val="Hyperlink"/>
@@ -15193,7 +15193,7 @@
         </w:rPr>
         <w:t xml:space="preserve">INTERMAGNET Observatory Network: </w:t>
       </w:r>
-      <w:hyperlink w:history="1" r:id="rIdd4zxculikfhsqphlada4u">
+      <w:hyperlink w:history="1" r:id="rIdus8hub9rj0jkdmnde0op4">
         <w:r>
           <w:rPr>
             <w:rStyle w:val="Hyperlink"/>
@@ -15213,7 +15213,7 @@
         </w:rPr>
         <w:t xml:space="preserve">IGRF-13: </w:t>
       </w:r>
-      <w:hyperlink w:history="1" r:id="rIdfhdpwh1kb40wrkdwyokhf">
+      <w:hyperlink w:history="1" r:id="rIdqwwwx98srvjvm6xkwohmi">
         <w:r>
           <w:rPr>
             <w:rStyle w:val="Hyperlink"/>
@@ -15233,7 +15233,7 @@
         </w:rPr>
         <w:t xml:space="preserve">ESA Gaia Data Release 3: </w:t>
       </w:r>
-      <w:hyperlink w:history="1" r:id="rIdguon9rzrrjn2xkcopkan3">
+      <w:hyperlink w:history="1" r:id="rIdeqw38_shesjyevkxjg81a">
         <w:r>
           <w:rPr>
             <w:rStyle w:val="Hyperlink"/>
@@ -15253,7 +15253,7 @@
         </w:rPr>
         <w:t xml:space="preserve">Hipparcos Catalogue: </w:t>
       </w:r>
-      <w:hyperlink w:history="1" r:id="rIdxx5gbnf7tfbufhxx0sd1c">
+      <w:hyperlink w:history="1" r:id="rIdernhufsyhhgalbe_yxdp7">
         <w:r>
           <w:rPr>
             <w:rStyle w:val="Hyperlink"/>
@@ -15273,7 +15273,7 @@
         </w:rPr>
         <w:t xml:space="preserve">US Patent 787412 (Tesla): </w:t>
       </w:r>
-      <w:hyperlink w:history="1" r:id="rIdtv-vebpi1jojz-hftz-wa">
+      <w:hyperlink w:history="1" r:id="rIdvzo2kpxxhmpkztucfz5gh">
         <w:r>
           <w:rPr>
             <w:rStyle w:val="Hyperlink"/>
@@ -15293,7 +15293,7 @@
         </w:rPr>
         <w:t xml:space="preserve">NOAA Solar Position Algorithm: </w:t>
       </w:r>
-      <w:hyperlink w:history="1" r:id="rIdck7m5tm6ja8c33f89ai-e">
+      <w:hyperlink w:history="1" r:id="rIdvbufoyw3qxtawhipwlpny">
         <w:r>
           <w:rPr>
             <w:rStyle w:val="Hyperlink"/>
@@ -15313,7 +15313,7 @@
         </w:rPr>
         <w:t xml:space="preserve">National Geodetic Survey Gravity: </w:t>
       </w:r>
-      <w:hyperlink w:history="1" r:id="rIdt4a78sqct4ahr2xs_9600">
+      <w:hyperlink w:history="1" r:id="rIdpniu--6ff0dpr2rvqo9el">
         <w:r>
           <w:rPr>
             <w:rStyle w:val="Hyperlink"/>
@@ -15333,7 +15333,7 @@
         </w:rPr>
         <w:t xml:space="preserve">CHIME/FRB Project: </w:t>
       </w:r>
-      <w:hyperlink w:history="1" r:id="rId_6vgn2ifmelhgpmhozsdu">
+      <w:hyperlink w:history="1" r:id="rIdsqm0c-gnvc4qiajbdo10p">
         <w:r>
           <w:rPr>
             <w:rStyle w:val="Hyperlink"/>
@@ -15353,7 +15353,7 @@
         </w:rPr>
         <w:t xml:space="preserve">GRACE-FO (gravity mapping): </w:t>
       </w:r>
-      <w:hyperlink w:history="1" r:id="rId9cmoap3vbdiaxeqrhxdjl">
+      <w:hyperlink w:history="1" r:id="rIdk05xzns1p6nnbhsarqw4j">
         <w:r>
           <w:rPr>
             <w:rStyle w:val="Hyperlink"/>
@@ -15373,7 +15373,7 @@
         </w:rPr>
         <w:t xml:space="preserve">GOCE (gravity field): </w:t>
       </w:r>
-      <w:hyperlink w:history="1" r:id="rIditjih7wgiif7uzhnkboem">
+      <w:hyperlink w:history="1" r:id="rIdrkehtptmwcnyeb1r_xj92">
         <w:r>
           <w:rPr>
             <w:rStyle w:val="Hyperlink"/>
@@ -15393,7 +15393,7 @@
         </w:rPr>
         <w:t xml:space="preserve">GPS.gov: </w:t>
       </w:r>
-      <w:hyperlink w:history="1" r:id="rIdtra6ydzgzrtpjizmo4_p7">
+      <w:hyperlink w:history="1" r:id="rIdjpbwjugx8wp_wyli8et9b">
         <w:r>
           <w:rPr>
             <w:rStyle w:val="Hyperlink"/>
@@ -15413,7 +15413,7 @@
         </w:rPr>
         <w:t xml:space="preserve">CelesTrak TLE Data: </w:t>
       </w:r>
-      <w:hyperlink w:history="1" r:id="rId0pgrk5pfyis4mw-unk2_w">
+      <w:hyperlink w:history="1" r:id="rIdy2quuz3iqtfkflozwmana">
         <w:r>
           <w:rPr>
             <w:rStyle w:val="Hyperlink"/>

</xml_diff>

<commit_message>
Add tabbed navigation to break long review into structured sections
7 tabs: Overview, The Model, 67 Wins Reviewed, Site Pages,
Falsification Tests, AI & Conclusions, References.

- Sticky tab bar at top of page with dark mode support
- Previous/Next section buttons at bottom of each tab
- TOC links auto-switch to correct tab and scroll to anchor
- All existing IDs and internal links preserved
- Mobile responsive (tabs wrap on small screens)
- URL hash support for direct linking to tabs

Co-Authored-By: Claude Opus 4.6 <noreply@anthropic.com>
</commit_message>
<xml_diff>
--- a/downloads/critical-review-dome-model-v4.docx
+++ b/downloads/critical-review-dome-model-v4.docx
@@ -8889,7 +8889,7 @@
       <w:r>
         <w:t xml:space="preserve">US Patent 787412 (1905), publicly available at </w:t>
       </w:r>
-      <w:hyperlink w:history="1" r:id="rIddg2ylui8mnwhaw9j6ec1y">
+      <w:hyperlink w:history="1" r:id="rId2xgu9vhv8tcvku00sdwtw">
         <w:r>
           <w:rPr>
             <w:rStyle w:val="Hyperlink"/>
@@ -9029,7 +9029,7 @@
       <w:r>
         <w:t xml:space="preserve">James Bradley (1727) explicitly tested and rejected atmospheric refraction as an explanation: refraction is wavelength-dependent (chromatic), while stellar aberration is achromatic. Modern VLBI measurements achieve milliarcsecond precision and directly confirm aberration correlates with Earth's orbital velocity (~30 km/s). The </w:t>
       </w:r>
-      <w:hyperlink w:history="1" r:id="rId5epxhloek_hiyvzcbma2i">
+      <w:hyperlink w:history="1" r:id="rIdut-kqj0vozgifit2tpnb7">
         <w:r>
           <w:rPr>
             <w:rStyle w:val="Hyperlink"/>
@@ -9095,7 +9095,7 @@
       <w:r>
         <w:t xml:space="preserve">ESA </w:t>
       </w:r>
-      <w:hyperlink w:history="1" r:id="rId5f0u4sanxirvajicyd1lp">
+      <w:hyperlink w:history="1" r:id="rIdu83mc4fiht4u0sjb33uqw">
         <w:r>
           <w:rPr>
             <w:rStyle w:val="Hyperlink"/>
@@ -9161,7 +9161,7 @@
       <w:r>
         <w:t xml:space="preserve">Crepuscular rays are parallel beams made visible by atmospheric scattering. The apparent divergence is a perspective effect. Crucially, anticrepuscular rays converge at the anti-solar point simultaneously. See </w:t>
       </w:r>
-      <w:hyperlink w:history="1" r:id="rIdkzfgm21qpjwq5k5jkymgu">
+      <w:hyperlink w:history="1" r:id="rIdz1qwn2nrljhvq-hslqkej">
         <w:r>
           <w:rPr>
             <w:rStyle w:val="Hyperlink"/>
@@ -9172,7 +9172,7 @@
       <w:r>
         <w:t xml:space="preserve"> and </w:t>
       </w:r>
-      <w:hyperlink w:history="1" r:id="rIdopzmrewhmymmbgzoyo-j6">
+      <w:hyperlink w:history="1" r:id="rId8rqxkcnobu4kmayoesom-">
         <w:r>
           <w:rPr>
             <w:rStyle w:val="Hyperlink"/>
@@ -9238,7 +9238,7 @@
       <w:r>
         <w:t xml:space="preserve">NOAA officially states no evidence of anomalous disappearances. </w:t>
       </w:r>
-      <w:hyperlink w:history="1" r:id="rIdtmmlcwvgruvet1htapcmo">
+      <w:hyperlink w:history="1" r:id="rIdwj4ngzr9nph5tuz2mvywh">
         <w:r>
           <w:rPr>
             <w:rStyle w:val="Hyperlink"/>
@@ -9304,7 +9304,7 @@
       <w:r>
         <w:t xml:space="preserve">Hipparcos </w:t>
       </w:r>
-      <w:hyperlink w:history="1" r:id="rIdf73yqepj88p_f_avfsl6n">
+      <w:hyperlink w:history="1" r:id="rId2t2w9yto19-vtli1pwvy0">
         <w:r>
           <w:rPr>
             <w:rStyle w:val="Hyperlink"/>
@@ -9720,7 +9720,7 @@
       <w:r>
         <w:t xml:space="preserve">Terra-Nova et al. (2017, PNAS) demonstrate reversed-flux patches reproduce SAA splitting in MHD simulations. The </w:t>
       </w:r>
-      <w:hyperlink w:history="1" r:id="rId8huqpmidrn16fhdop-yq9">
+      <w:hyperlink w:history="1" r:id="rIdwoslmju-o4czhjdvxs3s-">
         <w:r>
           <w:rPr>
             <w:rStyle w:val="Hyperlink"/>
@@ -9731,7 +9731,7 @@
       <w:r>
         <w:t xml:space="preserve"> documents the evolution quantitatively. </w:t>
       </w:r>
-      <w:hyperlink w:history="1" r:id="rIdemcwkbrbts6s9tqdnqp04">
+      <w:hyperlink w:history="1" r:id="rIdeebttn6mrwtdoff9gatoy">
         <w:r>
           <w:rPr>
             <w:rStyle w:val="Hyperlink"/>
@@ -9782,7 +9782,7 @@
       <w:r>
         <w:t xml:space="preserve">Normal secular variation documented by </w:t>
       </w:r>
-      <w:hyperlink w:history="1" r:id="rIdrdouiqkx2oe-n8tx06pnh">
+      <w:hyperlink w:history="1" r:id="rIdt4to530xvzggfcgwmb7mg">
         <w:r>
           <w:rPr>
             <w:rStyle w:val="Hyperlink"/>
@@ -9849,7 +9849,7 @@
       <w:r>
         <w:t xml:space="preserve">Eclipse-induced perturbations predicted by Chapman (1933) via ionospheric conductivity drops. Data from </w:t>
       </w:r>
-      <w:hyperlink w:history="1" r:id="rIdvotec7xcoapgvrv8anhnn">
+      <w:hyperlink w:history="1" r:id="rIdha-leekpko2trnisk4pck">
         <w:r>
           <w:rPr>
             <w:rStyle w:val="Hyperlink"/>
@@ -9937,7 +9937,7 @@
       <w:r>
         <w:t xml:space="preserve">The formula used is for a quarter-wave linear waveguide, not a spherical cavity. Correct formula f = c/(2*pi*R) gives R = 6,098 km, within 4% of Earth's radius. The ionosphere IS conductive (</w:t>
       </w:r>
-      <w:hyperlink w:history="1" r:id="rIdsxv0ageieianhy_q_u9yl">
+      <w:hyperlink w:history="1" r:id="rIdlkfndl70l5dol-ygkrgj9">
         <w:r>
           <w:rPr>
             <w:rStyle w:val="Hyperlink"/>
@@ -10004,7 +10004,7 @@
       <w:r>
         <w:t xml:space="preserve">All five observations already predicted by </w:t>
       </w:r>
-      <w:hyperlink w:history="1" r:id="rIde4-ckefpkuexsb3sd5hlk">
+      <w:hyperlink w:history="1" r:id="rIdiwy3_u0e-kqielcneyst4">
         <w:r>
           <w:rPr>
             <w:rStyle w:val="Hyperlink"/>
@@ -10015,7 +10015,7 @@
       <w:r>
         <w:t xml:space="preserve">, </w:t>
       </w:r>
-      <w:hyperlink w:history="1" r:id="rIdceg5-dooapsljzlsm0ua4">
+      <w:hyperlink w:history="1" r:id="rId982rjbxwpgyvtm7jk7mjl">
         <w:r>
           <w:rPr>
             <w:rStyle w:val="Hyperlink"/>
@@ -10342,7 +10342,7 @@
       <w:r>
         <w:t xml:space="preserve">Antarctic gravity anomalies are mapped from orbit by </w:t>
       </w:r>
-      <w:hyperlink w:history="1" r:id="rIdxxjkes_22i_mretuhvd0s">
+      <w:hyperlink w:history="1" r:id="rIdbeg_0l6whfjxtgmy1wopy">
         <w:r>
           <w:rPr>
             <w:rStyle w:val="Hyperlink"/>
@@ -10353,7 +10353,7 @@
       <w:r>
         <w:t xml:space="preserve"> and </w:t>
       </w:r>
-      <w:hyperlink w:history="1" r:id="rIdvpo7xsxldmdnpva7cwntk">
+      <w:hyperlink w:history="1" r:id="rIdcccwzcqelmvei6xtxfuey">
         <w:r>
           <w:rPr>
             <w:rStyle w:val="Hyperlink"/>
@@ -13329,7 +13329,7 @@
       <w:r>
         <w:t xml:space="preserve">A </w:t>
       </w:r>
-      <w:hyperlink w:history="1" r:id="rId95cfygkuguokhbv4mg8fl">
+      <w:hyperlink w:history="1" r:id="rIdbrc4bbcpkhzurn_ihjeif">
         <w:r>
           <w:rPr>
             <w:rStyle w:val="Hyperlink"/>
@@ -13340,7 +13340,7 @@
       <w:r>
         <w:t xml:space="preserve"> found detectable decreases in X, Z, and total field components during eclipses. An </w:t>
       </w:r>
-      <w:hyperlink w:history="1" r:id="rIdufxcbhar5uuzlu-mvzw8q">
+      <w:hyperlink w:history="1" r:id="rId4radaqxt3xoi1lzejyudx">
         <w:r>
           <w:rPr>
             <w:rStyle w:val="Hyperlink"/>
@@ -13845,7 +13845,7 @@
       <w:r>
         <w:t xml:space="preserve">Continuous 24-hour sunlight. A local sun at 5,733 km circling above a flat disc cannot produce 24-hour sunlight at the disc edge. Directly observable at Amundsen-Scott Station, staffed year-round since 1957. See </w:t>
       </w:r>
-      <w:hyperlink w:history="1" r:id="rIdyqxsm5sdngzicra_tvoyb">
+      <w:hyperlink w:history="1" r:id="rIdkv5zzezq5nyvfusn0jwea">
         <w:r>
           <w:rPr>
             <w:rStyle w:val="Hyperlink"/>
@@ -13909,7 +13909,7 @@
       <w:r>
         <w:t xml:space="preserve">GPS provides 1–3 meter accuracy worldwide using 24+ satellites in Keplerian orbits calculated from spherical-Earth gravitational mechanics. The system requires precise relativistic corrections (both special and general) that depend on the satellites' orbital velocity and altitude above a spherical gravitational well. If Earth were a flat disc with different geometry, the signal propagation times, relativistic corrections, and satellite visibility geometry would all be wrong, and the system would not achieve meter-level accuracy. The same applies to every other satellite navigation system (GLONASS, Galileo, BeiDou). The ISS at 408 km is visible on predictable schedules computed from Keplerian orbits. Geostationary satellites at 35,786 km — far above the dome's maximum height — provide continuous coverage. See </w:t>
       </w:r>
-      <w:hyperlink w:history="1" r:id="rId-fwfwm29arjfjodbgylod">
+      <w:hyperlink w:history="1" r:id="rIdy_oja6o4dbpqyoilupyz5">
         <w:r>
           <w:rPr>
             <w:rStyle w:val="Hyperlink"/>
@@ -13920,7 +13920,7 @@
       <w:r>
         <w:t xml:space="preserve">; </w:t>
       </w:r>
-      <w:hyperlink w:history="1" r:id="rIdn0_qn-sfslkrpg3n0x8db">
+      <w:hyperlink w:history="1" r:id="rIdklns9bvn7jtm7irus5l6_">
         <w:r>
           <w:rPr>
             <w:rStyle w:val="Hyperlink"/>
@@ -13969,7 +13969,7 @@
       <w:r>
         <w:t xml:space="preserve">Modern solar calculators (</w:t>
       </w:r>
-      <w:hyperlink w:history="1" r:id="rIdzv51ih8z1euf3ceimb4st">
+      <w:hyperlink w:history="1" r:id="rIdjlmtkj9upxvvjv2n9r1wa">
         <w:r>
           <w:rPr>
             <w:rStyle w:val="Hyperlink"/>
@@ -14018,7 +14018,7 @@
       <w:r>
         <w:t xml:space="preserve">The </w:t>
       </w:r>
-      <w:hyperlink w:history="1" r:id="rIdsradv32izhi4hj6fyuqdk">
+      <w:hyperlink w:history="1" r:id="rIdnxsiipq6mgraig6yhxwsl">
         <w:r>
           <w:rPr>
             <w:rStyle w:val="Hyperlink"/>
@@ -14067,7 +14067,7 @@
       <w:r>
         <w:t xml:space="preserve">Earth's field is a dipole. South magnetic pole at 64.1°S, 135.9°E (</w:t>
       </w:r>
-      <w:hyperlink w:history="1" r:id="rIdae99yi2ht7ovrc5kgtf44">
+      <w:hyperlink w:history="1" r:id="rId5na-n69jwwmchqciokrk3">
         <w:r>
           <w:rPr>
             <w:rStyle w:val="Hyperlink"/>
@@ -14116,7 +14116,7 @@
       <w:r>
         <w:t xml:space="preserve">g = 9.780 m/s² at equator, 9.832 m/s² at poles (0.53% variation). On a flat disc, centrifugal force points outward from center, producing the OPPOSITE pattern. See </w:t>
       </w:r>
-      <w:hyperlink w:history="1" r:id="rIdrp9413udh-h_8pb1eqofj">
+      <w:hyperlink w:history="1" r:id="rIdv3kyvh1dzdfij7uda_axz">
         <w:r>
           <w:rPr>
             <w:rStyle w:val="Hyperlink"/>
@@ -15113,7 +15113,7 @@
         </w:rPr>
         <w:t xml:space="preserve">NOAA World Magnetic Model 2025: </w:t>
       </w:r>
-      <w:hyperlink w:history="1" r:id="rId8c_jf0qanshvdxezw0pyp">
+      <w:hyperlink w:history="1" r:id="rIddllsmdcdhr6x5gvset8r2">
         <w:r>
           <w:rPr>
             <w:rStyle w:val="Hyperlink"/>
@@ -15133,7 +15133,7 @@
         </w:rPr>
         <w:t xml:space="preserve">NOAA Wandering Geomagnetic Poles: </w:t>
       </w:r>
-      <w:hyperlink w:history="1" r:id="rIdfyvlblyv5fn6giczhoh84">
+      <w:hyperlink w:history="1" r:id="rIdwxnzal6-vr-15ivyl3kzh">
         <w:r>
           <w:rPr>
             <w:rStyle w:val="Hyperlink"/>
@@ -15153,7 +15153,7 @@
         </w:rPr>
         <w:t xml:space="preserve">CHAOS-7 Geomagnetic Field Model: </w:t>
       </w:r>
-      <w:hyperlink w:history="1" r:id="rIddfbuaw8ghvxbgjkx6glji">
+      <w:hyperlink w:history="1" r:id="rIde2fbrhxm3g2zf9yz074yj">
         <w:r>
           <w:rPr>
             <w:rStyle w:val="Hyperlink"/>
@@ -15173,7 +15173,7 @@
         </w:rPr>
         <w:t xml:space="preserve">ESA Swarm Satellite Mission: </w:t>
       </w:r>
-      <w:hyperlink w:history="1" r:id="rIdiop5ylijmx5ralwf5hzjo">
+      <w:hyperlink w:history="1" r:id="rIdbr2yv6e5wwhbmeymtigfa">
         <w:r>
           <w:rPr>
             <w:rStyle w:val="Hyperlink"/>
@@ -15193,7 +15193,7 @@
         </w:rPr>
         <w:t xml:space="preserve">INTERMAGNET Observatory Network: </w:t>
       </w:r>
-      <w:hyperlink w:history="1" r:id="rIdus8hub9rj0jkdmnde0op4">
+      <w:hyperlink w:history="1" r:id="rIdm-icwps7rtj-fves9h6lc">
         <w:r>
           <w:rPr>
             <w:rStyle w:val="Hyperlink"/>
@@ -15213,7 +15213,7 @@
         </w:rPr>
         <w:t xml:space="preserve">IGRF-13: </w:t>
       </w:r>
-      <w:hyperlink w:history="1" r:id="rIdqwwwx98srvjvm6xkwohmi">
+      <w:hyperlink w:history="1" r:id="rIdlo9ozvrlodwywif-lhrwc">
         <w:r>
           <w:rPr>
             <w:rStyle w:val="Hyperlink"/>
@@ -15233,7 +15233,7 @@
         </w:rPr>
         <w:t xml:space="preserve">ESA Gaia Data Release 3: </w:t>
       </w:r>
-      <w:hyperlink w:history="1" r:id="rIdeqw38_shesjyevkxjg81a">
+      <w:hyperlink w:history="1" r:id="rIdnaec3hvfjdasb40duamyw">
         <w:r>
           <w:rPr>
             <w:rStyle w:val="Hyperlink"/>
@@ -15253,7 +15253,7 @@
         </w:rPr>
         <w:t xml:space="preserve">Hipparcos Catalogue: </w:t>
       </w:r>
-      <w:hyperlink w:history="1" r:id="rIdernhufsyhhgalbe_yxdp7">
+      <w:hyperlink w:history="1" r:id="rIdbphmwlgax5kw2-ve_6nrm">
         <w:r>
           <w:rPr>
             <w:rStyle w:val="Hyperlink"/>
@@ -15273,7 +15273,7 @@
         </w:rPr>
         <w:t xml:space="preserve">US Patent 787412 (Tesla): </w:t>
       </w:r>
-      <w:hyperlink w:history="1" r:id="rIdvzo2kpxxhmpkztucfz5gh">
+      <w:hyperlink w:history="1" r:id="rIds075geomhjoe5-7hq1vmv">
         <w:r>
           <w:rPr>
             <w:rStyle w:val="Hyperlink"/>
@@ -15293,7 +15293,7 @@
         </w:rPr>
         <w:t xml:space="preserve">NOAA Solar Position Algorithm: </w:t>
       </w:r>
-      <w:hyperlink w:history="1" r:id="rIdvbufoyw3qxtawhipwlpny">
+      <w:hyperlink w:history="1" r:id="rIdbl7xcwxezicphhwmvk5by">
         <w:r>
           <w:rPr>
             <w:rStyle w:val="Hyperlink"/>
@@ -15313,7 +15313,7 @@
         </w:rPr>
         <w:t xml:space="preserve">National Geodetic Survey Gravity: </w:t>
       </w:r>
-      <w:hyperlink w:history="1" r:id="rIdpniu--6ff0dpr2rvqo9el">
+      <w:hyperlink w:history="1" r:id="rIdsvtu0sfuk18_9lf2mn_3m">
         <w:r>
           <w:rPr>
             <w:rStyle w:val="Hyperlink"/>
@@ -15333,7 +15333,7 @@
         </w:rPr>
         <w:t xml:space="preserve">CHIME/FRB Project: </w:t>
       </w:r>
-      <w:hyperlink w:history="1" r:id="rIdsqm0c-gnvc4qiajbdo10p">
+      <w:hyperlink w:history="1" r:id="rId6i6z78eggdsld2xrjf-dp">
         <w:r>
           <w:rPr>
             <w:rStyle w:val="Hyperlink"/>
@@ -15353,7 +15353,7 @@
         </w:rPr>
         <w:t xml:space="preserve">GRACE-FO (gravity mapping): </w:t>
       </w:r>
-      <w:hyperlink w:history="1" r:id="rIdk05xzns1p6nnbhsarqw4j">
+      <w:hyperlink w:history="1" r:id="rId5wldtr86dziz29alfz5bl">
         <w:r>
           <w:rPr>
             <w:rStyle w:val="Hyperlink"/>
@@ -15373,7 +15373,7 @@
         </w:rPr>
         <w:t xml:space="preserve">GOCE (gravity field): </w:t>
       </w:r>
-      <w:hyperlink w:history="1" r:id="rIdrkehtptmwcnyeb1r_xj92">
+      <w:hyperlink w:history="1" r:id="rIde-ctzf3cuj9ocut63mp_e">
         <w:r>
           <w:rPr>
             <w:rStyle w:val="Hyperlink"/>
@@ -15393,7 +15393,7 @@
         </w:rPr>
         <w:t xml:space="preserve">GPS.gov: </w:t>
       </w:r>
-      <w:hyperlink w:history="1" r:id="rIdjpbwjugx8wp_wyli8et9b">
+      <w:hyperlink w:history="1" r:id="rIdkid9vnsbor5mxafe4vbu9">
         <w:r>
           <w:rPr>
             <w:rStyle w:val="Hyperlink"/>
@@ -15413,7 +15413,7 @@
         </w:rPr>
         <w:t xml:space="preserve">CelesTrak TLE Data: </w:t>
       </w:r>
-      <w:hyperlink w:history="1" r:id="rIdy2quuz3iqtfkflozwmana">
+      <w:hyperlink w:history="1" r:id="rIdkboaje0ardzjbutpruvvz">
         <w:r>
           <w:rPr>
             <w:rStyle w:val="Hyperlink"/>

</xml_diff>

<commit_message>
Rename Site Pages tab to Live Power Analysis; rewrite Part 3 for clarity
- Tab renamed to match the author's own page structure
- Fixed nav flow: overview → model → wins → pages → falsify → ai → refs
- Section 3.1: lead with punchline (14/20 domains share one constant),
  broke out Groups B and C into tables for consistency
- Section 3.2: restructured eclipse analysis with 3 numbered problems
- Section 3.3: broke Kill-Shot tests into individual evaluations
- Section 3.4: reformatted 6-step audit pipeline as numbered list
- Section 3.5: expanded tracking page contradiction
- Section 3.6: broke 5 Dielectric points into headed subsections
  with Claim/Reality structure for each

Co-Authored-By: Claude Opus 4.6 <noreply@anthropic.com>
</commit_message>
<xml_diff>
--- a/downloads/critical-review-dome-model-v4.docx
+++ b/downloads/critical-review-dome-model-v4.docx
@@ -8889,7 +8889,7 @@
       <w:r>
         <w:t xml:space="preserve">US Patent 787412 (1905), publicly available at </w:t>
       </w:r>
-      <w:hyperlink w:history="1" r:id="rId2xgu9vhv8tcvku00sdwtw">
+      <w:hyperlink w:history="1" r:id="rIdb40ybuv4ymvh7w-dnzaq0">
         <w:r>
           <w:rPr>
             <w:rStyle w:val="Hyperlink"/>
@@ -9029,7 +9029,7 @@
       <w:r>
         <w:t xml:space="preserve">James Bradley (1727) explicitly tested and rejected atmospheric refraction as an explanation: refraction is wavelength-dependent (chromatic), while stellar aberration is achromatic. Modern VLBI measurements achieve milliarcsecond precision and directly confirm aberration correlates with Earth's orbital velocity (~30 km/s). The </w:t>
       </w:r>
-      <w:hyperlink w:history="1" r:id="rIdut-kqj0vozgifit2tpnb7">
+      <w:hyperlink w:history="1" r:id="rIdel4m-cgd9sao-rsjz6qw-">
         <w:r>
           <w:rPr>
             <w:rStyle w:val="Hyperlink"/>
@@ -9095,7 +9095,7 @@
       <w:r>
         <w:t xml:space="preserve">ESA </w:t>
       </w:r>
-      <w:hyperlink w:history="1" r:id="rIdu83mc4fiht4u0sjb33uqw">
+      <w:hyperlink w:history="1" r:id="rId6n-42q-ldvzzqctpgtxsn">
         <w:r>
           <w:rPr>
             <w:rStyle w:val="Hyperlink"/>
@@ -9161,7 +9161,7 @@
       <w:r>
         <w:t xml:space="preserve">Crepuscular rays are parallel beams made visible by atmospheric scattering. The apparent divergence is a perspective effect. Crucially, anticrepuscular rays converge at the anti-solar point simultaneously. See </w:t>
       </w:r>
-      <w:hyperlink w:history="1" r:id="rIdz1qwn2nrljhvq-hslqkej">
+      <w:hyperlink w:history="1" r:id="rIdd9tl8p-v0gyhwy72ijavh">
         <w:r>
           <w:rPr>
             <w:rStyle w:val="Hyperlink"/>
@@ -9172,7 +9172,7 @@
       <w:r>
         <w:t xml:space="preserve"> and </w:t>
       </w:r>
-      <w:hyperlink w:history="1" r:id="rId8rqxkcnobu4kmayoesom-">
+      <w:hyperlink w:history="1" r:id="rIdoab-k8hx1e0gqyuznhkmr">
         <w:r>
           <w:rPr>
             <w:rStyle w:val="Hyperlink"/>
@@ -9238,7 +9238,7 @@
       <w:r>
         <w:t xml:space="preserve">NOAA officially states no evidence of anomalous disappearances. </w:t>
       </w:r>
-      <w:hyperlink w:history="1" r:id="rIdwj4ngzr9nph5tuz2mvywh">
+      <w:hyperlink w:history="1" r:id="rIdztsc-kco8-qynhswi7usr">
         <w:r>
           <w:rPr>
             <w:rStyle w:val="Hyperlink"/>
@@ -9304,7 +9304,7 @@
       <w:r>
         <w:t xml:space="preserve">Hipparcos </w:t>
       </w:r>
-      <w:hyperlink w:history="1" r:id="rId2t2w9yto19-vtli1pwvy0">
+      <w:hyperlink w:history="1" r:id="rId389xjgrxu8spu4szzaxtx">
         <w:r>
           <w:rPr>
             <w:rStyle w:val="Hyperlink"/>
@@ -9720,7 +9720,7 @@
       <w:r>
         <w:t xml:space="preserve">Terra-Nova et al. (2017, PNAS) demonstrate reversed-flux patches reproduce SAA splitting in MHD simulations. The </w:t>
       </w:r>
-      <w:hyperlink w:history="1" r:id="rIdwoslmju-o4czhjdvxs3s-">
+      <w:hyperlink w:history="1" r:id="rIdszk3pphy6bavx42dpq6gk">
         <w:r>
           <w:rPr>
             <w:rStyle w:val="Hyperlink"/>
@@ -9731,7 +9731,7 @@
       <w:r>
         <w:t xml:space="preserve"> documents the evolution quantitatively. </w:t>
       </w:r>
-      <w:hyperlink w:history="1" r:id="rIdeebttn6mrwtdoff9gatoy">
+      <w:hyperlink w:history="1" r:id="rIdrzgq7eu8xncc4ppk1patz">
         <w:r>
           <w:rPr>
             <w:rStyle w:val="Hyperlink"/>
@@ -9782,7 +9782,7 @@
       <w:r>
         <w:t xml:space="preserve">Normal secular variation documented by </w:t>
       </w:r>
-      <w:hyperlink w:history="1" r:id="rIdt4to530xvzggfcgwmb7mg">
+      <w:hyperlink w:history="1" r:id="rIdtsbbgngaqi0ewuedjmvbz">
         <w:r>
           <w:rPr>
             <w:rStyle w:val="Hyperlink"/>
@@ -9849,7 +9849,7 @@
       <w:r>
         <w:t xml:space="preserve">Eclipse-induced perturbations predicted by Chapman (1933) via ionospheric conductivity drops. Data from </w:t>
       </w:r>
-      <w:hyperlink w:history="1" r:id="rIdha-leekpko2trnisk4pck">
+      <w:hyperlink w:history="1" r:id="rId-zcoyhrwwdlcdmvnbbl13">
         <w:r>
           <w:rPr>
             <w:rStyle w:val="Hyperlink"/>
@@ -9937,7 +9937,7 @@
       <w:r>
         <w:t xml:space="preserve">The formula used is for a quarter-wave linear waveguide, not a spherical cavity. Correct formula f = c/(2*pi*R) gives R = 6,098 km, within 4% of Earth's radius. The ionosphere IS conductive (</w:t>
       </w:r>
-      <w:hyperlink w:history="1" r:id="rIdlkfndl70l5dol-ygkrgj9">
+      <w:hyperlink w:history="1" r:id="rIdxdf8bvdtzwthqh5hcapfr">
         <w:r>
           <w:rPr>
             <w:rStyle w:val="Hyperlink"/>
@@ -10004,7 +10004,7 @@
       <w:r>
         <w:t xml:space="preserve">All five observations already predicted by </w:t>
       </w:r>
-      <w:hyperlink w:history="1" r:id="rIdiwy3_u0e-kqielcneyst4">
+      <w:hyperlink w:history="1" r:id="rIduksaqgskpmw1elwbhxrav">
         <w:r>
           <w:rPr>
             <w:rStyle w:val="Hyperlink"/>
@@ -10015,7 +10015,7 @@
       <w:r>
         <w:t xml:space="preserve">, </w:t>
       </w:r>
-      <w:hyperlink w:history="1" r:id="rId982rjbxwpgyvtm7jk7mjl">
+      <w:hyperlink w:history="1" r:id="rIdxh3hauwxrpcpkr7dnfe7h">
         <w:r>
           <w:rPr>
             <w:rStyle w:val="Hyperlink"/>
@@ -10342,7 +10342,7 @@
       <w:r>
         <w:t xml:space="preserve">Antarctic gravity anomalies are mapped from orbit by </w:t>
       </w:r>
-      <w:hyperlink w:history="1" r:id="rIdbeg_0l6whfjxtgmy1wopy">
+      <w:hyperlink w:history="1" r:id="rIdp67rpfndbad97b_bqnrk6">
         <w:r>
           <w:rPr>
             <w:rStyle w:val="Hyperlink"/>
@@ -10353,7 +10353,7 @@
       <w:r>
         <w:t xml:space="preserve"> and </w:t>
       </w:r>
-      <w:hyperlink w:history="1" r:id="rIdcccwzcqelmvei6xtxfuey">
+      <w:hyperlink w:history="1" r:id="rIdn255oeerbs9vugeqcslas">
         <w:r>
           <w:rPr>
             <w:rStyle w:val="Hyperlink"/>
@@ -13329,7 +13329,7 @@
       <w:r>
         <w:t xml:space="preserve">A </w:t>
       </w:r>
-      <w:hyperlink w:history="1" r:id="rIdbrc4bbcpkhzurn_ihjeif">
+      <w:hyperlink w:history="1" r:id="rIdyuuefqywvmovxj4rwq8dq">
         <w:r>
           <w:rPr>
             <w:rStyle w:val="Hyperlink"/>
@@ -13340,7 +13340,7 @@
       <w:r>
         <w:t xml:space="preserve"> found detectable decreases in X, Z, and total field components during eclipses. An </w:t>
       </w:r>
-      <w:hyperlink w:history="1" r:id="rId4radaqxt3xoi1lzejyudx">
+      <w:hyperlink w:history="1" r:id="rId1k2ux-plknh7fnkljrvvu">
         <w:r>
           <w:rPr>
             <w:rStyle w:val="Hyperlink"/>
@@ -13845,7 +13845,7 @@
       <w:r>
         <w:t xml:space="preserve">Continuous 24-hour sunlight. A local sun at 5,733 km circling above a flat disc cannot produce 24-hour sunlight at the disc edge. Directly observable at Amundsen-Scott Station, staffed year-round since 1957. See </w:t>
       </w:r>
-      <w:hyperlink w:history="1" r:id="rIdkv5zzezq5nyvfusn0jwea">
+      <w:hyperlink w:history="1" r:id="rIdt_0pmhqhk7ky0cdxexo62">
         <w:r>
           <w:rPr>
             <w:rStyle w:val="Hyperlink"/>
@@ -13909,7 +13909,7 @@
       <w:r>
         <w:t xml:space="preserve">GPS provides 1–3 meter accuracy worldwide using 24+ satellites in Keplerian orbits calculated from spherical-Earth gravitational mechanics. The system requires precise relativistic corrections (both special and general) that depend on the satellites' orbital velocity and altitude above a spherical gravitational well. If Earth were a flat disc with different geometry, the signal propagation times, relativistic corrections, and satellite visibility geometry would all be wrong, and the system would not achieve meter-level accuracy. The same applies to every other satellite navigation system (GLONASS, Galileo, BeiDou). The ISS at 408 km is visible on predictable schedules computed from Keplerian orbits. Geostationary satellites at 35,786 km — far above the dome's maximum height — provide continuous coverage. See </w:t>
       </w:r>
-      <w:hyperlink w:history="1" r:id="rIdy_oja6o4dbpqyoilupyz5">
+      <w:hyperlink w:history="1" r:id="rIdfuphnhwfbi6bvfyx1v_ai">
         <w:r>
           <w:rPr>
             <w:rStyle w:val="Hyperlink"/>
@@ -13920,7 +13920,7 @@
       <w:r>
         <w:t xml:space="preserve">; </w:t>
       </w:r>
-      <w:hyperlink w:history="1" r:id="rIdklns9bvn7jtm7irus5l6_">
+      <w:hyperlink w:history="1" r:id="rId1jdrhwkdab0ld2qscmgun">
         <w:r>
           <w:rPr>
             <w:rStyle w:val="Hyperlink"/>
@@ -13969,7 +13969,7 @@
       <w:r>
         <w:t xml:space="preserve">Modern solar calculators (</w:t>
       </w:r>
-      <w:hyperlink w:history="1" r:id="rIdjlmtkj9upxvvjv2n9r1wa">
+      <w:hyperlink w:history="1" r:id="rIdavrxya0cnxgx3w57wzauw">
         <w:r>
           <w:rPr>
             <w:rStyle w:val="Hyperlink"/>
@@ -14018,7 +14018,7 @@
       <w:r>
         <w:t xml:space="preserve">The </w:t>
       </w:r>
-      <w:hyperlink w:history="1" r:id="rIdnxsiipq6mgraig6yhxwsl">
+      <w:hyperlink w:history="1" r:id="rIdxfmvu1hw10oexzbybxbom">
         <w:r>
           <w:rPr>
             <w:rStyle w:val="Hyperlink"/>
@@ -14067,7 +14067,7 @@
       <w:r>
         <w:t xml:space="preserve">Earth's field is a dipole. South magnetic pole at 64.1°S, 135.9°E (</w:t>
       </w:r>
-      <w:hyperlink w:history="1" r:id="rId5na-n69jwwmchqciokrk3">
+      <w:hyperlink w:history="1" r:id="rIdg1mow8e3exbht7dwbnecs">
         <w:r>
           <w:rPr>
             <w:rStyle w:val="Hyperlink"/>
@@ -14116,7 +14116,7 @@
       <w:r>
         <w:t xml:space="preserve">g = 9.780 m/s² at equator, 9.832 m/s² at poles (0.53% variation). On a flat disc, centrifugal force points outward from center, producing the OPPOSITE pattern. See </w:t>
       </w:r>
-      <w:hyperlink w:history="1" r:id="rIdv3kyvh1dzdfij7uda_axz">
+      <w:hyperlink w:history="1" r:id="rIdfjwbypcr7rhm0lhbyt5em">
         <w:r>
           <w:rPr>
             <w:rStyle w:val="Hyperlink"/>
@@ -15113,7 +15113,7 @@
         </w:rPr>
         <w:t xml:space="preserve">NOAA World Magnetic Model 2025: </w:t>
       </w:r>
-      <w:hyperlink w:history="1" r:id="rIddllsmdcdhr6x5gvset8r2">
+      <w:hyperlink w:history="1" r:id="rIdbpuhbs3niextut1uwe5f1">
         <w:r>
           <w:rPr>
             <w:rStyle w:val="Hyperlink"/>
@@ -15133,7 +15133,7 @@
         </w:rPr>
         <w:t xml:space="preserve">NOAA Wandering Geomagnetic Poles: </w:t>
       </w:r>
-      <w:hyperlink w:history="1" r:id="rIdwxnzal6-vr-15ivyl3kzh">
+      <w:hyperlink w:history="1" r:id="rIdi58r4jhnjuwlxyb3torgw">
         <w:r>
           <w:rPr>
             <w:rStyle w:val="Hyperlink"/>
@@ -15153,7 +15153,7 @@
         </w:rPr>
         <w:t xml:space="preserve">CHAOS-7 Geomagnetic Field Model: </w:t>
       </w:r>
-      <w:hyperlink w:history="1" r:id="rIde2fbrhxm3g2zf9yz074yj">
+      <w:hyperlink w:history="1" r:id="rIdw5zssk3ipw0uimb_9tebh">
         <w:r>
           <w:rPr>
             <w:rStyle w:val="Hyperlink"/>
@@ -15173,7 +15173,7 @@
         </w:rPr>
         <w:t xml:space="preserve">ESA Swarm Satellite Mission: </w:t>
       </w:r>
-      <w:hyperlink w:history="1" r:id="rIdbr2yv6e5wwhbmeymtigfa">
+      <w:hyperlink w:history="1" r:id="rIdocnu_43mrccjydxf0o14q">
         <w:r>
           <w:rPr>
             <w:rStyle w:val="Hyperlink"/>
@@ -15193,7 +15193,7 @@
         </w:rPr>
         <w:t xml:space="preserve">INTERMAGNET Observatory Network: </w:t>
       </w:r>
-      <w:hyperlink w:history="1" r:id="rIdm-icwps7rtj-fves9h6lc">
+      <w:hyperlink w:history="1" r:id="rIdqoz3qdkx-m39e8l4ekdjr">
         <w:r>
           <w:rPr>
             <w:rStyle w:val="Hyperlink"/>
@@ -15213,7 +15213,7 @@
         </w:rPr>
         <w:t xml:space="preserve">IGRF-13: </w:t>
       </w:r>
-      <w:hyperlink w:history="1" r:id="rIdlo9ozvrlodwywif-lhrwc">
+      <w:hyperlink w:history="1" r:id="rIdw9dqlo0ucpr8ova7wlgts">
         <w:r>
           <w:rPr>
             <w:rStyle w:val="Hyperlink"/>
@@ -15233,7 +15233,7 @@
         </w:rPr>
         <w:t xml:space="preserve">ESA Gaia Data Release 3: </w:t>
       </w:r>
-      <w:hyperlink w:history="1" r:id="rIdnaec3hvfjdasb40duamyw">
+      <w:hyperlink w:history="1" r:id="rIdegpbpb_swnytb6stw1vta">
         <w:r>
           <w:rPr>
             <w:rStyle w:val="Hyperlink"/>
@@ -15253,7 +15253,7 @@
         </w:rPr>
         <w:t xml:space="preserve">Hipparcos Catalogue: </w:t>
       </w:r>
-      <w:hyperlink w:history="1" r:id="rIdbphmwlgax5kw2-ve_6nrm">
+      <w:hyperlink w:history="1" r:id="rIdesyvtwzec3tn2msbg1eiq">
         <w:r>
           <w:rPr>
             <w:rStyle w:val="Hyperlink"/>
@@ -15273,7 +15273,7 @@
         </w:rPr>
         <w:t xml:space="preserve">US Patent 787412 (Tesla): </w:t>
       </w:r>
-      <w:hyperlink w:history="1" r:id="rIds075geomhjoe5-7hq1vmv">
+      <w:hyperlink w:history="1" r:id="rIde4c9wwilveam6lz3dlr4i">
         <w:r>
           <w:rPr>
             <w:rStyle w:val="Hyperlink"/>
@@ -15293,7 +15293,7 @@
         </w:rPr>
         <w:t xml:space="preserve">NOAA Solar Position Algorithm: </w:t>
       </w:r>
-      <w:hyperlink w:history="1" r:id="rIdbl7xcwxezicphhwmvk5by">
+      <w:hyperlink w:history="1" r:id="rIdl9yrn5mgc1unjtdbyaqii">
         <w:r>
           <w:rPr>
             <w:rStyle w:val="Hyperlink"/>
@@ -15313,7 +15313,7 @@
         </w:rPr>
         <w:t xml:space="preserve">National Geodetic Survey Gravity: </w:t>
       </w:r>
-      <w:hyperlink w:history="1" r:id="rIdsvtu0sfuk18_9lf2mn_3m">
+      <w:hyperlink w:history="1" r:id="rIdldo5bvbrjyqxuroilwloa">
         <w:r>
           <w:rPr>
             <w:rStyle w:val="Hyperlink"/>
@@ -15333,7 +15333,7 @@
         </w:rPr>
         <w:t xml:space="preserve">CHIME/FRB Project: </w:t>
       </w:r>
-      <w:hyperlink w:history="1" r:id="rId6i6z78eggdsld2xrjf-dp">
+      <w:hyperlink w:history="1" r:id="rIdam5fp8qdsg9abt6dq9bch">
         <w:r>
           <w:rPr>
             <w:rStyle w:val="Hyperlink"/>
@@ -15353,7 +15353,7 @@
         </w:rPr>
         <w:t xml:space="preserve">GRACE-FO (gravity mapping): </w:t>
       </w:r>
-      <w:hyperlink w:history="1" r:id="rId5wldtr86dziz29alfz5bl">
+      <w:hyperlink w:history="1" r:id="rIdqzf2emsrwkkmuhz1lvbog">
         <w:r>
           <w:rPr>
             <w:rStyle w:val="Hyperlink"/>
@@ -15373,7 +15373,7 @@
         </w:rPr>
         <w:t xml:space="preserve">GOCE (gravity field): </w:t>
       </w:r>
-      <w:hyperlink w:history="1" r:id="rIde-ctzf3cuj9ocut63mp_e">
+      <w:hyperlink w:history="1" r:id="rIdgymn1f1wrf5ssatpi6jt-">
         <w:r>
           <w:rPr>
             <w:rStyle w:val="Hyperlink"/>
@@ -15393,7 +15393,7 @@
         </w:rPr>
         <w:t xml:space="preserve">GPS.gov: </w:t>
       </w:r>
-      <w:hyperlink w:history="1" r:id="rIdkid9vnsbor5mxafe4vbu9">
+      <w:hyperlink w:history="1" r:id="rIdyyfymceylikpedpjxz_sm">
         <w:r>
           <w:rPr>
             <w:rStyle w:val="Hyperlink"/>
@@ -15413,7 +15413,7 @@
         </w:rPr>
         <w:t xml:space="preserve">CelesTrak TLE Data: </w:t>
       </w:r>
-      <w:hyperlink w:history="1" r:id="rIdkboaje0ardzjbutpruvvz">
+      <w:hyperlink w:history="1" r:id="rIdr_odnq96bh4pu7mjttw4m">
         <w:r>
           <w:rPr>
             <w:rStyle w:val="Hyperlink"/>

</xml_diff>

<commit_message>
Add scorecard overview and full readability pass
Scorecard: visual grid at top of Overview tab showing 4 key metrics
(67 claims, 0 unique to dome, 11 self-contradicted, 14/20 share
one constant) — gives readers the bottom line at a glance.

Readability pass across all tabs:
- Defined jargon on first use: INTERMAGNET, Chapman mechanism,
  Sq current system, ΛCDM, AIC, WGS84, geodynamo, Membach SG,
  oblate spheroid, secular variation, microGal, and others
- Added plain-English explanations after every formula
  (what the variables mean, what the result tells you)
- Replaced unexplained Latin ("argumentum ad ignorantiam")
  with English equivalents
- Simplified technical descriptions while keeping all
  factual content and numerical precision

Co-Authored-By: Claude Opus 4.6 <noreply@anthropic.com>
</commit_message>
<xml_diff>
--- a/downloads/critical-review-dome-model-v4.docx
+++ b/downloads/critical-review-dome-model-v4.docx
@@ -8889,7 +8889,7 @@
       <w:r>
         <w:t xml:space="preserve">US Patent 787412 (1905), publicly available at </w:t>
       </w:r>
-      <w:hyperlink w:history="1" r:id="rIdb40ybuv4ymvh7w-dnzaq0">
+      <w:hyperlink w:history="1" r:id="rIdxpfdjgw989-dkgdvqoijh">
         <w:r>
           <w:rPr>
             <w:rStyle w:val="Hyperlink"/>
@@ -9029,7 +9029,7 @@
       <w:r>
         <w:t xml:space="preserve">James Bradley (1727) explicitly tested and rejected atmospheric refraction as an explanation: refraction is wavelength-dependent (chromatic), while stellar aberration is achromatic. Modern VLBI measurements achieve milliarcsecond precision and directly confirm aberration correlates with Earth's orbital velocity (~30 km/s). The </w:t>
       </w:r>
-      <w:hyperlink w:history="1" r:id="rIdel4m-cgd9sao-rsjz6qw-">
+      <w:hyperlink w:history="1" r:id="rIdkkz5ffnl94vae9ivtql_x">
         <w:r>
           <w:rPr>
             <w:rStyle w:val="Hyperlink"/>
@@ -9095,7 +9095,7 @@
       <w:r>
         <w:t xml:space="preserve">ESA </w:t>
       </w:r>
-      <w:hyperlink w:history="1" r:id="rId6n-42q-ldvzzqctpgtxsn">
+      <w:hyperlink w:history="1" r:id="rIdu5dw9rsn3iqr7ccom4tha">
         <w:r>
           <w:rPr>
             <w:rStyle w:val="Hyperlink"/>
@@ -9161,7 +9161,7 @@
       <w:r>
         <w:t xml:space="preserve">Crepuscular rays are parallel beams made visible by atmospheric scattering. The apparent divergence is a perspective effect. Crucially, anticrepuscular rays converge at the anti-solar point simultaneously. See </w:t>
       </w:r>
-      <w:hyperlink w:history="1" r:id="rIdd9tl8p-v0gyhwy72ijavh">
+      <w:hyperlink w:history="1" r:id="rIdkzm16-0pk91iaythqyfqj">
         <w:r>
           <w:rPr>
             <w:rStyle w:val="Hyperlink"/>
@@ -9172,7 +9172,7 @@
       <w:r>
         <w:t xml:space="preserve"> and </w:t>
       </w:r>
-      <w:hyperlink w:history="1" r:id="rIdoab-k8hx1e0gqyuznhkmr">
+      <w:hyperlink w:history="1" r:id="rId5xn_gnaarpjljpiifsymo">
         <w:r>
           <w:rPr>
             <w:rStyle w:val="Hyperlink"/>
@@ -9238,7 +9238,7 @@
       <w:r>
         <w:t xml:space="preserve">NOAA officially states no evidence of anomalous disappearances. </w:t>
       </w:r>
-      <w:hyperlink w:history="1" r:id="rIdztsc-kco8-qynhswi7usr">
+      <w:hyperlink w:history="1" r:id="rIdsu9wopf3_xh691co5a656">
         <w:r>
           <w:rPr>
             <w:rStyle w:val="Hyperlink"/>
@@ -9304,7 +9304,7 @@
       <w:r>
         <w:t xml:space="preserve">Hipparcos </w:t>
       </w:r>
-      <w:hyperlink w:history="1" r:id="rId389xjgrxu8spu4szzaxtx">
+      <w:hyperlink w:history="1" r:id="rIdjuudopuindyk6s00afmnd">
         <w:r>
           <w:rPr>
             <w:rStyle w:val="Hyperlink"/>
@@ -9720,7 +9720,7 @@
       <w:r>
         <w:t xml:space="preserve">Terra-Nova et al. (2017, PNAS) demonstrate reversed-flux patches reproduce SAA splitting in MHD simulations. The </w:t>
       </w:r>
-      <w:hyperlink w:history="1" r:id="rIdszk3pphy6bavx42dpq6gk">
+      <w:hyperlink w:history="1" r:id="rIdognli3alw7klg165phm7d">
         <w:r>
           <w:rPr>
             <w:rStyle w:val="Hyperlink"/>
@@ -9731,7 +9731,7 @@
       <w:r>
         <w:t xml:space="preserve"> documents the evolution quantitatively. </w:t>
       </w:r>
-      <w:hyperlink w:history="1" r:id="rIdrzgq7eu8xncc4ppk1patz">
+      <w:hyperlink w:history="1" r:id="rIdqhehbjlwxdjiyztfycqnb">
         <w:r>
           <w:rPr>
             <w:rStyle w:val="Hyperlink"/>
@@ -9782,7 +9782,7 @@
       <w:r>
         <w:t xml:space="preserve">Normal secular variation documented by </w:t>
       </w:r>
-      <w:hyperlink w:history="1" r:id="rIdtsbbgngaqi0ewuedjmvbz">
+      <w:hyperlink w:history="1" r:id="rIdte_vrzh77rrmcsbhc3bbr">
         <w:r>
           <w:rPr>
             <w:rStyle w:val="Hyperlink"/>
@@ -9849,7 +9849,7 @@
       <w:r>
         <w:t xml:space="preserve">Eclipse-induced perturbations predicted by Chapman (1933) via ionospheric conductivity drops. Data from </w:t>
       </w:r>
-      <w:hyperlink w:history="1" r:id="rId-zcoyhrwwdlcdmvnbbl13">
+      <w:hyperlink w:history="1" r:id="rId91yrloxuyokgg9ykag_k7">
         <w:r>
           <w:rPr>
             <w:rStyle w:val="Hyperlink"/>
@@ -9937,7 +9937,7 @@
       <w:r>
         <w:t xml:space="preserve">The formula used is for a quarter-wave linear waveguide, not a spherical cavity. Correct formula f = c/(2*pi*R) gives R = 6,098 km, within 4% of Earth's radius. The ionosphere IS conductive (</w:t>
       </w:r>
-      <w:hyperlink w:history="1" r:id="rIdxdf8bvdtzwthqh5hcapfr">
+      <w:hyperlink w:history="1" r:id="rIdw73ymvjd50hyoapsryxox">
         <w:r>
           <w:rPr>
             <w:rStyle w:val="Hyperlink"/>
@@ -10004,7 +10004,7 @@
       <w:r>
         <w:t xml:space="preserve">All five observations already predicted by </w:t>
       </w:r>
-      <w:hyperlink w:history="1" r:id="rIduksaqgskpmw1elwbhxrav">
+      <w:hyperlink w:history="1" r:id="rId8bxasvmoqdwm2se4eq9lb">
         <w:r>
           <w:rPr>
             <w:rStyle w:val="Hyperlink"/>
@@ -10015,7 +10015,7 @@
       <w:r>
         <w:t xml:space="preserve">, </w:t>
       </w:r>
-      <w:hyperlink w:history="1" r:id="rIdxh3hauwxrpcpkr7dnfe7h">
+      <w:hyperlink w:history="1" r:id="rIdjeebrxl619tuyujktjxus">
         <w:r>
           <w:rPr>
             <w:rStyle w:val="Hyperlink"/>
@@ -10342,7 +10342,7 @@
       <w:r>
         <w:t xml:space="preserve">Antarctic gravity anomalies are mapped from orbit by </w:t>
       </w:r>
-      <w:hyperlink w:history="1" r:id="rIdp67rpfndbad97b_bqnrk6">
+      <w:hyperlink w:history="1" r:id="rId1aousakjeze9qiigcwzbi">
         <w:r>
           <w:rPr>
             <w:rStyle w:val="Hyperlink"/>
@@ -10353,7 +10353,7 @@
       <w:r>
         <w:t xml:space="preserve"> and </w:t>
       </w:r>
-      <w:hyperlink w:history="1" r:id="rIdn255oeerbs9vugeqcslas">
+      <w:hyperlink w:history="1" r:id="rIdqocdci2vuziwb3et_t8bh">
         <w:r>
           <w:rPr>
             <w:rStyle w:val="Hyperlink"/>
@@ -13329,7 +13329,7 @@
       <w:r>
         <w:t xml:space="preserve">A </w:t>
       </w:r>
-      <w:hyperlink w:history="1" r:id="rIdyuuefqywvmovxj4rwq8dq">
+      <w:hyperlink w:history="1" r:id="rIdtz_lptdyrhv6v97m6j6xi">
         <w:r>
           <w:rPr>
             <w:rStyle w:val="Hyperlink"/>
@@ -13340,7 +13340,7 @@
       <w:r>
         <w:t xml:space="preserve"> found detectable decreases in X, Z, and total field components during eclipses. An </w:t>
       </w:r>
-      <w:hyperlink w:history="1" r:id="rId1k2ux-plknh7fnkljrvvu">
+      <w:hyperlink w:history="1" r:id="rIdjxmezrvzqanhzydezfzbn">
         <w:r>
           <w:rPr>
             <w:rStyle w:val="Hyperlink"/>
@@ -13845,7 +13845,7 @@
       <w:r>
         <w:t xml:space="preserve">Continuous 24-hour sunlight. A local sun at 5,733 km circling above a flat disc cannot produce 24-hour sunlight at the disc edge. Directly observable at Amundsen-Scott Station, staffed year-round since 1957. See </w:t>
       </w:r>
-      <w:hyperlink w:history="1" r:id="rIdt_0pmhqhk7ky0cdxexo62">
+      <w:hyperlink w:history="1" r:id="rId6yepqcncbmuattk_pdxuw">
         <w:r>
           <w:rPr>
             <w:rStyle w:val="Hyperlink"/>
@@ -13909,7 +13909,7 @@
       <w:r>
         <w:t xml:space="preserve">GPS provides 1–3 meter accuracy worldwide using 24+ satellites in Keplerian orbits calculated from spherical-Earth gravitational mechanics. The system requires precise relativistic corrections (both special and general) that depend on the satellites' orbital velocity and altitude above a spherical gravitational well. If Earth were a flat disc with different geometry, the signal propagation times, relativistic corrections, and satellite visibility geometry would all be wrong, and the system would not achieve meter-level accuracy. The same applies to every other satellite navigation system (GLONASS, Galileo, BeiDou). The ISS at 408 km is visible on predictable schedules computed from Keplerian orbits. Geostationary satellites at 35,786 km — far above the dome's maximum height — provide continuous coverage. See </w:t>
       </w:r>
-      <w:hyperlink w:history="1" r:id="rIdfuphnhwfbi6bvfyx1v_ai">
+      <w:hyperlink w:history="1" r:id="rIdqdquacpqzxvkahahrdgeg">
         <w:r>
           <w:rPr>
             <w:rStyle w:val="Hyperlink"/>
@@ -13920,7 +13920,7 @@
       <w:r>
         <w:t xml:space="preserve">; </w:t>
       </w:r>
-      <w:hyperlink w:history="1" r:id="rId1jdrhwkdab0ld2qscmgun">
+      <w:hyperlink w:history="1" r:id="rIdwxhorumzw1l0bk_3akq94">
         <w:r>
           <w:rPr>
             <w:rStyle w:val="Hyperlink"/>
@@ -13969,7 +13969,7 @@
       <w:r>
         <w:t xml:space="preserve">Modern solar calculators (</w:t>
       </w:r>
-      <w:hyperlink w:history="1" r:id="rIdavrxya0cnxgx3w57wzauw">
+      <w:hyperlink w:history="1" r:id="rId0lxysm_sp2zoysrjdcitl">
         <w:r>
           <w:rPr>
             <w:rStyle w:val="Hyperlink"/>
@@ -14018,7 +14018,7 @@
       <w:r>
         <w:t xml:space="preserve">The </w:t>
       </w:r>
-      <w:hyperlink w:history="1" r:id="rIdxfmvu1hw10oexzbybxbom">
+      <w:hyperlink w:history="1" r:id="rIdvmggunzfubzwgkvfyckyw">
         <w:r>
           <w:rPr>
             <w:rStyle w:val="Hyperlink"/>
@@ -14067,7 +14067,7 @@
       <w:r>
         <w:t xml:space="preserve">Earth's field is a dipole. South magnetic pole at 64.1°S, 135.9°E (</w:t>
       </w:r>
-      <w:hyperlink w:history="1" r:id="rIdg1mow8e3exbht7dwbnecs">
+      <w:hyperlink w:history="1" r:id="rIdscvan6shl6ir2zdhnqyzw">
         <w:r>
           <w:rPr>
             <w:rStyle w:val="Hyperlink"/>
@@ -14116,7 +14116,7 @@
       <w:r>
         <w:t xml:space="preserve">g = 9.780 m/s² at equator, 9.832 m/s² at poles (0.53% variation). On a flat disc, centrifugal force points outward from center, producing the OPPOSITE pattern. See </w:t>
       </w:r>
-      <w:hyperlink w:history="1" r:id="rIdfjwbypcr7rhm0lhbyt5em">
+      <w:hyperlink w:history="1" r:id="rIdcah_o89hb2wxsaechxryb">
         <w:r>
           <w:rPr>
             <w:rStyle w:val="Hyperlink"/>
@@ -15113,7 +15113,7 @@
         </w:rPr>
         <w:t xml:space="preserve">NOAA World Magnetic Model 2025: </w:t>
       </w:r>
-      <w:hyperlink w:history="1" r:id="rIdbpuhbs3niextut1uwe5f1">
+      <w:hyperlink w:history="1" r:id="rId3uhinhei_0h7vw-awonwk">
         <w:r>
           <w:rPr>
             <w:rStyle w:val="Hyperlink"/>
@@ -15133,7 +15133,7 @@
         </w:rPr>
         <w:t xml:space="preserve">NOAA Wandering Geomagnetic Poles: </w:t>
       </w:r>
-      <w:hyperlink w:history="1" r:id="rIdi58r4jhnjuwlxyb3torgw">
+      <w:hyperlink w:history="1" r:id="rIdtrjuvxbm_ejvrmkljdy2h">
         <w:r>
           <w:rPr>
             <w:rStyle w:val="Hyperlink"/>
@@ -15153,7 +15153,7 @@
         </w:rPr>
         <w:t xml:space="preserve">CHAOS-7 Geomagnetic Field Model: </w:t>
       </w:r>
-      <w:hyperlink w:history="1" r:id="rIdw5zssk3ipw0uimb_9tebh">
+      <w:hyperlink w:history="1" r:id="rIdhgmbsetbc6usfi42epi_6">
         <w:r>
           <w:rPr>
             <w:rStyle w:val="Hyperlink"/>
@@ -15173,7 +15173,7 @@
         </w:rPr>
         <w:t xml:space="preserve">ESA Swarm Satellite Mission: </w:t>
       </w:r>
-      <w:hyperlink w:history="1" r:id="rIdocnu_43mrccjydxf0o14q">
+      <w:hyperlink w:history="1" r:id="rIdbxf7ksbd5tedka0j5idyh">
         <w:r>
           <w:rPr>
             <w:rStyle w:val="Hyperlink"/>
@@ -15193,7 +15193,7 @@
         </w:rPr>
         <w:t xml:space="preserve">INTERMAGNET Observatory Network: </w:t>
       </w:r>
-      <w:hyperlink w:history="1" r:id="rIdqoz3qdkx-m39e8l4ekdjr">
+      <w:hyperlink w:history="1" r:id="rIdlpkjn3ijn7tujxrcnsbcd">
         <w:r>
           <w:rPr>
             <w:rStyle w:val="Hyperlink"/>
@@ -15213,7 +15213,7 @@
         </w:rPr>
         <w:t xml:space="preserve">IGRF-13: </w:t>
       </w:r>
-      <w:hyperlink w:history="1" r:id="rIdw9dqlo0ucpr8ova7wlgts">
+      <w:hyperlink w:history="1" r:id="rIdi8kz3fjzdsra2gf2pxgns">
         <w:r>
           <w:rPr>
             <w:rStyle w:val="Hyperlink"/>
@@ -15233,7 +15233,7 @@
         </w:rPr>
         <w:t xml:space="preserve">ESA Gaia Data Release 3: </w:t>
       </w:r>
-      <w:hyperlink w:history="1" r:id="rIdegpbpb_swnytb6stw1vta">
+      <w:hyperlink w:history="1" r:id="rIddxqiid4tqkjmw0ns_oo3-">
         <w:r>
           <w:rPr>
             <w:rStyle w:val="Hyperlink"/>
@@ -15253,7 +15253,7 @@
         </w:rPr>
         <w:t xml:space="preserve">Hipparcos Catalogue: </w:t>
       </w:r>
-      <w:hyperlink w:history="1" r:id="rIdesyvtwzec3tn2msbg1eiq">
+      <w:hyperlink w:history="1" r:id="rId-dene0coipjdimd3gbynf">
         <w:r>
           <w:rPr>
             <w:rStyle w:val="Hyperlink"/>
@@ -15273,7 +15273,7 @@
         </w:rPr>
         <w:t xml:space="preserve">US Patent 787412 (Tesla): </w:t>
       </w:r>
-      <w:hyperlink w:history="1" r:id="rIde4c9wwilveam6lz3dlr4i">
+      <w:hyperlink w:history="1" r:id="rIde1-rbld6pnnb4s1jek8ms">
         <w:r>
           <w:rPr>
             <w:rStyle w:val="Hyperlink"/>
@@ -15293,7 +15293,7 @@
         </w:rPr>
         <w:t xml:space="preserve">NOAA Solar Position Algorithm: </w:t>
       </w:r>
-      <w:hyperlink w:history="1" r:id="rIdl9yrn5mgc1unjtdbyaqii">
+      <w:hyperlink w:history="1" r:id="rIdzbkapofc4gw-ntqsy-bnh">
         <w:r>
           <w:rPr>
             <w:rStyle w:val="Hyperlink"/>
@@ -15313,7 +15313,7 @@
         </w:rPr>
         <w:t xml:space="preserve">National Geodetic Survey Gravity: </w:t>
       </w:r>
-      <w:hyperlink w:history="1" r:id="rIdldo5bvbrjyqxuroilwloa">
+      <w:hyperlink w:history="1" r:id="rIddcsaaidcr55z3rbvd4pyi">
         <w:r>
           <w:rPr>
             <w:rStyle w:val="Hyperlink"/>
@@ -15333,7 +15333,7 @@
         </w:rPr>
         <w:t xml:space="preserve">CHIME/FRB Project: </w:t>
       </w:r>
-      <w:hyperlink w:history="1" r:id="rIdam5fp8qdsg9abt6dq9bch">
+      <w:hyperlink w:history="1" r:id="rIdmjxi5fdysrc6gxhocy0no">
         <w:r>
           <w:rPr>
             <w:rStyle w:val="Hyperlink"/>
@@ -15353,7 +15353,7 @@
         </w:rPr>
         <w:t xml:space="preserve">GRACE-FO (gravity mapping): </w:t>
       </w:r>
-      <w:hyperlink w:history="1" r:id="rIdqzf2emsrwkkmuhz1lvbog">
+      <w:hyperlink w:history="1" r:id="rIdqat5vbqffdr1auindwpu8">
         <w:r>
           <w:rPr>
             <w:rStyle w:val="Hyperlink"/>
@@ -15373,7 +15373,7 @@
         </w:rPr>
         <w:t xml:space="preserve">GOCE (gravity field): </w:t>
       </w:r>
-      <w:hyperlink w:history="1" r:id="rIdgymn1f1wrf5ssatpi6jt-">
+      <w:hyperlink w:history="1" r:id="rIdd3u90j-sv82r742ncysqp">
         <w:r>
           <w:rPr>
             <w:rStyle w:val="Hyperlink"/>
@@ -15393,7 +15393,7 @@
         </w:rPr>
         <w:t xml:space="preserve">GPS.gov: </w:t>
       </w:r>
-      <w:hyperlink w:history="1" r:id="rIdyyfymceylikpedpjxz_sm">
+      <w:hyperlink w:history="1" r:id="rIdonxom5xpojalmuvw0mtja">
         <w:r>
           <w:rPr>
             <w:rStyle w:val="Hyperlink"/>
@@ -15413,7 +15413,7 @@
         </w:rPr>
         <w:t xml:space="preserve">CelesTrak TLE Data: </w:t>
       </w:r>
-      <w:hyperlink w:history="1" r:id="rIdr_odnq96bh4pu7mjttw4m">
+      <w:hyperlink w:history="1" r:id="rIduvphvpco5biltmmums1ir">
         <w:r>
           <w:rPr>
             <w:rStyle w:val="Hyperlink"/>

</xml_diff>

<commit_message>
Unify verdict category colors across all components
Use Material Design 400-level palette as single source of truth.
Pie chart, scorecard borders, verdict legend, table cells, and
verdict tags now all derive from the same 6 colors per category.
Added --*-solid CSS vars for borders/accents alongside transparent
background variants for light/dark mode consistency.

Co-Authored-By: Claude Opus 4.6 <noreply@anthropic.com>
</commit_message>
<xml_diff>
--- a/downloads/critical-review-dome-model-v4.docx
+++ b/downloads/critical-review-dome-model-v4.docx
@@ -8889,7 +8889,7 @@
       <w:r>
         <w:t xml:space="preserve">US Patent 787412 (1905), publicly available at </w:t>
       </w:r>
-      <w:hyperlink w:history="1" r:id="rIdirsmuaxchck5lly1hhwyh">
+      <w:hyperlink w:history="1" r:id="rIdzfiqfn5y3rfgadi5jml5o">
         <w:r>
           <w:rPr>
             <w:rStyle w:val="Hyperlink"/>
@@ -9029,7 +9029,7 @@
       <w:r>
         <w:t xml:space="preserve">James Bradley (1727) explicitly tested and rejected atmospheric refraction as an explanation: refraction is wavelength-dependent (chromatic), while stellar aberration is achromatic. Modern VLBI measurements achieve milliarcsecond precision and directly confirm aberration correlates with Earth's orbital velocity (~30 km/s). The </w:t>
       </w:r>
-      <w:hyperlink w:history="1" r:id="rIdo90rqkzoeolwa_rdvzb8x">
+      <w:hyperlink w:history="1" r:id="rIdzj9_aszln6wc_oyjy6dkw">
         <w:r>
           <w:rPr>
             <w:rStyle w:val="Hyperlink"/>
@@ -9095,7 +9095,7 @@
       <w:r>
         <w:t xml:space="preserve">ESA </w:t>
       </w:r>
-      <w:hyperlink w:history="1" r:id="rIdwittchzpep34rmuh-iwxo">
+      <w:hyperlink w:history="1" r:id="rIdlchad2yd109ifsisphjog">
         <w:r>
           <w:rPr>
             <w:rStyle w:val="Hyperlink"/>
@@ -9161,7 +9161,7 @@
       <w:r>
         <w:t xml:space="preserve">Crepuscular rays are parallel beams made visible by atmospheric scattering. The apparent divergence is a perspective effect. Crucially, anticrepuscular rays converge at the anti-solar point simultaneously. See </w:t>
       </w:r>
-      <w:hyperlink w:history="1" r:id="rIdgjelger6otbspdeo7uxye">
+      <w:hyperlink w:history="1" r:id="rId4xd5dxdudif80vun-9bjf">
         <w:r>
           <w:rPr>
             <w:rStyle w:val="Hyperlink"/>
@@ -9172,7 +9172,7 @@
       <w:r>
         <w:t xml:space="preserve"> and </w:t>
       </w:r>
-      <w:hyperlink w:history="1" r:id="rIdntahizqcqc660nxin_egp">
+      <w:hyperlink w:history="1" r:id="rId2yxcwvkdqmsizbofxxbyr">
         <w:r>
           <w:rPr>
             <w:rStyle w:val="Hyperlink"/>
@@ -9238,7 +9238,7 @@
       <w:r>
         <w:t xml:space="preserve">NOAA officially states no evidence of anomalous disappearances. </w:t>
       </w:r>
-      <w:hyperlink w:history="1" r:id="rId4zojcdd9ihwsfmfipraae">
+      <w:hyperlink w:history="1" r:id="rIdb8jgulyl085w0pcislcwx">
         <w:r>
           <w:rPr>
             <w:rStyle w:val="Hyperlink"/>
@@ -9304,7 +9304,7 @@
       <w:r>
         <w:t xml:space="preserve">Hipparcos </w:t>
       </w:r>
-      <w:hyperlink w:history="1" r:id="rIdivpzm1il2njhbylq-cx6r">
+      <w:hyperlink w:history="1" r:id="rIdsdmbi8ubb7-ct1lv1hj17">
         <w:r>
           <w:rPr>
             <w:rStyle w:val="Hyperlink"/>
@@ -9720,7 +9720,7 @@
       <w:r>
         <w:t xml:space="preserve">Terra-Nova et al. (2017, PNAS) demonstrate reversed-flux patches reproduce SAA splitting in MHD simulations. The </w:t>
       </w:r>
-      <w:hyperlink w:history="1" r:id="rIdrfwyr5_kvid2snwduowmv">
+      <w:hyperlink w:history="1" r:id="rIdtspi2tsxjkvhkvqyt3gej">
         <w:r>
           <w:rPr>
             <w:rStyle w:val="Hyperlink"/>
@@ -9731,7 +9731,7 @@
       <w:r>
         <w:t xml:space="preserve"> documents the evolution quantitatively. </w:t>
       </w:r>
-      <w:hyperlink w:history="1" r:id="rId6q68mescq9chvpeogukxt">
+      <w:hyperlink w:history="1" r:id="rIdxuzli6dqxucsrththzy8z">
         <w:r>
           <w:rPr>
             <w:rStyle w:val="Hyperlink"/>
@@ -9782,7 +9782,7 @@
       <w:r>
         <w:t xml:space="preserve">Normal secular variation documented by </w:t>
       </w:r>
-      <w:hyperlink w:history="1" r:id="rIdtcngtnoe-whwypawopltb">
+      <w:hyperlink w:history="1" r:id="rIdpy9mmctoym3hktq549wwr">
         <w:r>
           <w:rPr>
             <w:rStyle w:val="Hyperlink"/>
@@ -9849,7 +9849,7 @@
       <w:r>
         <w:t xml:space="preserve">Eclipse-induced perturbations predicted by Chapman (1933) via ionospheric conductivity drops. Data from </w:t>
       </w:r>
-      <w:hyperlink w:history="1" r:id="rIdnm_oewpwyjsdqqh2unqdy">
+      <w:hyperlink w:history="1" r:id="rIdg5e9_85uujtcbclrvpl3i">
         <w:r>
           <w:rPr>
             <w:rStyle w:val="Hyperlink"/>
@@ -9937,7 +9937,7 @@
       <w:r>
         <w:t xml:space="preserve">The formula used is for a quarter-wave linear waveguide, not a spherical cavity. Correct formula f = c/(2*pi*R) gives R = 6,098 km, within 4% of Earth's radius. The ionosphere IS conductive (</w:t>
       </w:r>
-      <w:hyperlink w:history="1" r:id="rIdphfg_ukkqv2qvbs4dxu9b">
+      <w:hyperlink w:history="1" r:id="rIdjympzpz4s9rmkkuufxoan">
         <w:r>
           <w:rPr>
             <w:rStyle w:val="Hyperlink"/>
@@ -10004,7 +10004,7 @@
       <w:r>
         <w:t xml:space="preserve">All five observations already predicted by </w:t>
       </w:r>
-      <w:hyperlink w:history="1" r:id="rIdxqh8souza2vb2kvzmfitr">
+      <w:hyperlink w:history="1" r:id="rIdmtifusiflbszzp3uz6_ix">
         <w:r>
           <w:rPr>
             <w:rStyle w:val="Hyperlink"/>
@@ -10015,7 +10015,7 @@
       <w:r>
         <w:t xml:space="preserve">, </w:t>
       </w:r>
-      <w:hyperlink w:history="1" r:id="rIdmczvxct8lotgz8neb3xq9">
+      <w:hyperlink w:history="1" r:id="rIdyfu-lddhjomvvwvngpg23">
         <w:r>
           <w:rPr>
             <w:rStyle w:val="Hyperlink"/>
@@ -10342,7 +10342,7 @@
       <w:r>
         <w:t xml:space="preserve">Antarctic gravity anomalies are mapped from orbit by </w:t>
       </w:r>
-      <w:hyperlink w:history="1" r:id="rIdwxiyizn31br1jmr7flf_r">
+      <w:hyperlink w:history="1" r:id="rIds6wtemxwqw8cwmzwdbyns">
         <w:r>
           <w:rPr>
             <w:rStyle w:val="Hyperlink"/>
@@ -10353,7 +10353,7 @@
       <w:r>
         <w:t xml:space="preserve"> and </w:t>
       </w:r>
-      <w:hyperlink w:history="1" r:id="rIdceawi0ruef8nxvickhjn6">
+      <w:hyperlink w:history="1" r:id="rIdktrdci79lh_prac1lkqfe">
         <w:r>
           <w:rPr>
             <w:rStyle w:val="Hyperlink"/>
@@ -13329,7 +13329,7 @@
       <w:r>
         <w:t xml:space="preserve">A </w:t>
       </w:r>
-      <w:hyperlink w:history="1" r:id="rId8rp_2xzo9ehfvygw1cpwi">
+      <w:hyperlink w:history="1" r:id="rIddgfxhjwgcztef_kryjt37">
         <w:r>
           <w:rPr>
             <w:rStyle w:val="Hyperlink"/>
@@ -13340,7 +13340,7 @@
       <w:r>
         <w:t xml:space="preserve"> found detectable decreases in X, Z, and total field components during eclipses. An </w:t>
       </w:r>
-      <w:hyperlink w:history="1" r:id="rIdcp0mmqcifxay8awg-nmgo">
+      <w:hyperlink w:history="1" r:id="rIdbrt9y5mcdeusyyqwy8yhz">
         <w:r>
           <w:rPr>
             <w:rStyle w:val="Hyperlink"/>
@@ -13845,7 +13845,7 @@
       <w:r>
         <w:t xml:space="preserve">Continuous 24-hour sunlight. A local sun at 5,733 km circling above a flat disc cannot produce 24-hour sunlight at the disc edge. Directly observable at Amundsen-Scott Station, staffed year-round since 1957. See </w:t>
       </w:r>
-      <w:hyperlink w:history="1" r:id="rId7sajn8ocbeqbz1gzo3rfl">
+      <w:hyperlink w:history="1" r:id="rIdzkuy6904q3hr5ri6xr3-h">
         <w:r>
           <w:rPr>
             <w:rStyle w:val="Hyperlink"/>
@@ -13909,7 +13909,7 @@
       <w:r>
         <w:t xml:space="preserve">GPS provides 1–3 meter accuracy worldwide using 24+ satellites in Keplerian orbits calculated from spherical-Earth gravitational mechanics. The system requires precise relativistic corrections (both special and general) that depend on the satellites' orbital velocity and altitude above a spherical gravitational well. If Earth were a flat disc with different geometry, the signal propagation times, relativistic corrections, and satellite visibility geometry would all be wrong, and the system would not achieve meter-level accuracy. The same applies to every other satellite navigation system (GLONASS, Galileo, BeiDou). The ISS at 408 km is visible on predictable schedules computed from Keplerian orbits. Geostationary satellites at 35,786 km — far above the dome's maximum height — provide continuous coverage. See </w:t>
       </w:r>
-      <w:hyperlink w:history="1" r:id="rIdews4o1j1ecxbwz1q_fsd1">
+      <w:hyperlink w:history="1" r:id="rIdhcf5abfkzyfajex1wsprz">
         <w:r>
           <w:rPr>
             <w:rStyle w:val="Hyperlink"/>
@@ -13920,7 +13920,7 @@
       <w:r>
         <w:t xml:space="preserve">; </w:t>
       </w:r>
-      <w:hyperlink w:history="1" r:id="rIdubou0yaxiduibvxev01ue">
+      <w:hyperlink w:history="1" r:id="rIdwga0-3tl9rbkvcux91j7o">
         <w:r>
           <w:rPr>
             <w:rStyle w:val="Hyperlink"/>
@@ -13969,7 +13969,7 @@
       <w:r>
         <w:t xml:space="preserve">Modern solar calculators (</w:t>
       </w:r>
-      <w:hyperlink w:history="1" r:id="rIdfm6devzwsg-zxpjkhxq10">
+      <w:hyperlink w:history="1" r:id="rIdqtedbypozhmgp9etibqpo">
         <w:r>
           <w:rPr>
             <w:rStyle w:val="Hyperlink"/>
@@ -14018,7 +14018,7 @@
       <w:r>
         <w:t xml:space="preserve">The </w:t>
       </w:r>
-      <w:hyperlink w:history="1" r:id="rIdoiyhov3x0vph77uzgx4om">
+      <w:hyperlink w:history="1" r:id="rIdkfd5pav-2pkmjoemnnskw">
         <w:r>
           <w:rPr>
             <w:rStyle w:val="Hyperlink"/>
@@ -14067,7 +14067,7 @@
       <w:r>
         <w:t xml:space="preserve">Earth's field is a dipole. South magnetic pole at 64.1°S, 135.9°E (</w:t>
       </w:r>
-      <w:hyperlink w:history="1" r:id="rIdhf-pczfmdloqiasax8btf">
+      <w:hyperlink w:history="1" r:id="rIdxk6ddheajoqmfqpyjosfo">
         <w:r>
           <w:rPr>
             <w:rStyle w:val="Hyperlink"/>
@@ -14116,7 +14116,7 @@
       <w:r>
         <w:t xml:space="preserve">g = 9.780 m/s² at equator, 9.832 m/s² at poles (0.53% variation). On a flat disc, centrifugal force points outward from center, producing the OPPOSITE pattern. See </w:t>
       </w:r>
-      <w:hyperlink w:history="1" r:id="rIdl_3orrvcx6atntskxuaz9">
+      <w:hyperlink w:history="1" r:id="rIdyczaa7rxoznk4hix6iwjc">
         <w:r>
           <w:rPr>
             <w:rStyle w:val="Hyperlink"/>
@@ -15113,7 +15113,7 @@
         </w:rPr>
         <w:t xml:space="preserve">NOAA World Magnetic Model 2025: </w:t>
       </w:r>
-      <w:hyperlink w:history="1" r:id="rIdegbwgd4uubsabnvd0glac">
+      <w:hyperlink w:history="1" r:id="rIdfmcudtp1x7xn1bhs0qjcb">
         <w:r>
           <w:rPr>
             <w:rStyle w:val="Hyperlink"/>
@@ -15133,7 +15133,7 @@
         </w:rPr>
         <w:t xml:space="preserve">NOAA Wandering Geomagnetic Poles: </w:t>
       </w:r>
-      <w:hyperlink w:history="1" r:id="rIdbqdlrabt4cdtt6vbvvkoo">
+      <w:hyperlink w:history="1" r:id="rIdeudarraxpyivjsaxlxmmk">
         <w:r>
           <w:rPr>
             <w:rStyle w:val="Hyperlink"/>
@@ -15153,7 +15153,7 @@
         </w:rPr>
         <w:t xml:space="preserve">CHAOS-7 Geomagnetic Field Model: </w:t>
       </w:r>
-      <w:hyperlink w:history="1" r:id="rIdfr7bwbkg-tuau8phd94x-">
+      <w:hyperlink w:history="1" r:id="rIdoqtqi3gczd71uab6nadgi">
         <w:r>
           <w:rPr>
             <w:rStyle w:val="Hyperlink"/>
@@ -15173,7 +15173,7 @@
         </w:rPr>
         <w:t xml:space="preserve">ESA Swarm Satellite Mission: </w:t>
       </w:r>
-      <w:hyperlink w:history="1" r:id="rIdqje5xzadnragjdfxyrkhy">
+      <w:hyperlink w:history="1" r:id="rIdbbkcesinkbipqnccshx7x">
         <w:r>
           <w:rPr>
             <w:rStyle w:val="Hyperlink"/>
@@ -15193,7 +15193,7 @@
         </w:rPr>
         <w:t xml:space="preserve">INTERMAGNET Observatory Network: </w:t>
       </w:r>
-      <w:hyperlink w:history="1" r:id="rIdpw7eifnrqxd8plj2mlbna">
+      <w:hyperlink w:history="1" r:id="rIdgiodixvzi1z3qzo_ko_ik">
         <w:r>
           <w:rPr>
             <w:rStyle w:val="Hyperlink"/>
@@ -15213,7 +15213,7 @@
         </w:rPr>
         <w:t xml:space="preserve">IGRF-13: </w:t>
       </w:r>
-      <w:hyperlink w:history="1" r:id="rIdn5mpilkybljn59fcqwyf_">
+      <w:hyperlink w:history="1" r:id="rId8nptwwjy7eoaywxhdbcco">
         <w:r>
           <w:rPr>
             <w:rStyle w:val="Hyperlink"/>
@@ -15233,7 +15233,7 @@
         </w:rPr>
         <w:t xml:space="preserve">ESA Gaia Data Release 3: </w:t>
       </w:r>
-      <w:hyperlink w:history="1" r:id="rIdardil18xt37gprwuecqsr">
+      <w:hyperlink w:history="1" r:id="rIdl2dsgvokjvvz3fuwi9afc">
         <w:r>
           <w:rPr>
             <w:rStyle w:val="Hyperlink"/>
@@ -15253,7 +15253,7 @@
         </w:rPr>
         <w:t xml:space="preserve">Hipparcos Catalogue: </w:t>
       </w:r>
-      <w:hyperlink w:history="1" r:id="rIdvsuvgf_mhj_jr9xkmd63x">
+      <w:hyperlink w:history="1" r:id="rIdkc-zmfl5ads5nroqcegtk">
         <w:r>
           <w:rPr>
             <w:rStyle w:val="Hyperlink"/>
@@ -15273,7 +15273,7 @@
         </w:rPr>
         <w:t xml:space="preserve">US Patent 787412 (Tesla): </w:t>
       </w:r>
-      <w:hyperlink w:history="1" r:id="rIdcfqhc6cd-wjzcp-y52mf1">
+      <w:hyperlink w:history="1" r:id="rId3h9lol9kwlxt_y4wed-wg">
         <w:r>
           <w:rPr>
             <w:rStyle w:val="Hyperlink"/>
@@ -15293,7 +15293,7 @@
         </w:rPr>
         <w:t xml:space="preserve">NOAA Solar Position Algorithm: </w:t>
       </w:r>
-      <w:hyperlink w:history="1" r:id="rIdcqlozrrtjg0r1dhffhgkp">
+      <w:hyperlink w:history="1" r:id="rIdiguvioqbqrfpg9wmy8w_s">
         <w:r>
           <w:rPr>
             <w:rStyle w:val="Hyperlink"/>
@@ -15313,7 +15313,7 @@
         </w:rPr>
         <w:t xml:space="preserve">National Geodetic Survey Gravity: </w:t>
       </w:r>
-      <w:hyperlink w:history="1" r:id="rIdugn4vk10stwv-_1rreirn">
+      <w:hyperlink w:history="1" r:id="rIdbgr7_exvrwtywvhdmljiu">
         <w:r>
           <w:rPr>
             <w:rStyle w:val="Hyperlink"/>
@@ -15333,7 +15333,7 @@
         </w:rPr>
         <w:t xml:space="preserve">CHIME/FRB Project: </w:t>
       </w:r>
-      <w:hyperlink w:history="1" r:id="rIdeygpjhxaj4dfagfi7xkc3">
+      <w:hyperlink w:history="1" r:id="rId9hstljvv6tfe7wojyjx5h">
         <w:r>
           <w:rPr>
             <w:rStyle w:val="Hyperlink"/>
@@ -15353,7 +15353,7 @@
         </w:rPr>
         <w:t xml:space="preserve">GRACE-FO (gravity mapping): </w:t>
       </w:r>
-      <w:hyperlink w:history="1" r:id="rIdcskt2u8ni_g3pmsej7qbv">
+      <w:hyperlink w:history="1" r:id="rIdknrytdcm5qka2odhcy0nx">
         <w:r>
           <w:rPr>
             <w:rStyle w:val="Hyperlink"/>
@@ -15373,7 +15373,7 @@
         </w:rPr>
         <w:t xml:space="preserve">GOCE (gravity field): </w:t>
       </w:r>
-      <w:hyperlink w:history="1" r:id="rId7c5g2c1-a51hu4_pz7lrd">
+      <w:hyperlink w:history="1" r:id="rIdsyxz7e2khibpfpznm-bfk">
         <w:r>
           <w:rPr>
             <w:rStyle w:val="Hyperlink"/>
@@ -15393,7 +15393,7 @@
         </w:rPr>
         <w:t xml:space="preserve">GPS.gov: </w:t>
       </w:r>
-      <w:hyperlink w:history="1" r:id="rIdnavbwhvwleujol9v808wq">
+      <w:hyperlink w:history="1" r:id="rId03kngem5-uoqpdgqb4rvy">
         <w:r>
           <w:rPr>
             <w:rStyle w:val="Hyperlink"/>
@@ -15413,7 +15413,7 @@
         </w:rPr>
         <w:t xml:space="preserve">CelesTrak TLE Data: </w:t>
       </w:r>
-      <w:hyperlink w:history="1" r:id="rIddb9z1fpglrm6vrtghcv9e">
+      <w:hyperlink w:history="1" r:id="rIdd97b8qloyzwvtbilsh4rc">
         <w:r>
           <w:rPr>
             <w:rStyle w:val="Hyperlink"/>

</xml_diff>

<commit_message>
Rewrite domains table: explain WHY, not just 'we already knew this'
Every Problem column entry now answers 'why doesn't this distinguish
dome from globe?' instead of appealing to incumbency. Added:
- Discriminating tests where they exist (D-layer zenith angle,
  equatorial flight asymmetry, GPS relativistic corrections)
- Explicit 'both models predict X — non-discriminating' framing
- Dome's actual mechanism vs globe's mechanism side by side
- Why importing known constants isn't prediction (M2, Roaring 40s)
Consistent with Evaluation Guide principle: mainstream physics is
not assumed correct by default.

Co-Authored-By: Claude Opus 4.6 <noreply@anthropic.com>
</commit_message>
<xml_diff>
--- a/downloads/critical-review-dome-model-v4.docx
+++ b/downloads/critical-review-dome-model-v4.docx
@@ -8889,7 +8889,7 @@
       <w:r>
         <w:t xml:space="preserve">US Patent 787412 (1905), publicly available at </w:t>
       </w:r>
-      <w:hyperlink w:history="1" r:id="rIdkpzu67c0enwwbluzr6onl">
+      <w:hyperlink w:history="1" r:id="rId9oxrrqb55nhm_sfvatonz">
         <w:r>
           <w:rPr>
             <w:rStyle w:val="Hyperlink"/>
@@ -9029,7 +9029,7 @@
       <w:r>
         <w:t xml:space="preserve">James Bradley (1727) explicitly tested and rejected atmospheric refraction as an explanation: refraction is wavelength-dependent (chromatic), while stellar aberration is achromatic. Modern VLBI measurements achieve milliarcsecond precision and directly confirm aberration correlates with Earth's orbital velocity (~30 km/s). The </w:t>
       </w:r>
-      <w:hyperlink w:history="1" r:id="rIdpv4d3iqguz4fbbou9jo3l">
+      <w:hyperlink w:history="1" r:id="rIdykr56jev_excuzxjsbbqx">
         <w:r>
           <w:rPr>
             <w:rStyle w:val="Hyperlink"/>
@@ -9095,7 +9095,7 @@
       <w:r>
         <w:t xml:space="preserve">ESA </w:t>
       </w:r>
-      <w:hyperlink w:history="1" r:id="rId7gz_la1hwo9cgqqu7xuh_">
+      <w:hyperlink w:history="1" r:id="rId0jinvuokxius4qj0fzmur">
         <w:r>
           <w:rPr>
             <w:rStyle w:val="Hyperlink"/>
@@ -9161,7 +9161,7 @@
       <w:r>
         <w:t xml:space="preserve">Crepuscular rays are parallel beams made visible by atmospheric scattering. The apparent divergence is a perspective effect. Crucially, anticrepuscular rays converge at the anti-solar point simultaneously. See </w:t>
       </w:r>
-      <w:hyperlink w:history="1" r:id="rIdztxipgtdarlbtx6upgpoi">
+      <w:hyperlink w:history="1" r:id="rIdm_cz3qb0gxhjm8k58pp-s">
         <w:r>
           <w:rPr>
             <w:rStyle w:val="Hyperlink"/>
@@ -9172,7 +9172,7 @@
       <w:r>
         <w:t xml:space="preserve"> and </w:t>
       </w:r>
-      <w:hyperlink w:history="1" r:id="rId_vyechtvjlqcdkqowrmzw">
+      <w:hyperlink w:history="1" r:id="rIdkfyjccf1vkqyet6almx5f">
         <w:r>
           <w:rPr>
             <w:rStyle w:val="Hyperlink"/>
@@ -9238,7 +9238,7 @@
       <w:r>
         <w:t xml:space="preserve">NOAA officially states no evidence of anomalous disappearances. </w:t>
       </w:r>
-      <w:hyperlink w:history="1" r:id="rIdzqp1um_fjxmjrxbkwj93e">
+      <w:hyperlink w:history="1" r:id="rIdc5qxqpxct_ssc1ch5ppdi">
         <w:r>
           <w:rPr>
             <w:rStyle w:val="Hyperlink"/>
@@ -9304,7 +9304,7 @@
       <w:r>
         <w:t xml:space="preserve">Hipparcos </w:t>
       </w:r>
-      <w:hyperlink w:history="1" r:id="rIdpxelbossirksous_w2ytv">
+      <w:hyperlink w:history="1" r:id="rIdda8svt3477xejyl_bxv7y">
         <w:r>
           <w:rPr>
             <w:rStyle w:val="Hyperlink"/>
@@ -9720,7 +9720,7 @@
       <w:r>
         <w:t xml:space="preserve">Terra-Nova et al. (2017, PNAS) demonstrate reversed-flux patches reproduce SAA splitting in MHD simulations. The </w:t>
       </w:r>
-      <w:hyperlink w:history="1" r:id="rIddkeawsxy-ddfhlalyzgmp">
+      <w:hyperlink w:history="1" r:id="rIdwwpqj51ecweutomxvtdvp">
         <w:r>
           <w:rPr>
             <w:rStyle w:val="Hyperlink"/>
@@ -9731,7 +9731,7 @@
       <w:r>
         <w:t xml:space="preserve"> documents the evolution quantitatively. </w:t>
       </w:r>
-      <w:hyperlink w:history="1" r:id="rIdiyi3ekmvccrprewpnc-8u">
+      <w:hyperlink w:history="1" r:id="rId41x7gz9ddcsugmrwbuztc">
         <w:r>
           <w:rPr>
             <w:rStyle w:val="Hyperlink"/>
@@ -9782,7 +9782,7 @@
       <w:r>
         <w:t xml:space="preserve">Normal secular variation documented by </w:t>
       </w:r>
-      <w:hyperlink w:history="1" r:id="rIdnwryfpstjy51ocdovgfwq">
+      <w:hyperlink w:history="1" r:id="rIdwpoc6iuvonp9wjvfmqs6d">
         <w:r>
           <w:rPr>
             <w:rStyle w:val="Hyperlink"/>
@@ -9849,7 +9849,7 @@
       <w:r>
         <w:t xml:space="preserve">Eclipse-induced perturbations predicted by Chapman (1933) via ionospheric conductivity drops. Data from </w:t>
       </w:r>
-      <w:hyperlink w:history="1" r:id="rIdj0kk2wuuq_p6f168jhiag">
+      <w:hyperlink w:history="1" r:id="rIdhftkdk_cmlaz0hk_mwbrs">
         <w:r>
           <w:rPr>
             <w:rStyle w:val="Hyperlink"/>
@@ -9937,7 +9937,7 @@
       <w:r>
         <w:t xml:space="preserve">The formula used is for a quarter-wave linear waveguide, not a spherical cavity. Correct formula f = c/(2*pi*R) gives R = 6,098 km, within 4% of Earth's radius. The ionosphere IS conductive (</w:t>
       </w:r>
-      <w:hyperlink w:history="1" r:id="rIdgiub9shqmfjhjtm1sit0y">
+      <w:hyperlink w:history="1" r:id="rIdzom5jiqsl928djbmsw37f">
         <w:r>
           <w:rPr>
             <w:rStyle w:val="Hyperlink"/>
@@ -10004,7 +10004,7 @@
       <w:r>
         <w:t xml:space="preserve">All five observations already predicted by </w:t>
       </w:r>
-      <w:hyperlink w:history="1" r:id="rId5hyqxw2s8jyqgeziyclj8">
+      <w:hyperlink w:history="1" r:id="rIdfqjxls2sqwvp4oa8cxzyd">
         <w:r>
           <w:rPr>
             <w:rStyle w:val="Hyperlink"/>
@@ -10015,7 +10015,7 @@
       <w:r>
         <w:t xml:space="preserve">, </w:t>
       </w:r>
-      <w:hyperlink w:history="1" r:id="rIdc_pvd7ckbwxw1rgpp_bv3">
+      <w:hyperlink w:history="1" r:id="rIdtivo2ko1o8ypwxbmewdqv">
         <w:r>
           <w:rPr>
             <w:rStyle w:val="Hyperlink"/>
@@ -10342,7 +10342,7 @@
       <w:r>
         <w:t xml:space="preserve">Antarctic gravity anomalies are mapped from orbit by </w:t>
       </w:r>
-      <w:hyperlink w:history="1" r:id="rIdzxcru9vgyjmafjcqfom5s">
+      <w:hyperlink w:history="1" r:id="rIdkfs9roxvpybnrrjsxximi">
         <w:r>
           <w:rPr>
             <w:rStyle w:val="Hyperlink"/>
@@ -10353,7 +10353,7 @@
       <w:r>
         <w:t xml:space="preserve"> and </w:t>
       </w:r>
-      <w:hyperlink w:history="1" r:id="rIddmykokzvhjuivz8-fjdal">
+      <w:hyperlink w:history="1" r:id="rIdy-h7wnykhzgvw4trrdwsw">
         <w:r>
           <w:rPr>
             <w:rStyle w:val="Hyperlink"/>
@@ -13329,7 +13329,7 @@
       <w:r>
         <w:t xml:space="preserve">A </w:t>
       </w:r>
-      <w:hyperlink w:history="1" r:id="rId2yldkusmu1-ow1mkjxoff">
+      <w:hyperlink w:history="1" r:id="rIdbl_bv23dst5xn_8fsm9vk">
         <w:r>
           <w:rPr>
             <w:rStyle w:val="Hyperlink"/>
@@ -13340,7 +13340,7 @@
       <w:r>
         <w:t xml:space="preserve"> found detectable decreases in X, Z, and total field components during eclipses. An </w:t>
       </w:r>
-      <w:hyperlink w:history="1" r:id="rIdxeovazhbwdplccams-8jl">
+      <w:hyperlink w:history="1" r:id="rIdncxcq8iq6-1dt0mpqs_qm">
         <w:r>
           <w:rPr>
             <w:rStyle w:val="Hyperlink"/>
@@ -13845,7 +13845,7 @@
       <w:r>
         <w:t xml:space="preserve">Continuous 24-hour sunlight. A local sun at 5,733 km circling above a flat disc cannot produce 24-hour sunlight at the disc edge. Directly observable at Amundsen-Scott Station, staffed year-round since 1957. See </w:t>
       </w:r>
-      <w:hyperlink w:history="1" r:id="rIdmsd-d06nyhqlbuhskcgj0">
+      <w:hyperlink w:history="1" r:id="rIdq9ewfkzya-aev8kom2u4b">
         <w:r>
           <w:rPr>
             <w:rStyle w:val="Hyperlink"/>
@@ -13909,7 +13909,7 @@
       <w:r>
         <w:t xml:space="preserve">GPS provides 1–3 meter accuracy worldwide using 24+ satellites in Keplerian orbits calculated from spherical-Earth gravitational mechanics. The system requires precise relativistic corrections (both special and general) that depend on the satellites' orbital velocity and altitude above a spherical gravitational well. If Earth were a flat disc with different geometry, the signal propagation times, relativistic corrections, and satellite visibility geometry would all be wrong, and the system would not achieve meter-level accuracy. The same applies to every other satellite navigation system (GLONASS, Galileo, BeiDou). The ISS at 408 km is visible on predictable schedules computed from Keplerian orbits. Geostationary satellites at 35,786 km — far above the dome's maximum height — provide continuous coverage. See </w:t>
       </w:r>
-      <w:hyperlink w:history="1" r:id="rIdpmtawjytchpdf3slk6yir">
+      <w:hyperlink w:history="1" r:id="rIdox9a3nzoxociulebicvtj">
         <w:r>
           <w:rPr>
             <w:rStyle w:val="Hyperlink"/>
@@ -13920,7 +13920,7 @@
       <w:r>
         <w:t xml:space="preserve">; </w:t>
       </w:r>
-      <w:hyperlink w:history="1" r:id="rIdhvztj6udnzuowo2zm3a_b">
+      <w:hyperlink w:history="1" r:id="rId_k1etelco0uhqabo-_5aa">
         <w:r>
           <w:rPr>
             <w:rStyle w:val="Hyperlink"/>
@@ -13969,7 +13969,7 @@
       <w:r>
         <w:t xml:space="preserve">Modern solar calculators (</w:t>
       </w:r>
-      <w:hyperlink w:history="1" r:id="rIdqvbqdeq3lnckcjarrwgi2">
+      <w:hyperlink w:history="1" r:id="rIdyventlb2l7e615uvjryxb">
         <w:r>
           <w:rPr>
             <w:rStyle w:val="Hyperlink"/>
@@ -14018,7 +14018,7 @@
       <w:r>
         <w:t xml:space="preserve">The </w:t>
       </w:r>
-      <w:hyperlink w:history="1" r:id="rIdcxn1_6hdvhrgxzmwym0bq">
+      <w:hyperlink w:history="1" r:id="rIdla6hf4_gnhlmlhh5hebft">
         <w:r>
           <w:rPr>
             <w:rStyle w:val="Hyperlink"/>
@@ -14067,7 +14067,7 @@
       <w:r>
         <w:t xml:space="preserve">Earth's field is a dipole. South magnetic pole at 64.1°S, 135.9°E (</w:t>
       </w:r>
-      <w:hyperlink w:history="1" r:id="rIdltnvc4x_ktm3sus2ps0da">
+      <w:hyperlink w:history="1" r:id="rIdsvgkvjvlxr38caztwvgwl">
         <w:r>
           <w:rPr>
             <w:rStyle w:val="Hyperlink"/>
@@ -14116,7 +14116,7 @@
       <w:r>
         <w:t xml:space="preserve">g = 9.780 m/s² at equator, 9.832 m/s² at poles (0.53% variation). On a flat disc, centrifugal force points outward from center, producing the OPPOSITE pattern. See </w:t>
       </w:r>
-      <w:hyperlink w:history="1" r:id="rIdkrrsby__mvy-5_whj4r7a">
+      <w:hyperlink w:history="1" r:id="rIdn1uswiublpck9k09fwevg">
         <w:r>
           <w:rPr>
             <w:rStyle w:val="Hyperlink"/>
@@ -15113,7 +15113,7 @@
         </w:rPr>
         <w:t xml:space="preserve">NOAA World Magnetic Model 2025: </w:t>
       </w:r>
-      <w:hyperlink w:history="1" r:id="rId4tysr0cej-khgznrrwery">
+      <w:hyperlink w:history="1" r:id="rIdjslp6asffe6q_xsgureqe">
         <w:r>
           <w:rPr>
             <w:rStyle w:val="Hyperlink"/>
@@ -15133,7 +15133,7 @@
         </w:rPr>
         <w:t xml:space="preserve">NOAA Wandering Geomagnetic Poles: </w:t>
       </w:r>
-      <w:hyperlink w:history="1" r:id="rIdhyrpguysku3qegkzoxn9r">
+      <w:hyperlink w:history="1" r:id="rId6umrmmh0lb148r0uc2y3f">
         <w:r>
           <w:rPr>
             <w:rStyle w:val="Hyperlink"/>
@@ -15153,7 +15153,7 @@
         </w:rPr>
         <w:t xml:space="preserve">CHAOS-7 Geomagnetic Field Model: </w:t>
       </w:r>
-      <w:hyperlink w:history="1" r:id="rIdjm49aygm-zgu4my7l_atu">
+      <w:hyperlink w:history="1" r:id="rIduyrlaxnrkkfwxmbgpwxul">
         <w:r>
           <w:rPr>
             <w:rStyle w:val="Hyperlink"/>
@@ -15173,7 +15173,7 @@
         </w:rPr>
         <w:t xml:space="preserve">ESA Swarm Satellite Mission: </w:t>
       </w:r>
-      <w:hyperlink w:history="1" r:id="rIdhwh7y3oyyim2uh0xepmy0">
+      <w:hyperlink w:history="1" r:id="rIdtcnic8tmykafson-duklm">
         <w:r>
           <w:rPr>
             <w:rStyle w:val="Hyperlink"/>
@@ -15193,7 +15193,7 @@
         </w:rPr>
         <w:t xml:space="preserve">INTERMAGNET Observatory Network: </w:t>
       </w:r>
-      <w:hyperlink w:history="1" r:id="rIdhqgdfvyzhdvq_1ixww4u9">
+      <w:hyperlink w:history="1" r:id="rId02ocvvv2nyumvgwqlq5uq">
         <w:r>
           <w:rPr>
             <w:rStyle w:val="Hyperlink"/>
@@ -15213,7 +15213,7 @@
         </w:rPr>
         <w:t xml:space="preserve">IGRF-13: </w:t>
       </w:r>
-      <w:hyperlink w:history="1" r:id="rIdgwssi5_23bmhzp3vk5aej">
+      <w:hyperlink w:history="1" r:id="rIdxgni78-wuzeuadcdjntxv">
         <w:r>
           <w:rPr>
             <w:rStyle w:val="Hyperlink"/>
@@ -15233,7 +15233,7 @@
         </w:rPr>
         <w:t xml:space="preserve">ESA Gaia Data Release 3: </w:t>
       </w:r>
-      <w:hyperlink w:history="1" r:id="rIdcfbunsq_bll8_dxtxxucc">
+      <w:hyperlink w:history="1" r:id="rId59ejbbost6qplg5sg9tke">
         <w:r>
           <w:rPr>
             <w:rStyle w:val="Hyperlink"/>
@@ -15253,7 +15253,7 @@
         </w:rPr>
         <w:t xml:space="preserve">Hipparcos Catalogue: </w:t>
       </w:r>
-      <w:hyperlink w:history="1" r:id="rIdktjeyhjxqw5navwu2jxnh">
+      <w:hyperlink w:history="1" r:id="rIdmajl7ys05vns544pqm09j">
         <w:r>
           <w:rPr>
             <w:rStyle w:val="Hyperlink"/>
@@ -15273,7 +15273,7 @@
         </w:rPr>
         <w:t xml:space="preserve">US Patent 787412 (Tesla): </w:t>
       </w:r>
-      <w:hyperlink w:history="1" r:id="rIdjmwctl9sd6k1xzosztds8">
+      <w:hyperlink w:history="1" r:id="rIdpvtcs27k_yyfwjax_fks-">
         <w:r>
           <w:rPr>
             <w:rStyle w:val="Hyperlink"/>
@@ -15293,7 +15293,7 @@
         </w:rPr>
         <w:t xml:space="preserve">NOAA Solar Position Algorithm: </w:t>
       </w:r>
-      <w:hyperlink w:history="1" r:id="rIdzjvdnk6xfh57swapoczem">
+      <w:hyperlink w:history="1" r:id="rIdxwbxkwg73fiumxfwxuhbm">
         <w:r>
           <w:rPr>
             <w:rStyle w:val="Hyperlink"/>
@@ -15313,7 +15313,7 @@
         </w:rPr>
         <w:t xml:space="preserve">National Geodetic Survey Gravity: </w:t>
       </w:r>
-      <w:hyperlink w:history="1" r:id="rId9obuqk-0adbakbpqxgdvu">
+      <w:hyperlink w:history="1" r:id="rIdw8rhjnjuddee2sx5unhc5">
         <w:r>
           <w:rPr>
             <w:rStyle w:val="Hyperlink"/>
@@ -15333,7 +15333,7 @@
         </w:rPr>
         <w:t xml:space="preserve">CHIME/FRB Project: </w:t>
       </w:r>
-      <w:hyperlink w:history="1" r:id="rIdsmz-c6mgkaxphlfthpt1p">
+      <w:hyperlink w:history="1" r:id="rIdicgxhqvnwzsuqu7gpeilk">
         <w:r>
           <w:rPr>
             <w:rStyle w:val="Hyperlink"/>
@@ -15353,7 +15353,7 @@
         </w:rPr>
         <w:t xml:space="preserve">GRACE-FO (gravity mapping): </w:t>
       </w:r>
-      <w:hyperlink w:history="1" r:id="rIdxolbkvsb8s4y93uq7fzsx">
+      <w:hyperlink w:history="1" r:id="rIdjoxlqvnhyroaaijxg7b0z">
         <w:r>
           <w:rPr>
             <w:rStyle w:val="Hyperlink"/>
@@ -15373,7 +15373,7 @@
         </w:rPr>
         <w:t xml:space="preserve">GOCE (gravity field): </w:t>
       </w:r>
-      <w:hyperlink w:history="1" r:id="rIdt2ye4xao2anqut7bimwb-">
+      <w:hyperlink w:history="1" r:id="rIdjp6jjmuhf-nft5ssjerih">
         <w:r>
           <w:rPr>
             <w:rStyle w:val="Hyperlink"/>
@@ -15393,7 +15393,7 @@
         </w:rPr>
         <w:t xml:space="preserve">GPS.gov: </w:t>
       </w:r>
-      <w:hyperlink w:history="1" r:id="rIdnylejz7sbvdelchbe1_lm">
+      <w:hyperlink w:history="1" r:id="rIdikibry4e6_kcrpw1tszed">
         <w:r>
           <w:rPr>
             <w:rStyle w:val="Hyperlink"/>
@@ -15413,7 +15413,7 @@
         </w:rPr>
         <w:t xml:space="preserve">CelesTrak TLE Data: </w:t>
       </w:r>
-      <w:hyperlink w:history="1" r:id="rIdxrfy2c2ugfystiu_skpjj">
+      <w:hyperlink w:history="1" r:id="rIdpilgqqoduqsztkmjdbijs">
         <w:r>
           <w:rPr>
             <w:rStyle w:val="Hyperlink"/>

</xml_diff>

<commit_message>
Split Internal Contradictions into own tab; fix Sydney-Perth analysis
New 'Internal Contradictions' tab separates Part 4.5 (dome's own
geometry refuting itself) from Part 4 (external falsification tests).
These are fundamentally different arguments — one uses outside data,
the other uses only the dome's own published constants.

Sydney-Perth: corrected factual error. Our review claimed railway
was ~3,961 km (actually the driving distance). The Indian Pacific
railway is 4,352 km — matching the dome prediction exactly. This
suspicious match suggests calibration, not derivation. Reframed
to compare against direct flight distance (3,290 km = globe
geodesic) as the proper geometric benchmark.

Co-Authored-By: Claude Opus 4.6 <noreply@anthropic.com>
</commit_message>
<xml_diff>
--- a/downloads/critical-review-dome-model-v4.docx
+++ b/downloads/critical-review-dome-model-v4.docx
@@ -8889,7 +8889,7 @@
       <w:r>
         <w:t xml:space="preserve">US Patent 787412 (1905), publicly available at </w:t>
       </w:r>
-      <w:hyperlink w:history="1" r:id="rId9oxrrqb55nhm_sfvatonz">
+      <w:hyperlink w:history="1" r:id="rId1zngncwdt_amiqn1hoa2m">
         <w:r>
           <w:rPr>
             <w:rStyle w:val="Hyperlink"/>
@@ -9029,7 +9029,7 @@
       <w:r>
         <w:t xml:space="preserve">James Bradley (1727) explicitly tested and rejected atmospheric refraction as an explanation: refraction is wavelength-dependent (chromatic), while stellar aberration is achromatic. Modern VLBI measurements achieve milliarcsecond precision and directly confirm aberration correlates with Earth's orbital velocity (~30 km/s). The </w:t>
       </w:r>
-      <w:hyperlink w:history="1" r:id="rIdykr56jev_excuzxjsbbqx">
+      <w:hyperlink w:history="1" r:id="rIdihafmu3_i_qam0lh9ghzs">
         <w:r>
           <w:rPr>
             <w:rStyle w:val="Hyperlink"/>
@@ -9095,7 +9095,7 @@
       <w:r>
         <w:t xml:space="preserve">ESA </w:t>
       </w:r>
-      <w:hyperlink w:history="1" r:id="rId0jinvuokxius4qj0fzmur">
+      <w:hyperlink w:history="1" r:id="rId-_mhnis9ka2aebfbi5e0m">
         <w:r>
           <w:rPr>
             <w:rStyle w:val="Hyperlink"/>
@@ -9161,7 +9161,7 @@
       <w:r>
         <w:t xml:space="preserve">Crepuscular rays are parallel beams made visible by atmospheric scattering. The apparent divergence is a perspective effect. Crucially, anticrepuscular rays converge at the anti-solar point simultaneously. See </w:t>
       </w:r>
-      <w:hyperlink w:history="1" r:id="rIdm_cz3qb0gxhjm8k58pp-s">
+      <w:hyperlink w:history="1" r:id="rId9cchvorv8ie4cbo3z9p0q">
         <w:r>
           <w:rPr>
             <w:rStyle w:val="Hyperlink"/>
@@ -9172,7 +9172,7 @@
       <w:r>
         <w:t xml:space="preserve"> and </w:t>
       </w:r>
-      <w:hyperlink w:history="1" r:id="rIdkfyjccf1vkqyet6almx5f">
+      <w:hyperlink w:history="1" r:id="rIdtq-gftdb7bhewgp8ldxdq">
         <w:r>
           <w:rPr>
             <w:rStyle w:val="Hyperlink"/>
@@ -9238,7 +9238,7 @@
       <w:r>
         <w:t xml:space="preserve">NOAA officially states no evidence of anomalous disappearances. </w:t>
       </w:r>
-      <w:hyperlink w:history="1" r:id="rIdc5qxqpxct_ssc1ch5ppdi">
+      <w:hyperlink w:history="1" r:id="rIdlmaruzaj55-sjeznvekju">
         <w:r>
           <w:rPr>
             <w:rStyle w:val="Hyperlink"/>
@@ -9304,7 +9304,7 @@
       <w:r>
         <w:t xml:space="preserve">Hipparcos </w:t>
       </w:r>
-      <w:hyperlink w:history="1" r:id="rIdda8svt3477xejyl_bxv7y">
+      <w:hyperlink w:history="1" r:id="rIdm8ij5u_5is5ryiebbikul">
         <w:r>
           <w:rPr>
             <w:rStyle w:val="Hyperlink"/>
@@ -9720,7 +9720,7 @@
       <w:r>
         <w:t xml:space="preserve">Terra-Nova et al. (2017, PNAS) demonstrate reversed-flux patches reproduce SAA splitting in MHD simulations. The </w:t>
       </w:r>
-      <w:hyperlink w:history="1" r:id="rIdwwpqj51ecweutomxvtdvp">
+      <w:hyperlink w:history="1" r:id="rIdbzgc_vhmcgkrpreze3qq0">
         <w:r>
           <w:rPr>
             <w:rStyle w:val="Hyperlink"/>
@@ -9731,7 +9731,7 @@
       <w:r>
         <w:t xml:space="preserve"> documents the evolution quantitatively. </w:t>
       </w:r>
-      <w:hyperlink w:history="1" r:id="rId41x7gz9ddcsugmrwbuztc">
+      <w:hyperlink w:history="1" r:id="rIdxhclptcechivqgh8sbfm7">
         <w:r>
           <w:rPr>
             <w:rStyle w:val="Hyperlink"/>
@@ -9782,7 +9782,7 @@
       <w:r>
         <w:t xml:space="preserve">Normal secular variation documented by </w:t>
       </w:r>
-      <w:hyperlink w:history="1" r:id="rIdwpoc6iuvonp9wjvfmqs6d">
+      <w:hyperlink w:history="1" r:id="rIdccgoyzzcvzlui-q3u6wht">
         <w:r>
           <w:rPr>
             <w:rStyle w:val="Hyperlink"/>
@@ -9849,7 +9849,7 @@
       <w:r>
         <w:t xml:space="preserve">Eclipse-induced perturbations predicted by Chapman (1933) via ionospheric conductivity drops. Data from </w:t>
       </w:r>
-      <w:hyperlink w:history="1" r:id="rIdhftkdk_cmlaz0hk_mwbrs">
+      <w:hyperlink w:history="1" r:id="rIddnymzcl4gcldv99bsovaw">
         <w:r>
           <w:rPr>
             <w:rStyle w:val="Hyperlink"/>
@@ -9937,7 +9937,7 @@
       <w:r>
         <w:t xml:space="preserve">The formula used is for a quarter-wave linear waveguide, not a spherical cavity. Correct formula f = c/(2*pi*R) gives R = 6,098 km, within 4% of Earth's radius. The ionosphere IS conductive (</w:t>
       </w:r>
-      <w:hyperlink w:history="1" r:id="rIdzom5jiqsl928djbmsw37f">
+      <w:hyperlink w:history="1" r:id="rIdw43shzrrjslgkcbpogek9">
         <w:r>
           <w:rPr>
             <w:rStyle w:val="Hyperlink"/>
@@ -10004,7 +10004,7 @@
       <w:r>
         <w:t xml:space="preserve">All five observations already predicted by </w:t>
       </w:r>
-      <w:hyperlink w:history="1" r:id="rIdfqjxls2sqwvp4oa8cxzyd">
+      <w:hyperlink w:history="1" r:id="rIdmzy3jjp7vxmbfwzu_uavj">
         <w:r>
           <w:rPr>
             <w:rStyle w:val="Hyperlink"/>
@@ -10015,7 +10015,7 @@
       <w:r>
         <w:t xml:space="preserve">, </w:t>
       </w:r>
-      <w:hyperlink w:history="1" r:id="rIdtivo2ko1o8ypwxbmewdqv">
+      <w:hyperlink w:history="1" r:id="rIdcfyma5jhpj1bqnaguazf3">
         <w:r>
           <w:rPr>
             <w:rStyle w:val="Hyperlink"/>
@@ -10342,7 +10342,7 @@
       <w:r>
         <w:t xml:space="preserve">Antarctic gravity anomalies are mapped from orbit by </w:t>
       </w:r>
-      <w:hyperlink w:history="1" r:id="rIdkfs9roxvpybnrrjsxximi">
+      <w:hyperlink w:history="1" r:id="rIdvhyjkuh1roj5_eqfsnb_q">
         <w:r>
           <w:rPr>
             <w:rStyle w:val="Hyperlink"/>
@@ -10353,7 +10353,7 @@
       <w:r>
         <w:t xml:space="preserve"> and </w:t>
       </w:r>
-      <w:hyperlink w:history="1" r:id="rIdy-h7wnykhzgvw4trrdwsw">
+      <w:hyperlink w:history="1" r:id="rIdkqb0o170vgt3yebjrzgtj">
         <w:r>
           <w:rPr>
             <w:rStyle w:val="Hyperlink"/>
@@ -13329,7 +13329,7 @@
       <w:r>
         <w:t xml:space="preserve">A </w:t>
       </w:r>
-      <w:hyperlink w:history="1" r:id="rIdbl_bv23dst5xn_8fsm9vk">
+      <w:hyperlink w:history="1" r:id="rIdbub41-jnghuifdu2q_wwh">
         <w:r>
           <w:rPr>
             <w:rStyle w:val="Hyperlink"/>
@@ -13340,7 +13340,7 @@
       <w:r>
         <w:t xml:space="preserve"> found detectable decreases in X, Z, and total field components during eclipses. An </w:t>
       </w:r>
-      <w:hyperlink w:history="1" r:id="rIdncxcq8iq6-1dt0mpqs_qm">
+      <w:hyperlink w:history="1" r:id="rIdr-0mofsfbdsl6vxuft80e">
         <w:r>
           <w:rPr>
             <w:rStyle w:val="Hyperlink"/>
@@ -13845,7 +13845,7 @@
       <w:r>
         <w:t xml:space="preserve">Continuous 24-hour sunlight. A local sun at 5,733 km circling above a flat disc cannot produce 24-hour sunlight at the disc edge. Directly observable at Amundsen-Scott Station, staffed year-round since 1957. See </w:t>
       </w:r>
-      <w:hyperlink w:history="1" r:id="rIdq9ewfkzya-aev8kom2u4b">
+      <w:hyperlink w:history="1" r:id="rIdwnbi3gxplp8sbqziktpec">
         <w:r>
           <w:rPr>
             <w:rStyle w:val="Hyperlink"/>
@@ -13909,7 +13909,7 @@
       <w:r>
         <w:t xml:space="preserve">GPS provides 1–3 meter accuracy worldwide using 24+ satellites in Keplerian orbits calculated from spherical-Earth gravitational mechanics. The system requires precise relativistic corrections (both special and general) that depend on the satellites' orbital velocity and altitude above a spherical gravitational well. If Earth were a flat disc with different geometry, the signal propagation times, relativistic corrections, and satellite visibility geometry would all be wrong, and the system would not achieve meter-level accuracy. The same applies to every other satellite navigation system (GLONASS, Galileo, BeiDou). The ISS at 408 km is visible on predictable schedules computed from Keplerian orbits. Geostationary satellites at 35,786 km — far above the dome's maximum height — provide continuous coverage. See </w:t>
       </w:r>
-      <w:hyperlink w:history="1" r:id="rIdox9a3nzoxociulebicvtj">
+      <w:hyperlink w:history="1" r:id="rIdisbanernf699c67-l8gi5">
         <w:r>
           <w:rPr>
             <w:rStyle w:val="Hyperlink"/>
@@ -13920,7 +13920,7 @@
       <w:r>
         <w:t xml:space="preserve">; </w:t>
       </w:r>
-      <w:hyperlink w:history="1" r:id="rId_k1etelco0uhqabo-_5aa">
+      <w:hyperlink w:history="1" r:id="rIdyfg1t0v_za2xzo3ffazcj">
         <w:r>
           <w:rPr>
             <w:rStyle w:val="Hyperlink"/>
@@ -13969,7 +13969,7 @@
       <w:r>
         <w:t xml:space="preserve">Modern solar calculators (</w:t>
       </w:r>
-      <w:hyperlink w:history="1" r:id="rIdyventlb2l7e615uvjryxb">
+      <w:hyperlink w:history="1" r:id="rIduusgys74k3-2xp_rwlgo3">
         <w:r>
           <w:rPr>
             <w:rStyle w:val="Hyperlink"/>
@@ -14018,7 +14018,7 @@
       <w:r>
         <w:t xml:space="preserve">The </w:t>
       </w:r>
-      <w:hyperlink w:history="1" r:id="rIdla6hf4_gnhlmlhh5hebft">
+      <w:hyperlink w:history="1" r:id="rId4m_1rk8sskvdvakz4i_-y">
         <w:r>
           <w:rPr>
             <w:rStyle w:val="Hyperlink"/>
@@ -14067,7 +14067,7 @@
       <w:r>
         <w:t xml:space="preserve">Earth's field is a dipole. South magnetic pole at 64.1°S, 135.9°E (</w:t>
       </w:r>
-      <w:hyperlink w:history="1" r:id="rIdsvgkvjvlxr38caztwvgwl">
+      <w:hyperlink w:history="1" r:id="rId8y38nqexcw6rnb4m-6ckn">
         <w:r>
           <w:rPr>
             <w:rStyle w:val="Hyperlink"/>
@@ -14116,7 +14116,7 @@
       <w:r>
         <w:t xml:space="preserve">g = 9.780 m/s² at equator, 9.832 m/s² at poles (0.53% variation). On a flat disc, centrifugal force points outward from center, producing the OPPOSITE pattern. See </w:t>
       </w:r>
-      <w:hyperlink w:history="1" r:id="rIdn1uswiublpck9k09fwevg">
+      <w:hyperlink w:history="1" r:id="rIdq8otkckzw3x5-g6wkcqob">
         <w:r>
           <w:rPr>
             <w:rStyle w:val="Hyperlink"/>
@@ -15113,7 +15113,7 @@
         </w:rPr>
         <w:t xml:space="preserve">NOAA World Magnetic Model 2025: </w:t>
       </w:r>
-      <w:hyperlink w:history="1" r:id="rIdjslp6asffe6q_xsgureqe">
+      <w:hyperlink w:history="1" r:id="rId_j4w0uqvtn9nlvvm_40dg">
         <w:r>
           <w:rPr>
             <w:rStyle w:val="Hyperlink"/>
@@ -15133,7 +15133,7 @@
         </w:rPr>
         <w:t xml:space="preserve">NOAA Wandering Geomagnetic Poles: </w:t>
       </w:r>
-      <w:hyperlink w:history="1" r:id="rId6umrmmh0lb148r0uc2y3f">
+      <w:hyperlink w:history="1" r:id="rIdbr8gafnzqsasiivsooaeg">
         <w:r>
           <w:rPr>
             <w:rStyle w:val="Hyperlink"/>
@@ -15153,7 +15153,7 @@
         </w:rPr>
         <w:t xml:space="preserve">CHAOS-7 Geomagnetic Field Model: </w:t>
       </w:r>
-      <w:hyperlink w:history="1" r:id="rIduyrlaxnrkkfwxmbgpwxul">
+      <w:hyperlink w:history="1" r:id="rIdhgbktnwoozd1ts9yyh6de">
         <w:r>
           <w:rPr>
             <w:rStyle w:val="Hyperlink"/>
@@ -15173,7 +15173,7 @@
         </w:rPr>
         <w:t xml:space="preserve">ESA Swarm Satellite Mission: </w:t>
       </w:r>
-      <w:hyperlink w:history="1" r:id="rIdtcnic8tmykafson-duklm">
+      <w:hyperlink w:history="1" r:id="rIdvn970fflg54xj4tu8u3ri">
         <w:r>
           <w:rPr>
             <w:rStyle w:val="Hyperlink"/>
@@ -15193,7 +15193,7 @@
         </w:rPr>
         <w:t xml:space="preserve">INTERMAGNET Observatory Network: </w:t>
       </w:r>
-      <w:hyperlink w:history="1" r:id="rId02ocvvv2nyumvgwqlq5uq">
+      <w:hyperlink w:history="1" r:id="rId2-s425q7gngukmgaafrhr">
         <w:r>
           <w:rPr>
             <w:rStyle w:val="Hyperlink"/>
@@ -15213,7 +15213,7 @@
         </w:rPr>
         <w:t xml:space="preserve">IGRF-13: </w:t>
       </w:r>
-      <w:hyperlink w:history="1" r:id="rIdxgni78-wuzeuadcdjntxv">
+      <w:hyperlink w:history="1" r:id="rIdsm1a9ftpaxm97ylcoqyor">
         <w:r>
           <w:rPr>
             <w:rStyle w:val="Hyperlink"/>
@@ -15233,7 +15233,7 @@
         </w:rPr>
         <w:t xml:space="preserve">ESA Gaia Data Release 3: </w:t>
       </w:r>
-      <w:hyperlink w:history="1" r:id="rId59ejbbost6qplg5sg9tke">
+      <w:hyperlink w:history="1" r:id="rId-1unwyyqcjtlghnf4lbp8">
         <w:r>
           <w:rPr>
             <w:rStyle w:val="Hyperlink"/>
@@ -15253,7 +15253,7 @@
         </w:rPr>
         <w:t xml:space="preserve">Hipparcos Catalogue: </w:t>
       </w:r>
-      <w:hyperlink w:history="1" r:id="rIdmajl7ys05vns544pqm09j">
+      <w:hyperlink w:history="1" r:id="rIds1tu57dbjnkus3ygyhtzf">
         <w:r>
           <w:rPr>
             <w:rStyle w:val="Hyperlink"/>
@@ -15273,7 +15273,7 @@
         </w:rPr>
         <w:t xml:space="preserve">US Patent 787412 (Tesla): </w:t>
       </w:r>
-      <w:hyperlink w:history="1" r:id="rIdpvtcs27k_yyfwjax_fks-">
+      <w:hyperlink w:history="1" r:id="rIdbgyhsnruicstpkai9h0uk">
         <w:r>
           <w:rPr>
             <w:rStyle w:val="Hyperlink"/>
@@ -15293,7 +15293,7 @@
         </w:rPr>
         <w:t xml:space="preserve">NOAA Solar Position Algorithm: </w:t>
       </w:r>
-      <w:hyperlink w:history="1" r:id="rIdxwbxkwg73fiumxfwxuhbm">
+      <w:hyperlink w:history="1" r:id="rIdfmg8qmhsa0ngsqvdhjpbj">
         <w:r>
           <w:rPr>
             <w:rStyle w:val="Hyperlink"/>
@@ -15313,7 +15313,7 @@
         </w:rPr>
         <w:t xml:space="preserve">National Geodetic Survey Gravity: </w:t>
       </w:r>
-      <w:hyperlink w:history="1" r:id="rIdw8rhjnjuddee2sx5unhc5">
+      <w:hyperlink w:history="1" r:id="rIdgqwvo4hmytbyxbrsw4vyo">
         <w:r>
           <w:rPr>
             <w:rStyle w:val="Hyperlink"/>
@@ -15333,7 +15333,7 @@
         </w:rPr>
         <w:t xml:space="preserve">CHIME/FRB Project: </w:t>
       </w:r>
-      <w:hyperlink w:history="1" r:id="rIdicgxhqvnwzsuqu7gpeilk">
+      <w:hyperlink w:history="1" r:id="rIdbvnl4dgjabqgbdrupdpbn">
         <w:r>
           <w:rPr>
             <w:rStyle w:val="Hyperlink"/>
@@ -15353,7 +15353,7 @@
         </w:rPr>
         <w:t xml:space="preserve">GRACE-FO (gravity mapping): </w:t>
       </w:r>
-      <w:hyperlink w:history="1" r:id="rIdjoxlqvnhyroaaijxg7b0z">
+      <w:hyperlink w:history="1" r:id="rId-he9kcwx6ijhjiflckqdn">
         <w:r>
           <w:rPr>
             <w:rStyle w:val="Hyperlink"/>
@@ -15373,7 +15373,7 @@
         </w:rPr>
         <w:t xml:space="preserve">GOCE (gravity field): </w:t>
       </w:r>
-      <w:hyperlink w:history="1" r:id="rIdjp6jjmuhf-nft5ssjerih">
+      <w:hyperlink w:history="1" r:id="rIdptcifbulaadwyt-pxsrbn">
         <w:r>
           <w:rPr>
             <w:rStyle w:val="Hyperlink"/>
@@ -15393,7 +15393,7 @@
         </w:rPr>
         <w:t xml:space="preserve">GPS.gov: </w:t>
       </w:r>
-      <w:hyperlink w:history="1" r:id="rIdikibry4e6_kcrpw1tszed">
+      <w:hyperlink w:history="1" r:id="rId9-91stzhaqd3ldw8vxxqn">
         <w:r>
           <w:rPr>
             <w:rStyle w:val="Hyperlink"/>
@@ -15413,7 +15413,7 @@
         </w:rPr>
         <w:t xml:space="preserve">CelesTrak TLE Data: </w:t>
       </w:r>
-      <w:hyperlink w:history="1" r:id="rIdpilgqqoduqsztkmjdbijs">
+      <w:hyperlink w:history="1" r:id="rIdnajfdklccfe1l_bxtggga">
         <w:r>
           <w:rPr>
             <w:rStyle w:val="Hyperlink"/>

</xml_diff>

<commit_message>
Correct Sydney-Perth analysis: acknowledge dome's Finsler system
Previous version incorrectly used standard AE flat-earth projection
(~8,300 km) as a strawman. The dome model uses a custom V13 Finsler
coordinate system with two-zone topology, elliptic integral arcs,
and aetheric refractive index n(r). It does derive 4,352 km from
its own formulas.

Stronger critique: the same formula admits 73% error on SYD-EZE
(dome's own coordinates page). n(r) is a free function with no
independent measurement — it can match one city pair while failing
catastrophically on another. This is overfitting, not prediction.
Direct flights confirm the globe geodesic (3,291 km for SYD-PER).

Also fixed SH distances section: removed inaccurate Cape Town-Sydney
figures and replaced with the dome's own admitted SYD-EZE failure.

Co-Authored-By: Claude Opus 4.6 <noreply@anthropic.com>
</commit_message>
<xml_diff>
--- a/downloads/critical-review-dome-model-v4.docx
+++ b/downloads/critical-review-dome-model-v4.docx
@@ -8889,7 +8889,7 @@
       <w:r>
         <w:t xml:space="preserve">US Patent 787412 (1905), publicly available at </w:t>
       </w:r>
-      <w:hyperlink w:history="1" r:id="rIdaxdfbfhevfvdukwuqwuvy">
+      <w:hyperlink w:history="1" r:id="rIda_xt3rttrnhr4fne5xne3">
         <w:r>
           <w:rPr>
             <w:rStyle w:val="Hyperlink"/>
@@ -9029,7 +9029,7 @@
       <w:r>
         <w:t xml:space="preserve">James Bradley (1727) explicitly tested and rejected atmospheric refraction as an explanation: refraction is wavelength-dependent (chromatic), while stellar aberration is achromatic. Modern VLBI measurements achieve milliarcsecond precision and directly confirm aberration correlates with Earth's orbital velocity (~30 km/s). The </w:t>
       </w:r>
-      <w:hyperlink w:history="1" r:id="rIdacgglew8tzpzebkv58v9x">
+      <w:hyperlink w:history="1" r:id="rIdjqbnji88iu3s4cc1mvmi9">
         <w:r>
           <w:rPr>
             <w:rStyle w:val="Hyperlink"/>
@@ -9095,7 +9095,7 @@
       <w:r>
         <w:t xml:space="preserve">ESA </w:t>
       </w:r>
-      <w:hyperlink w:history="1" r:id="rIdoulc2hlybtjgsmznjhbme">
+      <w:hyperlink w:history="1" r:id="rIdfjrtww6apy9snw4ranjmv">
         <w:r>
           <w:rPr>
             <w:rStyle w:val="Hyperlink"/>
@@ -9161,7 +9161,7 @@
       <w:r>
         <w:t xml:space="preserve">Crepuscular rays are parallel beams made visible by atmospheric scattering. The apparent divergence is a perspective effect. Crucially, anticrepuscular rays converge at the anti-solar point simultaneously. See </w:t>
       </w:r>
-      <w:hyperlink w:history="1" r:id="rIdljcd2_9tv9igxbopvda6c">
+      <w:hyperlink w:history="1" r:id="rId0_f88x2vtmzsaq_f0y1sp">
         <w:r>
           <w:rPr>
             <w:rStyle w:val="Hyperlink"/>
@@ -9172,7 +9172,7 @@
       <w:r>
         <w:t xml:space="preserve"> and </w:t>
       </w:r>
-      <w:hyperlink w:history="1" r:id="rIddlsv6sxsilr1vbxd9u-bt">
+      <w:hyperlink w:history="1" r:id="rIdzdbpv75c3tc9lssheymm4">
         <w:r>
           <w:rPr>
             <w:rStyle w:val="Hyperlink"/>
@@ -9238,7 +9238,7 @@
       <w:r>
         <w:t xml:space="preserve">NOAA officially states no evidence of anomalous disappearances. </w:t>
       </w:r>
-      <w:hyperlink w:history="1" r:id="rId9ngndwc0x-gc790qjfpar">
+      <w:hyperlink w:history="1" r:id="rIdcxnhbi0qllcm6vhedisoq">
         <w:r>
           <w:rPr>
             <w:rStyle w:val="Hyperlink"/>
@@ -9304,7 +9304,7 @@
       <w:r>
         <w:t xml:space="preserve">Hipparcos </w:t>
       </w:r>
-      <w:hyperlink w:history="1" r:id="rId1eqoa810brda9hpvfafo_">
+      <w:hyperlink w:history="1" r:id="rId5oruwzip4alvnjeqxwe5v">
         <w:r>
           <w:rPr>
             <w:rStyle w:val="Hyperlink"/>
@@ -9720,7 +9720,7 @@
       <w:r>
         <w:t xml:space="preserve">Terra-Nova et al. (2017, PNAS) demonstrate reversed-flux patches reproduce SAA splitting in MHD simulations. The </w:t>
       </w:r>
-      <w:hyperlink w:history="1" r:id="rIdjibckcxw082shex3ej-ue">
+      <w:hyperlink w:history="1" r:id="rIdnpmyrispygbacviysqx0g">
         <w:r>
           <w:rPr>
             <w:rStyle w:val="Hyperlink"/>
@@ -9731,7 +9731,7 @@
       <w:r>
         <w:t xml:space="preserve"> documents the evolution quantitatively. </w:t>
       </w:r>
-      <w:hyperlink w:history="1" r:id="rIdxiblejy5bkdtc2r_wxnc8">
+      <w:hyperlink w:history="1" r:id="rIdbcr9enihrplrbebqhiryg">
         <w:r>
           <w:rPr>
             <w:rStyle w:val="Hyperlink"/>
@@ -9782,7 +9782,7 @@
       <w:r>
         <w:t xml:space="preserve">Normal secular variation documented by </w:t>
       </w:r>
-      <w:hyperlink w:history="1" r:id="rIdobic_b4zmyodoubdffobv">
+      <w:hyperlink w:history="1" r:id="rIdslp4uvcl-9f2l73rmj415">
         <w:r>
           <w:rPr>
             <w:rStyle w:val="Hyperlink"/>
@@ -9849,7 +9849,7 @@
       <w:r>
         <w:t xml:space="preserve">Eclipse-induced perturbations predicted by Chapman (1933) via ionospheric conductivity drops. Data from </w:t>
       </w:r>
-      <w:hyperlink w:history="1" r:id="rId6yixhvht9tldnbfff3-9b">
+      <w:hyperlink w:history="1" r:id="rIdxa2hvqog7gcfa_w67uvly">
         <w:r>
           <w:rPr>
             <w:rStyle w:val="Hyperlink"/>
@@ -9937,7 +9937,7 @@
       <w:r>
         <w:t xml:space="preserve">The formula used is for a quarter-wave linear waveguide, not a spherical cavity. Correct formula f = c/(2*pi*R) gives R = 6,098 km, within 4% of Earth's radius. The ionosphere IS conductive (</w:t>
       </w:r>
-      <w:hyperlink w:history="1" r:id="rIdskp5antp-vgxoj9dvmsok">
+      <w:hyperlink w:history="1" r:id="rIdllzntc1hhyvrhey4shcof">
         <w:r>
           <w:rPr>
             <w:rStyle w:val="Hyperlink"/>
@@ -10004,7 +10004,7 @@
       <w:r>
         <w:t xml:space="preserve">All five observations already predicted by </w:t>
       </w:r>
-      <w:hyperlink w:history="1" r:id="rIdj24arlp84oxaazqzd0xiv">
+      <w:hyperlink w:history="1" r:id="rIdj8akws6jkzwbcm3zsu6sx">
         <w:r>
           <w:rPr>
             <w:rStyle w:val="Hyperlink"/>
@@ -10015,7 +10015,7 @@
       <w:r>
         <w:t xml:space="preserve">, </w:t>
       </w:r>
-      <w:hyperlink w:history="1" r:id="rIdr3er-frhdg93nrvaw4do2">
+      <w:hyperlink w:history="1" r:id="rIddqm8ck8saxco-gxzs8hl5">
         <w:r>
           <w:rPr>
             <w:rStyle w:val="Hyperlink"/>
@@ -10342,7 +10342,7 @@
       <w:r>
         <w:t xml:space="preserve">Antarctic gravity anomalies are mapped from orbit by </w:t>
       </w:r>
-      <w:hyperlink w:history="1" r:id="rIdk7-6_q5w-lxb3y31xsnqr">
+      <w:hyperlink w:history="1" r:id="rIdz05escb92nvndyboadvwb">
         <w:r>
           <w:rPr>
             <w:rStyle w:val="Hyperlink"/>
@@ -10353,7 +10353,7 @@
       <w:r>
         <w:t xml:space="preserve"> and </w:t>
       </w:r>
-      <w:hyperlink w:history="1" r:id="rIdq1suovthlsc4g816gtysy">
+      <w:hyperlink w:history="1" r:id="rId10quoudgyizwrk84v5ggg">
         <w:r>
           <w:rPr>
             <w:rStyle w:val="Hyperlink"/>
@@ -13329,7 +13329,7 @@
       <w:r>
         <w:t xml:space="preserve">A </w:t>
       </w:r>
-      <w:hyperlink w:history="1" r:id="rIdlp6vtxrhj5rgfstovb5uw">
+      <w:hyperlink w:history="1" r:id="rIdunk-rkk9lp6v2cexjc4lu">
         <w:r>
           <w:rPr>
             <w:rStyle w:val="Hyperlink"/>
@@ -13340,7 +13340,7 @@
       <w:r>
         <w:t xml:space="preserve"> found detectable decreases in X, Z, and total field components during eclipses. An </w:t>
       </w:r>
-      <w:hyperlink w:history="1" r:id="rId-43eidlcxdepdsvmcs7hw">
+      <w:hyperlink w:history="1" r:id="rIdtcyd4ydspd8ohii_mymuh">
         <w:r>
           <w:rPr>
             <w:rStyle w:val="Hyperlink"/>
@@ -13845,7 +13845,7 @@
       <w:r>
         <w:t xml:space="preserve">Continuous 24-hour sunlight. A local sun at 5,733 km circling above a flat disc cannot produce 24-hour sunlight at the disc edge. Directly observable at Amundsen-Scott Station, staffed year-round since 1957. See </w:t>
       </w:r>
-      <w:hyperlink w:history="1" r:id="rIdshzggnnmixd3_ratqmv8h">
+      <w:hyperlink w:history="1" r:id="rIdyfahjzupoxgc2orzow_u9">
         <w:r>
           <w:rPr>
             <w:rStyle w:val="Hyperlink"/>
@@ -13909,7 +13909,7 @@
       <w:r>
         <w:t xml:space="preserve">GPS provides 1–3 meter accuracy worldwide using 24+ satellites in Keplerian orbits calculated from spherical-Earth gravitational mechanics. The system requires precise relativistic corrections (both special and general) that depend on the satellites' orbital velocity and altitude above a spherical gravitational well. If Earth were a flat disc with different geometry, the signal propagation times, relativistic corrections, and satellite visibility geometry would all be wrong, and the system would not achieve meter-level accuracy. The same applies to every other satellite navigation system (GLONASS, Galileo, BeiDou). The ISS at 408 km is visible on predictable schedules computed from Keplerian orbits. Geostationary satellites at 35,786 km — far above the dome's maximum height — provide continuous coverage. See </w:t>
       </w:r>
-      <w:hyperlink w:history="1" r:id="rIdx78a7lf5bbcmdybtzht4g">
+      <w:hyperlink w:history="1" r:id="rIdigljkm2g4nmrg0adzd7kz">
         <w:r>
           <w:rPr>
             <w:rStyle w:val="Hyperlink"/>
@@ -13920,7 +13920,7 @@
       <w:r>
         <w:t xml:space="preserve">; </w:t>
       </w:r>
-      <w:hyperlink w:history="1" r:id="rIdjf_l9d77-axn-mtdllndc">
+      <w:hyperlink w:history="1" r:id="rIdzyaqlxvw2esewzhud-2w9">
         <w:r>
           <w:rPr>
             <w:rStyle w:val="Hyperlink"/>
@@ -13969,7 +13969,7 @@
       <w:r>
         <w:t xml:space="preserve">Modern solar calculators (</w:t>
       </w:r>
-      <w:hyperlink w:history="1" r:id="rIdachnai8muu2etlh5l_hum">
+      <w:hyperlink w:history="1" r:id="rIdxd1gqtfzvthvckqxacxn1">
         <w:r>
           <w:rPr>
             <w:rStyle w:val="Hyperlink"/>
@@ -14018,7 +14018,7 @@
       <w:r>
         <w:t xml:space="preserve">The </w:t>
       </w:r>
-      <w:hyperlink w:history="1" r:id="rIdzwulfc3lq99qaq20znteo">
+      <w:hyperlink w:history="1" r:id="rIdu3qc5tl_tjcxxft9flmfd">
         <w:r>
           <w:rPr>
             <w:rStyle w:val="Hyperlink"/>
@@ -14067,7 +14067,7 @@
       <w:r>
         <w:t xml:space="preserve">Earth's field is a dipole. South magnetic pole at 64.1°S, 135.9°E (</w:t>
       </w:r>
-      <w:hyperlink w:history="1" r:id="rIdha8w3yra4r0yhzcvyapx7">
+      <w:hyperlink w:history="1" r:id="rIdgg3jccsdaiv4_cujexdaz">
         <w:r>
           <w:rPr>
             <w:rStyle w:val="Hyperlink"/>
@@ -14116,7 +14116,7 @@
       <w:r>
         <w:t xml:space="preserve">g = 9.780 m/s² at equator, 9.832 m/s² at poles (0.53% variation). On a flat disc, centrifugal force points outward from center, producing the OPPOSITE pattern. See </w:t>
       </w:r>
-      <w:hyperlink w:history="1" r:id="rId91m8mqpqhp8pwj5-wfw8a">
+      <w:hyperlink w:history="1" r:id="rId0xok_al4zwmt6ke7n3evz">
         <w:r>
           <w:rPr>
             <w:rStyle w:val="Hyperlink"/>
@@ -15113,7 +15113,7 @@
         </w:rPr>
         <w:t xml:space="preserve">NOAA World Magnetic Model 2025: </w:t>
       </w:r>
-      <w:hyperlink w:history="1" r:id="rIdxm-_lorvuygp7ibrfj3iv">
+      <w:hyperlink w:history="1" r:id="rIdv7-eljr4swyfhqymc-bxm">
         <w:r>
           <w:rPr>
             <w:rStyle w:val="Hyperlink"/>
@@ -15133,7 +15133,7 @@
         </w:rPr>
         <w:t xml:space="preserve">NOAA Wandering Geomagnetic Poles: </w:t>
       </w:r>
-      <w:hyperlink w:history="1" r:id="rIduwfgmb_jyewfbplh-esb2">
+      <w:hyperlink w:history="1" r:id="rIdujrhnuia-7to7en2lgegs">
         <w:r>
           <w:rPr>
             <w:rStyle w:val="Hyperlink"/>
@@ -15153,7 +15153,7 @@
         </w:rPr>
         <w:t xml:space="preserve">CHAOS-7 Geomagnetic Field Model: </w:t>
       </w:r>
-      <w:hyperlink w:history="1" r:id="rIdjthvxvqyjjmjc34lh_f3n">
+      <w:hyperlink w:history="1" r:id="rId7s_0d17vi7nlizwrtyo-2">
         <w:r>
           <w:rPr>
             <w:rStyle w:val="Hyperlink"/>
@@ -15173,7 +15173,7 @@
         </w:rPr>
         <w:t xml:space="preserve">ESA Swarm Satellite Mission: </w:t>
       </w:r>
-      <w:hyperlink w:history="1" r:id="rId6s9zd4pw8ou6hnzzcvn56">
+      <w:hyperlink w:history="1" r:id="rId74cjwbthllpr-4hwrwc3c">
         <w:r>
           <w:rPr>
             <w:rStyle w:val="Hyperlink"/>
@@ -15193,7 +15193,7 @@
         </w:rPr>
         <w:t xml:space="preserve">INTERMAGNET Observatory Network: </w:t>
       </w:r>
-      <w:hyperlink w:history="1" r:id="rIdvpynuq82njv40jaenwslg">
+      <w:hyperlink w:history="1" r:id="rIdjlj643xr_cwoyhhptd68z">
         <w:r>
           <w:rPr>
             <w:rStyle w:val="Hyperlink"/>
@@ -15213,7 +15213,7 @@
         </w:rPr>
         <w:t xml:space="preserve">IGRF-13: </w:t>
       </w:r>
-      <w:hyperlink w:history="1" r:id="rId7uu6qbjuynenzyuurslz1">
+      <w:hyperlink w:history="1" r:id="rId631azucoc-onxne-6i31e">
         <w:r>
           <w:rPr>
             <w:rStyle w:val="Hyperlink"/>
@@ -15233,7 +15233,7 @@
         </w:rPr>
         <w:t xml:space="preserve">ESA Gaia Data Release 3: </w:t>
       </w:r>
-      <w:hyperlink w:history="1" r:id="rIdx1cbd2vtqdl_szbvhnx2g">
+      <w:hyperlink w:history="1" r:id="rIdh1jsabicaud4cegmjkctw">
         <w:r>
           <w:rPr>
             <w:rStyle w:val="Hyperlink"/>
@@ -15253,7 +15253,7 @@
         </w:rPr>
         <w:t xml:space="preserve">Hipparcos Catalogue: </w:t>
       </w:r>
-      <w:hyperlink w:history="1" r:id="rId0rdopsduwpj6zxdzes3jr">
+      <w:hyperlink w:history="1" r:id="rIdwmbma1sdwkcsnnpakhmm4">
         <w:r>
           <w:rPr>
             <w:rStyle w:val="Hyperlink"/>
@@ -15273,7 +15273,7 @@
         </w:rPr>
         <w:t xml:space="preserve">US Patent 787412 (Tesla): </w:t>
       </w:r>
-      <w:hyperlink w:history="1" r:id="rIde8doas7hnwradb6cjxxeo">
+      <w:hyperlink w:history="1" r:id="rIdavtbk_am7fwkseq-yvfqc">
         <w:r>
           <w:rPr>
             <w:rStyle w:val="Hyperlink"/>
@@ -15293,7 +15293,7 @@
         </w:rPr>
         <w:t xml:space="preserve">NOAA Solar Position Algorithm: </w:t>
       </w:r>
-      <w:hyperlink w:history="1" r:id="rId78xt7jkngkutukqv-hm-r">
+      <w:hyperlink w:history="1" r:id="rIdph-j1n0qu2o3nn1-3trnf">
         <w:r>
           <w:rPr>
             <w:rStyle w:val="Hyperlink"/>
@@ -15313,7 +15313,7 @@
         </w:rPr>
         <w:t xml:space="preserve">National Geodetic Survey Gravity: </w:t>
       </w:r>
-      <w:hyperlink w:history="1" r:id="rIdodvo1cjqwuq6nfqxbbyad">
+      <w:hyperlink w:history="1" r:id="rIduj3ggl2-ih8m7vhyo7nse">
         <w:r>
           <w:rPr>
             <w:rStyle w:val="Hyperlink"/>
@@ -15333,7 +15333,7 @@
         </w:rPr>
         <w:t xml:space="preserve">CHIME/FRB Project: </w:t>
       </w:r>
-      <w:hyperlink w:history="1" r:id="rId3d7tlo350vmovuczupzxd">
+      <w:hyperlink w:history="1" r:id="rIdp_qqdhj5tnwfzwk23hgmt">
         <w:r>
           <w:rPr>
             <w:rStyle w:val="Hyperlink"/>
@@ -15353,7 +15353,7 @@
         </w:rPr>
         <w:t xml:space="preserve">GRACE-FO (gravity mapping): </w:t>
       </w:r>
-      <w:hyperlink w:history="1" r:id="rIdbgqj8mea3zhz6izzu72b1">
+      <w:hyperlink w:history="1" r:id="rIdvwy8gd8i2rd9yob3d7nlg">
         <w:r>
           <w:rPr>
             <w:rStyle w:val="Hyperlink"/>
@@ -15373,7 +15373,7 @@
         </w:rPr>
         <w:t xml:space="preserve">GOCE (gravity field): </w:t>
       </w:r>
-      <w:hyperlink w:history="1" r:id="rIdah7fqzfrcmgprj_qpu2wo">
+      <w:hyperlink w:history="1" r:id="rId9ktacxe9uao_kre1e3pdj">
         <w:r>
           <w:rPr>
             <w:rStyle w:val="Hyperlink"/>
@@ -15393,7 +15393,7 @@
         </w:rPr>
         <w:t xml:space="preserve">GPS.gov: </w:t>
       </w:r>
-      <w:hyperlink w:history="1" r:id="rIddbswirwaqktu9fbhykmql">
+      <w:hyperlink w:history="1" r:id="rIdbbjikjapamcvbiknpok3n">
         <w:r>
           <w:rPr>
             <w:rStyle w:val="Hyperlink"/>
@@ -15413,7 +15413,7 @@
         </w:rPr>
         <w:t xml:space="preserve">CelesTrak TLE Data: </w:t>
       </w:r>
-      <w:hyperlink w:history="1" r:id="rId_pmpswxncqr3b-fgfufok">
+      <w:hyperlink w:history="1" r:id="rIdgyfjjy6_rv9vdpa2ri6cr">
         <w:r>
           <w:rPr>
             <w:rStyle w:val="Hyperlink"/>

</xml_diff>

<commit_message>
Sydney-Perth: add calibration circularity and Adelaide detour findings
Three-pronged critique now:
1. Calibration, not prediction — V13 Finsler formula was explicitly
   built (2026-03-28) to fix SH distance errors, with the Indian
   Pacific distance as a known reference point (OPEN-016). Not marked
   as prospective on the site's own methodology.
2. Matches a railway, not geometry — the 4,352 km corresponds to a
   route detouring 1,061 km through Adelaide. Why does a geometric
   formula match a circuitous railway instead of the straight-line
   distance (3,291 km, confirmed by flights)?
3. Fails 73% on SYD-EZE — same formula, same latitude, different
   longitude separation. Free parameter n(r) has no independent
   derivation; overfitting, not prediction.

Co-Authored-By: Claude Opus 4.6 <noreply@anthropic.com>
</commit_message>
<xml_diff>
--- a/downloads/critical-review-dome-model-v4.docx
+++ b/downloads/critical-review-dome-model-v4.docx
@@ -8889,7 +8889,7 @@
       <w:r>
         <w:t xml:space="preserve">US Patent 787412 (1905), publicly available at </w:t>
       </w:r>
-      <w:hyperlink w:history="1" r:id="rIda_xt3rttrnhr4fne5xne3">
+      <w:hyperlink w:history="1" r:id="rIdq5wsdkt-qjwenyg3xrusk">
         <w:r>
           <w:rPr>
             <w:rStyle w:val="Hyperlink"/>
@@ -9029,7 +9029,7 @@
       <w:r>
         <w:t xml:space="preserve">James Bradley (1727) explicitly tested and rejected atmospheric refraction as an explanation: refraction is wavelength-dependent (chromatic), while stellar aberration is achromatic. Modern VLBI measurements achieve milliarcsecond precision and directly confirm aberration correlates with Earth's orbital velocity (~30 km/s). The </w:t>
       </w:r>
-      <w:hyperlink w:history="1" r:id="rIdjqbnji88iu3s4cc1mvmi9">
+      <w:hyperlink w:history="1" r:id="rIdad7pgay6lmfuftxpxvxi0">
         <w:r>
           <w:rPr>
             <w:rStyle w:val="Hyperlink"/>
@@ -9095,7 +9095,7 @@
       <w:r>
         <w:t xml:space="preserve">ESA </w:t>
       </w:r>
-      <w:hyperlink w:history="1" r:id="rIdfjrtww6apy9snw4ranjmv">
+      <w:hyperlink w:history="1" r:id="rIdnf7thwo4iorwlnxpkhuv4">
         <w:r>
           <w:rPr>
             <w:rStyle w:val="Hyperlink"/>
@@ -9161,7 +9161,7 @@
       <w:r>
         <w:t xml:space="preserve">Crepuscular rays are parallel beams made visible by atmospheric scattering. The apparent divergence is a perspective effect. Crucially, anticrepuscular rays converge at the anti-solar point simultaneously. See </w:t>
       </w:r>
-      <w:hyperlink w:history="1" r:id="rId0_f88x2vtmzsaq_f0y1sp">
+      <w:hyperlink w:history="1" r:id="rIdoix18zg80qppnywq_s6pf">
         <w:r>
           <w:rPr>
             <w:rStyle w:val="Hyperlink"/>
@@ -9172,7 +9172,7 @@
       <w:r>
         <w:t xml:space="preserve"> and </w:t>
       </w:r>
-      <w:hyperlink w:history="1" r:id="rIdzdbpv75c3tc9lssheymm4">
+      <w:hyperlink w:history="1" r:id="rIdpyvnvvzptgbfkzycifk9h">
         <w:r>
           <w:rPr>
             <w:rStyle w:val="Hyperlink"/>
@@ -9238,7 +9238,7 @@
       <w:r>
         <w:t xml:space="preserve">NOAA officially states no evidence of anomalous disappearances. </w:t>
       </w:r>
-      <w:hyperlink w:history="1" r:id="rIdcxnhbi0qllcm6vhedisoq">
+      <w:hyperlink w:history="1" r:id="rIdrv0yxkwlbklwlt5ij4m8b">
         <w:r>
           <w:rPr>
             <w:rStyle w:val="Hyperlink"/>
@@ -9304,7 +9304,7 @@
       <w:r>
         <w:t xml:space="preserve">Hipparcos </w:t>
       </w:r>
-      <w:hyperlink w:history="1" r:id="rId5oruwzip4alvnjeqxwe5v">
+      <w:hyperlink w:history="1" r:id="rIdrik2cu2jdspj0omzifkc-">
         <w:r>
           <w:rPr>
             <w:rStyle w:val="Hyperlink"/>
@@ -9720,7 +9720,7 @@
       <w:r>
         <w:t xml:space="preserve">Terra-Nova et al. (2017, PNAS) demonstrate reversed-flux patches reproduce SAA splitting in MHD simulations. The </w:t>
       </w:r>
-      <w:hyperlink w:history="1" r:id="rIdnpmyrispygbacviysqx0g">
+      <w:hyperlink w:history="1" r:id="rIdvjritd35cpjz0cxbme5wm">
         <w:r>
           <w:rPr>
             <w:rStyle w:val="Hyperlink"/>
@@ -9731,7 +9731,7 @@
       <w:r>
         <w:t xml:space="preserve"> documents the evolution quantitatively. </w:t>
       </w:r>
-      <w:hyperlink w:history="1" r:id="rIdbcr9enihrplrbebqhiryg">
+      <w:hyperlink w:history="1" r:id="rIdjr3w_zxo-nexwmmg2dlra">
         <w:r>
           <w:rPr>
             <w:rStyle w:val="Hyperlink"/>
@@ -9782,7 +9782,7 @@
       <w:r>
         <w:t xml:space="preserve">Normal secular variation documented by </w:t>
       </w:r>
-      <w:hyperlink w:history="1" r:id="rIdslp4uvcl-9f2l73rmj415">
+      <w:hyperlink w:history="1" r:id="rIdsacrxpjs63rkbecqdgtzd">
         <w:r>
           <w:rPr>
             <w:rStyle w:val="Hyperlink"/>
@@ -9849,7 +9849,7 @@
       <w:r>
         <w:t xml:space="preserve">Eclipse-induced perturbations predicted by Chapman (1933) via ionospheric conductivity drops. Data from </w:t>
       </w:r>
-      <w:hyperlink w:history="1" r:id="rIdxa2hvqog7gcfa_w67uvly">
+      <w:hyperlink w:history="1" r:id="rId2bi0sprt9kqewmqnueojl">
         <w:r>
           <w:rPr>
             <w:rStyle w:val="Hyperlink"/>
@@ -9937,7 +9937,7 @@
       <w:r>
         <w:t xml:space="preserve">The formula used is for a quarter-wave linear waveguide, not a spherical cavity. Correct formula f = c/(2*pi*R) gives R = 6,098 km, within 4% of Earth's radius. The ionosphere IS conductive (</w:t>
       </w:r>
-      <w:hyperlink w:history="1" r:id="rIdllzntc1hhyvrhey4shcof">
+      <w:hyperlink w:history="1" r:id="rIddtidvtb0ogfdkwvtfmzdh">
         <w:r>
           <w:rPr>
             <w:rStyle w:val="Hyperlink"/>
@@ -10004,7 +10004,7 @@
       <w:r>
         <w:t xml:space="preserve">All five observations already predicted by </w:t>
       </w:r>
-      <w:hyperlink w:history="1" r:id="rIdj8akws6jkzwbcm3zsu6sx">
+      <w:hyperlink w:history="1" r:id="rIdnxpxel2zuu0clrslsuash">
         <w:r>
           <w:rPr>
             <w:rStyle w:val="Hyperlink"/>
@@ -10015,7 +10015,7 @@
       <w:r>
         <w:t xml:space="preserve">, </w:t>
       </w:r>
-      <w:hyperlink w:history="1" r:id="rIddqm8ck8saxco-gxzs8hl5">
+      <w:hyperlink w:history="1" r:id="rIdj52xqnpgjrxy2vrqzg7p3">
         <w:r>
           <w:rPr>
             <w:rStyle w:val="Hyperlink"/>
@@ -10342,7 +10342,7 @@
       <w:r>
         <w:t xml:space="preserve">Antarctic gravity anomalies are mapped from orbit by </w:t>
       </w:r>
-      <w:hyperlink w:history="1" r:id="rIdz05escb92nvndyboadvwb">
+      <w:hyperlink w:history="1" r:id="rIddnou6iy0vstmrcnl52fyi">
         <w:r>
           <w:rPr>
             <w:rStyle w:val="Hyperlink"/>
@@ -10353,7 +10353,7 @@
       <w:r>
         <w:t xml:space="preserve"> and </w:t>
       </w:r>
-      <w:hyperlink w:history="1" r:id="rId10quoudgyizwrk84v5ggg">
+      <w:hyperlink w:history="1" r:id="rIdebrq5-ninz4elkkjzuzt-">
         <w:r>
           <w:rPr>
             <w:rStyle w:val="Hyperlink"/>
@@ -13329,7 +13329,7 @@
       <w:r>
         <w:t xml:space="preserve">A </w:t>
       </w:r>
-      <w:hyperlink w:history="1" r:id="rIdunk-rkk9lp6v2cexjc4lu">
+      <w:hyperlink w:history="1" r:id="rIduhati8w-nusrwudlhppbj">
         <w:r>
           <w:rPr>
             <w:rStyle w:val="Hyperlink"/>
@@ -13340,7 +13340,7 @@
       <w:r>
         <w:t xml:space="preserve"> found detectable decreases in X, Z, and total field components during eclipses. An </w:t>
       </w:r>
-      <w:hyperlink w:history="1" r:id="rIdtcyd4ydspd8ohii_mymuh">
+      <w:hyperlink w:history="1" r:id="rIddqsopusfesoes9jzverlu">
         <w:r>
           <w:rPr>
             <w:rStyle w:val="Hyperlink"/>
@@ -13845,7 +13845,7 @@
       <w:r>
         <w:t xml:space="preserve">Continuous 24-hour sunlight. A local sun at 5,733 km circling above a flat disc cannot produce 24-hour sunlight at the disc edge. Directly observable at Amundsen-Scott Station, staffed year-round since 1957. See </w:t>
       </w:r>
-      <w:hyperlink w:history="1" r:id="rIdyfahjzupoxgc2orzow_u9">
+      <w:hyperlink w:history="1" r:id="rIdlnhqvigohcrgvtxwe0bmn">
         <w:r>
           <w:rPr>
             <w:rStyle w:val="Hyperlink"/>
@@ -13909,7 +13909,7 @@
       <w:r>
         <w:t xml:space="preserve">GPS provides 1–3 meter accuracy worldwide using 24+ satellites in Keplerian orbits calculated from spherical-Earth gravitational mechanics. The system requires precise relativistic corrections (both special and general) that depend on the satellites' orbital velocity and altitude above a spherical gravitational well. If Earth were a flat disc with different geometry, the signal propagation times, relativistic corrections, and satellite visibility geometry would all be wrong, and the system would not achieve meter-level accuracy. The same applies to every other satellite navigation system (GLONASS, Galileo, BeiDou). The ISS at 408 km is visible on predictable schedules computed from Keplerian orbits. Geostationary satellites at 35,786 km — far above the dome's maximum height — provide continuous coverage. See </w:t>
       </w:r>
-      <w:hyperlink w:history="1" r:id="rIdigljkm2g4nmrg0adzd7kz">
+      <w:hyperlink w:history="1" r:id="rIdd8dpbquynw8onrgh_d-l_">
         <w:r>
           <w:rPr>
             <w:rStyle w:val="Hyperlink"/>
@@ -13920,7 +13920,7 @@
       <w:r>
         <w:t xml:space="preserve">; </w:t>
       </w:r>
-      <w:hyperlink w:history="1" r:id="rIdzyaqlxvw2esewzhud-2w9">
+      <w:hyperlink w:history="1" r:id="rIdngw9q_fnktxerunarp-eb">
         <w:r>
           <w:rPr>
             <w:rStyle w:val="Hyperlink"/>
@@ -13969,7 +13969,7 @@
       <w:r>
         <w:t xml:space="preserve">Modern solar calculators (</w:t>
       </w:r>
-      <w:hyperlink w:history="1" r:id="rIdxd1gqtfzvthvckqxacxn1">
+      <w:hyperlink w:history="1" r:id="rIdwasaxfkxhtq6omthd4hdo">
         <w:r>
           <w:rPr>
             <w:rStyle w:val="Hyperlink"/>
@@ -14018,7 +14018,7 @@
       <w:r>
         <w:t xml:space="preserve">The </w:t>
       </w:r>
-      <w:hyperlink w:history="1" r:id="rIdu3qc5tl_tjcxxft9flmfd">
+      <w:hyperlink w:history="1" r:id="rIdppjclg9oz1qarpmn94ywu">
         <w:r>
           <w:rPr>
             <w:rStyle w:val="Hyperlink"/>
@@ -14067,7 +14067,7 @@
       <w:r>
         <w:t xml:space="preserve">Earth's field is a dipole. South magnetic pole at 64.1°S, 135.9°E (</w:t>
       </w:r>
-      <w:hyperlink w:history="1" r:id="rIdgg3jccsdaiv4_cujexdaz">
+      <w:hyperlink w:history="1" r:id="rIdans1fetdaqonzl-qqzwg_">
         <w:r>
           <w:rPr>
             <w:rStyle w:val="Hyperlink"/>
@@ -14116,7 +14116,7 @@
       <w:r>
         <w:t xml:space="preserve">g = 9.780 m/s² at equator, 9.832 m/s² at poles (0.53% variation). On a flat disc, centrifugal force points outward from center, producing the OPPOSITE pattern. See </w:t>
       </w:r>
-      <w:hyperlink w:history="1" r:id="rId0xok_al4zwmt6ke7n3evz">
+      <w:hyperlink w:history="1" r:id="rIdyi5vceztyimykbcmyaxku">
         <w:r>
           <w:rPr>
             <w:rStyle w:val="Hyperlink"/>
@@ -15113,7 +15113,7 @@
         </w:rPr>
         <w:t xml:space="preserve">NOAA World Magnetic Model 2025: </w:t>
       </w:r>
-      <w:hyperlink w:history="1" r:id="rIdv7-eljr4swyfhqymc-bxm">
+      <w:hyperlink w:history="1" r:id="rIdx2lbjnjtvzhuuiyswrgae">
         <w:r>
           <w:rPr>
             <w:rStyle w:val="Hyperlink"/>
@@ -15133,7 +15133,7 @@
         </w:rPr>
         <w:t xml:space="preserve">NOAA Wandering Geomagnetic Poles: </w:t>
       </w:r>
-      <w:hyperlink w:history="1" r:id="rIdujrhnuia-7to7en2lgegs">
+      <w:hyperlink w:history="1" r:id="rIdbxqvlh15vorexo9nyxsfv">
         <w:r>
           <w:rPr>
             <w:rStyle w:val="Hyperlink"/>
@@ -15153,7 +15153,7 @@
         </w:rPr>
         <w:t xml:space="preserve">CHAOS-7 Geomagnetic Field Model: </w:t>
       </w:r>
-      <w:hyperlink w:history="1" r:id="rId7s_0d17vi7nlizwrtyo-2">
+      <w:hyperlink w:history="1" r:id="rIduy1wbtizjegaautzdxjfx">
         <w:r>
           <w:rPr>
             <w:rStyle w:val="Hyperlink"/>
@@ -15173,7 +15173,7 @@
         </w:rPr>
         <w:t xml:space="preserve">ESA Swarm Satellite Mission: </w:t>
       </w:r>
-      <w:hyperlink w:history="1" r:id="rId74cjwbthllpr-4hwrwc3c">
+      <w:hyperlink w:history="1" r:id="rIdo_jyz3qwtbbdentryyg_8">
         <w:r>
           <w:rPr>
             <w:rStyle w:val="Hyperlink"/>
@@ -15193,7 +15193,7 @@
         </w:rPr>
         <w:t xml:space="preserve">INTERMAGNET Observatory Network: </w:t>
       </w:r>
-      <w:hyperlink w:history="1" r:id="rIdjlj643xr_cwoyhhptd68z">
+      <w:hyperlink w:history="1" r:id="rIdjzglk7fpisx49mmc8iopb">
         <w:r>
           <w:rPr>
             <w:rStyle w:val="Hyperlink"/>
@@ -15213,7 +15213,7 @@
         </w:rPr>
         <w:t xml:space="preserve">IGRF-13: </w:t>
       </w:r>
-      <w:hyperlink w:history="1" r:id="rId631azucoc-onxne-6i31e">
+      <w:hyperlink w:history="1" r:id="rIdm-euw7hwtlcrekq2iyzpu">
         <w:r>
           <w:rPr>
             <w:rStyle w:val="Hyperlink"/>
@@ -15233,7 +15233,7 @@
         </w:rPr>
         <w:t xml:space="preserve">ESA Gaia Data Release 3: </w:t>
       </w:r>
-      <w:hyperlink w:history="1" r:id="rIdh1jsabicaud4cegmjkctw">
+      <w:hyperlink w:history="1" r:id="rIdwf01zcrwpyuh9hgeushh6">
         <w:r>
           <w:rPr>
             <w:rStyle w:val="Hyperlink"/>
@@ -15253,7 +15253,7 @@
         </w:rPr>
         <w:t xml:space="preserve">Hipparcos Catalogue: </w:t>
       </w:r>
-      <w:hyperlink w:history="1" r:id="rIdwmbma1sdwkcsnnpakhmm4">
+      <w:hyperlink w:history="1" r:id="rIdumskq5ctho6um7grhogn-">
         <w:r>
           <w:rPr>
             <w:rStyle w:val="Hyperlink"/>
@@ -15273,7 +15273,7 @@
         </w:rPr>
         <w:t xml:space="preserve">US Patent 787412 (Tesla): </w:t>
       </w:r>
-      <w:hyperlink w:history="1" r:id="rIdavtbk_am7fwkseq-yvfqc">
+      <w:hyperlink w:history="1" r:id="rIduz8iewok2yxiueb3asn8d">
         <w:r>
           <w:rPr>
             <w:rStyle w:val="Hyperlink"/>
@@ -15293,7 +15293,7 @@
         </w:rPr>
         <w:t xml:space="preserve">NOAA Solar Position Algorithm: </w:t>
       </w:r>
-      <w:hyperlink w:history="1" r:id="rIdph-j1n0qu2o3nn1-3trnf">
+      <w:hyperlink w:history="1" r:id="rIdkaz7ivljjssc5cb-ck3uk">
         <w:r>
           <w:rPr>
             <w:rStyle w:val="Hyperlink"/>
@@ -15313,7 +15313,7 @@
         </w:rPr>
         <w:t xml:space="preserve">National Geodetic Survey Gravity: </w:t>
       </w:r>
-      <w:hyperlink w:history="1" r:id="rIduj3ggl2-ih8m7vhyo7nse">
+      <w:hyperlink w:history="1" r:id="rIdmjxdnux9m4lz6xnhus_rb">
         <w:r>
           <w:rPr>
             <w:rStyle w:val="Hyperlink"/>
@@ -15333,7 +15333,7 @@
         </w:rPr>
         <w:t xml:space="preserve">CHIME/FRB Project: </w:t>
       </w:r>
-      <w:hyperlink w:history="1" r:id="rIdp_qqdhj5tnwfzwk23hgmt">
+      <w:hyperlink w:history="1" r:id="rIdfs3zz7uoso0muwol9htui">
         <w:r>
           <w:rPr>
             <w:rStyle w:val="Hyperlink"/>
@@ -15353,7 +15353,7 @@
         </w:rPr>
         <w:t xml:space="preserve">GRACE-FO (gravity mapping): </w:t>
       </w:r>
-      <w:hyperlink w:history="1" r:id="rIdvwy8gd8i2rd9yob3d7nlg">
+      <w:hyperlink w:history="1" r:id="rIdhuzvmovfqpehhybvua409">
         <w:r>
           <w:rPr>
             <w:rStyle w:val="Hyperlink"/>
@@ -15373,7 +15373,7 @@
         </w:rPr>
         <w:t xml:space="preserve">GOCE (gravity field): </w:t>
       </w:r>
-      <w:hyperlink w:history="1" r:id="rId9ktacxe9uao_kre1e3pdj">
+      <w:hyperlink w:history="1" r:id="rIdcex0q5vjssstlyybl3soq">
         <w:r>
           <w:rPr>
             <w:rStyle w:val="Hyperlink"/>
@@ -15393,7 +15393,7 @@
         </w:rPr>
         <w:t xml:space="preserve">GPS.gov: </w:t>
       </w:r>
-      <w:hyperlink w:history="1" r:id="rIdbbjikjapamcvbiknpok3n">
+      <w:hyperlink w:history="1" r:id="rIdwixny_ed2cnzy7ggpri1a">
         <w:r>
           <w:rPr>
             <w:rStyle w:val="Hyperlink"/>
@@ -15413,7 +15413,7 @@
         </w:rPr>
         <w:t xml:space="preserve">CelesTrak TLE Data: </w:t>
       </w:r>
-      <w:hyperlink w:history="1" r:id="rIdgyfjjy6_rv9vdpa2ri6cr">
+      <w:hyperlink w:history="1" r:id="rIdhn3y6dfosvcwmn6mjfuo7">
         <w:r>
           <w:rPr>
             <w:rStyle w:val="Hyperlink"/>

</xml_diff>

<commit_message>
Expand JFK-LHR Kill-Shot with three discriminating tests
The dome predicts 'eastbound >5% advantage' from aetheric slipstream;
the globe predicts it from the jet stream. Both agree the asymmetry
exists. Three tests distinguish the mechanisms:

1. Seasonal variation: winter ~62 min, summer ~51 min — matches jet
   stream strength cycle, not constant aether (Williams 2016)
2. Equatorial absence: asymmetry vanishes near equator where jet
   stream is absent; dome predicts it everywhere
3. Hemispheric variation: pattern changes by southern latitude,
   matching wind patterns not fixed cavity circulation

Also noted the dome's straw man: claiming globe predicts '0% after
wind' misframes the jet stream as noise rather than the explanation.

Updated domains table row 18 with same discriminating tests.

Co-Authored-By: Claude Opus 4.6 <noreply@anthropic.com>
</commit_message>
<xml_diff>
--- a/downloads/critical-review-dome-model-v4.docx
+++ b/downloads/critical-review-dome-model-v4.docx
@@ -8889,7 +8889,7 @@
       <w:r>
         <w:t xml:space="preserve">US Patent 787412 (1905), publicly available at </w:t>
       </w:r>
-      <w:hyperlink w:history="1" r:id="rIdq5wsdkt-qjwenyg3xrusk">
+      <w:hyperlink w:history="1" r:id="rIdawe0olit_mhw8uvdfbahs">
         <w:r>
           <w:rPr>
             <w:rStyle w:val="Hyperlink"/>
@@ -9029,7 +9029,7 @@
       <w:r>
         <w:t xml:space="preserve">James Bradley (1727) explicitly tested and rejected atmospheric refraction as an explanation: refraction is wavelength-dependent (chromatic), while stellar aberration is achromatic. Modern VLBI measurements achieve milliarcsecond precision and directly confirm aberration correlates with Earth's orbital velocity (~30 km/s). The </w:t>
       </w:r>
-      <w:hyperlink w:history="1" r:id="rIdad7pgay6lmfuftxpxvxi0">
+      <w:hyperlink w:history="1" r:id="rId7zrvudhb-oq_qbyilu-me">
         <w:r>
           <w:rPr>
             <w:rStyle w:val="Hyperlink"/>
@@ -9095,7 +9095,7 @@
       <w:r>
         <w:t xml:space="preserve">ESA </w:t>
       </w:r>
-      <w:hyperlink w:history="1" r:id="rIdnf7thwo4iorwlnxpkhuv4">
+      <w:hyperlink w:history="1" r:id="rId4bqgydhy6zbk0ogqreyzq">
         <w:r>
           <w:rPr>
             <w:rStyle w:val="Hyperlink"/>
@@ -9161,7 +9161,7 @@
       <w:r>
         <w:t xml:space="preserve">Crepuscular rays are parallel beams made visible by atmospheric scattering. The apparent divergence is a perspective effect. Crucially, anticrepuscular rays converge at the anti-solar point simultaneously. See </w:t>
       </w:r>
-      <w:hyperlink w:history="1" r:id="rIdoix18zg80qppnywq_s6pf">
+      <w:hyperlink w:history="1" r:id="rIdyynjrgo1pd8da4fx4jhbh">
         <w:r>
           <w:rPr>
             <w:rStyle w:val="Hyperlink"/>
@@ -9172,7 +9172,7 @@
       <w:r>
         <w:t xml:space="preserve"> and </w:t>
       </w:r>
-      <w:hyperlink w:history="1" r:id="rIdpyvnvvzptgbfkzycifk9h">
+      <w:hyperlink w:history="1" r:id="rId7ri3upo4wtjfhueu2_sgr">
         <w:r>
           <w:rPr>
             <w:rStyle w:val="Hyperlink"/>
@@ -9238,7 +9238,7 @@
       <w:r>
         <w:t xml:space="preserve">NOAA officially states no evidence of anomalous disappearances. </w:t>
       </w:r>
-      <w:hyperlink w:history="1" r:id="rIdrv0yxkwlbklwlt5ij4m8b">
+      <w:hyperlink w:history="1" r:id="rIdubm32ppeugsnoaerec_hx">
         <w:r>
           <w:rPr>
             <w:rStyle w:val="Hyperlink"/>
@@ -9304,7 +9304,7 @@
       <w:r>
         <w:t xml:space="preserve">Hipparcos </w:t>
       </w:r>
-      <w:hyperlink w:history="1" r:id="rIdrik2cu2jdspj0omzifkc-">
+      <w:hyperlink w:history="1" r:id="rIdsd9vlzeubc07wqaorboba">
         <w:r>
           <w:rPr>
             <w:rStyle w:val="Hyperlink"/>
@@ -9720,7 +9720,7 @@
       <w:r>
         <w:t xml:space="preserve">Terra-Nova et al. (2017, PNAS) demonstrate reversed-flux patches reproduce SAA splitting in MHD simulations. The </w:t>
       </w:r>
-      <w:hyperlink w:history="1" r:id="rIdvjritd35cpjz0cxbme5wm">
+      <w:hyperlink w:history="1" r:id="rIdi7auqtyujfgfquypqeymh">
         <w:r>
           <w:rPr>
             <w:rStyle w:val="Hyperlink"/>
@@ -9731,7 +9731,7 @@
       <w:r>
         <w:t xml:space="preserve"> documents the evolution quantitatively. </w:t>
       </w:r>
-      <w:hyperlink w:history="1" r:id="rIdjr3w_zxo-nexwmmg2dlra">
+      <w:hyperlink w:history="1" r:id="rIda3i3amj09ticumchn6nvz">
         <w:r>
           <w:rPr>
             <w:rStyle w:val="Hyperlink"/>
@@ -9782,7 +9782,7 @@
       <w:r>
         <w:t xml:space="preserve">Normal secular variation documented by </w:t>
       </w:r>
-      <w:hyperlink w:history="1" r:id="rIdsacrxpjs63rkbecqdgtzd">
+      <w:hyperlink w:history="1" r:id="rId7-siy_71dkiez3ua9z56k">
         <w:r>
           <w:rPr>
             <w:rStyle w:val="Hyperlink"/>
@@ -9849,7 +9849,7 @@
       <w:r>
         <w:t xml:space="preserve">Eclipse-induced perturbations predicted by Chapman (1933) via ionospheric conductivity drops. Data from </w:t>
       </w:r>
-      <w:hyperlink w:history="1" r:id="rId2bi0sprt9kqewmqnueojl">
+      <w:hyperlink w:history="1" r:id="rIdeamccolj-0bx6iig-yblr">
         <w:r>
           <w:rPr>
             <w:rStyle w:val="Hyperlink"/>
@@ -9937,7 +9937,7 @@
       <w:r>
         <w:t xml:space="preserve">The formula used is for a quarter-wave linear waveguide, not a spherical cavity. Correct formula f = c/(2*pi*R) gives R = 6,098 km, within 4% of Earth's radius. The ionosphere IS conductive (</w:t>
       </w:r>
-      <w:hyperlink w:history="1" r:id="rIddtidvtb0ogfdkwvtfmzdh">
+      <w:hyperlink w:history="1" r:id="rIde--hp01f0dwmvefpfcyxf">
         <w:r>
           <w:rPr>
             <w:rStyle w:val="Hyperlink"/>
@@ -10004,7 +10004,7 @@
       <w:r>
         <w:t xml:space="preserve">All five observations already predicted by </w:t>
       </w:r>
-      <w:hyperlink w:history="1" r:id="rIdnxpxel2zuu0clrslsuash">
+      <w:hyperlink w:history="1" r:id="rIdpivwvzx-dilaxqdlik1g4">
         <w:r>
           <w:rPr>
             <w:rStyle w:val="Hyperlink"/>
@@ -10015,7 +10015,7 @@
       <w:r>
         <w:t xml:space="preserve">, </w:t>
       </w:r>
-      <w:hyperlink w:history="1" r:id="rIdj52xqnpgjrxy2vrqzg7p3">
+      <w:hyperlink w:history="1" r:id="rIdyerk4ll2qlv_oqsgapn3s">
         <w:r>
           <w:rPr>
             <w:rStyle w:val="Hyperlink"/>
@@ -10342,7 +10342,7 @@
       <w:r>
         <w:t xml:space="preserve">Antarctic gravity anomalies are mapped from orbit by </w:t>
       </w:r>
-      <w:hyperlink w:history="1" r:id="rIddnou6iy0vstmrcnl52fyi">
+      <w:hyperlink w:history="1" r:id="rIdsyzb7bj_nutvmvxlajdhb">
         <w:r>
           <w:rPr>
             <w:rStyle w:val="Hyperlink"/>
@@ -10353,7 +10353,7 @@
       <w:r>
         <w:t xml:space="preserve"> and </w:t>
       </w:r>
-      <w:hyperlink w:history="1" r:id="rIdebrq5-ninz4elkkjzuzt-">
+      <w:hyperlink w:history="1" r:id="rIdy2bulsfwmuaez3yxx3brt">
         <w:r>
           <w:rPr>
             <w:rStyle w:val="Hyperlink"/>
@@ -13329,7 +13329,7 @@
       <w:r>
         <w:t xml:space="preserve">A </w:t>
       </w:r>
-      <w:hyperlink w:history="1" r:id="rIduhati8w-nusrwudlhppbj">
+      <w:hyperlink w:history="1" r:id="rIdumhjssb-gb-7z-ovzhfs_">
         <w:r>
           <w:rPr>
             <w:rStyle w:val="Hyperlink"/>
@@ -13340,7 +13340,7 @@
       <w:r>
         <w:t xml:space="preserve"> found detectable decreases in X, Z, and total field components during eclipses. An </w:t>
       </w:r>
-      <w:hyperlink w:history="1" r:id="rIddqsopusfesoes9jzverlu">
+      <w:hyperlink w:history="1" r:id="rIdsoww5oybdl64gebu4kn8i">
         <w:r>
           <w:rPr>
             <w:rStyle w:val="Hyperlink"/>
@@ -13845,7 +13845,7 @@
       <w:r>
         <w:t xml:space="preserve">Continuous 24-hour sunlight. A local sun at 5,733 km circling above a flat disc cannot produce 24-hour sunlight at the disc edge. Directly observable at Amundsen-Scott Station, staffed year-round since 1957. See </w:t>
       </w:r>
-      <w:hyperlink w:history="1" r:id="rIdlnhqvigohcrgvtxwe0bmn">
+      <w:hyperlink w:history="1" r:id="rId3p2hzsdwn6p811ko4pnfs">
         <w:r>
           <w:rPr>
             <w:rStyle w:val="Hyperlink"/>
@@ -13909,7 +13909,7 @@
       <w:r>
         <w:t xml:space="preserve">GPS provides 1–3 meter accuracy worldwide using 24+ satellites in Keplerian orbits calculated from spherical-Earth gravitational mechanics. The system requires precise relativistic corrections (both special and general) that depend on the satellites' orbital velocity and altitude above a spherical gravitational well. If Earth were a flat disc with different geometry, the signal propagation times, relativistic corrections, and satellite visibility geometry would all be wrong, and the system would not achieve meter-level accuracy. The same applies to every other satellite navigation system (GLONASS, Galileo, BeiDou). The ISS at 408 km is visible on predictable schedules computed from Keplerian orbits. Geostationary satellites at 35,786 km — far above the dome's maximum height — provide continuous coverage. See </w:t>
       </w:r>
-      <w:hyperlink w:history="1" r:id="rIdd8dpbquynw8onrgh_d-l_">
+      <w:hyperlink w:history="1" r:id="rIdgtig6l5nfxouaxzhgwqil">
         <w:r>
           <w:rPr>
             <w:rStyle w:val="Hyperlink"/>
@@ -13920,7 +13920,7 @@
       <w:r>
         <w:t xml:space="preserve">; </w:t>
       </w:r>
-      <w:hyperlink w:history="1" r:id="rIdngw9q_fnktxerunarp-eb">
+      <w:hyperlink w:history="1" r:id="rIdeszdlhlceyd_jb9t3pdng">
         <w:r>
           <w:rPr>
             <w:rStyle w:val="Hyperlink"/>
@@ -13969,7 +13969,7 @@
       <w:r>
         <w:t xml:space="preserve">Modern solar calculators (</w:t>
       </w:r>
-      <w:hyperlink w:history="1" r:id="rIdwasaxfkxhtq6omthd4hdo">
+      <w:hyperlink w:history="1" r:id="rIdl4ncydzfxjfswn8bcxl4j">
         <w:r>
           <w:rPr>
             <w:rStyle w:val="Hyperlink"/>
@@ -14018,7 +14018,7 @@
       <w:r>
         <w:t xml:space="preserve">The </w:t>
       </w:r>
-      <w:hyperlink w:history="1" r:id="rIdppjclg9oz1qarpmn94ywu">
+      <w:hyperlink w:history="1" r:id="rIdgsavjslojghpocge17b9g">
         <w:r>
           <w:rPr>
             <w:rStyle w:val="Hyperlink"/>
@@ -14067,7 +14067,7 @@
       <w:r>
         <w:t xml:space="preserve">Earth's field is a dipole. South magnetic pole at 64.1°S, 135.9°E (</w:t>
       </w:r>
-      <w:hyperlink w:history="1" r:id="rIdans1fetdaqonzl-qqzwg_">
+      <w:hyperlink w:history="1" r:id="rIdwtoy54mzkqwgkogutqu-v">
         <w:r>
           <w:rPr>
             <w:rStyle w:val="Hyperlink"/>
@@ -14116,7 +14116,7 @@
       <w:r>
         <w:t xml:space="preserve">g = 9.780 m/s² at equator, 9.832 m/s² at poles (0.53% variation). On a flat disc, centrifugal force points outward from center, producing the OPPOSITE pattern. See </w:t>
       </w:r>
-      <w:hyperlink w:history="1" r:id="rIdyi5vceztyimykbcmyaxku">
+      <w:hyperlink w:history="1" r:id="rIdo747-dhgifn9fdlpz2h5t">
         <w:r>
           <w:rPr>
             <w:rStyle w:val="Hyperlink"/>
@@ -15113,7 +15113,7 @@
         </w:rPr>
         <w:t xml:space="preserve">NOAA World Magnetic Model 2025: </w:t>
       </w:r>
-      <w:hyperlink w:history="1" r:id="rIdx2lbjnjtvzhuuiyswrgae">
+      <w:hyperlink w:history="1" r:id="rIdqlmvkvqu-ge8reshwb44t">
         <w:r>
           <w:rPr>
             <w:rStyle w:val="Hyperlink"/>
@@ -15133,7 +15133,7 @@
         </w:rPr>
         <w:t xml:space="preserve">NOAA Wandering Geomagnetic Poles: </w:t>
       </w:r>
-      <w:hyperlink w:history="1" r:id="rIdbxqvlh15vorexo9nyxsfv">
+      <w:hyperlink w:history="1" r:id="rIdefamdtiez_-0983x361jb">
         <w:r>
           <w:rPr>
             <w:rStyle w:val="Hyperlink"/>
@@ -15153,7 +15153,7 @@
         </w:rPr>
         <w:t xml:space="preserve">CHAOS-7 Geomagnetic Field Model: </w:t>
       </w:r>
-      <w:hyperlink w:history="1" r:id="rIduy1wbtizjegaautzdxjfx">
+      <w:hyperlink w:history="1" r:id="rIdbhguovsg0sfim4kazmwuy">
         <w:r>
           <w:rPr>
             <w:rStyle w:val="Hyperlink"/>
@@ -15173,7 +15173,7 @@
         </w:rPr>
         <w:t xml:space="preserve">ESA Swarm Satellite Mission: </w:t>
       </w:r>
-      <w:hyperlink w:history="1" r:id="rIdo_jyz3qwtbbdentryyg_8">
+      <w:hyperlink w:history="1" r:id="rId6wgngts4ba00kfzwhynqs">
         <w:r>
           <w:rPr>
             <w:rStyle w:val="Hyperlink"/>
@@ -15193,7 +15193,7 @@
         </w:rPr>
         <w:t xml:space="preserve">INTERMAGNET Observatory Network: </w:t>
       </w:r>
-      <w:hyperlink w:history="1" r:id="rIdjzglk7fpisx49mmc8iopb">
+      <w:hyperlink w:history="1" r:id="rId0g6ghqvwxfbwezbuhuyb0">
         <w:r>
           <w:rPr>
             <w:rStyle w:val="Hyperlink"/>
@@ -15213,7 +15213,7 @@
         </w:rPr>
         <w:t xml:space="preserve">IGRF-13: </w:t>
       </w:r>
-      <w:hyperlink w:history="1" r:id="rIdm-euw7hwtlcrekq2iyzpu">
+      <w:hyperlink w:history="1" r:id="rIdpiiw1c-1luy8kogudyix_">
         <w:r>
           <w:rPr>
             <w:rStyle w:val="Hyperlink"/>
@@ -15233,7 +15233,7 @@
         </w:rPr>
         <w:t xml:space="preserve">ESA Gaia Data Release 3: </w:t>
       </w:r>
-      <w:hyperlink w:history="1" r:id="rIdwf01zcrwpyuh9hgeushh6">
+      <w:hyperlink w:history="1" r:id="rIdn8nraw-ddlgjkdr3h7ldy">
         <w:r>
           <w:rPr>
             <w:rStyle w:val="Hyperlink"/>
@@ -15253,7 +15253,7 @@
         </w:rPr>
         <w:t xml:space="preserve">Hipparcos Catalogue: </w:t>
       </w:r>
-      <w:hyperlink w:history="1" r:id="rIdumskq5ctho6um7grhogn-">
+      <w:hyperlink w:history="1" r:id="rIddb1rnbfxym17ttlep38_2">
         <w:r>
           <w:rPr>
             <w:rStyle w:val="Hyperlink"/>
@@ -15273,7 +15273,7 @@
         </w:rPr>
         <w:t xml:space="preserve">US Patent 787412 (Tesla): </w:t>
       </w:r>
-      <w:hyperlink w:history="1" r:id="rIduz8iewok2yxiueb3asn8d">
+      <w:hyperlink w:history="1" r:id="rIdulfbrvnaadmrc6bbykrv_">
         <w:r>
           <w:rPr>
             <w:rStyle w:val="Hyperlink"/>
@@ -15293,7 +15293,7 @@
         </w:rPr>
         <w:t xml:space="preserve">NOAA Solar Position Algorithm: </w:t>
       </w:r>
-      <w:hyperlink w:history="1" r:id="rIdkaz7ivljjssc5cb-ck3uk">
+      <w:hyperlink w:history="1" r:id="rIdwidd8ek_vo70toghkwnl4">
         <w:r>
           <w:rPr>
             <w:rStyle w:val="Hyperlink"/>
@@ -15313,7 +15313,7 @@
         </w:rPr>
         <w:t xml:space="preserve">National Geodetic Survey Gravity: </w:t>
       </w:r>
-      <w:hyperlink w:history="1" r:id="rIdmjxdnux9m4lz6xnhus_rb">
+      <w:hyperlink w:history="1" r:id="rId0unqprqsmuqqea6_zev1e">
         <w:r>
           <w:rPr>
             <w:rStyle w:val="Hyperlink"/>
@@ -15333,7 +15333,7 @@
         </w:rPr>
         <w:t xml:space="preserve">CHIME/FRB Project: </w:t>
       </w:r>
-      <w:hyperlink w:history="1" r:id="rIdfs3zz7uoso0muwol9htui">
+      <w:hyperlink w:history="1" r:id="rIdto0gb4cp9aorwdvv4n_br">
         <w:r>
           <w:rPr>
             <w:rStyle w:val="Hyperlink"/>
@@ -15353,7 +15353,7 @@
         </w:rPr>
         <w:t xml:space="preserve">GRACE-FO (gravity mapping): </w:t>
       </w:r>
-      <w:hyperlink w:history="1" r:id="rIdhuzvmovfqpehhybvua409">
+      <w:hyperlink w:history="1" r:id="rIdiyuxb1kd-bxd-htg3kwrz">
         <w:r>
           <w:rPr>
             <w:rStyle w:val="Hyperlink"/>
@@ -15373,7 +15373,7 @@
         </w:rPr>
         <w:t xml:space="preserve">GOCE (gravity field): </w:t>
       </w:r>
-      <w:hyperlink w:history="1" r:id="rIdcex0q5vjssstlyybl3soq">
+      <w:hyperlink w:history="1" r:id="rId1eefvxyjohp6r8aqfjrkb">
         <w:r>
           <w:rPr>
             <w:rStyle w:val="Hyperlink"/>
@@ -15393,7 +15393,7 @@
         </w:rPr>
         <w:t xml:space="preserve">GPS.gov: </w:t>
       </w:r>
-      <w:hyperlink w:history="1" r:id="rIdwixny_ed2cnzy7ggpri1a">
+      <w:hyperlink w:history="1" r:id="rIdpuphfg8wxe-dwujllqfkc">
         <w:r>
           <w:rPr>
             <w:rStyle w:val="Hyperlink"/>
@@ -15413,7 +15413,7 @@
         </w:rPr>
         <w:t xml:space="preserve">CelesTrak TLE Data: </w:t>
       </w:r>
-      <w:hyperlink w:history="1" r:id="rIdhn3y6dfosvcwmn6mjfuo7">
+      <w:hyperlink w:history="1" r:id="rId5jlbxy_ibdbk07rwt6y0e">
         <w:r>
           <w:rPr>
             <w:rStyle w:val="Hyperlink"/>

</xml_diff>

<commit_message>
Expand Kill-Shot Tests 2 (Polaris) and 6 (NMP drift) with detailed analysis
- Polaris Test 2: error budget analysis (0.74° offset > 0.27° claim), no methodology,
  dome's own site marks broader Polaris prediction as falsified
- NMP Test 6: dome currently failing at 39.9% error (exceeds own 30% threshold),
  prediction is curve-fit extrapolation not geometry, globe straw-manned
- Eclipse Test 5: cross-reference to Section 3.2 analysis
- Rebuild HTML/DOCX/PDF

Co-Authored-By: Claude Opus 4.6 <noreply@anthropic.com>
</commit_message>
<xml_diff>
--- a/downloads/critical-review-dome-model-v4.docx
+++ b/downloads/critical-review-dome-model-v4.docx
@@ -8889,7 +8889,7 @@
       <w:r>
         <w:t xml:space="preserve">US Patent 787412 (1905), publicly available at </w:t>
       </w:r>
-      <w:hyperlink w:history="1" r:id="rIdw-qd7mnzayivx6gwzdjmt">
+      <w:hyperlink w:history="1" r:id="rIdks9u0byvur5dbgmyrc8mi">
         <w:r>
           <w:rPr>
             <w:rStyle w:val="Hyperlink"/>
@@ -9029,7 +9029,7 @@
       <w:r>
         <w:t xml:space="preserve">James Bradley (1727) explicitly tested and rejected atmospheric refraction as an explanation: refraction is wavelength-dependent (chromatic), while stellar aberration is achromatic. Modern VLBI measurements achieve milliarcsecond precision and directly confirm aberration correlates with Earth's orbital velocity (~30 km/s). The </w:t>
       </w:r>
-      <w:hyperlink w:history="1" r:id="rIdahmhglacjljijurd8flgw">
+      <w:hyperlink w:history="1" r:id="rIdsa73df7eeqt78vcc3stbu">
         <w:r>
           <w:rPr>
             <w:rStyle w:val="Hyperlink"/>
@@ -9095,7 +9095,7 @@
       <w:r>
         <w:t xml:space="preserve">ESA </w:t>
       </w:r>
-      <w:hyperlink w:history="1" r:id="rIdfekyov4i9q7qw0wlqnnwk">
+      <w:hyperlink w:history="1" r:id="rIdsa4xcyiykx25jckdoro-g">
         <w:r>
           <w:rPr>
             <w:rStyle w:val="Hyperlink"/>
@@ -9161,7 +9161,7 @@
       <w:r>
         <w:t xml:space="preserve">Crepuscular rays are parallel beams made visible by atmospheric scattering. The apparent divergence is a perspective effect. Crucially, anticrepuscular rays converge at the anti-solar point simultaneously. See </w:t>
       </w:r>
-      <w:hyperlink w:history="1" r:id="rId_81eqxp8ybsnlh9j1bsca">
+      <w:hyperlink w:history="1" r:id="rIdchbeyi-ppoh0zarnlm0oa">
         <w:r>
           <w:rPr>
             <w:rStyle w:val="Hyperlink"/>
@@ -9172,7 +9172,7 @@
       <w:r>
         <w:t xml:space="preserve"> and </w:t>
       </w:r>
-      <w:hyperlink w:history="1" r:id="rIdzwkedvhcez2nenpfohuh2">
+      <w:hyperlink w:history="1" r:id="rId37vfxsgspzvl_x_l1-tvw">
         <w:r>
           <w:rPr>
             <w:rStyle w:val="Hyperlink"/>
@@ -9238,7 +9238,7 @@
       <w:r>
         <w:t xml:space="preserve">NOAA officially states no evidence of anomalous disappearances. </w:t>
       </w:r>
-      <w:hyperlink w:history="1" r:id="rId9r3aarb0ccbdemais_ijk">
+      <w:hyperlink w:history="1" r:id="rIdlm2s5nshcdtp6mwvn5vye">
         <w:r>
           <w:rPr>
             <w:rStyle w:val="Hyperlink"/>
@@ -9304,7 +9304,7 @@
       <w:r>
         <w:t xml:space="preserve">Hipparcos </w:t>
       </w:r>
-      <w:hyperlink w:history="1" r:id="rIdbx38k_ibvkssrwmcscfor">
+      <w:hyperlink w:history="1" r:id="rId-21ejrzsytt85cdnajgmc">
         <w:r>
           <w:rPr>
             <w:rStyle w:val="Hyperlink"/>
@@ -9720,7 +9720,7 @@
       <w:r>
         <w:t xml:space="preserve">Terra-Nova et al. (2017, PNAS) demonstrate reversed-flux patches reproduce SAA splitting in MHD simulations. The </w:t>
       </w:r>
-      <w:hyperlink w:history="1" r:id="rIdvbc-xev11lk98awlti0st">
+      <w:hyperlink w:history="1" r:id="rId91nsh_dtc674anoax5xon">
         <w:r>
           <w:rPr>
             <w:rStyle w:val="Hyperlink"/>
@@ -9731,7 +9731,7 @@
       <w:r>
         <w:t xml:space="preserve"> documents the evolution quantitatively. </w:t>
       </w:r>
-      <w:hyperlink w:history="1" r:id="rId7fqtwd9mdppr_w6wi0blv">
+      <w:hyperlink w:history="1" r:id="rIdlr6irx9mgf1hmzlpulpow">
         <w:r>
           <w:rPr>
             <w:rStyle w:val="Hyperlink"/>
@@ -9782,7 +9782,7 @@
       <w:r>
         <w:t xml:space="preserve">Normal secular variation documented by </w:t>
       </w:r>
-      <w:hyperlink w:history="1" r:id="rId3u39r6sbsbxppb_ykvxvp">
+      <w:hyperlink w:history="1" r:id="rIdn4dv29max5emozkhojah5">
         <w:r>
           <w:rPr>
             <w:rStyle w:val="Hyperlink"/>
@@ -9849,7 +9849,7 @@
       <w:r>
         <w:t xml:space="preserve">Eclipse-induced perturbations predicted by Chapman (1933) via ionospheric conductivity drops. Data from </w:t>
       </w:r>
-      <w:hyperlink w:history="1" r:id="rIdmwsl2zoj9a5budwmqv0my">
+      <w:hyperlink w:history="1" r:id="rIdjv_nskl4ftc3uzy4hi_xq">
         <w:r>
           <w:rPr>
             <w:rStyle w:val="Hyperlink"/>
@@ -9937,7 +9937,7 @@
       <w:r>
         <w:t xml:space="preserve">The formula used is for a quarter-wave linear waveguide, not a spherical cavity. Correct formula f = c/(2*pi*R) gives R = 6,098 km, within 4% of Earth's radius. The ionosphere IS conductive (</w:t>
       </w:r>
-      <w:hyperlink w:history="1" r:id="rIdafiz8gues2alpscmilwox">
+      <w:hyperlink w:history="1" r:id="rIdj5lbu_xty0q-5rdwgzjtv">
         <w:r>
           <w:rPr>
             <w:rStyle w:val="Hyperlink"/>
@@ -10004,7 +10004,7 @@
       <w:r>
         <w:t xml:space="preserve">All five observations already predicted by </w:t>
       </w:r>
-      <w:hyperlink w:history="1" r:id="rIdvrghdx4i_hzex20jtyqcy">
+      <w:hyperlink w:history="1" r:id="rIdajhlre1r73gd1c7dggwu4">
         <w:r>
           <w:rPr>
             <w:rStyle w:val="Hyperlink"/>
@@ -10015,7 +10015,7 @@
       <w:r>
         <w:t xml:space="preserve">, </w:t>
       </w:r>
-      <w:hyperlink w:history="1" r:id="rIdqn4tiotra9n9vxhrobwjn">
+      <w:hyperlink w:history="1" r:id="rIdwm4ojscnyv38p284zpovt">
         <w:r>
           <w:rPr>
             <w:rStyle w:val="Hyperlink"/>
@@ -10342,7 +10342,7 @@
       <w:r>
         <w:t xml:space="preserve">Antarctic gravity anomalies are mapped from orbit by </w:t>
       </w:r>
-      <w:hyperlink w:history="1" r:id="rIdjgd-ahvkev2_bt2d2axwv">
+      <w:hyperlink w:history="1" r:id="rIddkr4plhhb2i8valybbzv2">
         <w:r>
           <w:rPr>
             <w:rStyle w:val="Hyperlink"/>
@@ -10353,7 +10353,7 @@
       <w:r>
         <w:t xml:space="preserve"> and </w:t>
       </w:r>
-      <w:hyperlink w:history="1" r:id="rIdy-hhlvwj2eotagsbsrd43">
+      <w:hyperlink w:history="1" r:id="rId-efoog3rhbvrkzvv_emgd">
         <w:r>
           <w:rPr>
             <w:rStyle w:val="Hyperlink"/>
@@ -13329,7 +13329,7 @@
       <w:r>
         <w:t xml:space="preserve">A </w:t>
       </w:r>
-      <w:hyperlink w:history="1" r:id="rIdswjocpc9bowl5xauzizbm">
+      <w:hyperlink w:history="1" r:id="rIdpiqnspifgy_4dmqvuggrb">
         <w:r>
           <w:rPr>
             <w:rStyle w:val="Hyperlink"/>
@@ -13340,7 +13340,7 @@
       <w:r>
         <w:t xml:space="preserve"> found detectable decreases in X, Z, and total field components during eclipses. An </w:t>
       </w:r>
-      <w:hyperlink w:history="1" r:id="rIdxn93bjsqxwvksyirgclx6">
+      <w:hyperlink w:history="1" r:id="rIdl3xaj_0l_calhdwy-nufq">
         <w:r>
           <w:rPr>
             <w:rStyle w:val="Hyperlink"/>
@@ -13845,7 +13845,7 @@
       <w:r>
         <w:t xml:space="preserve">Continuous 24-hour sunlight. A local sun at 5,733 km circling above a flat disc cannot produce 24-hour sunlight at the disc edge. Directly observable at Amundsen-Scott Station, staffed year-round since 1957. See </w:t>
       </w:r>
-      <w:hyperlink w:history="1" r:id="rIdqnw3qwyac8yu8rfoa1uly">
+      <w:hyperlink w:history="1" r:id="rIdbanzy_bah0nzpdgwefvpf">
         <w:r>
           <w:rPr>
             <w:rStyle w:val="Hyperlink"/>
@@ -13909,7 +13909,7 @@
       <w:r>
         <w:t xml:space="preserve">GPS provides 1–3 meter accuracy worldwide using 24+ satellites in Keplerian orbits calculated from spherical-Earth gravitational mechanics. The system requires precise relativistic corrections (both special and general) that depend on the satellites' orbital velocity and altitude above a spherical gravitational well. If Earth were a flat disc with different geometry, the signal propagation times, relativistic corrections, and satellite visibility geometry would all be wrong, and the system would not achieve meter-level accuracy. The same applies to every other satellite navigation system (GLONASS, Galileo, BeiDou). The ISS at 408 km is visible on predictable schedules computed from Keplerian orbits. Geostationary satellites at 35,786 km — far above the dome's maximum height — provide continuous coverage. See </w:t>
       </w:r>
-      <w:hyperlink w:history="1" r:id="rIdlugrznctj6xegkm3pgw2y">
+      <w:hyperlink w:history="1" r:id="rIdcgpqw0ydqxfxykgs05-mj">
         <w:r>
           <w:rPr>
             <w:rStyle w:val="Hyperlink"/>
@@ -13920,7 +13920,7 @@
       <w:r>
         <w:t xml:space="preserve">; </w:t>
       </w:r>
-      <w:hyperlink w:history="1" r:id="rId8au437-z_b1upmtv9ghsg">
+      <w:hyperlink w:history="1" r:id="rIdqd3qjkoxbvit3ocpy6v-b">
         <w:r>
           <w:rPr>
             <w:rStyle w:val="Hyperlink"/>
@@ -13969,7 +13969,7 @@
       <w:r>
         <w:t xml:space="preserve">Modern solar calculators (</w:t>
       </w:r>
-      <w:hyperlink w:history="1" r:id="rId-j8csqc4hvmgrpxka28qv">
+      <w:hyperlink w:history="1" r:id="rIdz9vwptjsmucwcc6fueqlq">
         <w:r>
           <w:rPr>
             <w:rStyle w:val="Hyperlink"/>
@@ -14018,7 +14018,7 @@
       <w:r>
         <w:t xml:space="preserve">The </w:t>
       </w:r>
-      <w:hyperlink w:history="1" r:id="rIdnlj9szcc50xtn4kmix4sb">
+      <w:hyperlink w:history="1" r:id="rId9c4nztdtha5uwebdu4jic">
         <w:r>
           <w:rPr>
             <w:rStyle w:val="Hyperlink"/>
@@ -14067,7 +14067,7 @@
       <w:r>
         <w:t xml:space="preserve">Earth's field is a dipole. South magnetic pole at 64.1°S, 135.9°E (</w:t>
       </w:r>
-      <w:hyperlink w:history="1" r:id="rIdjwwz4pnhiv1uo_vogcm0o">
+      <w:hyperlink w:history="1" r:id="rIdovs_tkxze52mvb7yeypxe">
         <w:r>
           <w:rPr>
             <w:rStyle w:val="Hyperlink"/>
@@ -14116,7 +14116,7 @@
       <w:r>
         <w:t xml:space="preserve">g = 9.780 m/s² at equator, 9.832 m/s² at poles (0.53% variation). On a flat disc, centrifugal force points outward from center, producing the OPPOSITE pattern. See </w:t>
       </w:r>
-      <w:hyperlink w:history="1" r:id="rIdrzbg3-jvftlfcldyz45-g">
+      <w:hyperlink w:history="1" r:id="rIdotnct9i9ys6ruasxisxmv">
         <w:r>
           <w:rPr>
             <w:rStyle w:val="Hyperlink"/>
@@ -15113,7 +15113,7 @@
         </w:rPr>
         <w:t xml:space="preserve">NOAA World Magnetic Model 2025: </w:t>
       </w:r>
-      <w:hyperlink w:history="1" r:id="rId1ybhhhpsz_bb-jhoobrem">
+      <w:hyperlink w:history="1" r:id="rIdlxm9trkq5h6sozvn1w5zm">
         <w:r>
           <w:rPr>
             <w:rStyle w:val="Hyperlink"/>
@@ -15133,7 +15133,7 @@
         </w:rPr>
         <w:t xml:space="preserve">NOAA Wandering Geomagnetic Poles: </w:t>
       </w:r>
-      <w:hyperlink w:history="1" r:id="rIdesl_ru7crkjj-qk3q_uln">
+      <w:hyperlink w:history="1" r:id="rId3umdu7a51rcq1mjtpyrsp">
         <w:r>
           <w:rPr>
             <w:rStyle w:val="Hyperlink"/>
@@ -15153,7 +15153,7 @@
         </w:rPr>
         <w:t xml:space="preserve">CHAOS-7 Geomagnetic Field Model: </w:t>
       </w:r>
-      <w:hyperlink w:history="1" r:id="rIdfdfyjfctkd2rlauww0b9x">
+      <w:hyperlink w:history="1" r:id="rIdskij3y6wl4xb6oq60vjvd">
         <w:r>
           <w:rPr>
             <w:rStyle w:val="Hyperlink"/>
@@ -15173,7 +15173,7 @@
         </w:rPr>
         <w:t xml:space="preserve">ESA Swarm Satellite Mission: </w:t>
       </w:r>
-      <w:hyperlink w:history="1" r:id="rIdkvlqebnm8ap3e7memwvru">
+      <w:hyperlink w:history="1" r:id="rId4slpd_vjlw6el5oso5ntv">
         <w:r>
           <w:rPr>
             <w:rStyle w:val="Hyperlink"/>
@@ -15193,7 +15193,7 @@
         </w:rPr>
         <w:t xml:space="preserve">INTERMAGNET Observatory Network: </w:t>
       </w:r>
-      <w:hyperlink w:history="1" r:id="rId24wkerssgnbm7xc1yt2ur">
+      <w:hyperlink w:history="1" r:id="rIdm2dtgo9ge4e4ah20nb4vk">
         <w:r>
           <w:rPr>
             <w:rStyle w:val="Hyperlink"/>
@@ -15213,7 +15213,7 @@
         </w:rPr>
         <w:t xml:space="preserve">IGRF-13: </w:t>
       </w:r>
-      <w:hyperlink w:history="1" r:id="rIdorxemd1rylbeozfct-g9o">
+      <w:hyperlink w:history="1" r:id="rId5lx4cz_yifypop1zfjp3d">
         <w:r>
           <w:rPr>
             <w:rStyle w:val="Hyperlink"/>
@@ -15233,7 +15233,7 @@
         </w:rPr>
         <w:t xml:space="preserve">ESA Gaia Data Release 3: </w:t>
       </w:r>
-      <w:hyperlink w:history="1" r:id="rIdejelm_pgpyfoa9-jek1-n">
+      <w:hyperlink w:history="1" r:id="rId3irzeldvf6bkvebucxydv">
         <w:r>
           <w:rPr>
             <w:rStyle w:val="Hyperlink"/>
@@ -15253,7 +15253,7 @@
         </w:rPr>
         <w:t xml:space="preserve">Hipparcos Catalogue: </w:t>
       </w:r>
-      <w:hyperlink w:history="1" r:id="rIdpttrsku7c71e1ke5zpz6x">
+      <w:hyperlink w:history="1" r:id="rIdkfuzpozmui8rtt2tbrejw">
         <w:r>
           <w:rPr>
             <w:rStyle w:val="Hyperlink"/>
@@ -15273,7 +15273,7 @@
         </w:rPr>
         <w:t xml:space="preserve">US Patent 787412 (Tesla): </w:t>
       </w:r>
-      <w:hyperlink w:history="1" r:id="rIdefg23kh2zde_wvftoe6ps">
+      <w:hyperlink w:history="1" r:id="rIdjh9kzr8iyrfoi0br8qrw7">
         <w:r>
           <w:rPr>
             <w:rStyle w:val="Hyperlink"/>
@@ -15293,7 +15293,7 @@
         </w:rPr>
         <w:t xml:space="preserve">NOAA Solar Position Algorithm: </w:t>
       </w:r>
-      <w:hyperlink w:history="1" r:id="rId2zitm0h1dzgvouqxlbeha">
+      <w:hyperlink w:history="1" r:id="rId5weumpdsvctvg87btiqzv">
         <w:r>
           <w:rPr>
             <w:rStyle w:val="Hyperlink"/>
@@ -15313,7 +15313,7 @@
         </w:rPr>
         <w:t xml:space="preserve">National Geodetic Survey Gravity: </w:t>
       </w:r>
-      <w:hyperlink w:history="1" r:id="rIdyyqenbv5oomw9cljug1yu">
+      <w:hyperlink w:history="1" r:id="rIdix7rk_3bqwtkvu39gbisn">
         <w:r>
           <w:rPr>
             <w:rStyle w:val="Hyperlink"/>
@@ -15333,7 +15333,7 @@
         </w:rPr>
         <w:t xml:space="preserve">CHIME/FRB Project: </w:t>
       </w:r>
-      <w:hyperlink w:history="1" r:id="rIdl_nsgl-whrzfqbldy0i1e">
+      <w:hyperlink w:history="1" r:id="rId46ocr28_cvvgohwj4xzlj">
         <w:r>
           <w:rPr>
             <w:rStyle w:val="Hyperlink"/>
@@ -15353,7 +15353,7 @@
         </w:rPr>
         <w:t xml:space="preserve">GRACE-FO (gravity mapping): </w:t>
       </w:r>
-      <w:hyperlink w:history="1" r:id="rIdaz7m0_tqeg1dtyeqldecn">
+      <w:hyperlink w:history="1" r:id="rIdgqlo3emh6rfa_tuzr_hce">
         <w:r>
           <w:rPr>
             <w:rStyle w:val="Hyperlink"/>
@@ -15373,7 +15373,7 @@
         </w:rPr>
         <w:t xml:space="preserve">GOCE (gravity field): </w:t>
       </w:r>
-      <w:hyperlink w:history="1" r:id="rId4huhk4banw94eqtmknifk">
+      <w:hyperlink w:history="1" r:id="rIdmpk7tou7edasmucb-ci-9">
         <w:r>
           <w:rPr>
             <w:rStyle w:val="Hyperlink"/>
@@ -15393,7 +15393,7 @@
         </w:rPr>
         <w:t xml:space="preserve">GPS.gov: </w:t>
       </w:r>
-      <w:hyperlink w:history="1" r:id="rIddsdad0pahxpsd4aihdq4b">
+      <w:hyperlink w:history="1" r:id="rIdcgqbdlqegvzurgvb1lyqb">
         <w:r>
           <w:rPr>
             <w:rStyle w:val="Hyperlink"/>
@@ -15413,7 +15413,7 @@
         </w:rPr>
         <w:t xml:space="preserve">CelesTrak TLE Data: </w:t>
       </w:r>
-      <w:hyperlink w:history="1" r:id="rIdmxu392sgwhxm7tgcnougu">
+      <w:hyperlink w:history="1" r:id="rIdmpybi5r_pw7p6jn9ofavq">
         <w:r>
           <w:rPr>
             <w:rStyle w:val="Hyperlink"/>

</xml_diff>

<commit_message>
Replace 300,000× tidal force argument with geometric tidal pattern argument
The old argument (dome moon produces 300,000× excess tidal force) was
flawed — it assumed the dome's moon has the same mass as the real moon.
If mass scales with d³ (same angular size and density), amplitude matches
automatically. Replaced with the irrefutable geometric pattern argument:
at d/R ≈ 0.13, tidal force is a sharp localized spike producing one
pulse per lunar pass, not the observed two-bulge semidiurnal pattern.
This is purely geometric and cannot be fixed by mass adjustment.

Also corrected moon altitude from 5,733 km (sun) to 2,534 km (moon,
from inject_ai_layer.py core_parameters) across all tidal WINs.

Updated: wins.json (5 tidal WINs), generate-html.js, build-doc-v4.js,
CLAUDE.md, SESSION-CONTEXT.md. Rebuilt HTML/DOCX/PDF.

Co-Authored-By: Claude Opus 4.6 <noreply@anthropic.com>
</commit_message>
<xml_diff>
--- a/downloads/critical-review-dome-model-v4.docx
+++ b/downloads/critical-review-dome-model-v4.docx
@@ -6152,7 +6152,7 @@
                 <w:sz w:val="18"/>
                 <w:szCs w:val="18"/>
               </w:rPr>
-              <w:t xml:space="preserve">Never derived from dome; local moon at 5,733 km gives tidal forces 300,000× too strong</w:t>
+              <w:t xml:space="preserve">Period is trivial (half a lunar day); dome's local moon produces one sharp tidal spike, not the observed two-bulge pattern</w:t>
             </w:r>
           </w:p>
         </w:tc>
@@ -6271,7 +6271,7 @@
                 <w:sz w:val="18"/>
                 <w:szCs w:val="18"/>
               </w:rPr>
-              <w:t xml:space="preserve">Never derived from dome; local moon produces 300,000× excess tidal force</w:t>
+              <w:t xml:space="preserve">Period is trivial (half a solar day); dome's local moon at 2,534 km cannot produce the observed two-bulge pattern</w:t>
             </w:r>
           </w:p>
         </w:tc>
@@ -6628,7 +6628,7 @@
                 <w:sz w:val="18"/>
                 <w:szCs w:val="18"/>
               </w:rPr>
-              <w:t xml:space="preserve">Never derived from dome; local moon produces 300,000× excess tidal force</w:t>
+              <w:t xml:space="preserve">Period is trivial (luni-solar diurnal); dome's local moon cannot produce the observed two-bulge tidal pattern</w:t>
             </w:r>
           </w:p>
         </w:tc>
@@ -6747,7 +6747,7 @@
                 <w:sz w:val="18"/>
                 <w:szCs w:val="18"/>
               </w:rPr>
-              <w:t xml:space="preserve">Never derived from dome; local moon produces 300,000× excess tidal force</w:t>
+              <w:t xml:space="preserve">Period is trivial (lunar diurnal); dome's local moon cannot produce the observed two-bulge tidal pattern</w:t>
             </w:r>
           </w:p>
         </w:tc>
@@ -6866,7 +6866,7 @@
                 <w:sz w:val="18"/>
                 <w:szCs w:val="18"/>
               </w:rPr>
-              <w:t xml:space="preserve">Never derived from dome; local moon produces 300,000× excess tidal force</w:t>
+              <w:t xml:space="preserve">Period is trivial (lunar elliptical); dome's local moon cannot produce the observed two-bulge tidal pattern</w:t>
             </w:r>
           </w:p>
         </w:tc>
@@ -8811,7 +8811,7 @@
         <w:t xml:space="preserve">Self-Contradicted breakdown: </w:t>
       </w:r>
       <w:r>
-        <w:t xml:space="preserve">Schumann resonance (4 WINs: 002, 029, 038, 061): dome cavity gives ~22 Hz not 7.83. Tidal periods (5 WINs: 045, 046, 049, 050, 051): never derived from dome; local moon gives 300,000× excess force. Solar elevation (WIN-056): uses globe's axial-tilt formula. Antarctic gravity (WIN-067): dome predicts 90% gravity drop at rim. In every case, the author substitutes globe physics to avoid his own geometry's predictions.</w:t>
+        <w:t xml:space="preserve">Schumann resonance (4 WINs: 002, 029, 038, 061): dome cavity gives ~22 Hz not 7.83. Tidal periods (5 WINs: 045, 046, 049, 050, 051): never derived from dome; local moon at 2,534 km produces one tidal spike, not the observed two-bulge pattern. Solar elevation (WIN-056): uses globe's axial-tilt formula. Antarctic gravity (WIN-067): dome predicts 90% gravity drop at rim. In every case, the author substitutes globe physics to avoid his own geometry's predictions.</w:t>
       </w:r>
     </w:p>
     <w:p>
@@ -8889,7 +8889,7 @@
       <w:r>
         <w:t xml:space="preserve">US Patent 787412 (1905), publicly available at </w:t>
       </w:r>
-      <w:hyperlink w:history="1" r:id="rIdloed4uojjokdkinwzmcve">
+      <w:hyperlink w:history="1" r:id="rIdcytyzinkjqb8k5geu7rcb">
         <w:r>
           <w:rPr>
             <w:rStyle w:val="Hyperlink"/>
@@ -9029,7 +9029,7 @@
       <w:r>
         <w:t xml:space="preserve">James Bradley (1727) explicitly tested and rejected atmospheric refraction as an explanation: refraction is wavelength-dependent (chromatic), while stellar aberration is achromatic. Modern VLBI measurements achieve milliarcsecond precision and directly confirm aberration correlates with Earth's orbital velocity (~30 km/s). The </w:t>
       </w:r>
-      <w:hyperlink w:history="1" r:id="rIder3gwrkuvml8efalbwwkr">
+      <w:hyperlink w:history="1" r:id="rIdvl4wjw32prt_kh4mvul5h">
         <w:r>
           <w:rPr>
             <w:rStyle w:val="Hyperlink"/>
@@ -9095,7 +9095,7 @@
       <w:r>
         <w:t xml:space="preserve">ESA </w:t>
       </w:r>
-      <w:hyperlink w:history="1" r:id="rIdrbzipjbxkwlefuzaq8qfq">
+      <w:hyperlink w:history="1" r:id="rIdif0-zf8klsjzf46mb1xnz">
         <w:r>
           <w:rPr>
             <w:rStyle w:val="Hyperlink"/>
@@ -9161,7 +9161,7 @@
       <w:r>
         <w:t xml:space="preserve">Crepuscular rays are parallel beams made visible by atmospheric scattering. The apparent divergence is a perspective effect. Crucially, anticrepuscular rays converge at the anti-solar point simultaneously. See </w:t>
       </w:r>
-      <w:hyperlink w:history="1" r:id="rIdwkdwpsts9kuziuofqro0q">
+      <w:hyperlink w:history="1" r:id="rIdy7biyma4yn9tvi9cqumbx">
         <w:r>
           <w:rPr>
             <w:rStyle w:val="Hyperlink"/>
@@ -9172,7 +9172,7 @@
       <w:r>
         <w:t xml:space="preserve"> and </w:t>
       </w:r>
-      <w:hyperlink w:history="1" r:id="rIdisatq1zpqceosvnglwev6">
+      <w:hyperlink w:history="1" r:id="rId26z7val-ax0qzs4dvooe6">
         <w:r>
           <w:rPr>
             <w:rStyle w:val="Hyperlink"/>
@@ -9238,7 +9238,7 @@
       <w:r>
         <w:t xml:space="preserve">NOAA officially states no evidence of anomalous disappearances. </w:t>
       </w:r>
-      <w:hyperlink w:history="1" r:id="rId_zcgv2eunbrn1kgob-qgk">
+      <w:hyperlink w:history="1" r:id="rId61cvw0ohyjmjomsffbfle">
         <w:r>
           <w:rPr>
             <w:rStyle w:val="Hyperlink"/>
@@ -9304,7 +9304,7 @@
       <w:r>
         <w:t xml:space="preserve">Hipparcos </w:t>
       </w:r>
-      <w:hyperlink w:history="1" r:id="rIdcnudvz0ynb2kuutu5jyyp">
+      <w:hyperlink w:history="1" r:id="rIdtvfakxl0viaafzecyzv4v">
         <w:r>
           <w:rPr>
             <w:rStyle w:val="Hyperlink"/>
@@ -9720,7 +9720,7 @@
       <w:r>
         <w:t xml:space="preserve">Terra-Nova et al. (2017, PNAS) demonstrate reversed-flux patches reproduce SAA splitting in MHD simulations. The </w:t>
       </w:r>
-      <w:hyperlink w:history="1" r:id="rIdbqeoc2ry55msyshf_u0-d">
+      <w:hyperlink w:history="1" r:id="rIdutthf3iuo60ut5tz6j-sk">
         <w:r>
           <w:rPr>
             <w:rStyle w:val="Hyperlink"/>
@@ -9731,7 +9731,7 @@
       <w:r>
         <w:t xml:space="preserve"> documents the evolution quantitatively. </w:t>
       </w:r>
-      <w:hyperlink w:history="1" r:id="rIdvqkcq_7bp6h3m6sljyksz">
+      <w:hyperlink w:history="1" r:id="rIdjfbutavoeb6ucdbrbhpau">
         <w:r>
           <w:rPr>
             <w:rStyle w:val="Hyperlink"/>
@@ -9782,7 +9782,7 @@
       <w:r>
         <w:t xml:space="preserve">Normal secular variation documented by </w:t>
       </w:r>
-      <w:hyperlink w:history="1" r:id="rIdeqqh6pjqa23g2qm_oz2ji">
+      <w:hyperlink w:history="1" r:id="rId5ggadgnkwjhh1wertvbu1">
         <w:r>
           <w:rPr>
             <w:rStyle w:val="Hyperlink"/>
@@ -9849,7 +9849,7 @@
       <w:r>
         <w:t xml:space="preserve">Eclipse-induced perturbations predicted by Chapman (1933) via ionospheric conductivity drops. Data from </w:t>
       </w:r>
-      <w:hyperlink w:history="1" r:id="rId1yq6lqcxl_h1eeue3p-a1">
+      <w:hyperlink w:history="1" r:id="rIddll2dqebworsyaixjvzny">
         <w:r>
           <w:rPr>
             <w:rStyle w:val="Hyperlink"/>
@@ -9937,7 +9937,7 @@
       <w:r>
         <w:t xml:space="preserve">The formula used is for a quarter-wave linear waveguide, not a spherical cavity. Correct formula f = c/(2*pi*R) gives R = 6,098 km, within 4% of Earth's radius. The ionosphere IS conductive (</w:t>
       </w:r>
-      <w:hyperlink w:history="1" r:id="rIdbjzx44etw9hicrgh4kl8v">
+      <w:hyperlink w:history="1" r:id="rId10zee53cpkdipprdthclo">
         <w:r>
           <w:rPr>
             <w:rStyle w:val="Hyperlink"/>
@@ -10004,7 +10004,7 @@
       <w:r>
         <w:t xml:space="preserve">All five observations already predicted by </w:t>
       </w:r>
-      <w:hyperlink w:history="1" r:id="rIdfj7dsrhl1qdk3id55qg6u">
+      <w:hyperlink w:history="1" r:id="rIdrsxwea5ufmp4wqhf3p3bl">
         <w:r>
           <w:rPr>
             <w:rStyle w:val="Hyperlink"/>
@@ -10015,7 +10015,7 @@
       <w:r>
         <w:t xml:space="preserve">, </w:t>
       </w:r>
-      <w:hyperlink w:history="1" r:id="rId7mynbabjkugt6nhz70wtm">
+      <w:hyperlink w:history="1" r:id="rId4cufl4harfuu0elotsg-b">
         <w:r>
           <w:rPr>
             <w:rStyle w:val="Hyperlink"/>
@@ -10342,7 +10342,7 @@
       <w:r>
         <w:t xml:space="preserve">Antarctic gravity anomalies are mapped from orbit by </w:t>
       </w:r>
-      <w:hyperlink w:history="1" r:id="rIddbpojouejztvwskolh-ei">
+      <w:hyperlink w:history="1" r:id="rId09vwdggujcnxzr2lhntf8">
         <w:r>
           <w:rPr>
             <w:rStyle w:val="Hyperlink"/>
@@ -10353,7 +10353,7 @@
       <w:r>
         <w:t xml:space="preserve"> and </w:t>
       </w:r>
-      <w:hyperlink w:history="1" r:id="rIdhifpkmj2dhqbx65e2g6pw">
+      <w:hyperlink w:history="1" r:id="rIdhve-zatzzrwu38dskvu06">
         <w:r>
           <w:rPr>
             <w:rStyle w:val="Hyperlink"/>
@@ -13329,7 +13329,7 @@
       <w:r>
         <w:t xml:space="preserve">A </w:t>
       </w:r>
-      <w:hyperlink w:history="1" r:id="rIdtaxrvg1xfbaopdjtfqio9">
+      <w:hyperlink w:history="1" r:id="rIdsmc4acvberk_q5rmv2e2u">
         <w:r>
           <w:rPr>
             <w:rStyle w:val="Hyperlink"/>
@@ -13340,7 +13340,7 @@
       <w:r>
         <w:t xml:space="preserve"> found detectable decreases in X, Z, and total field components during eclipses. An </w:t>
       </w:r>
-      <w:hyperlink w:history="1" r:id="rIdusxgkctz658tictzs2liy">
+      <w:hyperlink w:history="1" r:id="rIdweum9ajbx09g-enkb0lzk">
         <w:r>
           <w:rPr>
             <w:rStyle w:val="Hyperlink"/>
@@ -13845,7 +13845,7 @@
       <w:r>
         <w:t xml:space="preserve">Continuous 24-hour sunlight. A local sun at 5,733 km circling above a flat disc cannot produce 24-hour sunlight at the disc edge. Directly observable at Amundsen-Scott Station, staffed year-round since 1957. See </w:t>
       </w:r>
-      <w:hyperlink w:history="1" r:id="rIdulpq0ktgotip7hqnwexav">
+      <w:hyperlink w:history="1" r:id="rIdwgttwz-hh75ohgrkyabnv">
         <w:r>
           <w:rPr>
             <w:rStyle w:val="Hyperlink"/>
@@ -13909,7 +13909,7 @@
       <w:r>
         <w:t xml:space="preserve">GPS provides 1–3 meter accuracy worldwide using 24+ satellites in Keplerian orbits calculated from spherical-Earth gravitational mechanics. The system requires precise relativistic corrections (both special and general) that depend on the satellites' orbital velocity and altitude above a spherical gravitational well. If Earth were a flat disc with different geometry, the signal propagation times, relativistic corrections, and satellite visibility geometry would all be wrong, and the system would not achieve meter-level accuracy. The same applies to every other satellite navigation system (GLONASS, Galileo, BeiDou). The ISS at 408 km is visible on predictable schedules computed from Keplerian orbits. Geostationary satellites at 35,786 km — far above the dome's maximum height — provide continuous coverage. See </w:t>
       </w:r>
-      <w:hyperlink w:history="1" r:id="rIdddppmszjqqzshgspnakqs">
+      <w:hyperlink w:history="1" r:id="rId1vt6ja2sade80t3_votwd">
         <w:r>
           <w:rPr>
             <w:rStyle w:val="Hyperlink"/>
@@ -13920,7 +13920,7 @@
       <w:r>
         <w:t xml:space="preserve">; </w:t>
       </w:r>
-      <w:hyperlink w:history="1" r:id="rId-gq8x-ma0sv4sbmraycqf">
+      <w:hyperlink w:history="1" r:id="rIdp_x88n8q18sqmszrznot5">
         <w:r>
           <w:rPr>
             <w:rStyle w:val="Hyperlink"/>
@@ -13969,7 +13969,7 @@
       <w:r>
         <w:t xml:space="preserve">Modern solar calculators (</w:t>
       </w:r>
-      <w:hyperlink w:history="1" r:id="rIdtpfkfyzgfzhf2qhe-mubf">
+      <w:hyperlink w:history="1" r:id="rId7qcgkdouinzuguglwcrvb">
         <w:r>
           <w:rPr>
             <w:rStyle w:val="Hyperlink"/>
@@ -14018,7 +14018,7 @@
       <w:r>
         <w:t xml:space="preserve">The </w:t>
       </w:r>
-      <w:hyperlink w:history="1" r:id="rId26sznzy1f06fh5-_fyupr">
+      <w:hyperlink w:history="1" r:id="rId2erthdricdno0emmg0ovp">
         <w:r>
           <w:rPr>
             <w:rStyle w:val="Hyperlink"/>
@@ -14067,7 +14067,7 @@
       <w:r>
         <w:t xml:space="preserve">Earth's field is a dipole. South magnetic pole at 64.1°S, 135.9°E (</w:t>
       </w:r>
-      <w:hyperlink w:history="1" r:id="rId8lkuqs87znj-egtyyveuy">
+      <w:hyperlink w:history="1" r:id="rIdydih1siix59o-sq6f2reu">
         <w:r>
           <w:rPr>
             <w:rStyle w:val="Hyperlink"/>
@@ -14116,7 +14116,7 @@
       <w:r>
         <w:t xml:space="preserve">g = 9.780 m/s² at equator, 9.832 m/s² at poles (0.53% variation). On a flat disc, centrifugal force points outward from center, producing the OPPOSITE pattern. See </w:t>
       </w:r>
-      <w:hyperlink w:history="1" r:id="rIdwfbafksvtdimckbdrdokj">
+      <w:hyperlink w:history="1" r:id="rIdvasag79gd8f37jxmmcod4">
         <w:r>
           <w:rPr>
             <w:rStyle w:val="Hyperlink"/>
@@ -14412,7 +14412,7 @@
         <w:pStyle w:val="Heading2"/>
       </w:pPr>
       <w:r>
-        <w:t xml:space="preserve">4.5.4 Tidal Forces: 300,000× Too Strong</w:t>
+        <w:t xml:space="preserve">4.5.4 Tidal Pattern: One Spike vs. Two Bulges</w:t>
       </w:r>
     </w:p>
     <w:p>
@@ -14427,7 +14427,7 @@
         <w:t xml:space="preserve">Globe tidal mechanism: </w:t>
       </w:r>
       <w:r>
-        <w:t xml:space="preserve">Tides are driven by the differential gravitational pull of the Moon at 384,400 km, producing a 1/r³ tidal potential. The tidal forcing ratio is (R_Earth/r_Moon)³ = (6,371/384,400)³ = 4.55×10⁻⁶.</w:t>
+        <w:t xml:space="preserve">The Moon orbits at d = 384,400 km. Earth's radius R = 6,371 km. The ratio d/R ≈ 60 — the Moon is far away relative to Earth's size. This means the tidal field is nearly uniform across the planet: the near side gets pulled slightly more, the far side slightly less, producing two symmetric tidal bulges (semidiurnal tide). This two-bulge pattern is the defining signature of real ocean tides.</w:t>
       </w:r>
     </w:p>
     <w:p>
@@ -14442,7 +14442,7 @@
         <w:t xml:space="preserve">Dome tidal mechanism: </w:t>
       </w:r>
       <w:r>
-        <w:t xml:space="preserve">A local moon at ~5,733 km altitude circling the disc. The tidal forcing ratio becomes (6,371/5,733)³ = 1.37 — a factor of 301,000× stronger than the globe calculation. If the dome's local moon exerted any gravitational influence at all, tidal ranges would be measured in kilometers, not the observed ~1 meter. The author claims tidal periods (M2 = 12.42h, etc.) as dome 'predictions' but has never derived them from his own geometry — he simply cites the standard tidal constituent values and declares them confirmed.</w:t>
+        <w:t xml:space="preserve">The dome's local moon orbits at altitude ~2,534 km (from inject_ai_layer.py core_parameters). The disc radius is ~20,000 km. The ratio d/R ≈ 0.13 — the moon is extremely close relative to the disc's size. Tidal force falls off as 1/r³. At the point directly beneath the moon, the tidal force is maximal. At the equatorial rim (~20,000 km away), the force drops to (2,534/20,000)³ ≈ 0.2% of its peak value. There is no far-side bulge — just a single sharp spike that tracks the moon's position. This produces one tidal pulse per lunar pass, not the observed two. This is a purely geometric argument: it depends only on the ratio of moon distance to disc size, not on the moon's mass. Adjusting the moon's mass changes the amplitude but cannot create a second bulge. The author claims tidal periods (M2 = 12.42h, etc.) as dome 'predictions' but has never derived them from his own geometry — he simply cites the standard tidal constituent values and declares them confirmed.</w:t>
       </w:r>
     </w:p>
     <w:p>
@@ -14625,7 +14625,7 @@
         <w:spacing w:after="120"/>
       </w:pPr>
       <w:r>
-        <w:t xml:space="preserve">If the author's own geometry were taken seriously and the physics worked through honestly, the dome model would predict: Schumann resonance at ~22 Hz (not 7.83), gravity varying by 80% pole-to-equator (not 0.53%), solar angular diameter changing by 50% through the day (not 1.7%), tidal forces 300,000× too strong, no longitude-dependent magnetic features, no secular variation, and a magnetic pole locked to geographic north. None of these match reality. The model 'works' only because the author replaces his own physics with the globe's physics whenever the dome geometry would produce the wrong answer.</w:t>
+        <w:t xml:space="preserve">If the author's own geometry were taken seriously and the physics worked through honestly, the dome model would predict: Schumann resonance at ~22 Hz (not 7.83), gravity varying by 80% pole-to-equator (not 0.53%), solar angular diameter changing by 50% through the day (not 1.7%), a single tidal spike instead of two bulges, no longitude-dependent magnetic features, no secular variation, and a magnetic pole locked to geographic north. None of these match reality. The model 'works' only because the author replaces his own physics with the globe's physics whenever the dome geometry would produce the wrong answer.</w:t>
       </w:r>
     </w:p>
     <w:p>
@@ -14910,7 +14910,7 @@
         <w:t xml:space="preserve">Pattern 11 (NEW): Self-Contradicting Own Geometry. </w:t>
       </w:r>
       <w:r>
-        <w:t xml:space="preserve">In 11 of 67 WINs, the dome's own stated geometry produces predictions that radically diverge from both reality and the author's claims. The dome cavity gives ~22 Hz for Schumann (not 7.83), 300,000× excess tidal forces, 90% gravity drop at the rim, and 50% solar diameter variation through the day. The author avoids these failures by substituting globe formulas, ignoring his own exponential height profile, or curve-fitting to observations. This pattern is the strongest argument against the model: it doesn't merely fail against external data — it contradicts itself.</w:t>
+        <w:t xml:space="preserve">In 11 of 67 WINs, the dome's own stated geometry produces predictions that radically diverge from both reality and the author's claims. The dome cavity gives ~22 Hz for Schumann (not 7.83), a single tidal spike instead of two bulges, 90% gravity drop at the rim, and 50% solar diameter variation through the day. The author avoids these failures by substituting globe formulas, ignoring his own exponential height profile, or curve-fitting to observations. This pattern is the strongest argument against the model: it doesn't merely fail against external data — it contradicts itself.</w:t>
       </w:r>
     </w:p>
     <w:p>
@@ -15113,7 +15113,7 @@
         </w:rPr>
         <w:t xml:space="preserve">NOAA World Magnetic Model 2025: </w:t>
       </w:r>
-      <w:hyperlink w:history="1" r:id="rIdob-ijwagtrbgdv3jnyl_b">
+      <w:hyperlink w:history="1" r:id="rIdbsqrqqk8jjtjdnajfnjyw">
         <w:r>
           <w:rPr>
             <w:rStyle w:val="Hyperlink"/>
@@ -15133,7 +15133,7 @@
         </w:rPr>
         <w:t xml:space="preserve">NOAA Wandering Geomagnetic Poles: </w:t>
       </w:r>
-      <w:hyperlink w:history="1" r:id="rIdrwyg3-0bqw2qb2x0h4wp2">
+      <w:hyperlink w:history="1" r:id="rIdh3tk_syclfe-jutz5e5ji">
         <w:r>
           <w:rPr>
             <w:rStyle w:val="Hyperlink"/>
@@ -15153,7 +15153,7 @@
         </w:rPr>
         <w:t xml:space="preserve">CHAOS-7 Geomagnetic Field Model: </w:t>
       </w:r>
-      <w:hyperlink w:history="1" r:id="rIdxxfxbjpi67t2gflw4419u">
+      <w:hyperlink w:history="1" r:id="rIdogohphzslr9tmxv_ojooe">
         <w:r>
           <w:rPr>
             <w:rStyle w:val="Hyperlink"/>
@@ -15173,7 +15173,7 @@
         </w:rPr>
         <w:t xml:space="preserve">ESA Swarm Satellite Mission: </w:t>
       </w:r>
-      <w:hyperlink w:history="1" r:id="rIdmt_y9r0blxv0xlkhkdhwm">
+      <w:hyperlink w:history="1" r:id="rIdew66tswgcflm_zs17ttvn">
         <w:r>
           <w:rPr>
             <w:rStyle w:val="Hyperlink"/>
@@ -15193,7 +15193,7 @@
         </w:rPr>
         <w:t xml:space="preserve">INTERMAGNET Observatory Network: </w:t>
       </w:r>
-      <w:hyperlink w:history="1" r:id="rId9kdigb5kmpz_u4mzuir59">
+      <w:hyperlink w:history="1" r:id="rIdc--huzxxrxxmje15xgxy8">
         <w:r>
           <w:rPr>
             <w:rStyle w:val="Hyperlink"/>
@@ -15213,7 +15213,7 @@
         </w:rPr>
         <w:t xml:space="preserve">IGRF-13: </w:t>
       </w:r>
-      <w:hyperlink w:history="1" r:id="rIdunvjjk6av-qgffu8gj-hs">
+      <w:hyperlink w:history="1" r:id="rIdlk6dw8tsgrmmfobmv-jhn">
         <w:r>
           <w:rPr>
             <w:rStyle w:val="Hyperlink"/>
@@ -15233,7 +15233,7 @@
         </w:rPr>
         <w:t xml:space="preserve">ESA Gaia Data Release 3: </w:t>
       </w:r>
-      <w:hyperlink w:history="1" r:id="rIddvtmtlytphjrwdxiv85t4">
+      <w:hyperlink w:history="1" r:id="rIdentv0ze2vosbg5l6nomm1">
         <w:r>
           <w:rPr>
             <w:rStyle w:val="Hyperlink"/>
@@ -15253,7 +15253,7 @@
         </w:rPr>
         <w:t xml:space="preserve">Hipparcos Catalogue: </w:t>
       </w:r>
-      <w:hyperlink w:history="1" r:id="rIdfjgv7hicm7wkgi3c85qh5">
+      <w:hyperlink w:history="1" r:id="rIdxhbjmsafhyrmrbes-vunc">
         <w:r>
           <w:rPr>
             <w:rStyle w:val="Hyperlink"/>
@@ -15273,7 +15273,7 @@
         </w:rPr>
         <w:t xml:space="preserve">US Patent 787412 (Tesla): </w:t>
       </w:r>
-      <w:hyperlink w:history="1" r:id="rIdrf_ex5on9ms23kqpzoww9">
+      <w:hyperlink w:history="1" r:id="rId8ef9gnjoevh7dkp77wagp">
         <w:r>
           <w:rPr>
             <w:rStyle w:val="Hyperlink"/>
@@ -15293,7 +15293,7 @@
         </w:rPr>
         <w:t xml:space="preserve">NOAA Solar Position Algorithm: </w:t>
       </w:r>
-      <w:hyperlink w:history="1" r:id="rIdudeb9ccifu__hiwjxxftt">
+      <w:hyperlink w:history="1" r:id="rIdfsoqxrqavat3noctbxwl9">
         <w:r>
           <w:rPr>
             <w:rStyle w:val="Hyperlink"/>
@@ -15313,7 +15313,7 @@
         </w:rPr>
         <w:t xml:space="preserve">National Geodetic Survey Gravity: </w:t>
       </w:r>
-      <w:hyperlink w:history="1" r:id="rIdpyv0ji-z-m3xxcdtjqxbh">
+      <w:hyperlink w:history="1" r:id="rId9yky-2gz8ha1csegvr0wm">
         <w:r>
           <w:rPr>
             <w:rStyle w:val="Hyperlink"/>
@@ -15333,7 +15333,7 @@
         </w:rPr>
         <w:t xml:space="preserve">CHIME/FRB Project: </w:t>
       </w:r>
-      <w:hyperlink w:history="1" r:id="rId-ai1jzvz41-0hsyrbchb7">
+      <w:hyperlink w:history="1" r:id="rIdmepz3jrfgk9w8jfjznx9b">
         <w:r>
           <w:rPr>
             <w:rStyle w:val="Hyperlink"/>
@@ -15353,7 +15353,7 @@
         </w:rPr>
         <w:t xml:space="preserve">GRACE-FO (gravity mapping): </w:t>
       </w:r>
-      <w:hyperlink w:history="1" r:id="rIdanji12cxw1crgpojh05bq">
+      <w:hyperlink w:history="1" r:id="rIde6siphevlytpm30efzdp5">
         <w:r>
           <w:rPr>
             <w:rStyle w:val="Hyperlink"/>
@@ -15373,7 +15373,7 @@
         </w:rPr>
         <w:t xml:space="preserve">GOCE (gravity field): </w:t>
       </w:r>
-      <w:hyperlink w:history="1" r:id="rId1w6r7nih1ydbxhnhsbuu6">
+      <w:hyperlink w:history="1" r:id="rIdrklmcprqx6gdntqyel0u3">
         <w:r>
           <w:rPr>
             <w:rStyle w:val="Hyperlink"/>
@@ -15393,7 +15393,7 @@
         </w:rPr>
         <w:t xml:space="preserve">GPS.gov: </w:t>
       </w:r>
-      <w:hyperlink w:history="1" r:id="rId8zxspdkvp6vchhsg7qmrv">
+      <w:hyperlink w:history="1" r:id="rIdk1lnctnjwivpj48nvmh6v">
         <w:r>
           <w:rPr>
             <w:rStyle w:val="Hyperlink"/>
@@ -15413,7 +15413,7 @@
         </w:rPr>
         <w:t xml:space="preserve">CelesTrak TLE Data: </w:t>
       </w:r>
-      <w:hyperlink w:history="1" r:id="rId29zkd-lbpondriemn2e_4">
+      <w:hyperlink w:history="1" r:id="rIdxzwntpppm0dlfptuqwwss">
         <w:r>
           <w:rPr>
             <w:rStyle w:val="Hyperlink"/>
@@ -15646,7 +15646,7 @@
         <w:t xml:space="preserve">V4.7 (April 5, 2026): </w:t>
       </w:r>
       <w:r>
-        <w:t xml:space="preserve">Added 'Self-Contradicted' verdict category for 11 WINs where the dome's own geometry produces predictions that contradict the author's claims (Schumann ~22 Hz, tidal forces 300,000× excess, gravity 90% drop at rim, globe solar formula substitution). Updated tallies and patterns.</w:t>
+        <w:t xml:space="preserve">Added 'Self-Contradicted' verdict category for 11 WINs where the dome's own geometry produces predictions that contradict the author's claims (Schumann ~22 Hz, one tidal spike instead of two bulges, gravity 90% drop at rim, globe solar formula substitution). Updated tallies and patterns.</w:t>
       </w:r>
     </w:p>
     <w:p>

</xml_diff>

<commit_message>
Add visual card layout to Kill-Shot test section
Each of the 6 Kill-Shot tests is now wrapped in a bordered card with
a colored status badge (Claimed Confirmed / Pending / Failing). This
visually separates the tests which previously ran together as one
continuous block of text.

Co-Authored-By: Claude Opus 4.6 <noreply@anthropic.com>
</commit_message>
<xml_diff>
--- a/downloads/critical-review-dome-model-v4.docx
+++ b/downloads/critical-review-dome-model-v4.docx
@@ -8889,7 +8889,7 @@
       <w:r>
         <w:t xml:space="preserve">US Patent 787412 (1905), publicly available at </w:t>
       </w:r>
-      <w:hyperlink w:history="1" r:id="rIdcytyzinkjqb8k5geu7rcb">
+      <w:hyperlink w:history="1" r:id="rId1uiuoidjp1rzfe5znwgkl">
         <w:r>
           <w:rPr>
             <w:rStyle w:val="Hyperlink"/>
@@ -9029,7 +9029,7 @@
       <w:r>
         <w:t xml:space="preserve">James Bradley (1727) explicitly tested and rejected atmospheric refraction as an explanation: refraction is wavelength-dependent (chromatic), while stellar aberration is achromatic. Modern VLBI measurements achieve milliarcsecond precision and directly confirm aberration correlates with Earth's orbital velocity (~30 km/s). The </w:t>
       </w:r>
-      <w:hyperlink w:history="1" r:id="rIdvl4wjw32prt_kh4mvul5h">
+      <w:hyperlink w:history="1" r:id="rIdsl4qvd5ydvudynllwq5sq">
         <w:r>
           <w:rPr>
             <w:rStyle w:val="Hyperlink"/>
@@ -9095,7 +9095,7 @@
       <w:r>
         <w:t xml:space="preserve">ESA </w:t>
       </w:r>
-      <w:hyperlink w:history="1" r:id="rIdif0-zf8klsjzf46mb1xnz">
+      <w:hyperlink w:history="1" r:id="rIdx3nyejmmluheq5t3hhyhv">
         <w:r>
           <w:rPr>
             <w:rStyle w:val="Hyperlink"/>
@@ -9161,7 +9161,7 @@
       <w:r>
         <w:t xml:space="preserve">Crepuscular rays are parallel beams made visible by atmospheric scattering. The apparent divergence is a perspective effect. Crucially, anticrepuscular rays converge at the anti-solar point simultaneously. See </w:t>
       </w:r>
-      <w:hyperlink w:history="1" r:id="rIdy7biyma4yn9tvi9cqumbx">
+      <w:hyperlink w:history="1" r:id="rIdtwxzsmbz2fz7tslhquff2">
         <w:r>
           <w:rPr>
             <w:rStyle w:val="Hyperlink"/>
@@ -9172,7 +9172,7 @@
       <w:r>
         <w:t xml:space="preserve"> and </w:t>
       </w:r>
-      <w:hyperlink w:history="1" r:id="rId26z7val-ax0qzs4dvooe6">
+      <w:hyperlink w:history="1" r:id="rIdi2jlzl_qsaxreoluj3hvp">
         <w:r>
           <w:rPr>
             <w:rStyle w:val="Hyperlink"/>
@@ -9238,7 +9238,7 @@
       <w:r>
         <w:t xml:space="preserve">NOAA officially states no evidence of anomalous disappearances. </w:t>
       </w:r>
-      <w:hyperlink w:history="1" r:id="rId61cvw0ohyjmjomsffbfle">
+      <w:hyperlink w:history="1" r:id="rIdvzeuwf1tplwe52x2b_njf">
         <w:r>
           <w:rPr>
             <w:rStyle w:val="Hyperlink"/>
@@ -9304,7 +9304,7 @@
       <w:r>
         <w:t xml:space="preserve">Hipparcos </w:t>
       </w:r>
-      <w:hyperlink w:history="1" r:id="rIdtvfakxl0viaafzecyzv4v">
+      <w:hyperlink w:history="1" r:id="rIdzbgn0wqupjjtgwkah5ed0">
         <w:r>
           <w:rPr>
             <w:rStyle w:val="Hyperlink"/>
@@ -9720,7 +9720,7 @@
       <w:r>
         <w:t xml:space="preserve">Terra-Nova et al. (2017, PNAS) demonstrate reversed-flux patches reproduce SAA splitting in MHD simulations. The </w:t>
       </w:r>
-      <w:hyperlink w:history="1" r:id="rIdutthf3iuo60ut5tz6j-sk">
+      <w:hyperlink w:history="1" r:id="rIdahmq5zxkveha--x45o0h0">
         <w:r>
           <w:rPr>
             <w:rStyle w:val="Hyperlink"/>
@@ -9731,7 +9731,7 @@
       <w:r>
         <w:t xml:space="preserve"> documents the evolution quantitatively. </w:t>
       </w:r>
-      <w:hyperlink w:history="1" r:id="rIdjfbutavoeb6ucdbrbhpau">
+      <w:hyperlink w:history="1" r:id="rIdbr0t2xiufpb761ekzaija">
         <w:r>
           <w:rPr>
             <w:rStyle w:val="Hyperlink"/>
@@ -9782,7 +9782,7 @@
       <w:r>
         <w:t xml:space="preserve">Normal secular variation documented by </w:t>
       </w:r>
-      <w:hyperlink w:history="1" r:id="rId5ggadgnkwjhh1wertvbu1">
+      <w:hyperlink w:history="1" r:id="rIdxmugueq1xpdgpofncig9a">
         <w:r>
           <w:rPr>
             <w:rStyle w:val="Hyperlink"/>
@@ -9849,7 +9849,7 @@
       <w:r>
         <w:t xml:space="preserve">Eclipse-induced perturbations predicted by Chapman (1933) via ionospheric conductivity drops. Data from </w:t>
       </w:r>
-      <w:hyperlink w:history="1" r:id="rIddll2dqebworsyaixjvzny">
+      <w:hyperlink w:history="1" r:id="rIdyhtio2_tqbw9purlcqwdf">
         <w:r>
           <w:rPr>
             <w:rStyle w:val="Hyperlink"/>
@@ -9937,7 +9937,7 @@
       <w:r>
         <w:t xml:space="preserve">The formula used is for a quarter-wave linear waveguide, not a spherical cavity. Correct formula f = c/(2*pi*R) gives R = 6,098 km, within 4% of Earth's radius. The ionosphere IS conductive (</w:t>
       </w:r>
-      <w:hyperlink w:history="1" r:id="rId10zee53cpkdipprdthclo">
+      <w:hyperlink w:history="1" r:id="rIdcuys_52ecmjlzwhnxh3oy">
         <w:r>
           <w:rPr>
             <w:rStyle w:val="Hyperlink"/>
@@ -10004,7 +10004,7 @@
       <w:r>
         <w:t xml:space="preserve">All five observations already predicted by </w:t>
       </w:r>
-      <w:hyperlink w:history="1" r:id="rIdrsxwea5ufmp4wqhf3p3bl">
+      <w:hyperlink w:history="1" r:id="rIdi-g-d5v7npxp3qhpyjwlp">
         <w:r>
           <w:rPr>
             <w:rStyle w:val="Hyperlink"/>
@@ -10015,7 +10015,7 @@
       <w:r>
         <w:t xml:space="preserve">, </w:t>
       </w:r>
-      <w:hyperlink w:history="1" r:id="rId4cufl4harfuu0elotsg-b">
+      <w:hyperlink w:history="1" r:id="rIdxdxqvthudho7vfphhn9v-">
         <w:r>
           <w:rPr>
             <w:rStyle w:val="Hyperlink"/>
@@ -10342,7 +10342,7 @@
       <w:r>
         <w:t xml:space="preserve">Antarctic gravity anomalies are mapped from orbit by </w:t>
       </w:r>
-      <w:hyperlink w:history="1" r:id="rId09vwdggujcnxzr2lhntf8">
+      <w:hyperlink w:history="1" r:id="rIdiulfwlykg9fuolvwlz4ab">
         <w:r>
           <w:rPr>
             <w:rStyle w:val="Hyperlink"/>
@@ -10353,7 +10353,7 @@
       <w:r>
         <w:t xml:space="preserve"> and </w:t>
       </w:r>
-      <w:hyperlink w:history="1" r:id="rIdhve-zatzzrwu38dskvu06">
+      <w:hyperlink w:history="1" r:id="rIdqkrewkpjk_tiz-rxu9c6j">
         <w:r>
           <w:rPr>
             <w:rStyle w:val="Hyperlink"/>
@@ -13329,7 +13329,7 @@
       <w:r>
         <w:t xml:space="preserve">A </w:t>
       </w:r>
-      <w:hyperlink w:history="1" r:id="rIdsmc4acvberk_q5rmv2e2u">
+      <w:hyperlink w:history="1" r:id="rIdfftakwjdymeoltrxqhhlh">
         <w:r>
           <w:rPr>
             <w:rStyle w:val="Hyperlink"/>
@@ -13340,7 +13340,7 @@
       <w:r>
         <w:t xml:space="preserve"> found detectable decreases in X, Z, and total field components during eclipses. An </w:t>
       </w:r>
-      <w:hyperlink w:history="1" r:id="rIdweum9ajbx09g-enkb0lzk">
+      <w:hyperlink w:history="1" r:id="rIdm7end1kmctxktmpbrgq-h">
         <w:r>
           <w:rPr>
             <w:rStyle w:val="Hyperlink"/>
@@ -13845,7 +13845,7 @@
       <w:r>
         <w:t xml:space="preserve">Continuous 24-hour sunlight. A local sun at 5,733 km circling above a flat disc cannot produce 24-hour sunlight at the disc edge. Directly observable at Amundsen-Scott Station, staffed year-round since 1957. See </w:t>
       </w:r>
-      <w:hyperlink w:history="1" r:id="rIdwgttwz-hh75ohgrkyabnv">
+      <w:hyperlink w:history="1" r:id="rIdcy2banj3gxkgjfpiw-gyi">
         <w:r>
           <w:rPr>
             <w:rStyle w:val="Hyperlink"/>
@@ -13909,7 +13909,7 @@
       <w:r>
         <w:t xml:space="preserve">GPS provides 1–3 meter accuracy worldwide using 24+ satellites in Keplerian orbits calculated from spherical-Earth gravitational mechanics. The system requires precise relativistic corrections (both special and general) that depend on the satellites' orbital velocity and altitude above a spherical gravitational well. If Earth were a flat disc with different geometry, the signal propagation times, relativistic corrections, and satellite visibility geometry would all be wrong, and the system would not achieve meter-level accuracy. The same applies to every other satellite navigation system (GLONASS, Galileo, BeiDou). The ISS at 408 km is visible on predictable schedules computed from Keplerian orbits. Geostationary satellites at 35,786 km — far above the dome's maximum height — provide continuous coverage. See </w:t>
       </w:r>
-      <w:hyperlink w:history="1" r:id="rId1vt6ja2sade80t3_votwd">
+      <w:hyperlink w:history="1" r:id="rIdm2vsa27gf7lzdacn6n-aw">
         <w:r>
           <w:rPr>
             <w:rStyle w:val="Hyperlink"/>
@@ -13920,7 +13920,7 @@
       <w:r>
         <w:t xml:space="preserve">; </w:t>
       </w:r>
-      <w:hyperlink w:history="1" r:id="rIdp_x88n8q18sqmszrznot5">
+      <w:hyperlink w:history="1" r:id="rId50rmj1s067acd05w6dao3">
         <w:r>
           <w:rPr>
             <w:rStyle w:val="Hyperlink"/>
@@ -13969,7 +13969,7 @@
       <w:r>
         <w:t xml:space="preserve">Modern solar calculators (</w:t>
       </w:r>
-      <w:hyperlink w:history="1" r:id="rId7qcgkdouinzuguglwcrvb">
+      <w:hyperlink w:history="1" r:id="rId26h9oexc6_icyypfuqqsv">
         <w:r>
           <w:rPr>
             <w:rStyle w:val="Hyperlink"/>
@@ -14018,7 +14018,7 @@
       <w:r>
         <w:t xml:space="preserve">The </w:t>
       </w:r>
-      <w:hyperlink w:history="1" r:id="rId2erthdricdno0emmg0ovp">
+      <w:hyperlink w:history="1" r:id="rIdygpdy97zrcwlnzjbrxna9">
         <w:r>
           <w:rPr>
             <w:rStyle w:val="Hyperlink"/>
@@ -14067,7 +14067,7 @@
       <w:r>
         <w:t xml:space="preserve">Earth's field is a dipole. South magnetic pole at 64.1°S, 135.9°E (</w:t>
       </w:r>
-      <w:hyperlink w:history="1" r:id="rIdydih1siix59o-sq6f2reu">
+      <w:hyperlink w:history="1" r:id="rIdzy9bwdyos_0o28sc5q_6x">
         <w:r>
           <w:rPr>
             <w:rStyle w:val="Hyperlink"/>
@@ -14116,7 +14116,7 @@
       <w:r>
         <w:t xml:space="preserve">g = 9.780 m/s² at equator, 9.832 m/s² at poles (0.53% variation). On a flat disc, centrifugal force points outward from center, producing the OPPOSITE pattern. See </w:t>
       </w:r>
-      <w:hyperlink w:history="1" r:id="rIdvasag79gd8f37jxmmcod4">
+      <w:hyperlink w:history="1" r:id="rIdyopj6bmsuwssr8pm2bhhn">
         <w:r>
           <w:rPr>
             <w:rStyle w:val="Hyperlink"/>
@@ -15113,7 +15113,7 @@
         </w:rPr>
         <w:t xml:space="preserve">NOAA World Magnetic Model 2025: </w:t>
       </w:r>
-      <w:hyperlink w:history="1" r:id="rIdbsqrqqk8jjtjdnajfnjyw">
+      <w:hyperlink w:history="1" r:id="rIdpqtn2xal_4gxitk_3wbsw">
         <w:r>
           <w:rPr>
             <w:rStyle w:val="Hyperlink"/>
@@ -15133,7 +15133,7 @@
         </w:rPr>
         <w:t xml:space="preserve">NOAA Wandering Geomagnetic Poles: </w:t>
       </w:r>
-      <w:hyperlink w:history="1" r:id="rIdh3tk_syclfe-jutz5e5ji">
+      <w:hyperlink w:history="1" r:id="rIdydbd0zgk5s-nj_tvq2u51">
         <w:r>
           <w:rPr>
             <w:rStyle w:val="Hyperlink"/>
@@ -15153,7 +15153,7 @@
         </w:rPr>
         <w:t xml:space="preserve">CHAOS-7 Geomagnetic Field Model: </w:t>
       </w:r>
-      <w:hyperlink w:history="1" r:id="rIdogohphzslr9tmxv_ojooe">
+      <w:hyperlink w:history="1" r:id="rIdqnh4bgbo6rzzbgkx5zrmf">
         <w:r>
           <w:rPr>
             <w:rStyle w:val="Hyperlink"/>
@@ -15173,7 +15173,7 @@
         </w:rPr>
         <w:t xml:space="preserve">ESA Swarm Satellite Mission: </w:t>
       </w:r>
-      <w:hyperlink w:history="1" r:id="rIdew66tswgcflm_zs17ttvn">
+      <w:hyperlink w:history="1" r:id="rIdu_o903dubzl0o_enclror">
         <w:r>
           <w:rPr>
             <w:rStyle w:val="Hyperlink"/>
@@ -15193,7 +15193,7 @@
         </w:rPr>
         <w:t xml:space="preserve">INTERMAGNET Observatory Network: </w:t>
       </w:r>
-      <w:hyperlink w:history="1" r:id="rIdc--huzxxrxxmje15xgxy8">
+      <w:hyperlink w:history="1" r:id="rIdxfnijjpguhgttj1amg6mk">
         <w:r>
           <w:rPr>
             <w:rStyle w:val="Hyperlink"/>
@@ -15213,7 +15213,7 @@
         </w:rPr>
         <w:t xml:space="preserve">IGRF-13: </w:t>
       </w:r>
-      <w:hyperlink w:history="1" r:id="rIdlk6dw8tsgrmmfobmv-jhn">
+      <w:hyperlink w:history="1" r:id="rId46chvhotwzx2wmwjvgxan">
         <w:r>
           <w:rPr>
             <w:rStyle w:val="Hyperlink"/>
@@ -15233,7 +15233,7 @@
         </w:rPr>
         <w:t xml:space="preserve">ESA Gaia Data Release 3: </w:t>
       </w:r>
-      <w:hyperlink w:history="1" r:id="rIdentv0ze2vosbg5l6nomm1">
+      <w:hyperlink w:history="1" r:id="rIdox_8t4utiqpfdmhpegvlz">
         <w:r>
           <w:rPr>
             <w:rStyle w:val="Hyperlink"/>
@@ -15253,7 +15253,7 @@
         </w:rPr>
         <w:t xml:space="preserve">Hipparcos Catalogue: </w:t>
       </w:r>
-      <w:hyperlink w:history="1" r:id="rIdxhbjmsafhyrmrbes-vunc">
+      <w:hyperlink w:history="1" r:id="rIdl73tv9xrii8ejtbj2og_q">
         <w:r>
           <w:rPr>
             <w:rStyle w:val="Hyperlink"/>
@@ -15273,7 +15273,7 @@
         </w:rPr>
         <w:t xml:space="preserve">US Patent 787412 (Tesla): </w:t>
       </w:r>
-      <w:hyperlink w:history="1" r:id="rId8ef9gnjoevh7dkp77wagp">
+      <w:hyperlink w:history="1" r:id="rIdthvm2ewkb2ygpwclvamy_">
         <w:r>
           <w:rPr>
             <w:rStyle w:val="Hyperlink"/>
@@ -15293,7 +15293,7 @@
         </w:rPr>
         <w:t xml:space="preserve">NOAA Solar Position Algorithm: </w:t>
       </w:r>
-      <w:hyperlink w:history="1" r:id="rIdfsoqxrqavat3noctbxwl9">
+      <w:hyperlink w:history="1" r:id="rIdbmppqcpeiloxnrl0d_wkj">
         <w:r>
           <w:rPr>
             <w:rStyle w:val="Hyperlink"/>
@@ -15313,7 +15313,7 @@
         </w:rPr>
         <w:t xml:space="preserve">National Geodetic Survey Gravity: </w:t>
       </w:r>
-      <w:hyperlink w:history="1" r:id="rId9yky-2gz8ha1csegvr0wm">
+      <w:hyperlink w:history="1" r:id="rIdbvhihrzrwxddu7rgj-v0p">
         <w:r>
           <w:rPr>
             <w:rStyle w:val="Hyperlink"/>
@@ -15333,7 +15333,7 @@
         </w:rPr>
         <w:t xml:space="preserve">CHIME/FRB Project: </w:t>
       </w:r>
-      <w:hyperlink w:history="1" r:id="rIdmepz3jrfgk9w8jfjznx9b">
+      <w:hyperlink w:history="1" r:id="rId0f4lmgike5jk6x_fchntc">
         <w:r>
           <w:rPr>
             <w:rStyle w:val="Hyperlink"/>
@@ -15353,7 +15353,7 @@
         </w:rPr>
         <w:t xml:space="preserve">GRACE-FO (gravity mapping): </w:t>
       </w:r>
-      <w:hyperlink w:history="1" r:id="rIde6siphevlytpm30efzdp5">
+      <w:hyperlink w:history="1" r:id="rIdyvv-rxxen12yvdwijsa9j">
         <w:r>
           <w:rPr>
             <w:rStyle w:val="Hyperlink"/>
@@ -15373,7 +15373,7 @@
         </w:rPr>
         <w:t xml:space="preserve">GOCE (gravity field): </w:t>
       </w:r>
-      <w:hyperlink w:history="1" r:id="rIdrklmcprqx6gdntqyel0u3">
+      <w:hyperlink w:history="1" r:id="rIdr5udnl1qguwwucavnturn">
         <w:r>
           <w:rPr>
             <w:rStyle w:val="Hyperlink"/>
@@ -15393,7 +15393,7 @@
         </w:rPr>
         <w:t xml:space="preserve">GPS.gov: </w:t>
       </w:r>
-      <w:hyperlink w:history="1" r:id="rIdk1lnctnjwivpj48nvmh6v">
+      <w:hyperlink w:history="1" r:id="rIdktbvwzlnkda3het7zhv8c">
         <w:r>
           <w:rPr>
             <w:rStyle w:val="Hyperlink"/>
@@ -15413,7 +15413,7 @@
         </w:rPr>
         <w:t xml:space="preserve">CelesTrak TLE Data: </w:t>
       </w:r>
-      <w:hyperlink w:history="1" r:id="rIdxzwntpppm0dlfptuqwwss">
+      <w:hyperlink w:history="1" r:id="rIdyc9hwhfnd35sfvhkuphp4">
         <w:r>
           <w:rPr>
             <w:rStyle w:val="Hyperlink"/>

</xml_diff>

<commit_message>
Strengthen 95.2% accuracy analysis with source code evidence
Examined every script in the dome model's repository (scoring.js,
predictions.js, build.js, analytics.js, apply_scoring_schema.py,
recalc_v51.py, compile_exhaustive_api.py, verify_predictions.py,
build_tracking.py). The 95.2% figure is hardcoded as static HTML —
no script computes it. It also cannot be reproduced from the repo's
own data: api/scorecard.json gives 96.3%, results.json gives 97.0%,
homepage counts give 89.3% or 94.7%. The number has no derivation.

Co-Authored-By: Claude Opus 4.6 <noreply@anthropic.com>
</commit_message>
<xml_diff>
--- a/downloads/critical-review-dome-model-v4.docx
+++ b/downloads/critical-review-dome-model-v4.docx
@@ -8889,7 +8889,7 @@
       <w:r>
         <w:t xml:space="preserve">US Patent 787412 (1905), publicly available at </w:t>
       </w:r>
-      <w:hyperlink w:history="1" r:id="rId1uiuoidjp1rzfe5znwgkl">
+      <w:hyperlink w:history="1" r:id="rIdf13lmew1sd_afdtpeewkp">
         <w:r>
           <w:rPr>
             <w:rStyle w:val="Hyperlink"/>
@@ -9029,7 +9029,7 @@
       <w:r>
         <w:t xml:space="preserve">James Bradley (1727) explicitly tested and rejected atmospheric refraction as an explanation: refraction is wavelength-dependent (chromatic), while stellar aberration is achromatic. Modern VLBI measurements achieve milliarcsecond precision and directly confirm aberration correlates with Earth's orbital velocity (~30 km/s). The </w:t>
       </w:r>
-      <w:hyperlink w:history="1" r:id="rIdsl4qvd5ydvudynllwq5sq">
+      <w:hyperlink w:history="1" r:id="rIddbrhshypodg_5lyw3ffeq">
         <w:r>
           <w:rPr>
             <w:rStyle w:val="Hyperlink"/>
@@ -9095,7 +9095,7 @@
       <w:r>
         <w:t xml:space="preserve">ESA </w:t>
       </w:r>
-      <w:hyperlink w:history="1" r:id="rIdx3nyejmmluheq5t3hhyhv">
+      <w:hyperlink w:history="1" r:id="rIdiquhslxqiofbqe6iljror">
         <w:r>
           <w:rPr>
             <w:rStyle w:val="Hyperlink"/>
@@ -9161,7 +9161,7 @@
       <w:r>
         <w:t xml:space="preserve">Crepuscular rays are parallel beams made visible by atmospheric scattering. The apparent divergence is a perspective effect. Crucially, anticrepuscular rays converge at the anti-solar point simultaneously. See </w:t>
       </w:r>
-      <w:hyperlink w:history="1" r:id="rIdtwxzsmbz2fz7tslhquff2">
+      <w:hyperlink w:history="1" r:id="rIdacnfh7gvpf3natgu35sld">
         <w:r>
           <w:rPr>
             <w:rStyle w:val="Hyperlink"/>
@@ -9172,7 +9172,7 @@
       <w:r>
         <w:t xml:space="preserve"> and </w:t>
       </w:r>
-      <w:hyperlink w:history="1" r:id="rIdi2jlzl_qsaxreoluj3hvp">
+      <w:hyperlink w:history="1" r:id="rIdzvharaxdzpmf4ikkww8u_">
         <w:r>
           <w:rPr>
             <w:rStyle w:val="Hyperlink"/>
@@ -9238,7 +9238,7 @@
       <w:r>
         <w:t xml:space="preserve">NOAA officially states no evidence of anomalous disappearances. </w:t>
       </w:r>
-      <w:hyperlink w:history="1" r:id="rIdvzeuwf1tplwe52x2b_njf">
+      <w:hyperlink w:history="1" r:id="rIdzvxldhrhveg0qtd_rmhb_">
         <w:r>
           <w:rPr>
             <w:rStyle w:val="Hyperlink"/>
@@ -9304,7 +9304,7 @@
       <w:r>
         <w:t xml:space="preserve">Hipparcos </w:t>
       </w:r>
-      <w:hyperlink w:history="1" r:id="rIdzbgn0wqupjjtgwkah5ed0">
+      <w:hyperlink w:history="1" r:id="rIdxwbabf_dihtnlbdrgys2f">
         <w:r>
           <w:rPr>
             <w:rStyle w:val="Hyperlink"/>
@@ -9720,7 +9720,7 @@
       <w:r>
         <w:t xml:space="preserve">Terra-Nova et al. (2017, PNAS) demonstrate reversed-flux patches reproduce SAA splitting in MHD simulations. The </w:t>
       </w:r>
-      <w:hyperlink w:history="1" r:id="rIdahmq5zxkveha--x45o0h0">
+      <w:hyperlink w:history="1" r:id="rIda6htizumq4_lmygc718qp">
         <w:r>
           <w:rPr>
             <w:rStyle w:val="Hyperlink"/>
@@ -9731,7 +9731,7 @@
       <w:r>
         <w:t xml:space="preserve"> documents the evolution quantitatively. </w:t>
       </w:r>
-      <w:hyperlink w:history="1" r:id="rIdbr0t2xiufpb761ekzaija">
+      <w:hyperlink w:history="1" r:id="rIds5ow1tgw2knd1g2-90vax">
         <w:r>
           <w:rPr>
             <w:rStyle w:val="Hyperlink"/>
@@ -9782,7 +9782,7 @@
       <w:r>
         <w:t xml:space="preserve">Normal secular variation documented by </w:t>
       </w:r>
-      <w:hyperlink w:history="1" r:id="rIdxmugueq1xpdgpofncig9a">
+      <w:hyperlink w:history="1" r:id="rId6vq_jl-ktivpc1icfi2pb">
         <w:r>
           <w:rPr>
             <w:rStyle w:val="Hyperlink"/>
@@ -9849,7 +9849,7 @@
       <w:r>
         <w:t xml:space="preserve">Eclipse-induced perturbations predicted by Chapman (1933) via ionospheric conductivity drops. Data from </w:t>
       </w:r>
-      <w:hyperlink w:history="1" r:id="rIdyhtio2_tqbw9purlcqwdf">
+      <w:hyperlink w:history="1" r:id="rIdt1blh5qjsyiltzey1ordu">
         <w:r>
           <w:rPr>
             <w:rStyle w:val="Hyperlink"/>
@@ -9937,7 +9937,7 @@
       <w:r>
         <w:t xml:space="preserve">The formula used is for a quarter-wave linear waveguide, not a spherical cavity. Correct formula f = c/(2*pi*R) gives R = 6,098 km, within 4% of Earth's radius. The ionosphere IS conductive (</w:t>
       </w:r>
-      <w:hyperlink w:history="1" r:id="rIdcuys_52ecmjlzwhnxh3oy">
+      <w:hyperlink w:history="1" r:id="rIdjiuzwoiujusvanq2ujlqn">
         <w:r>
           <w:rPr>
             <w:rStyle w:val="Hyperlink"/>
@@ -10004,7 +10004,7 @@
       <w:r>
         <w:t xml:space="preserve">All five observations already predicted by </w:t>
       </w:r>
-      <w:hyperlink w:history="1" r:id="rIdi-g-d5v7npxp3qhpyjwlp">
+      <w:hyperlink w:history="1" r:id="rIdwh-baga2h4uyhj8a3xqim">
         <w:r>
           <w:rPr>
             <w:rStyle w:val="Hyperlink"/>
@@ -10015,7 +10015,7 @@
       <w:r>
         <w:t xml:space="preserve">, </w:t>
       </w:r>
-      <w:hyperlink w:history="1" r:id="rIdxdxqvthudho7vfphhn9v-">
+      <w:hyperlink w:history="1" r:id="rIdd2o3hm1d8_uujd1nmzltb">
         <w:r>
           <w:rPr>
             <w:rStyle w:val="Hyperlink"/>
@@ -10342,7 +10342,7 @@
       <w:r>
         <w:t xml:space="preserve">Antarctic gravity anomalies are mapped from orbit by </w:t>
       </w:r>
-      <w:hyperlink w:history="1" r:id="rIdiulfwlykg9fuolvwlz4ab">
+      <w:hyperlink w:history="1" r:id="rIdozqdepte4lhemevb_nzg0">
         <w:r>
           <w:rPr>
             <w:rStyle w:val="Hyperlink"/>
@@ -10353,7 +10353,7 @@
       <w:r>
         <w:t xml:space="preserve"> and </w:t>
       </w:r>
-      <w:hyperlink w:history="1" r:id="rIdqkrewkpjk_tiz-rxu9c6j">
+      <w:hyperlink w:history="1" r:id="rIdxaezb_z2mtcn-wrktkhak">
         <w:r>
           <w:rPr>
             <w:rStyle w:val="Hyperlink"/>
@@ -13329,7 +13329,7 @@
       <w:r>
         <w:t xml:space="preserve">A </w:t>
       </w:r>
-      <w:hyperlink w:history="1" r:id="rIdfftakwjdymeoltrxqhhlh">
+      <w:hyperlink w:history="1" r:id="rIdzj9khsaeylms9txkkb38o">
         <w:r>
           <w:rPr>
             <w:rStyle w:val="Hyperlink"/>
@@ -13340,7 +13340,7 @@
       <w:r>
         <w:t xml:space="preserve"> found detectable decreases in X, Z, and total field components during eclipses. An </w:t>
       </w:r>
-      <w:hyperlink w:history="1" r:id="rIdm7end1kmctxktmpbrgq-h">
+      <w:hyperlink w:history="1" r:id="rId7g5itqpakzuamy19ijb6z">
         <w:r>
           <w:rPr>
             <w:rStyle w:val="Hyperlink"/>
@@ -13845,7 +13845,7 @@
       <w:r>
         <w:t xml:space="preserve">Continuous 24-hour sunlight. A local sun at 5,733 km circling above a flat disc cannot produce 24-hour sunlight at the disc edge. Directly observable at Amundsen-Scott Station, staffed year-round since 1957. See </w:t>
       </w:r>
-      <w:hyperlink w:history="1" r:id="rIdcy2banj3gxkgjfpiw-gyi">
+      <w:hyperlink w:history="1" r:id="rIdyleyg1pc5nr4_-luvte3t">
         <w:r>
           <w:rPr>
             <w:rStyle w:val="Hyperlink"/>
@@ -13909,7 +13909,7 @@
       <w:r>
         <w:t xml:space="preserve">GPS provides 1–3 meter accuracy worldwide using 24+ satellites in Keplerian orbits calculated from spherical-Earth gravitational mechanics. The system requires precise relativistic corrections (both special and general) that depend on the satellites' orbital velocity and altitude above a spherical gravitational well. If Earth were a flat disc with different geometry, the signal propagation times, relativistic corrections, and satellite visibility geometry would all be wrong, and the system would not achieve meter-level accuracy. The same applies to every other satellite navigation system (GLONASS, Galileo, BeiDou). The ISS at 408 km is visible on predictable schedules computed from Keplerian orbits. Geostationary satellites at 35,786 km — far above the dome's maximum height — provide continuous coverage. See </w:t>
       </w:r>
-      <w:hyperlink w:history="1" r:id="rIdm2vsa27gf7lzdacn6n-aw">
+      <w:hyperlink w:history="1" r:id="rIdu6mviiqn3asa0ou7wqdjh">
         <w:r>
           <w:rPr>
             <w:rStyle w:val="Hyperlink"/>
@@ -13920,7 +13920,7 @@
       <w:r>
         <w:t xml:space="preserve">; </w:t>
       </w:r>
-      <w:hyperlink w:history="1" r:id="rId50rmj1s067acd05w6dao3">
+      <w:hyperlink w:history="1" r:id="rIdauwucuvntbpoc7deo_rpi">
         <w:r>
           <w:rPr>
             <w:rStyle w:val="Hyperlink"/>
@@ -13969,7 +13969,7 @@
       <w:r>
         <w:t xml:space="preserve">Modern solar calculators (</w:t>
       </w:r>
-      <w:hyperlink w:history="1" r:id="rId26h9oexc6_icyypfuqqsv">
+      <w:hyperlink w:history="1" r:id="rId6j4l6lm_djeqctvk_gziy">
         <w:r>
           <w:rPr>
             <w:rStyle w:val="Hyperlink"/>
@@ -14018,7 +14018,7 @@
       <w:r>
         <w:t xml:space="preserve">The </w:t>
       </w:r>
-      <w:hyperlink w:history="1" r:id="rIdygpdy97zrcwlnzjbrxna9">
+      <w:hyperlink w:history="1" r:id="rIdrlkih6fghcfxtanpjfgth">
         <w:r>
           <w:rPr>
             <w:rStyle w:val="Hyperlink"/>
@@ -14067,7 +14067,7 @@
       <w:r>
         <w:t xml:space="preserve">Earth's field is a dipole. South magnetic pole at 64.1°S, 135.9°E (</w:t>
       </w:r>
-      <w:hyperlink w:history="1" r:id="rIdzy9bwdyos_0o28sc5q_6x">
+      <w:hyperlink w:history="1" r:id="rIdjefaf2ndvr7umpnufsayx">
         <w:r>
           <w:rPr>
             <w:rStyle w:val="Hyperlink"/>
@@ -14116,7 +14116,7 @@
       <w:r>
         <w:t xml:space="preserve">g = 9.780 m/s² at equator, 9.832 m/s² at poles (0.53% variation). On a flat disc, centrifugal force points outward from center, producing the OPPOSITE pattern. See </w:t>
       </w:r>
-      <w:hyperlink w:history="1" r:id="rIdyopj6bmsuwssr8pm2bhhn">
+      <w:hyperlink w:history="1" r:id="rId7hcnbl_unxffwpop_crkd">
         <w:r>
           <w:rPr>
             <w:rStyle w:val="Hyperlink"/>
@@ -15113,7 +15113,7 @@
         </w:rPr>
         <w:t xml:space="preserve">NOAA World Magnetic Model 2025: </w:t>
       </w:r>
-      <w:hyperlink w:history="1" r:id="rIdpqtn2xal_4gxitk_3wbsw">
+      <w:hyperlink w:history="1" r:id="rIdk4t8kznijylqtqfcwzkna">
         <w:r>
           <w:rPr>
             <w:rStyle w:val="Hyperlink"/>
@@ -15133,7 +15133,7 @@
         </w:rPr>
         <w:t xml:space="preserve">NOAA Wandering Geomagnetic Poles: </w:t>
       </w:r>
-      <w:hyperlink w:history="1" r:id="rIdydbd0zgk5s-nj_tvq2u51">
+      <w:hyperlink w:history="1" r:id="rIdvdjje1uzxv5yp5l8ytksa">
         <w:r>
           <w:rPr>
             <w:rStyle w:val="Hyperlink"/>
@@ -15153,7 +15153,7 @@
         </w:rPr>
         <w:t xml:space="preserve">CHAOS-7 Geomagnetic Field Model: </w:t>
       </w:r>
-      <w:hyperlink w:history="1" r:id="rIdqnh4bgbo6rzzbgkx5zrmf">
+      <w:hyperlink w:history="1" r:id="rId5x9yb0oj8futaha9gbxju">
         <w:r>
           <w:rPr>
             <w:rStyle w:val="Hyperlink"/>
@@ -15173,7 +15173,7 @@
         </w:rPr>
         <w:t xml:space="preserve">ESA Swarm Satellite Mission: </w:t>
       </w:r>
-      <w:hyperlink w:history="1" r:id="rIdu_o903dubzl0o_enclror">
+      <w:hyperlink w:history="1" r:id="rIdwrgzkq5taaeisj15vwg5p">
         <w:r>
           <w:rPr>
             <w:rStyle w:val="Hyperlink"/>
@@ -15193,7 +15193,7 @@
         </w:rPr>
         <w:t xml:space="preserve">INTERMAGNET Observatory Network: </w:t>
       </w:r>
-      <w:hyperlink w:history="1" r:id="rIdxfnijjpguhgttj1amg6mk">
+      <w:hyperlink w:history="1" r:id="rIdktys8ng82n2oojeghtsqy">
         <w:r>
           <w:rPr>
             <w:rStyle w:val="Hyperlink"/>
@@ -15213,7 +15213,7 @@
         </w:rPr>
         <w:t xml:space="preserve">IGRF-13: </w:t>
       </w:r>
-      <w:hyperlink w:history="1" r:id="rId46chvhotwzx2wmwjvgxan">
+      <w:hyperlink w:history="1" r:id="rId3-lptkqd9llpz7gfswaln">
         <w:r>
           <w:rPr>
             <w:rStyle w:val="Hyperlink"/>
@@ -15233,7 +15233,7 @@
         </w:rPr>
         <w:t xml:space="preserve">ESA Gaia Data Release 3: </w:t>
       </w:r>
-      <w:hyperlink w:history="1" r:id="rIdox_8t4utiqpfdmhpegvlz">
+      <w:hyperlink w:history="1" r:id="rId--4m7xzij7rdjocqscv7g">
         <w:r>
           <w:rPr>
             <w:rStyle w:val="Hyperlink"/>
@@ -15253,7 +15253,7 @@
         </w:rPr>
         <w:t xml:space="preserve">Hipparcos Catalogue: </w:t>
       </w:r>
-      <w:hyperlink w:history="1" r:id="rIdl73tv9xrii8ejtbj2og_q">
+      <w:hyperlink w:history="1" r:id="rId1jxfd-jmqz3huvs8uzyf6">
         <w:r>
           <w:rPr>
             <w:rStyle w:val="Hyperlink"/>
@@ -15273,7 +15273,7 @@
         </w:rPr>
         <w:t xml:space="preserve">US Patent 787412 (Tesla): </w:t>
       </w:r>
-      <w:hyperlink w:history="1" r:id="rIdthvm2ewkb2ygpwclvamy_">
+      <w:hyperlink w:history="1" r:id="rIdjqbncz_4ihgl0h3lx9wes">
         <w:r>
           <w:rPr>
             <w:rStyle w:val="Hyperlink"/>
@@ -15293,7 +15293,7 @@
         </w:rPr>
         <w:t xml:space="preserve">NOAA Solar Position Algorithm: </w:t>
       </w:r>
-      <w:hyperlink w:history="1" r:id="rIdbmppqcpeiloxnrl0d_wkj">
+      <w:hyperlink w:history="1" r:id="rId5thyrx2ilsvs4msqqogno">
         <w:r>
           <w:rPr>
             <w:rStyle w:val="Hyperlink"/>
@@ -15313,7 +15313,7 @@
         </w:rPr>
         <w:t xml:space="preserve">National Geodetic Survey Gravity: </w:t>
       </w:r>
-      <w:hyperlink w:history="1" r:id="rIdbvhihrzrwxddu7rgj-v0p">
+      <w:hyperlink w:history="1" r:id="rId1ektiboo2zmnnxin_5wez">
         <w:r>
           <w:rPr>
             <w:rStyle w:val="Hyperlink"/>
@@ -15333,7 +15333,7 @@
         </w:rPr>
         <w:t xml:space="preserve">CHIME/FRB Project: </w:t>
       </w:r>
-      <w:hyperlink w:history="1" r:id="rId0f4lmgike5jk6x_fchntc">
+      <w:hyperlink w:history="1" r:id="rId0kzwb5inf1ican7w3ms1r">
         <w:r>
           <w:rPr>
             <w:rStyle w:val="Hyperlink"/>
@@ -15353,7 +15353,7 @@
         </w:rPr>
         <w:t xml:space="preserve">GRACE-FO (gravity mapping): </w:t>
       </w:r>
-      <w:hyperlink w:history="1" r:id="rIdyvv-rxxen12yvdwijsa9j">
+      <w:hyperlink w:history="1" r:id="rId6llbiuxun3o71lpaz-bjl">
         <w:r>
           <w:rPr>
             <w:rStyle w:val="Hyperlink"/>
@@ -15373,7 +15373,7 @@
         </w:rPr>
         <w:t xml:space="preserve">GOCE (gravity field): </w:t>
       </w:r>
-      <w:hyperlink w:history="1" r:id="rIdr5udnl1qguwwucavnturn">
+      <w:hyperlink w:history="1" r:id="rIdpwacbkumn4ge1lwqia-mh">
         <w:r>
           <w:rPr>
             <w:rStyle w:val="Hyperlink"/>
@@ -15393,7 +15393,7 @@
         </w:rPr>
         <w:t xml:space="preserve">GPS.gov: </w:t>
       </w:r>
-      <w:hyperlink w:history="1" r:id="rIdktbvwzlnkda3het7zhv8c">
+      <w:hyperlink w:history="1" r:id="rIdqy_vdpn4whv8xfy_wqzqk">
         <w:r>
           <w:rPr>
             <w:rStyle w:val="Hyperlink"/>
@@ -15413,7 +15413,7 @@
         </w:rPr>
         <w:t xml:space="preserve">CelesTrak TLE Data: </w:t>
       </w:r>
-      <w:hyperlink w:history="1" r:id="rIdyc9hwhfnd35sfvhkuphp4">
+      <w:hyperlink w:history="1" r:id="rIdnwm67jeucqmk8zsfepz_j">
         <w:r>
           <w:rPr>
             <w:rStyle w:val="Hyperlink"/>

</xml_diff>